<commit_message>
fixing minor mistake with duplicated variables and completing and fixing ReadMe.md files
</commit_message>
<xml_diff>
--- a/Relatorio/Relatório de estágio.docx
+++ b/Relatorio/Relatório de estágio.docx
@@ -1,6 +1,6 @@
 
 <file path=word/document.xml><?xml version="1.0" encoding="utf-8"?>
-<w:document xmlns:wpc="http://schemas.microsoft.com/office/word/2010/wordprocessingCanvas" xmlns:cx="http://schemas.microsoft.com/office/drawing/2014/chartex" xmlns:cx1="http://schemas.microsoft.com/office/drawing/2015/9/8/chartex" xmlns:cx2="http://schemas.microsoft.com/office/drawing/2015/10/21/chartex" xmlns:cx3="http://schemas.microsoft.com/office/drawing/2016/5/9/chartex" xmlns:cx4="http://schemas.microsoft.com/office/drawing/2016/5/10/chartex" xmlns:cx5="http://schemas.microsoft.com/office/drawing/2016/5/11/chartex" xmlns:cx6="http://schemas.microsoft.com/office/drawing/2016/5/12/chartex" xmlns:cx7="http://schemas.microsoft.com/office/drawing/2016/5/13/chartex" xmlns:cx8="http://schemas.microsoft.com/office/drawing/2016/5/14/chartex" xmlns:mc="http://schemas.openxmlformats.org/markup-compatibility/2006" xmlns:aink="http://schemas.microsoft.com/office/drawing/2016/ink" xmlns:am3d="http://schemas.microsoft.com/office/drawing/2017/model3d" xmlns:o="urn:schemas-microsoft-com:office:office" xmlns:oel="http://schemas.microsoft.com/office/2019/extlst" xmlns:r="http://schemas.openxmlformats.org/officeDocument/2006/relationships" xmlns:m="http://schemas.openxmlformats.org/officeDocument/2006/math" xmlns:v="urn:schemas-microsoft-com:vml" xmlns:wp14="http://schemas.microsoft.com/office/word/2010/wordprocessingDrawing" xmlns:wp="http://schemas.openxmlformats.org/drawingml/2006/wordprocessingDrawing" xmlns:w10="urn:schemas-microsoft-com:office:word" xmlns:w="http://schemas.openxmlformats.org/wordprocessingml/2006/main" xmlns:w14="http://schemas.microsoft.com/office/word/2010/wordml" xmlns:w15="http://schemas.microsoft.com/office/word/2012/wordml" xmlns:w16cex="http://schemas.microsoft.com/office/word/2018/wordml/cex" xmlns:w16cid="http://schemas.microsoft.com/office/word/2016/wordml/cid" xmlns:w16="http://schemas.microsoft.com/office/word/2018/wordml" xmlns:w16sdtdh="http://schemas.microsoft.com/office/word/2020/wordml/sdtdatahash" xmlns:w16se="http://schemas.microsoft.com/office/word/2015/wordml/symex" xmlns:wpg="http://schemas.microsoft.com/office/word/2010/wordprocessingGroup" xmlns:wpi="http://schemas.microsoft.com/office/word/2010/wordprocessingInk" xmlns:wne="http://schemas.microsoft.com/office/word/2006/wordml" xmlns:wps="http://schemas.microsoft.com/office/word/2010/wordprocessingShape" mc:Ignorable="w14 w15 w16se w16cid w16 w16cex w16sdtdh wp14">
+<w:document xmlns:wpc="http://schemas.microsoft.com/office/word/2010/wordprocessingCanvas" xmlns:cx="http://schemas.microsoft.com/office/drawing/2014/chartex" xmlns:cx1="http://schemas.microsoft.com/office/drawing/2015/9/8/chartex" xmlns:cx2="http://schemas.microsoft.com/office/drawing/2015/10/21/chartex" xmlns:cx3="http://schemas.microsoft.com/office/drawing/2016/5/9/chartex" xmlns:cx4="http://schemas.microsoft.com/office/drawing/2016/5/10/chartex" xmlns:cx5="http://schemas.microsoft.com/office/drawing/2016/5/11/chartex" xmlns:cx6="http://schemas.microsoft.com/office/drawing/2016/5/12/chartex" xmlns:cx7="http://schemas.microsoft.com/office/drawing/2016/5/13/chartex" xmlns:cx8="http://schemas.microsoft.com/office/drawing/2016/5/14/chartex" xmlns:mc="http://schemas.openxmlformats.org/markup-compatibility/2006" xmlns:aink="http://schemas.microsoft.com/office/drawing/2016/ink" xmlns:am3d="http://schemas.microsoft.com/office/drawing/2017/model3d" xmlns:o="urn:schemas-microsoft-com:office:office" xmlns:oel="http://schemas.microsoft.com/office/2019/extlst" xmlns:r="http://schemas.openxmlformats.org/officeDocument/2006/relationships" xmlns:m="http://schemas.openxmlformats.org/officeDocument/2006/math" xmlns:v="urn:schemas-microsoft-com:vml" xmlns:wp14="http://schemas.microsoft.com/office/word/2010/wordprocessingDrawing" xmlns:wp="http://schemas.openxmlformats.org/drawingml/2006/wordprocessingDrawing" xmlns:w10="urn:schemas-microsoft-com:office:word" xmlns:w="http://schemas.openxmlformats.org/wordprocessingml/2006/main" xmlns:w14="http://schemas.microsoft.com/office/word/2010/wordml" xmlns:w15="http://schemas.microsoft.com/office/word/2012/wordml" xmlns:w16cex="http://schemas.microsoft.com/office/word/2018/wordml/cex" xmlns:w16cid="http://schemas.microsoft.com/office/word/2016/wordml/cid" xmlns:w16="http://schemas.microsoft.com/office/word/2018/wordml" xmlns:w16du="http://schemas.microsoft.com/office/word/2023/wordml/word16du" xmlns:w16sdtdh="http://schemas.microsoft.com/office/word/2020/wordml/sdtdatahash" xmlns:w16sdtfl="http://schemas.microsoft.com/office/word/2024/wordml/sdtformatlock" xmlns:w16se="http://schemas.microsoft.com/office/word/2015/wordml/symex" xmlns:wpg="http://schemas.microsoft.com/office/word/2010/wordprocessingGroup" xmlns:wpi="http://schemas.microsoft.com/office/word/2010/wordprocessingInk" xmlns:wne="http://schemas.microsoft.com/office/word/2006/wordml" xmlns:wps="http://schemas.microsoft.com/office/word/2010/wordprocessingShape" mc:Ignorable="w14 w15 w16se w16cid w16 w16cex w16sdtdh w16sdtfl w16du wp14">
   <w:background w:color="FFFFFF"/>
   <w:body>
     <w:p>
@@ -123,9 +123,11 @@
       <w:pPr>
         <w:pStyle w:val="capaempresa"/>
       </w:pPr>
+      <w:proofErr w:type="spellStart"/>
       <w:r>
         <w:t>Deloitte</w:t>
       </w:r>
+      <w:proofErr w:type="spellEnd"/>
     </w:p>
     <w:p>
       <w:pPr>
@@ -292,9 +294,11 @@
       <w:pPr>
         <w:pStyle w:val="capaempresa"/>
       </w:pPr>
+      <w:proofErr w:type="spellStart"/>
       <w:r>
         <w:t>Deloitte</w:t>
       </w:r>
+      <w:proofErr w:type="spellEnd"/>
     </w:p>
     <w:p/>
     <w:p>
@@ -855,7 +859,7 @@
     </w:p>
     <w:p>
       <w:pPr>
-        <w:pStyle w:val="TOC1"/>
+        <w:pStyle w:val="ndice1"/>
         <w:tabs>
           <w:tab w:val="left" w:pos="480"/>
           <w:tab w:val="right" w:leader="dot" w:pos="8302"/>
@@ -883,7 +887,7 @@
       <w:hyperlink w:anchor="_Toc5805924" w:history="1">
         <w:r>
           <w:rPr>
-            <w:rStyle w:val="Hyperlink"/>
+            <w:rStyle w:val="Hiperligao"/>
             <w:noProof/>
           </w:rPr>
           <w:t>1</w:t>
@@ -903,7 +907,7 @@
         </w:r>
         <w:r>
           <w:rPr>
-            <w:rStyle w:val="Hyperlink"/>
+            <w:rStyle w:val="Hiperligao"/>
             <w:noProof/>
           </w:rPr>
           <w:t>Introdução</w:t>
@@ -953,7 +957,7 @@
     </w:p>
     <w:p>
       <w:pPr>
-        <w:pStyle w:val="TOC2"/>
+        <w:pStyle w:val="ndice2"/>
         <w:tabs>
           <w:tab w:val="left" w:pos="960"/>
           <w:tab w:val="right" w:leader="dot" w:pos="8302"/>
@@ -971,7 +975,7 @@
       <w:hyperlink w:anchor="_Toc5805925" w:history="1">
         <w:r>
           <w:rPr>
-            <w:rStyle w:val="Hyperlink"/>
+            <w:rStyle w:val="Hiperligao"/>
             <w:noProof/>
           </w:rPr>
           <w:t>1.1</w:t>
@@ -990,7 +994,7 @@
         </w:r>
         <w:r>
           <w:rPr>
-            <w:rStyle w:val="Hyperlink"/>
+            <w:rStyle w:val="Hiperligao"/>
             <w:noProof/>
           </w:rPr>
           <w:t>Enquadramento/Contexto</w:t>
@@ -1040,7 +1044,7 @@
     </w:p>
     <w:p>
       <w:pPr>
-        <w:pStyle w:val="TOC2"/>
+        <w:pStyle w:val="ndice2"/>
         <w:tabs>
           <w:tab w:val="left" w:pos="960"/>
           <w:tab w:val="right" w:leader="dot" w:pos="8302"/>
@@ -1058,7 +1062,7 @@
       <w:hyperlink w:anchor="_Toc5805926" w:history="1">
         <w:r>
           <w:rPr>
-            <w:rStyle w:val="Hyperlink"/>
+            <w:rStyle w:val="Hiperligao"/>
             <w:noProof/>
           </w:rPr>
           <w:t>1.2</w:t>
@@ -1077,7 +1081,7 @@
         </w:r>
         <w:r>
           <w:rPr>
-            <w:rStyle w:val="Hyperlink"/>
+            <w:rStyle w:val="Hiperligao"/>
             <w:noProof/>
           </w:rPr>
           <w:t>Descrição do Problema</w:t>
@@ -1127,7 +1131,7 @@
     </w:p>
     <w:p>
       <w:pPr>
-        <w:pStyle w:val="TOC2"/>
+        <w:pStyle w:val="ndice2"/>
         <w:tabs>
           <w:tab w:val="left" w:pos="960"/>
           <w:tab w:val="right" w:leader="dot" w:pos="8302"/>
@@ -1145,7 +1149,7 @@
       <w:hyperlink w:anchor="_Toc5805927" w:history="1">
         <w:r>
           <w:rPr>
-            <w:rStyle w:val="Hyperlink"/>
+            <w:rStyle w:val="Hiperligao"/>
             <w:noProof/>
           </w:rPr>
           <w:t>1.3</w:t>
@@ -1164,7 +1168,7 @@
         </w:r>
         <w:r>
           <w:rPr>
-            <w:rStyle w:val="Hyperlink"/>
+            <w:rStyle w:val="Hiperligao"/>
             <w:noProof/>
           </w:rPr>
           <w:t>Estrutura do relatório</w:t>
@@ -1214,7 +1218,7 @@
     </w:p>
     <w:p>
       <w:pPr>
-        <w:pStyle w:val="TOC1"/>
+        <w:pStyle w:val="ndice1"/>
         <w:tabs>
           <w:tab w:val="left" w:pos="480"/>
           <w:tab w:val="right" w:leader="dot" w:pos="8302"/>
@@ -1233,7 +1237,7 @@
       <w:hyperlink w:anchor="_Toc5805928" w:history="1">
         <w:r>
           <w:rPr>
-            <w:rStyle w:val="Hyperlink"/>
+            <w:rStyle w:val="Hiperligao"/>
             <w:noProof/>
           </w:rPr>
           <w:t>2</w:t>
@@ -1253,7 +1257,7 @@
         </w:r>
         <w:r>
           <w:rPr>
-            <w:rStyle w:val="Hyperlink"/>
+            <w:rStyle w:val="Hiperligao"/>
             <w:noProof/>
           </w:rPr>
           <w:t>Estado da arte</w:t>
@@ -1303,7 +1307,7 @@
     </w:p>
     <w:p>
       <w:pPr>
-        <w:pStyle w:val="TOC2"/>
+        <w:pStyle w:val="ndice2"/>
         <w:tabs>
           <w:tab w:val="left" w:pos="960"/>
           <w:tab w:val="right" w:leader="dot" w:pos="8302"/>
@@ -1321,7 +1325,7 @@
       <w:hyperlink w:anchor="_Toc5805929" w:history="1">
         <w:r>
           <w:rPr>
-            <w:rStyle w:val="Hyperlink"/>
+            <w:rStyle w:val="Hiperligao"/>
             <w:noProof/>
           </w:rPr>
           <w:t>2.1</w:t>
@@ -1340,7 +1344,7 @@
         </w:r>
         <w:r>
           <w:rPr>
-            <w:rStyle w:val="Hyperlink"/>
+            <w:rStyle w:val="Hiperligao"/>
             <w:noProof/>
           </w:rPr>
           <w:t>Trabalhos relacionados</w:t>
@@ -1390,7 +1394,7 @@
     </w:p>
     <w:p>
       <w:pPr>
-        <w:pStyle w:val="TOC2"/>
+        <w:pStyle w:val="ndice2"/>
         <w:tabs>
           <w:tab w:val="left" w:pos="960"/>
           <w:tab w:val="right" w:leader="dot" w:pos="8302"/>
@@ -1408,7 +1412,7 @@
       <w:hyperlink w:anchor="_Toc5805930" w:history="1">
         <w:r>
           <w:rPr>
-            <w:rStyle w:val="Hyperlink"/>
+            <w:rStyle w:val="Hiperligao"/>
             <w:noProof/>
           </w:rPr>
           <w:t>2.2</w:t>
@@ -1427,7 +1431,7 @@
         </w:r>
         <w:r>
           <w:rPr>
-            <w:rStyle w:val="Hyperlink"/>
+            <w:rStyle w:val="Hiperligao"/>
             <w:noProof/>
           </w:rPr>
           <w:t>Tecnologias existentes</w:t>
@@ -1477,7 +1481,7 @@
     </w:p>
     <w:p>
       <w:pPr>
-        <w:pStyle w:val="TOC1"/>
+        <w:pStyle w:val="ndice1"/>
         <w:tabs>
           <w:tab w:val="left" w:pos="480"/>
           <w:tab w:val="right" w:leader="dot" w:pos="8302"/>
@@ -1496,7 +1500,7 @@
       <w:hyperlink w:anchor="_Toc5805931" w:history="1">
         <w:r>
           <w:rPr>
-            <w:rStyle w:val="Hyperlink"/>
+            <w:rStyle w:val="Hiperligao"/>
             <w:noProof/>
           </w:rPr>
           <w:t>3</w:t>
@@ -1516,7 +1520,7 @@
         </w:r>
         <w:r>
           <w:rPr>
-            <w:rStyle w:val="Hyperlink"/>
+            <w:rStyle w:val="Hiperligao"/>
             <w:noProof/>
           </w:rPr>
           <w:t>Análise e desenho da solução</w:t>
@@ -1566,7 +1570,7 @@
     </w:p>
     <w:p>
       <w:pPr>
-        <w:pStyle w:val="TOC2"/>
+        <w:pStyle w:val="ndice2"/>
         <w:tabs>
           <w:tab w:val="left" w:pos="960"/>
           <w:tab w:val="right" w:leader="dot" w:pos="8302"/>
@@ -1584,7 +1588,7 @@
       <w:hyperlink w:anchor="_Toc5805932" w:history="1">
         <w:r>
           <w:rPr>
-            <w:rStyle w:val="Hyperlink"/>
+            <w:rStyle w:val="Hiperligao"/>
             <w:noProof/>
           </w:rPr>
           <w:t>3.1</w:t>
@@ -1603,7 +1607,7 @@
         </w:r>
         <w:r>
           <w:rPr>
-            <w:rStyle w:val="Hyperlink"/>
+            <w:rStyle w:val="Hiperligao"/>
             <w:noProof/>
           </w:rPr>
           <w:t>Domínio do problema</w:t>
@@ -1653,7 +1657,7 @@
     </w:p>
     <w:p>
       <w:pPr>
-        <w:pStyle w:val="TOC2"/>
+        <w:pStyle w:val="ndice2"/>
         <w:tabs>
           <w:tab w:val="left" w:pos="960"/>
           <w:tab w:val="right" w:leader="dot" w:pos="8302"/>
@@ -1671,7 +1675,7 @@
       <w:hyperlink w:anchor="_Toc5805933" w:history="1">
         <w:r>
           <w:rPr>
-            <w:rStyle w:val="Hyperlink"/>
+            <w:rStyle w:val="Hiperligao"/>
             <w:noProof/>
           </w:rPr>
           <w:t>3.2</w:t>
@@ -1690,7 +1694,7 @@
         </w:r>
         <w:r>
           <w:rPr>
-            <w:rStyle w:val="Hyperlink"/>
+            <w:rStyle w:val="Hiperligao"/>
             <w:noProof/>
           </w:rPr>
           <w:t>Requisitos funcionais e não funcionais</w:t>
@@ -1740,7 +1744,7 @@
     </w:p>
     <w:p>
       <w:pPr>
-        <w:pStyle w:val="TOC2"/>
+        <w:pStyle w:val="ndice2"/>
         <w:tabs>
           <w:tab w:val="left" w:pos="960"/>
           <w:tab w:val="right" w:leader="dot" w:pos="8302"/>
@@ -1758,7 +1762,7 @@
       <w:hyperlink w:anchor="_Toc5805934" w:history="1">
         <w:r>
           <w:rPr>
-            <w:rStyle w:val="Hyperlink"/>
+            <w:rStyle w:val="Hiperligao"/>
             <w:noProof/>
           </w:rPr>
           <w:t>3.3</w:t>
@@ -1777,7 +1781,7 @@
         </w:r>
         <w:r>
           <w:rPr>
-            <w:rStyle w:val="Hyperlink"/>
+            <w:rStyle w:val="Hiperligao"/>
             <w:noProof/>
           </w:rPr>
           <w:t>Desenho</w:t>
@@ -1827,7 +1831,7 @@
     </w:p>
     <w:p>
       <w:pPr>
-        <w:pStyle w:val="TOC1"/>
+        <w:pStyle w:val="ndice1"/>
         <w:tabs>
           <w:tab w:val="left" w:pos="480"/>
           <w:tab w:val="right" w:leader="dot" w:pos="8302"/>
@@ -1846,7 +1850,7 @@
       <w:hyperlink w:anchor="_Toc5805935" w:history="1">
         <w:r>
           <w:rPr>
-            <w:rStyle w:val="Hyperlink"/>
+            <w:rStyle w:val="Hiperligao"/>
             <w:noProof/>
           </w:rPr>
           <w:t>4</w:t>
@@ -1866,7 +1870,7 @@
         </w:r>
         <w:r>
           <w:rPr>
-            <w:rStyle w:val="Hyperlink"/>
+            <w:rStyle w:val="Hiperligao"/>
             <w:noProof/>
           </w:rPr>
           <w:t>Implementação da Solução</w:t>
@@ -1916,7 +1920,7 @@
     </w:p>
     <w:p>
       <w:pPr>
-        <w:pStyle w:val="TOC2"/>
+        <w:pStyle w:val="ndice2"/>
         <w:tabs>
           <w:tab w:val="left" w:pos="960"/>
           <w:tab w:val="right" w:leader="dot" w:pos="8302"/>
@@ -1934,7 +1938,7 @@
       <w:hyperlink w:anchor="_Toc5805936" w:history="1">
         <w:r>
           <w:rPr>
-            <w:rStyle w:val="Hyperlink"/>
+            <w:rStyle w:val="Hiperligao"/>
             <w:noProof/>
           </w:rPr>
           <w:t>4.1</w:t>
@@ -1953,7 +1957,7 @@
         </w:r>
         <w:r>
           <w:rPr>
-            <w:rStyle w:val="Hyperlink"/>
+            <w:rStyle w:val="Hiperligao"/>
             <w:noProof/>
           </w:rPr>
           <w:t>Descrição da implementação</w:t>
@@ -2003,7 +2007,7 @@
     </w:p>
     <w:p>
       <w:pPr>
-        <w:pStyle w:val="TOC2"/>
+        <w:pStyle w:val="ndice2"/>
         <w:tabs>
           <w:tab w:val="left" w:pos="960"/>
           <w:tab w:val="right" w:leader="dot" w:pos="8302"/>
@@ -2021,7 +2025,7 @@
       <w:hyperlink w:anchor="_Toc5805937" w:history="1">
         <w:r>
           <w:rPr>
-            <w:rStyle w:val="Hyperlink"/>
+            <w:rStyle w:val="Hiperligao"/>
             <w:noProof/>
           </w:rPr>
           <w:t>4.2</w:t>
@@ -2040,7 +2044,7 @@
         </w:r>
         <w:r>
           <w:rPr>
-            <w:rStyle w:val="Hyperlink"/>
+            <w:rStyle w:val="Hiperligao"/>
             <w:noProof/>
           </w:rPr>
           <w:t>Testes</w:t>
@@ -2090,7 +2094,7 @@
     </w:p>
     <w:p>
       <w:pPr>
-        <w:pStyle w:val="TOC2"/>
+        <w:pStyle w:val="ndice2"/>
         <w:tabs>
           <w:tab w:val="left" w:pos="960"/>
           <w:tab w:val="right" w:leader="dot" w:pos="8302"/>
@@ -2108,7 +2112,7 @@
       <w:hyperlink w:anchor="_Toc5805938" w:history="1">
         <w:r>
           <w:rPr>
-            <w:rStyle w:val="Hyperlink"/>
+            <w:rStyle w:val="Hiperligao"/>
             <w:noProof/>
           </w:rPr>
           <w:t>4.3</w:t>
@@ -2127,7 +2131,7 @@
         </w:r>
         <w:r>
           <w:rPr>
-            <w:rStyle w:val="Hyperlink"/>
+            <w:rStyle w:val="Hiperligao"/>
             <w:noProof/>
           </w:rPr>
           <w:t>Avaliação da solução</w:t>
@@ -2177,7 +2181,7 @@
     </w:p>
     <w:p>
       <w:pPr>
-        <w:pStyle w:val="TOC1"/>
+        <w:pStyle w:val="ndice1"/>
         <w:tabs>
           <w:tab w:val="left" w:pos="480"/>
           <w:tab w:val="right" w:leader="dot" w:pos="8302"/>
@@ -2196,7 +2200,7 @@
       <w:hyperlink w:anchor="_Toc5805939" w:history="1">
         <w:r>
           <w:rPr>
-            <w:rStyle w:val="Hyperlink"/>
+            <w:rStyle w:val="Hiperligao"/>
             <w:noProof/>
           </w:rPr>
           <w:t>5</w:t>
@@ -2216,7 +2220,7 @@
         </w:r>
         <w:r>
           <w:rPr>
-            <w:rStyle w:val="Hyperlink"/>
+            <w:rStyle w:val="Hiperligao"/>
             <w:noProof/>
           </w:rPr>
           <w:t>Conclusões</w:t>
@@ -2266,7 +2270,7 @@
     </w:p>
     <w:p>
       <w:pPr>
-        <w:pStyle w:val="TOC2"/>
+        <w:pStyle w:val="ndice2"/>
         <w:tabs>
           <w:tab w:val="left" w:pos="960"/>
           <w:tab w:val="right" w:leader="dot" w:pos="8302"/>
@@ -2284,7 +2288,7 @@
       <w:hyperlink w:anchor="_Toc5805940" w:history="1">
         <w:r>
           <w:rPr>
-            <w:rStyle w:val="Hyperlink"/>
+            <w:rStyle w:val="Hiperligao"/>
             <w:noProof/>
           </w:rPr>
           <w:t>5.1</w:t>
@@ -2303,7 +2307,7 @@
         </w:r>
         <w:r>
           <w:rPr>
-            <w:rStyle w:val="Hyperlink"/>
+            <w:rStyle w:val="Hiperligao"/>
             <w:noProof/>
           </w:rPr>
           <w:t>Objetivos concretizados</w:t>
@@ -2353,7 +2357,7 @@
     </w:p>
     <w:p>
       <w:pPr>
-        <w:pStyle w:val="TOC2"/>
+        <w:pStyle w:val="ndice2"/>
         <w:tabs>
           <w:tab w:val="left" w:pos="960"/>
           <w:tab w:val="right" w:leader="dot" w:pos="8302"/>
@@ -2371,7 +2375,7 @@
       <w:hyperlink w:anchor="_Toc5805941" w:history="1">
         <w:r>
           <w:rPr>
-            <w:rStyle w:val="Hyperlink"/>
+            <w:rStyle w:val="Hiperligao"/>
             <w:noProof/>
           </w:rPr>
           <w:t>5.2</w:t>
@@ -2390,7 +2394,7 @@
         </w:r>
         <w:r>
           <w:rPr>
-            <w:rStyle w:val="Hyperlink"/>
+            <w:rStyle w:val="Hiperligao"/>
             <w:noProof/>
           </w:rPr>
           <w:t>Limitações e trabalho futuro</w:t>
@@ -2440,7 +2444,7 @@
     </w:p>
     <w:p>
       <w:pPr>
-        <w:pStyle w:val="TOC2"/>
+        <w:pStyle w:val="ndice2"/>
         <w:tabs>
           <w:tab w:val="left" w:pos="960"/>
           <w:tab w:val="right" w:leader="dot" w:pos="8302"/>
@@ -2458,7 +2462,7 @@
       <w:hyperlink w:anchor="_Toc5805942" w:history="1">
         <w:r>
           <w:rPr>
-            <w:rStyle w:val="Hyperlink"/>
+            <w:rStyle w:val="Hiperligao"/>
             <w:noProof/>
           </w:rPr>
           <w:t>5.3</w:t>
@@ -2477,7 +2481,7 @@
         </w:r>
         <w:r>
           <w:rPr>
-            <w:rStyle w:val="Hyperlink"/>
+            <w:rStyle w:val="Hiperligao"/>
             <w:noProof/>
           </w:rPr>
           <w:t>Apreciação final</w:t>
@@ -2527,7 +2531,7 @@
     </w:p>
     <w:p>
       <w:pPr>
-        <w:pStyle w:val="TOC1"/>
+        <w:pStyle w:val="ndice1"/>
         <w:tabs>
           <w:tab w:val="right" w:leader="dot" w:pos="8302"/>
         </w:tabs>
@@ -2545,7 +2549,7 @@
       <w:hyperlink w:anchor="_Toc5805943" w:history="1">
         <w:r>
           <w:rPr>
-            <w:rStyle w:val="Hyperlink"/>
+            <w:rStyle w:val="Hiperligao"/>
             <w:noProof/>
           </w:rPr>
           <w:t>Referências</w:t>
@@ -2595,7 +2599,7 @@
     </w:p>
     <w:p>
       <w:pPr>
-        <w:pStyle w:val="TOC1"/>
+        <w:pStyle w:val="ndice1"/>
         <w:tabs>
           <w:tab w:val="left" w:pos="1200"/>
           <w:tab w:val="right" w:leader="dot" w:pos="8302"/>
@@ -2614,7 +2618,7 @@
       <w:hyperlink w:anchor="_Toc5805944" w:history="1">
         <w:r>
           <w:rPr>
-            <w:rStyle w:val="Hyperlink"/>
+            <w:rStyle w:val="Hiperligao"/>
             <w:noProof/>
           </w:rPr>
           <w:t>Anexo A</w:t>
@@ -2634,7 +2638,7 @@
         </w:r>
         <w:r>
           <w:rPr>
-            <w:rStyle w:val="Hyperlink"/>
+            <w:rStyle w:val="Hiperligao"/>
             <w:noProof/>
           </w:rPr>
           <w:t>Conteúdo em anexos</w:t>
@@ -2684,7 +2688,7 @@
     </w:p>
     <w:p>
       <w:pPr>
-        <w:pStyle w:val="TOC1"/>
+        <w:pStyle w:val="ndice1"/>
         <w:tabs>
           <w:tab w:val="left" w:pos="1200"/>
           <w:tab w:val="right" w:leader="dot" w:pos="8302"/>
@@ -2703,7 +2707,7 @@
       <w:hyperlink w:anchor="_Toc5805945" w:history="1">
         <w:r>
           <w:rPr>
-            <w:rStyle w:val="Hyperlink"/>
+            <w:rStyle w:val="Hiperligao"/>
             <w:noProof/>
           </w:rPr>
           <w:t>Anexo B</w:t>
@@ -2723,7 +2727,7 @@
         </w:r>
         <w:r>
           <w:rPr>
-            <w:rStyle w:val="Hyperlink"/>
+            <w:rStyle w:val="Hiperligao"/>
             <w:noProof/>
           </w:rPr>
           <w:t>Regras de Conteúdo e Estrutura</w:t>
@@ -2773,7 +2777,7 @@
     </w:p>
     <w:p>
       <w:pPr>
-        <w:pStyle w:val="TOC2"/>
+        <w:pStyle w:val="ndice2"/>
         <w:tabs>
           <w:tab w:val="left" w:pos="960"/>
           <w:tab w:val="right" w:leader="dot" w:pos="8302"/>
@@ -2791,7 +2795,7 @@
       <w:hyperlink w:anchor="_Toc5805946" w:history="1">
         <w:r>
           <w:rPr>
-            <w:rStyle w:val="Hyperlink"/>
+            <w:rStyle w:val="Hiperligao"/>
             <w:noProof/>
           </w:rPr>
           <w:t>B.1</w:t>
@@ -2810,7 +2814,7 @@
         </w:r>
         <w:r>
           <w:rPr>
-            <w:rStyle w:val="Hyperlink"/>
+            <w:rStyle w:val="Hiperligao"/>
             <w:noProof/>
           </w:rPr>
           <w:t>Linguagem</w:t>
@@ -2860,7 +2864,7 @@
     </w:p>
     <w:p>
       <w:pPr>
-        <w:pStyle w:val="TOC2"/>
+        <w:pStyle w:val="ndice2"/>
         <w:tabs>
           <w:tab w:val="left" w:pos="960"/>
           <w:tab w:val="right" w:leader="dot" w:pos="8302"/>
@@ -2878,7 +2882,7 @@
       <w:hyperlink w:anchor="_Toc5805947" w:history="1">
         <w:r>
           <w:rPr>
-            <w:rStyle w:val="Hyperlink"/>
+            <w:rStyle w:val="Hiperligao"/>
             <w:noProof/>
           </w:rPr>
           <w:t>B.2</w:t>
@@ -2897,7 +2901,7 @@
         </w:r>
         <w:r>
           <w:rPr>
-            <w:rStyle w:val="Hyperlink"/>
+            <w:rStyle w:val="Hiperligao"/>
             <w:noProof/>
           </w:rPr>
           <w:t>Formatação</w:t>
@@ -2947,7 +2951,7 @@
     </w:p>
     <w:p>
       <w:pPr>
-        <w:pStyle w:val="TOC2"/>
+        <w:pStyle w:val="ndice2"/>
         <w:tabs>
           <w:tab w:val="left" w:pos="960"/>
           <w:tab w:val="right" w:leader="dot" w:pos="8302"/>
@@ -2965,7 +2969,7 @@
       <w:hyperlink w:anchor="_Toc5805948" w:history="1">
         <w:r>
           <w:rPr>
-            <w:rStyle w:val="Hyperlink"/>
+            <w:rStyle w:val="Hiperligao"/>
             <w:noProof/>
           </w:rPr>
           <w:t>B.3</w:t>
@@ -2984,7 +2988,7 @@
         </w:r>
         <w:r>
           <w:rPr>
-            <w:rStyle w:val="Hyperlink"/>
+            <w:rStyle w:val="Hiperligao"/>
             <w:noProof/>
           </w:rPr>
           <w:t>Imagens e tabelas</w:t>
@@ -3034,7 +3038,7 @@
     </w:p>
     <w:p>
       <w:pPr>
-        <w:pStyle w:val="TOC2"/>
+        <w:pStyle w:val="ndice2"/>
         <w:tabs>
           <w:tab w:val="left" w:pos="960"/>
           <w:tab w:val="right" w:leader="dot" w:pos="8302"/>
@@ -3052,7 +3056,7 @@
       <w:hyperlink w:anchor="_Toc5805949" w:history="1">
         <w:r>
           <w:rPr>
-            <w:rStyle w:val="Hyperlink"/>
+            <w:rStyle w:val="Hiperligao"/>
             <w:noProof/>
           </w:rPr>
           <w:t>B.4</w:t>
@@ -3071,7 +3075,7 @@
         </w:r>
         <w:r>
           <w:rPr>
-            <w:rStyle w:val="Hyperlink"/>
+            <w:rStyle w:val="Hiperligao"/>
             <w:noProof/>
           </w:rPr>
           <w:t>Referências</w:t>
@@ -3121,7 +3125,7 @@
     </w:p>
     <w:p>
       <w:pPr>
-        <w:pStyle w:val="TOC1"/>
+        <w:pStyle w:val="ndice1"/>
         <w:tabs>
           <w:tab w:val="left" w:pos="1200"/>
           <w:tab w:val="right" w:leader="dot" w:pos="8302"/>
@@ -3140,7 +3144,7 @@
       <w:hyperlink w:anchor="_Toc5805950" w:history="1">
         <w:r>
           <w:rPr>
-            <w:rStyle w:val="Hyperlink"/>
+            <w:rStyle w:val="Hiperligao"/>
             <w:noProof/>
           </w:rPr>
           <w:t>Anexo C</w:t>
@@ -3160,7 +3164,7 @@
         </w:r>
         <w:r>
           <w:rPr>
-            <w:rStyle w:val="Hyperlink"/>
+            <w:rStyle w:val="Hiperligao"/>
             <w:noProof/>
           </w:rPr>
           <w:t>Plágio</w:t>
@@ -3248,7 +3252,7 @@
     </w:p>
     <w:p>
       <w:pPr>
-        <w:pStyle w:val="TableofFigures"/>
+        <w:pStyle w:val="ndicedeilustraes"/>
         <w:tabs>
           <w:tab w:val="right" w:leader="dot" w:pos="8302"/>
         </w:tabs>
@@ -3318,7 +3322,7 @@
     </w:p>
     <w:p>
       <w:pPr>
-        <w:pStyle w:val="TableofFigures"/>
+        <w:pStyle w:val="ndicedeilustraes"/>
         <w:tabs>
           <w:tab w:val="right" w:leader="dot" w:pos="8302"/>
         </w:tabs>
@@ -3379,7 +3383,7 @@
     </w:p>
     <w:p>
       <w:pPr>
-        <w:pStyle w:val="TOC1"/>
+        <w:pStyle w:val="ndice1"/>
         <w:tabs>
           <w:tab w:val="right" w:leader="dot" w:pos="8312"/>
         </w:tabs>
@@ -3494,7 +3498,7 @@
     </w:p>
     <w:p>
       <w:pPr>
-        <w:pStyle w:val="TableofFigures"/>
+        <w:pStyle w:val="ndicedeilustraes"/>
         <w:tabs>
           <w:tab w:val="right" w:leader="dot" w:pos="8302"/>
         </w:tabs>
@@ -3568,7 +3572,7 @@
     </w:p>
     <w:p>
       <w:pPr>
-        <w:pStyle w:val="TOC1"/>
+        <w:pStyle w:val="ndice1"/>
         <w:tabs>
           <w:tab w:val="right" w:leader="dot" w:pos="8312"/>
         </w:tabs>
@@ -3610,7 +3614,6 @@
         <w:tc>
           <w:tcPr>
             <w:tcW w:w="1368" w:type="dxa"/>
-            <w:shd w:val="clear" w:color="auto" w:fill="auto"/>
           </w:tcPr>
           <w:p>
             <w:pPr>
@@ -3618,18 +3621,19 @@
                 <w:b/>
               </w:rPr>
             </w:pPr>
+            <w:proofErr w:type="spellStart"/>
             <w:r>
               <w:rPr>
                 <w:b/>
               </w:rPr>
               <w:t>IaC</w:t>
             </w:r>
+            <w:proofErr w:type="spellEnd"/>
           </w:p>
         </w:tc>
         <w:tc>
           <w:tcPr>
             <w:tcW w:w="7160" w:type="dxa"/>
-            <w:shd w:val="clear" w:color="auto" w:fill="auto"/>
           </w:tcPr>
           <w:p>
             <w:r>
@@ -3648,13 +3652,26 @@
               <w:t>C</w:t>
             </w:r>
             <w:r>
-              <w:t xml:space="preserve">ódigo (do inglês Infrastructure as </w:t>
+              <w:t xml:space="preserve">ódigo (do inglês </w:t>
             </w:r>
+            <w:proofErr w:type="spellStart"/>
+            <w:r>
+              <w:t>Infrastructure</w:t>
+            </w:r>
+            <w:proofErr w:type="spellEnd"/>
+            <w:r>
+              <w:t xml:space="preserve"> as </w:t>
+            </w:r>
+            <w:proofErr w:type="spellStart"/>
             <w:r>
               <w:t>C</w:t>
             </w:r>
             <w:r>
-              <w:t>ode)</w:t>
+              <w:t>ode</w:t>
+            </w:r>
+            <w:proofErr w:type="spellEnd"/>
+            <w:r>
+              <w:t>)</w:t>
             </w:r>
           </w:p>
         </w:tc>
@@ -3663,26 +3680,31 @@
         <w:tc>
           <w:tcPr>
             <w:tcW w:w="1368" w:type="dxa"/>
-            <w:shd w:val="clear" w:color="auto" w:fill="auto"/>
           </w:tcPr>
           <w:p>
+            <w:proofErr w:type="spellStart"/>
             <w:r>
               <w:rPr>
                 <w:b/>
               </w:rPr>
               <w:t>Terraform</w:t>
             </w:r>
+            <w:proofErr w:type="spellEnd"/>
           </w:p>
         </w:tc>
         <w:tc>
           <w:tcPr>
             <w:tcW w:w="7160" w:type="dxa"/>
-            <w:shd w:val="clear" w:color="auto" w:fill="auto"/>
           </w:tcPr>
           <w:p>
             <w:r>
-              <w:t>Ferramenta de código aberto para a criação de IaC</w:t>
+              <w:t xml:space="preserve">Ferramenta de código aberto para a criação de </w:t>
             </w:r>
+            <w:proofErr w:type="spellStart"/>
+            <w:r>
+              <w:t>IaC</w:t>
+            </w:r>
+            <w:proofErr w:type="spellEnd"/>
           </w:p>
         </w:tc>
       </w:tr>
@@ -3690,7 +3712,6 @@
         <w:tc>
           <w:tcPr>
             <w:tcW w:w="1368" w:type="dxa"/>
-            <w:shd w:val="clear" w:color="auto" w:fill="auto"/>
           </w:tcPr>
           <w:p>
             <w:pPr>
@@ -3698,18 +3719,19 @@
                 <w:b/>
               </w:rPr>
             </w:pPr>
+            <w:proofErr w:type="spellStart"/>
             <w:r>
               <w:rPr>
                 <w:b/>
               </w:rPr>
               <w:t>Cloud</w:t>
             </w:r>
+            <w:proofErr w:type="spellEnd"/>
           </w:p>
         </w:tc>
         <w:tc>
           <w:tcPr>
             <w:tcW w:w="7160" w:type="dxa"/>
-            <w:shd w:val="clear" w:color="auto" w:fill="auto"/>
           </w:tcPr>
           <w:p>
             <w:r>
@@ -3728,7 +3750,6 @@
         <w:tc>
           <w:tcPr>
             <w:tcW w:w="1368" w:type="dxa"/>
-            <w:shd w:val="clear" w:color="auto" w:fill="auto"/>
           </w:tcPr>
           <w:p>
             <w:pPr>
@@ -3747,18 +3768,22 @@
         <w:tc>
           <w:tcPr>
             <w:tcW w:w="7160" w:type="dxa"/>
-            <w:shd w:val="clear" w:color="auto" w:fill="auto"/>
           </w:tcPr>
           <w:p>
             <w:r>
               <w:t xml:space="preserve">Amazon </w:t>
             </w:r>
             <w:r>
-              <w:t>Web Ser</w:t>
+              <w:t xml:space="preserve">Web </w:t>
+            </w:r>
+            <w:proofErr w:type="spellStart"/>
+            <w:r>
+              <w:t>Ser</w:t>
             </w:r>
             <w:r>
               <w:t>vice</w:t>
             </w:r>
+            <w:proofErr w:type="spellEnd"/>
           </w:p>
         </w:tc>
       </w:tr>
@@ -3766,7 +3791,6 @@
         <w:tc>
           <w:tcPr>
             <w:tcW w:w="1368" w:type="dxa"/>
-            <w:shd w:val="clear" w:color="auto" w:fill="auto"/>
           </w:tcPr>
           <w:p>
             <w:pPr>
@@ -3783,7 +3807,6 @@
         <w:tc>
           <w:tcPr>
             <w:tcW w:w="7160" w:type="dxa"/>
-            <w:shd w:val="clear" w:color="auto" w:fill="auto"/>
           </w:tcPr>
           <w:p>
             <w:pPr>
@@ -3799,7 +3822,6 @@
         <w:tc>
           <w:tcPr>
             <w:tcW w:w="1368" w:type="dxa"/>
-            <w:shd w:val="clear" w:color="auto" w:fill="auto"/>
           </w:tcPr>
           <w:p>
             <w:pPr>
@@ -3823,7 +3845,6 @@
         <w:tc>
           <w:tcPr>
             <w:tcW w:w="7160" w:type="dxa"/>
-            <w:shd w:val="clear" w:color="auto" w:fill="auto"/>
           </w:tcPr>
           <w:p>
             <w:pPr>
@@ -3857,7 +3878,6 @@
         <w:tc>
           <w:tcPr>
             <w:tcW w:w="1368" w:type="dxa"/>
-            <w:shd w:val="clear" w:color="auto" w:fill="auto"/>
           </w:tcPr>
           <w:p>
             <w:pPr>
@@ -3881,7 +3901,6 @@
         <w:tc>
           <w:tcPr>
             <w:tcW w:w="7160" w:type="dxa"/>
-            <w:shd w:val="clear" w:color="auto" w:fill="auto"/>
           </w:tcPr>
           <w:p>
             <w:pPr>
@@ -3903,7 +3922,6 @@
         <w:tc>
           <w:tcPr>
             <w:tcW w:w="1368" w:type="dxa"/>
-            <w:shd w:val="clear" w:color="auto" w:fill="auto"/>
           </w:tcPr>
           <w:p>
             <w:pPr>
@@ -3927,7 +3945,6 @@
         <w:tc>
           <w:tcPr>
             <w:tcW w:w="7160" w:type="dxa"/>
-            <w:shd w:val="clear" w:color="auto" w:fill="auto"/>
           </w:tcPr>
           <w:p>
             <w:pPr>
@@ -3949,7 +3966,6 @@
         <w:tc>
           <w:tcPr>
             <w:tcW w:w="1368" w:type="dxa"/>
-            <w:shd w:val="clear" w:color="auto" w:fill="auto"/>
           </w:tcPr>
           <w:p>
             <w:pPr>
@@ -3972,7 +3988,6 @@
         <w:tc>
           <w:tcPr>
             <w:tcW w:w="7160" w:type="dxa"/>
-            <w:shd w:val="clear" w:color="auto" w:fill="auto"/>
           </w:tcPr>
           <w:p>
             <w:pPr>
@@ -4006,7 +4021,6 @@
         <w:tc>
           <w:tcPr>
             <w:tcW w:w="1368" w:type="dxa"/>
-            <w:shd w:val="clear" w:color="auto" w:fill="auto"/>
           </w:tcPr>
           <w:p>
             <w:pPr>
@@ -4015,18 +4029,25 @@
                 <w:b/>
               </w:rPr>
             </w:pPr>
+            <w:proofErr w:type="spellStart"/>
             <w:r>
               <w:rPr>
                 <w:b/>
               </w:rPr>
-              <w:t>Token JWT</w:t>
+              <w:t>Token</w:t>
+            </w:r>
+            <w:proofErr w:type="spellEnd"/>
+            <w:r>
+              <w:rPr>
+                <w:b/>
+              </w:rPr>
+              <w:t xml:space="preserve"> JWT</w:t>
             </w:r>
           </w:p>
         </w:tc>
         <w:tc>
           <w:tcPr>
             <w:tcW w:w="7160" w:type="dxa"/>
-            <w:shd w:val="clear" w:color="auto" w:fill="auto"/>
           </w:tcPr>
           <w:p>
             <w:pPr>
@@ -4036,8 +4057,13 @@
               <w:t>JSON</w:t>
             </w:r>
             <w:r>
-              <w:t xml:space="preserve"> Web Token</w:t>
+              <w:t xml:space="preserve"> Web </w:t>
             </w:r>
+            <w:proofErr w:type="spellStart"/>
+            <w:r>
+              <w:t>Token</w:t>
+            </w:r>
+            <w:proofErr w:type="spellEnd"/>
           </w:p>
         </w:tc>
       </w:tr>
@@ -4045,7 +4071,6 @@
         <w:tc>
           <w:tcPr>
             <w:tcW w:w="1368" w:type="dxa"/>
-            <w:shd w:val="clear" w:color="auto" w:fill="auto"/>
           </w:tcPr>
           <w:p>
             <w:pPr>
@@ -4065,18 +4090,32 @@
         <w:tc>
           <w:tcPr>
             <w:tcW w:w="7160" w:type="dxa"/>
-            <w:shd w:val="clear" w:color="auto" w:fill="auto"/>
           </w:tcPr>
           <w:p>
             <w:pPr>
               <w:snapToGrid w:val="0"/>
             </w:pPr>
+            <w:proofErr w:type="spellStart"/>
             <w:r>
-              <w:t xml:space="preserve">Payment </w:t>
+              <w:t>Payment</w:t>
             </w:r>
+            <w:proofErr w:type="spellEnd"/>
             <w:r>
-              <w:t>Card Industry</w:t>
+              <w:t xml:space="preserve"> </w:t>
             </w:r>
+            <w:proofErr w:type="spellStart"/>
+            <w:r>
+              <w:t>Card</w:t>
+            </w:r>
+            <w:proofErr w:type="spellEnd"/>
+            <w:r>
+              <w:t xml:space="preserve"> </w:t>
+            </w:r>
+            <w:proofErr w:type="spellStart"/>
+            <w:r>
+              <w:t>Industry</w:t>
+            </w:r>
+            <w:proofErr w:type="spellEnd"/>
           </w:p>
         </w:tc>
       </w:tr>
@@ -4084,7 +4123,6 @@
         <w:tc>
           <w:tcPr>
             <w:tcW w:w="1368" w:type="dxa"/>
-            <w:shd w:val="clear" w:color="auto" w:fill="auto"/>
           </w:tcPr>
           <w:p>
             <w:pPr>
@@ -4104,14 +4142,21 @@
         <w:tc>
           <w:tcPr>
             <w:tcW w:w="7160" w:type="dxa"/>
-            <w:shd w:val="clear" w:color="auto" w:fill="auto"/>
           </w:tcPr>
           <w:p>
             <w:pPr>
               <w:snapToGrid w:val="0"/>
             </w:pPr>
             <w:r>
-              <w:t>Virtual Private Network</w:t>
+              <w:t xml:space="preserve">Virtual </w:t>
+            </w:r>
+            <w:proofErr w:type="spellStart"/>
+            <w:r>
+              <w:t>Private</w:t>
+            </w:r>
+            <w:proofErr w:type="spellEnd"/>
+            <w:r>
+              <w:t xml:space="preserve"> Network</w:t>
             </w:r>
           </w:p>
         </w:tc>
@@ -4120,7 +4165,6 @@
         <w:tc>
           <w:tcPr>
             <w:tcW w:w="1368" w:type="dxa"/>
-            <w:shd w:val="clear" w:color="auto" w:fill="auto"/>
           </w:tcPr>
           <w:p>
             <w:pPr>
@@ -4137,7 +4181,6 @@
         <w:tc>
           <w:tcPr>
             <w:tcW w:w="7160" w:type="dxa"/>
-            <w:shd w:val="clear" w:color="auto" w:fill="auto"/>
           </w:tcPr>
           <w:p>
             <w:pPr>
@@ -4154,8 +4197,17 @@
                 <w:i/>
                 <w:iCs/>
               </w:rPr>
-              <w:t>Web service</w:t>
+              <w:t xml:space="preserve">Web </w:t>
             </w:r>
+            <w:proofErr w:type="spellStart"/>
+            <w:r>
+              <w:rPr>
+                <w:i/>
+                <w:iCs/>
+              </w:rPr>
+              <w:t>service</w:t>
+            </w:r>
+            <w:proofErr w:type="spellEnd"/>
             <w:r>
               <w:rPr>
                 <w:iCs/>
@@ -4456,12 +4508,14 @@
       <w:r>
         <w:t>Nesta subsecção deve ser apresentado o planeamento (cronograma, etc.) definido para a execução do projeto com indicação das tarefas, datas e principais fases (</w:t>
       </w:r>
+      <w:proofErr w:type="spellStart"/>
       <w:r>
         <w:rPr>
           <w:i/>
         </w:rPr>
         <w:t>milestones</w:t>
       </w:r>
+      <w:proofErr w:type="spellEnd"/>
       <w:r>
         <w:rPr>
           <w:iCs/>
@@ -4608,22 +4662,7 @@
     </w:p>
     <w:p>
       <w:r>
-        <w:t>Este cap</w:t>
-      </w:r>
-      <w:r>
-        <w:t>ítulo apresenta uma análise do domínio da integração de sistemas e da infraest</w:t>
-      </w:r>
-      <w:r>
-        <w:t>rutura como código</w:t>
-      </w:r>
-      <w:r>
-        <w:t>, Serão, para isso, revistos trabalhos relevantes e exploradas as tecnologias</w:t>
-      </w:r>
-      <w:r>
-        <w:t xml:space="preserve"> utilizadas, com o onjetivo de identificar boas práticas e justificar escolhas</w:t>
-      </w:r>
-      <w:r>
-        <w:t xml:space="preserve"> tecnológicas adotadas na implementaçãoda solução proposta.</w:t>
+        <w:t>Este capítulo apresenta uma análise do domínio da integração de sistemas e da infraestrutura como código. Serão, para isso, revistos trabalhos relevantes e exploradas as tecnologias utilizadas, com o objetivo de identificar boas práticas e justificar as escolhas tecnológicas adotadas na implementação da solução proposta.</w:t>
       </w:r>
     </w:p>
     <w:p>
@@ -4638,7 +4677,24 @@
     </w:p>
     <w:p>
       <w:r>
-        <w:t>Nesta secção é realizada uma revisão de soluções e abordagens desenvolvidas no âmbito da integração de sistemas e da automação de infraestrutura, com foco na utilização de plataformas cloud e ferramentas de infraestrutura como código. A análise destas abordagens permite identificar práticas e tendências atuais na área, servindo como base para uma avaliação crítica e fundamentada das opções técnicas adotadas no projeto. Os casos analisados serão, assim, utilizados para justificar a seleção das tecnologias e ferramentas que compõem a solução proposta.</w:t>
+        <w:t xml:space="preserve">Nesta secção é realizada uma revisão de soluções e abordagens desenvolvidas no âmbito da integração de sistemas e da automação de infraestrutura, com foco na utilização de plataformas </w:t>
+      </w:r>
+      <w:proofErr w:type="spellStart"/>
+      <w:r>
+        <w:t>cloud</w:t>
+      </w:r>
+      <w:proofErr w:type="spellEnd"/>
+      <w:r>
+        <w:t xml:space="preserve"> e ferramentas de infraestrutura como código. A análise destas abordagens permite identificar práticas e tendências atuais na área, servindo como base para uma avaliação crítica</w:t>
+      </w:r>
+      <w:r>
+        <w:t xml:space="preserve"> </w:t>
+      </w:r>
+      <w:r>
+        <w:t>e fundamentada das opções técnicas adotadas no projeto. Os casos analisados serão, assim, utilizados para justificar a seleção das tecnologias e ferramentas que compõem a solução proposta</w:t>
+      </w:r>
+      <w:r>
+        <w:t>.</w:t>
       </w:r>
     </w:p>
     <w:p/>
@@ -4673,7 +4729,15 @@
         <w:t xml:space="preserve"> C&amp;C, </w:t>
       </w:r>
       <w:r>
-        <w:t xml:space="preserve">Casa &amp; Contrução, </w:t>
+        <w:t xml:space="preserve">Casa &amp; </w:t>
+      </w:r>
+      <w:proofErr w:type="spellStart"/>
+      <w:r>
+        <w:t>Contrução</w:t>
+      </w:r>
+      <w:proofErr w:type="spellEnd"/>
+      <w:r>
+        <w:t xml:space="preserve">, </w:t>
       </w:r>
       <w:r>
         <w:t xml:space="preserve">é </w:t>
@@ -4697,8 +4761,13 @@
         <w:t>s</w:t>
       </w:r>
       <w:r>
-        <w:t xml:space="preserve"> varejistas</w:t>
-      </w:r>
+        <w:t xml:space="preserve"> </w:t>
+      </w:r>
+      <w:proofErr w:type="spellStart"/>
+      <w:r>
+        <w:t>varejistas</w:t>
+      </w:r>
+      <w:proofErr w:type="spellEnd"/>
       <w:r>
         <w:t xml:space="preserve"> brasileira</w:t>
       </w:r>
@@ -4706,7 +4775,23 @@
         <w:t xml:space="preserve">s </w:t>
       </w:r>
       <w:r>
-        <w:t>no segmento de home center para pisos e revestimentos</w:t>
+        <w:t xml:space="preserve">no segmento de </w:t>
+      </w:r>
+      <w:proofErr w:type="spellStart"/>
+      <w:r>
+        <w:t>home</w:t>
+      </w:r>
+      <w:proofErr w:type="spellEnd"/>
+      <w:r>
+        <w:t xml:space="preserve"> </w:t>
+      </w:r>
+      <w:proofErr w:type="spellStart"/>
+      <w:r>
+        <w:t>center</w:t>
+      </w:r>
+      <w:proofErr w:type="spellEnd"/>
+      <w:r>
+        <w:t xml:space="preserve"> para pisos e revestimentos</w:t>
       </w:r>
       <w:r>
         <w:t>,</w:t>
@@ -4718,23 +4803,52 @@
         <w:t>1.5 milhões</w:t>
       </w:r>
       <w:r>
-        <w:t xml:space="preserve"> de Euros mensalmente, moveu a sua infraestrutura de e-comerce de local para </w:t>
-      </w:r>
-      <w:r>
-        <w:t>Cloud usando os serviços da AWS passando de 19 servidores físicos para 7 virtuais.</w:t>
-      </w:r>
-    </w:p>
-    <w:p>
-      <w:r>
-        <w:t xml:space="preserve">Inicialmente a C&amp;C mantia </w:t>
-      </w:r>
-      <w:r>
-        <w:t>toda a sua infrastrutura fisicamente</w:t>
-      </w:r>
+        <w:t xml:space="preserve"> de Euros mensalmente, moveu a sua infraestrutura de </w:t>
+      </w:r>
+      <w:proofErr w:type="spellStart"/>
+      <w:r>
+        <w:t>e-comerce</w:t>
+      </w:r>
+      <w:proofErr w:type="spellEnd"/>
+      <w:r>
+        <w:t xml:space="preserve"> de local para </w:t>
+      </w:r>
+      <w:proofErr w:type="spellStart"/>
+      <w:r>
+        <w:t>Cloud</w:t>
+      </w:r>
+      <w:proofErr w:type="spellEnd"/>
+      <w:r>
+        <w:t xml:space="preserve"> usando os serviços da AWS passando de 19 servidores físicos para 7 virtuais.</w:t>
+      </w:r>
+    </w:p>
+    <w:p>
+      <w:r>
+        <w:t xml:space="preserve">Inicialmente a C&amp;C </w:t>
+      </w:r>
+      <w:proofErr w:type="spellStart"/>
+      <w:r>
+        <w:t>mantia</w:t>
+      </w:r>
+      <w:proofErr w:type="spellEnd"/>
       <w:r>
         <w:t xml:space="preserve"> </w:t>
       </w:r>
       <w:r>
+        <w:t xml:space="preserve">toda a sua </w:t>
+      </w:r>
+      <w:proofErr w:type="spellStart"/>
+      <w:r>
+        <w:t>infrastrutura</w:t>
+      </w:r>
+      <w:proofErr w:type="spellEnd"/>
+      <w:r>
+        <w:t xml:space="preserve"> fisicamente</w:t>
+      </w:r>
+      <w:r>
+        <w:t xml:space="preserve"> </w:t>
+      </w:r>
+      <w:r>
         <w:t xml:space="preserve">e de acordo com </w:t>
       </w:r>
       <w:r>
@@ -4764,11 +4878,21 @@
     </w:p>
     <w:p>
       <w:r>
-        <w:t>Por isso, em parceria com a T-Systems</w:t>
-      </w:r>
-      <w:r>
-        <w:t xml:space="preserve"> decidiram fazer a migração para a AWS Cloud</w:t>
-      </w:r>
+        <w:t>Por isso, em parceria com a T-</w:t>
+      </w:r>
+      <w:proofErr w:type="spellStart"/>
+      <w:r>
+        <w:t>Systems</w:t>
+      </w:r>
+      <w:proofErr w:type="spellEnd"/>
+      <w:r>
+        <w:t xml:space="preserve"> decidiram fazer a migração para a AWS </w:t>
+      </w:r>
+      <w:proofErr w:type="spellStart"/>
+      <w:r>
+        <w:t>Cloud</w:t>
+      </w:r>
+      <w:proofErr w:type="spellEnd"/>
       <w:r>
         <w:t xml:space="preserve">. </w:t>
       </w:r>
@@ -4806,7 +4930,15 @@
         <w:t>, para as bases de dados</w:t>
       </w:r>
       <w:r>
-        <w:t xml:space="preserve">; e Amazon FSx para o file server </w:t>
+        <w:t xml:space="preserve">; e Amazon </w:t>
+      </w:r>
+      <w:proofErr w:type="spellStart"/>
+      <w:r>
+        <w:t>FSx</w:t>
+      </w:r>
+      <w:proofErr w:type="spellEnd"/>
+      <w:r>
+        <w:t xml:space="preserve"> para o file server </w:t>
       </w:r>
       <w:r>
         <w:t>e Amazon S3 para dados estáticos.</w:t>
@@ -4883,7 +5015,15 @@
         </w:sdtContent>
       </w:sdt>
       <w:r>
-        <w:t xml:space="preserve"> Greenn é uma</w:t>
+        <w:t xml:space="preserve"> </w:t>
+      </w:r>
+      <w:proofErr w:type="spellStart"/>
+      <w:r>
+        <w:t>Greenn</w:t>
+      </w:r>
+      <w:proofErr w:type="spellEnd"/>
+      <w:r>
+        <w:t xml:space="preserve"> é uma</w:t>
       </w:r>
       <w:r>
         <w:t xml:space="preserve"> plataforma de vendas online de produtos digitais</w:t>
@@ -4909,11 +5049,16 @@
       <w:r>
         <w:t xml:space="preserve">Com o suporte da </w:t>
       </w:r>
-      <w:r>
-        <w:t xml:space="preserve">Clouddog, </w:t>
-      </w:r>
-      <w:r>
-        <w:t> que remodelou a arquitetura de segurança da empresa com serviços AWS</w:t>
+      <w:proofErr w:type="spellStart"/>
+      <w:r>
+        <w:t>Clouddog</w:t>
+      </w:r>
+      <w:proofErr w:type="spellEnd"/>
+      <w:r>
+        <w:t xml:space="preserve">, </w:t>
+      </w:r>
+      <w:r>
+        <w:t>que remodelou a arquitetura de segurança da empresa com serviços AWS</w:t>
       </w:r>
       <w:r>
         <w:t>, conseguiram obter</w:t>
@@ -4927,7 +5072,23 @@
     </w:p>
     <w:p>
       <w:r>
-        <w:t>Um dos objetivos estratégicos da Greenn para este ano era tornar-se uma subadquirente, passando a atuar como intermediária entre adquirentes, lojas e clientes, processando pagamentos e transmitindo os dados gerados nestas transações.</w:t>
+        <w:t xml:space="preserve">Um dos objetivos estratégicos da </w:t>
+      </w:r>
+      <w:proofErr w:type="spellStart"/>
+      <w:r>
+        <w:t>Greenn</w:t>
+      </w:r>
+      <w:proofErr w:type="spellEnd"/>
+      <w:r>
+        <w:t xml:space="preserve"> para este ano era tornar-se uma </w:t>
+      </w:r>
+      <w:proofErr w:type="spellStart"/>
+      <w:r>
+        <w:t>subadquirente</w:t>
+      </w:r>
+      <w:proofErr w:type="spellEnd"/>
+      <w:r>
+        <w:t>, passando a atuar como intermediária entre adquirentes, lojas e clientes, processando pagamentos e transmitindo os dados gerados nestas transações.</w:t>
       </w:r>
       <w:r>
         <w:t xml:space="preserve"> Para isto</w:t>
@@ -4939,7 +5100,7 @@
         <w:t xml:space="preserve"> precisa que a sua arquitetura de segurança </w:t>
       </w:r>
       <w:r>
-        <w:t>esteja em coonformidade com algumas normas, como o padrão PCI</w:t>
+        <w:t>esteja em conformidade com algumas normas, como o padrão PCI</w:t>
       </w:r>
       <w:r>
         <w:t>.</w:t>
@@ -4953,25 +5114,83 @@
         <w:t>Com o apoio da</w:t>
       </w:r>
       <w:r>
-        <w:t xml:space="preserve"> Clouddog, </w:t>
-      </w:r>
-      <w:r>
-        <w:t>parceira AWS Advanced Tier Services</w:t>
-      </w:r>
+        <w:t xml:space="preserve"> </w:t>
+      </w:r>
+      <w:proofErr w:type="spellStart"/>
+      <w:r>
+        <w:t>Clouddog</w:t>
+      </w:r>
+      <w:proofErr w:type="spellEnd"/>
       <w:r>
         <w:t xml:space="preserve">, </w:t>
       </w:r>
       <w:r>
-        <w:t xml:space="preserve">reveram </w:t>
-      </w:r>
-      <w:r>
-        <w:t>a arquiterura de segurança da Green</w:t>
+        <w:t xml:space="preserve">parceira AWS </w:t>
+      </w:r>
+      <w:proofErr w:type="spellStart"/>
+      <w:r>
+        <w:t>Advanced</w:t>
+      </w:r>
+      <w:proofErr w:type="spellEnd"/>
+      <w:r>
+        <w:t xml:space="preserve"> </w:t>
+      </w:r>
+      <w:proofErr w:type="spellStart"/>
+      <w:r>
+        <w:t>Tier</w:t>
+      </w:r>
+      <w:proofErr w:type="spellEnd"/>
+      <w:r>
+        <w:t xml:space="preserve"> </w:t>
+      </w:r>
+      <w:proofErr w:type="spellStart"/>
+      <w:r>
+        <w:t>Services</w:t>
+      </w:r>
+      <w:proofErr w:type="spellEnd"/>
+      <w:r>
+        <w:t xml:space="preserve">, </w:t>
+      </w:r>
+      <w:proofErr w:type="spellStart"/>
+      <w:r>
+        <w:t>reveram</w:t>
+      </w:r>
+      <w:proofErr w:type="spellEnd"/>
+      <w:r>
+        <w:t xml:space="preserve"> </w:t>
+      </w:r>
+      <w:r>
+        <w:t xml:space="preserve">a </w:t>
+      </w:r>
+      <w:proofErr w:type="spellStart"/>
+      <w:r>
+        <w:t>arquiterura</w:t>
+      </w:r>
+      <w:proofErr w:type="spellEnd"/>
+      <w:r>
+        <w:t xml:space="preserve"> de segurança da Green</w:t>
       </w:r>
       <w:r>
         <w:t xml:space="preserve">. </w:t>
       </w:r>
       <w:r>
-        <w:t xml:space="preserve">O DevOps da Greenn, Danilo Macedo, </w:t>
+        <w:t xml:space="preserve">O </w:t>
+      </w:r>
+      <w:proofErr w:type="spellStart"/>
+      <w:r>
+        <w:t>DevOps</w:t>
+      </w:r>
+      <w:proofErr w:type="spellEnd"/>
+      <w:r>
+        <w:t xml:space="preserve"> da </w:t>
+      </w:r>
+      <w:proofErr w:type="spellStart"/>
+      <w:r>
+        <w:t>Greenn</w:t>
+      </w:r>
+      <w:proofErr w:type="spellEnd"/>
+      <w:r>
+        <w:t xml:space="preserve">, Danilo Macedo, </w:t>
       </w:r>
       <w:r>
         <w:t>diz</w:t>
@@ -4995,7 +5214,13 @@
         <w:t>as bases de dados foram separadas em i</w:t>
       </w:r>
       <w:r>
-        <w:t>nstâncias privadas, só acessadas via VPN.</w:t>
+        <w:t xml:space="preserve">nstâncias privadas, só </w:t>
+      </w:r>
+      <w:r>
+        <w:t>acessíveis</w:t>
+      </w:r>
+      <w:r>
+        <w:t xml:space="preserve"> via VPN.</w:t>
       </w:r>
       <w:r>
         <w:t xml:space="preserve"> </w:t>
@@ -5007,19 +5232,61 @@
         <w:t xml:space="preserve">garantir esta segregação e maior segurança </w:t>
       </w:r>
       <w:r>
-        <w:t xml:space="preserve">em todo o ambiente, a arquitetura passaou a utilizar serviços da AWS como AWS Fargate, </w:t>
-      </w:r>
-      <w:r>
-        <w:t>para computação serverless, e serviços de segurança como AWS WAF, Amazon GruardDuty</w:t>
-      </w:r>
-      <w:r>
-        <w:t xml:space="preserve"> e AWS CloudTrail.</w:t>
-      </w:r>
-    </w:p>
-    <w:p>
-      <w:r>
-        <w:t>O próximo passo da Green é levar outros workflows também para o mesmo ambiente Cloud</w:t>
-      </w:r>
+        <w:t xml:space="preserve">em todo o ambiente, a arquitetura passou a utilizar serviços da AWS como AWS </w:t>
+      </w:r>
+      <w:proofErr w:type="spellStart"/>
+      <w:r>
+        <w:t>Fargate</w:t>
+      </w:r>
+      <w:proofErr w:type="spellEnd"/>
+      <w:r>
+        <w:t xml:space="preserve">, </w:t>
+      </w:r>
+      <w:r>
+        <w:t xml:space="preserve">para computação </w:t>
+      </w:r>
+      <w:proofErr w:type="spellStart"/>
+      <w:r>
+        <w:t>serverless</w:t>
+      </w:r>
+      <w:proofErr w:type="spellEnd"/>
+      <w:r>
+        <w:t xml:space="preserve">, e serviços de segurança como AWS WAF, Amazon </w:t>
+      </w:r>
+      <w:proofErr w:type="spellStart"/>
+      <w:r>
+        <w:t>GruardDuty</w:t>
+      </w:r>
+      <w:proofErr w:type="spellEnd"/>
+      <w:r>
+        <w:t xml:space="preserve"> e AWS </w:t>
+      </w:r>
+      <w:proofErr w:type="spellStart"/>
+      <w:r>
+        <w:t>CloudTrail</w:t>
+      </w:r>
+      <w:proofErr w:type="spellEnd"/>
+      <w:r>
+        <w:t>.</w:t>
+      </w:r>
+    </w:p>
+    <w:p>
+      <w:r>
+        <w:t xml:space="preserve">O próximo passo da Green é levar outros </w:t>
+      </w:r>
+      <w:proofErr w:type="spellStart"/>
+      <w:r>
+        <w:t>workflows</w:t>
+      </w:r>
+      <w:proofErr w:type="spellEnd"/>
+      <w:r>
+        <w:t xml:space="preserve"> também para o mesmo ambiente </w:t>
+      </w:r>
+      <w:proofErr w:type="spellStart"/>
+      <w:r>
+        <w:t>Cloud</w:t>
+      </w:r>
+      <w:proofErr w:type="spellEnd"/>
       <w:r>
         <w:t>.</w:t>
       </w:r>
@@ -5098,18 +5365,90 @@
         <w:t xml:space="preserve">a automatização das configurações, mas necessitavam de algo para </w:t>
       </w:r>
       <w:r>
-        <w:t>aprovisionar automaticamente a infraestrutura na Cloud.</w:t>
-      </w:r>
-    </w:p>
-    <w:p>
-      <w:r>
-        <w:t>Com a migração para a cloud, a empresa adotou o Terraform Enterprise para automatizar totalmente o provisionamento da infraestrutura. Esta mudança permitiu lançar cerca de 20 novos serviços de forma automática, com onboarding de clientes feito com um simples clique e sem intervenção humana, o que melhorou significativamente a satisfação e retenção de clientes.</w:t>
+        <w:t xml:space="preserve">aprovisionar automaticamente a infraestrutura na </w:t>
+      </w:r>
+      <w:proofErr w:type="spellStart"/>
+      <w:r>
+        <w:t>Cloud</w:t>
+      </w:r>
+      <w:proofErr w:type="spellEnd"/>
+      <w:r>
+        <w:t>.</w:t>
+      </w:r>
+    </w:p>
+    <w:p>
+      <w:r>
+        <w:t xml:space="preserve">Com a migração para a </w:t>
+      </w:r>
+      <w:proofErr w:type="spellStart"/>
+      <w:r>
+        <w:t>cloud</w:t>
+      </w:r>
+      <w:proofErr w:type="spellEnd"/>
+      <w:r>
+        <w:t xml:space="preserve">, a empresa adotou o </w:t>
+      </w:r>
+      <w:proofErr w:type="spellStart"/>
+      <w:r>
+        <w:t>Terraform</w:t>
+      </w:r>
+      <w:proofErr w:type="spellEnd"/>
+      <w:r>
+        <w:t xml:space="preserve"> </w:t>
+      </w:r>
+      <w:proofErr w:type="spellStart"/>
+      <w:r>
+        <w:t>Enterprise</w:t>
+      </w:r>
+      <w:proofErr w:type="spellEnd"/>
+      <w:r>
+        <w:t xml:space="preserve"> para automatizar totalmente o provisionamento da infraestrutura. Esta mudança permitiu lançar cerca de 20 novos serviços de forma automática, com </w:t>
+      </w:r>
+      <w:proofErr w:type="spellStart"/>
+      <w:r>
+        <w:t>onboarding</w:t>
+      </w:r>
+      <w:proofErr w:type="spellEnd"/>
+      <w:r>
+        <w:t xml:space="preserve"> de clientes feito com um simples clique e sem intervenção humana, o que melhorou significativamente a satisfação e retenção de clientes.</w:t>
       </w:r>
     </w:p>
     <w:p>
       <w:r>
         <w:lastRenderedPageBreak/>
-        <w:t>Através do Terraform Module Registry e da integração com sistemas de controlo de versão, os programadores passaram a incorporar diretamente os templates de infraestrutura no código das suas aplicações, permitindo deployments mais rápidos e colaborativos.</w:t>
+        <w:t xml:space="preserve">Através do </w:t>
+      </w:r>
+      <w:proofErr w:type="spellStart"/>
+      <w:r>
+        <w:t>Terraform</w:t>
+      </w:r>
+      <w:proofErr w:type="spellEnd"/>
+      <w:r>
+        <w:t xml:space="preserve"> Module </w:t>
+      </w:r>
+      <w:proofErr w:type="spellStart"/>
+      <w:r>
+        <w:t>Registry</w:t>
+      </w:r>
+      <w:proofErr w:type="spellEnd"/>
+      <w:r>
+        <w:t xml:space="preserve"> e da integração com sistemas de controlo de versão, os programadores passaram a incorporar diretamente os </w:t>
+      </w:r>
+      <w:proofErr w:type="spellStart"/>
+      <w:r>
+        <w:t>templates</w:t>
+      </w:r>
+      <w:proofErr w:type="spellEnd"/>
+      <w:r>
+        <w:t xml:space="preserve"> de infraestrutura no código das suas aplicações, permitindo </w:t>
+      </w:r>
+      <w:proofErr w:type="spellStart"/>
+      <w:r>
+        <w:t>deployments</w:t>
+      </w:r>
+      <w:proofErr w:type="spellEnd"/>
+      <w:r>
+        <w:t xml:space="preserve"> mais rápidos e colaborativos.</w:t>
       </w:r>
     </w:p>
     <w:p>
@@ -5117,12 +5456,44 @@
         <w:t>De acordo com</w:t>
       </w:r>
       <w:r>
-        <w:t xml:space="preserve"> Takashi Kawano, engenheiro sénior da equipa de desenvolvimento da GMO Media, a automação com Terraform eliminou erros humanos, reduziu os tempos de entrega e simplificou todo o processo de provisionamento.</w:t>
-      </w:r>
-    </w:p>
-    <w:p>
-      <w:r>
-        <w:t>A GMO Media vê esta abordagem como uma vantagem competitiva clara e continua a apostar na automatização como base do seu fluxo DevOps.</w:t>
+        <w:t xml:space="preserve"> </w:t>
+      </w:r>
+      <w:proofErr w:type="spellStart"/>
+      <w:r>
+        <w:t>Takashi</w:t>
+      </w:r>
+      <w:proofErr w:type="spellEnd"/>
+      <w:r>
+        <w:t xml:space="preserve"> </w:t>
+      </w:r>
+      <w:proofErr w:type="spellStart"/>
+      <w:r>
+        <w:t>Kawano</w:t>
+      </w:r>
+      <w:proofErr w:type="spellEnd"/>
+      <w:r>
+        <w:t xml:space="preserve">, engenheiro sénior da equipa de desenvolvimento da GMO Media, a automação com </w:t>
+      </w:r>
+      <w:proofErr w:type="spellStart"/>
+      <w:r>
+        <w:t>Terraform</w:t>
+      </w:r>
+      <w:proofErr w:type="spellEnd"/>
+      <w:r>
+        <w:t xml:space="preserve"> eliminou erros humanos, reduziu os tempos de entrega e simplificou todo o processo de provisionamento.</w:t>
+      </w:r>
+    </w:p>
+    <w:p>
+      <w:r>
+        <w:t xml:space="preserve">A GMO Media vê esta abordagem como uma vantagem competitiva clara e continua a apostar na automatização como base do seu fluxo </w:t>
+      </w:r>
+      <w:proofErr w:type="spellStart"/>
+      <w:r>
+        <w:t>DevOps</w:t>
+      </w:r>
+      <w:proofErr w:type="spellEnd"/>
+      <w:r>
+        <w:t>.</w:t>
       </w:r>
     </w:p>
     <w:p/>
@@ -5499,7 +5870,7 @@
     </w:p>
     <w:p>
       <w:pPr>
-        <w:pStyle w:val="ListParagraph"/>
+        <w:pStyle w:val="PargrafodaLista"/>
         <w:numPr>
           <w:ilvl w:val="0"/>
           <w:numId w:val="28"/>
@@ -5517,7 +5888,7 @@
     </w:p>
     <w:p>
       <w:pPr>
-        <w:pStyle w:val="ListParagraph"/>
+        <w:pStyle w:val="PargrafodaLista"/>
         <w:numPr>
           <w:ilvl w:val="0"/>
           <w:numId w:val="28"/>
@@ -5535,7 +5906,7 @@
     </w:p>
     <w:p>
       <w:pPr>
-        <w:pStyle w:val="ListParagraph"/>
+        <w:pStyle w:val="PargrafodaLista"/>
         <w:numPr>
           <w:ilvl w:val="0"/>
           <w:numId w:val="28"/>
@@ -5553,7 +5924,7 @@
     </w:p>
     <w:p>
       <w:pPr>
-        <w:pStyle w:val="ListParagraph"/>
+        <w:pStyle w:val="PargrafodaLista"/>
         <w:numPr>
           <w:ilvl w:val="0"/>
           <w:numId w:val="28"/>
@@ -5571,7 +5942,7 @@
     </w:p>
     <w:p>
       <w:pPr>
-        <w:pStyle w:val="ListParagraph"/>
+        <w:pStyle w:val="PargrafodaLista"/>
         <w:numPr>
           <w:ilvl w:val="0"/>
           <w:numId w:val="28"/>
@@ -5589,7 +5960,7 @@
     </w:p>
     <w:p>
       <w:pPr>
-        <w:pStyle w:val="ListParagraph"/>
+        <w:pStyle w:val="PargrafodaLista"/>
         <w:numPr>
           <w:ilvl w:val="0"/>
           <w:numId w:val="28"/>
@@ -5773,7 +6144,7 @@
     </w:p>
     <w:p>
       <w:pPr>
-        <w:pStyle w:val="ListParagraph"/>
+        <w:pStyle w:val="PargrafodaLista"/>
         <w:numPr>
           <w:ilvl w:val="0"/>
           <w:numId w:val="29"/>
@@ -5812,7 +6183,7 @@
     </w:p>
     <w:p>
       <w:pPr>
-        <w:pStyle w:val="ListParagraph"/>
+        <w:pStyle w:val="PargrafodaLista"/>
         <w:numPr>
           <w:ilvl w:val="0"/>
           <w:numId w:val="29"/>
@@ -5830,7 +6201,7 @@
     </w:p>
     <w:p>
       <w:pPr>
-        <w:pStyle w:val="ListParagraph"/>
+        <w:pStyle w:val="PargrafodaLista"/>
         <w:numPr>
           <w:ilvl w:val="0"/>
           <w:numId w:val="29"/>
@@ -5885,7 +6256,7 @@
     </w:p>
     <w:p>
       <w:pPr>
-        <w:pStyle w:val="ListParagraph"/>
+        <w:pStyle w:val="PargrafodaLista"/>
         <w:numPr>
           <w:ilvl w:val="0"/>
           <w:numId w:val="30"/>
@@ -5903,7 +6274,7 @@
     </w:p>
     <w:p>
       <w:pPr>
-        <w:pStyle w:val="ListParagraph"/>
+        <w:pStyle w:val="PargrafodaLista"/>
         <w:numPr>
           <w:ilvl w:val="0"/>
           <w:numId w:val="30"/>
@@ -6835,7 +7206,15 @@
         <w:t>LEIC-FEUP</w:t>
       </w:r>
       <w:r>
-        <w:t xml:space="preserve"> (nd). </w:t>
+        <w:t xml:space="preserve"> (</w:t>
+      </w:r>
+      <w:proofErr w:type="spellStart"/>
+      <w:r>
+        <w:t>nd</w:t>
+      </w:r>
+      <w:proofErr w:type="spellEnd"/>
+      <w:r>
+        <w:t xml:space="preserve">). </w:t>
       </w:r>
       <w:r>
         <w:t>Guia de Elaboração de Relatórios LEIC. Texto académico.</w:t>
@@ -7086,7 +7465,15 @@
     </w:p>
     <w:p>
       <w:r>
-        <w:t>A linguagem de um relatório deve ser rigorosa, clara e com caráter técnico. Deve</w:t>
+        <w:t xml:space="preserve">A linguagem de um relatório deve ser rigorosa, clara e com </w:t>
+      </w:r>
+      <w:proofErr w:type="spellStart"/>
+      <w:r>
+        <w:t>caráter</w:t>
+      </w:r>
+      <w:proofErr w:type="spellEnd"/>
+      <w:r>
+        <w:t xml:space="preserve"> técnico. Deve</w:t>
       </w:r>
       <w:r>
         <w:t>m</w:t>
@@ -7195,7 +7582,15 @@
         <w:t>U</w:t>
       </w:r>
       <w:r>
-        <w:t>sar um tipo de letra com tamanho de fácil leitura (por exemplo, Calibri 11pts);</w:t>
+        <w:t xml:space="preserve">sar um tipo de letra com tamanho de fácil leitura (por exemplo, </w:t>
+      </w:r>
+      <w:proofErr w:type="spellStart"/>
+      <w:r>
+        <w:t>Calibri</w:t>
+      </w:r>
+      <w:proofErr w:type="spellEnd"/>
+      <w:r>
+        <w:t xml:space="preserve"> 11pts);</w:t>
       </w:r>
     </w:p>
     <w:p>
@@ -7372,7 +7767,7 @@
             <v:path o:extrusionok="f" gradientshapeok="t" o:connecttype="rect"/>
             <o:lock v:ext="edit" aspectratio="t"/>
           </v:shapetype>
-          <v:shape id="_x0000_i1025" type="#_x0000_t75" alt="" style="width:169.5pt;height:149pt;mso-width-percent:0;mso-height-percent:0;mso-width-percent:0;mso-height-percent:0" filled="t">
+          <v:shape id="_x0000_i1025" type="#_x0000_t75" alt="" style="width:169.5pt;height:149.25pt;mso-width-percent:0;mso-height-percent:0;mso-width-percent:0;mso-height-percent:0" filled="t">
             <v:fill color2="black"/>
             <v:imagedata r:id="rId59" o:title=""/>
           </v:shape>
@@ -7389,7 +7784,7 @@
           <w:noProof/>
         </w:rPr>
         <w:pict w14:anchorId="3C25CC42">
-          <v:shape id="_x0000_i1026" type="#_x0000_t75" alt="" style="width:180pt;height:118pt;mso-width-percent:0;mso-height-percent:0;mso-width-percent:0;mso-height-percent:0" filled="t">
+          <v:shape id="_x0000_i1026" type="#_x0000_t75" alt="" style="width:180pt;height:117.75pt;mso-width-percent:0;mso-height-percent:0;mso-width-percent:0;mso-height-percent:0" filled="t">
             <v:fill color2="black"/>
             <v:imagedata r:id="rId60" o:title=""/>
           </v:shape>
@@ -7398,7 +7793,7 @@
     </w:p>
     <w:p>
       <w:pPr>
-        <w:pStyle w:val="Caption"/>
+        <w:pStyle w:val="Legenda"/>
       </w:pPr>
       <w:bookmarkStart w:id="28" w:name="_Toc4158075"/>
       <w:r>
@@ -7488,7 +7883,7 @@
     </w:p>
     <w:p>
       <w:pPr>
-        <w:pStyle w:val="Caption"/>
+        <w:pStyle w:val="Legenda"/>
         <w:keepNext/>
       </w:pPr>
       <w:bookmarkStart w:id="29" w:name="_Toc3826194"/>
@@ -7620,12 +8015,16 @@
               <w:left w:val="single" w:sz="6" w:space="0" w:color="000000"/>
               <w:bottom w:val="single" w:sz="6" w:space="0" w:color="000000"/>
             </w:tcBorders>
-            <w:shd w:val="clear" w:color="auto" w:fill="auto"/>
           </w:tcPr>
           <w:p>
             <w:r>
-              <w:t>Pentium III 800 Mhz</w:t>
+              <w:t xml:space="preserve">Pentium III 800 </w:t>
             </w:r>
+            <w:proofErr w:type="spellStart"/>
+            <w:r>
+              <w:t>Mhz</w:t>
+            </w:r>
+            <w:proofErr w:type="spellEnd"/>
           </w:p>
         </w:tc>
         <w:tc>
@@ -7636,7 +8035,6 @@
               <w:left w:val="single" w:sz="6" w:space="0" w:color="000000"/>
               <w:bottom w:val="single" w:sz="6" w:space="0" w:color="000000"/>
             </w:tcBorders>
-            <w:shd w:val="clear" w:color="auto" w:fill="auto"/>
           </w:tcPr>
           <w:p>
             <w:r>
@@ -7653,7 +8051,6 @@
               <w:bottom w:val="single" w:sz="6" w:space="0" w:color="000000"/>
               <w:right w:val="single" w:sz="6" w:space="0" w:color="000000"/>
             </w:tcBorders>
-            <w:shd w:val="clear" w:color="auto" w:fill="auto"/>
           </w:tcPr>
           <w:p>
             <w:r>
@@ -7674,7 +8071,6 @@
               <w:left w:val="single" w:sz="6" w:space="0" w:color="000000"/>
               <w:bottom w:val="single" w:sz="6" w:space="0" w:color="000000"/>
             </w:tcBorders>
-            <w:shd w:val="clear" w:color="auto" w:fill="auto"/>
           </w:tcPr>
           <w:p>
             <w:r>
@@ -7690,7 +8086,6 @@
               <w:left w:val="single" w:sz="6" w:space="0" w:color="000000"/>
               <w:bottom w:val="single" w:sz="6" w:space="0" w:color="000000"/>
             </w:tcBorders>
-            <w:shd w:val="clear" w:color="auto" w:fill="auto"/>
           </w:tcPr>
           <w:p>
             <w:r>
@@ -7707,7 +8102,6 @@
               <w:bottom w:val="single" w:sz="6" w:space="0" w:color="000000"/>
               <w:right w:val="single" w:sz="6" w:space="0" w:color="000000"/>
             </w:tcBorders>
-            <w:shd w:val="clear" w:color="auto" w:fill="auto"/>
           </w:tcPr>
           <w:p>
             <w:r>
@@ -7820,7 +8214,15 @@
         <w:t xml:space="preserve"> um livro:</w:t>
       </w:r>
       <w:r>
-        <w:t xml:space="preserve"> nome(s) do(s) autor(es), ano da edição entre parêntesis, título do livro em itálico, nome da editora, local da edição, país da edição;</w:t>
+        <w:t xml:space="preserve"> nome(s) do(s) autor(</w:t>
+      </w:r>
+      <w:proofErr w:type="spellStart"/>
+      <w:r>
+        <w:t>es</w:t>
+      </w:r>
+      <w:proofErr w:type="spellEnd"/>
+      <w:r>
+        <w:t>), ano da edição entre parêntesis, título do livro em itálico, nome da editora, local da edição, país da edição;</w:t>
       </w:r>
     </w:p>
     <w:p>
@@ -7847,7 +8249,15 @@
         <w:t xml:space="preserve"> um artigo em revista:</w:t>
       </w:r>
       <w:r>
-        <w:t xml:space="preserve"> nome(s) do(s) autor(es), ano da edição entre parêntesis, título do artigo em itálico, nome da revista, volume da edição a negrito, número da edição, páginas;</w:t>
+        <w:t xml:space="preserve"> nome(s) do(s) autor(</w:t>
+      </w:r>
+      <w:proofErr w:type="spellStart"/>
+      <w:r>
+        <w:t>es</w:t>
+      </w:r>
+      <w:proofErr w:type="spellEnd"/>
+      <w:r>
+        <w:t>), ano da edição entre parêntesis, título do artigo em itálico, nome da revista, volume da edição a negrito, número da edição, páginas;</w:t>
       </w:r>
     </w:p>
     <w:p>
@@ -7874,7 +8284,15 @@
         <w:t xml:space="preserve"> uma comunicação em conferência:</w:t>
       </w:r>
       <w:r>
-        <w:t xml:space="preserve"> nome(s) do(s) autor(es), ano da conferência entre parêntesis, título da comunicação entre aspas, nome da conferência em itálico, local da conferência, país da conferência, mês da conferência;</w:t>
+        <w:t xml:space="preserve"> nome(s) do(s) autor(</w:t>
+      </w:r>
+      <w:proofErr w:type="spellStart"/>
+      <w:r>
+        <w:t>es</w:t>
+      </w:r>
+      <w:proofErr w:type="spellEnd"/>
+      <w:r>
+        <w:t>), ano da conferência entre parêntesis, título da comunicação entre aspas, nome da conferência em itálico, local da conferência, país da conferência, mês da conferência;</w:t>
       </w:r>
     </w:p>
     <w:p>
@@ -7928,7 +8346,15 @@
         <w:t xml:space="preserve"> um relatório interno:</w:t>
       </w:r>
       <w:r>
-        <w:t xml:space="preserve"> nome(s) do(s) autor(es), ano do relatório entre parêntesis, título do relatório, origem do relatório, referência do relatório, instituição de acesso ao relatório, local da instituição, país da instituição, mês do relatório (abreviado com 3 letras, exceção aos meses com 4 letras);</w:t>
+        <w:t xml:space="preserve"> nome(s) do(s) autor(</w:t>
+      </w:r>
+      <w:proofErr w:type="spellStart"/>
+      <w:r>
+        <w:t>es</w:t>
+      </w:r>
+      <w:proofErr w:type="spellEnd"/>
+      <w:r>
+        <w:t>), ano do relatório entre parêntesis, título do relatório, origem do relatório, referência do relatório, instituição de acesso ao relatório, local da instituição, país da instituição, mês do relatório (abreviado com 3 letras, exceção aos meses com 4 letras);</w:t>
       </w:r>
     </w:p>
     <w:p>
@@ -8070,7 +8496,7 @@
     </w:p>
     <w:p>
       <w:pPr>
-        <w:pStyle w:val="Caption"/>
+        <w:pStyle w:val="Legenda"/>
       </w:pPr>
       <w:bookmarkStart w:id="33" w:name="_Toc4158076"/>
       <w:r>
@@ -8135,7 +8561,7 @@
 </file>
 
 <file path=word/endnotes.xml><?xml version="1.0" encoding="utf-8"?>
-<w:endnotes xmlns:wpc="http://schemas.microsoft.com/office/word/2010/wordprocessingCanvas" xmlns:cx="http://schemas.microsoft.com/office/drawing/2014/chartex" xmlns:cx1="http://schemas.microsoft.com/office/drawing/2015/9/8/chartex" xmlns:cx2="http://schemas.microsoft.com/office/drawing/2015/10/21/chartex" xmlns:cx3="http://schemas.microsoft.com/office/drawing/2016/5/9/chartex" xmlns:cx4="http://schemas.microsoft.com/office/drawing/2016/5/10/chartex" xmlns:cx5="http://schemas.microsoft.com/office/drawing/2016/5/11/chartex" xmlns:cx6="http://schemas.microsoft.com/office/drawing/2016/5/12/chartex" xmlns:cx7="http://schemas.microsoft.com/office/drawing/2016/5/13/chartex" xmlns:cx8="http://schemas.microsoft.com/office/drawing/2016/5/14/chartex" xmlns:mc="http://schemas.openxmlformats.org/markup-compatibility/2006" xmlns:aink="http://schemas.microsoft.com/office/drawing/2016/ink" xmlns:am3d="http://schemas.microsoft.com/office/drawing/2017/model3d" xmlns:o="urn:schemas-microsoft-com:office:office" xmlns:oel="http://schemas.microsoft.com/office/2019/extlst" xmlns:r="http://schemas.openxmlformats.org/officeDocument/2006/relationships" xmlns:m="http://schemas.openxmlformats.org/officeDocument/2006/math" xmlns:v="urn:schemas-microsoft-com:vml" xmlns:wp14="http://schemas.microsoft.com/office/word/2010/wordprocessingDrawing" xmlns:wp="http://schemas.openxmlformats.org/drawingml/2006/wordprocessingDrawing" xmlns:w10="urn:schemas-microsoft-com:office:word" xmlns:w="http://schemas.openxmlformats.org/wordprocessingml/2006/main" xmlns:w14="http://schemas.microsoft.com/office/word/2010/wordml" xmlns:w15="http://schemas.microsoft.com/office/word/2012/wordml" xmlns:w16cex="http://schemas.microsoft.com/office/word/2018/wordml/cex" xmlns:w16cid="http://schemas.microsoft.com/office/word/2016/wordml/cid" xmlns:w16="http://schemas.microsoft.com/office/word/2018/wordml" xmlns:w16sdtdh="http://schemas.microsoft.com/office/word/2020/wordml/sdtdatahash" xmlns:w16se="http://schemas.microsoft.com/office/word/2015/wordml/symex" xmlns:wpg="http://schemas.microsoft.com/office/word/2010/wordprocessingGroup" xmlns:wpi="http://schemas.microsoft.com/office/word/2010/wordprocessingInk" xmlns:wne="http://schemas.microsoft.com/office/word/2006/wordml" xmlns:wps="http://schemas.microsoft.com/office/word/2010/wordprocessingShape" mc:Ignorable="w14 w15 w16se w16cid w16 w16cex w16sdtdh wp14">
+<w:endnotes xmlns:wpc="http://schemas.microsoft.com/office/word/2010/wordprocessingCanvas" xmlns:cx="http://schemas.microsoft.com/office/drawing/2014/chartex" xmlns:cx1="http://schemas.microsoft.com/office/drawing/2015/9/8/chartex" xmlns:cx2="http://schemas.microsoft.com/office/drawing/2015/10/21/chartex" xmlns:cx3="http://schemas.microsoft.com/office/drawing/2016/5/9/chartex" xmlns:cx4="http://schemas.microsoft.com/office/drawing/2016/5/10/chartex" xmlns:cx5="http://schemas.microsoft.com/office/drawing/2016/5/11/chartex" xmlns:cx6="http://schemas.microsoft.com/office/drawing/2016/5/12/chartex" xmlns:cx7="http://schemas.microsoft.com/office/drawing/2016/5/13/chartex" xmlns:cx8="http://schemas.microsoft.com/office/drawing/2016/5/14/chartex" xmlns:mc="http://schemas.openxmlformats.org/markup-compatibility/2006" xmlns:aink="http://schemas.microsoft.com/office/drawing/2016/ink" xmlns:am3d="http://schemas.microsoft.com/office/drawing/2017/model3d" xmlns:o="urn:schemas-microsoft-com:office:office" xmlns:oel="http://schemas.microsoft.com/office/2019/extlst" xmlns:r="http://schemas.openxmlformats.org/officeDocument/2006/relationships" xmlns:m="http://schemas.openxmlformats.org/officeDocument/2006/math" xmlns:v="urn:schemas-microsoft-com:vml" xmlns:wp14="http://schemas.microsoft.com/office/word/2010/wordprocessingDrawing" xmlns:wp="http://schemas.openxmlformats.org/drawingml/2006/wordprocessingDrawing" xmlns:w10="urn:schemas-microsoft-com:office:word" xmlns:w="http://schemas.openxmlformats.org/wordprocessingml/2006/main" xmlns:w14="http://schemas.microsoft.com/office/word/2010/wordml" xmlns:w15="http://schemas.microsoft.com/office/word/2012/wordml" xmlns:w16cex="http://schemas.microsoft.com/office/word/2018/wordml/cex" xmlns:w16cid="http://schemas.microsoft.com/office/word/2016/wordml/cid" xmlns:w16="http://schemas.microsoft.com/office/word/2018/wordml" xmlns:w16du="http://schemas.microsoft.com/office/word/2023/wordml/word16du" xmlns:w16sdtdh="http://schemas.microsoft.com/office/word/2020/wordml/sdtdatahash" xmlns:w16sdtfl="http://schemas.microsoft.com/office/word/2024/wordml/sdtformatlock" xmlns:w16se="http://schemas.microsoft.com/office/word/2015/wordml/symex" xmlns:wpg="http://schemas.microsoft.com/office/word/2010/wordprocessingGroup" xmlns:wpi="http://schemas.microsoft.com/office/word/2010/wordprocessingInk" xmlns:wne="http://schemas.microsoft.com/office/word/2006/wordml" xmlns:wps="http://schemas.microsoft.com/office/word/2010/wordprocessingShape" mc:Ignorable="w14 w15 w16se w16cid w16 w16cex w16sdtdh w16sdtfl w16du wp14">
   <w:endnote w:type="separator" w:id="-1">
     <w:p>
       <w:pPr>
@@ -8167,10 +8593,10 @@
 </file>
 
 <file path=word/footer1.xml><?xml version="1.0" encoding="utf-8"?>
-<w:ftr xmlns:wpc="http://schemas.microsoft.com/office/word/2010/wordprocessingCanvas" xmlns:cx="http://schemas.microsoft.com/office/drawing/2014/chartex" xmlns:cx1="http://schemas.microsoft.com/office/drawing/2015/9/8/chartex" xmlns:cx2="http://schemas.microsoft.com/office/drawing/2015/10/21/chartex" xmlns:cx3="http://schemas.microsoft.com/office/drawing/2016/5/9/chartex" xmlns:cx4="http://schemas.microsoft.com/office/drawing/2016/5/10/chartex" xmlns:cx5="http://schemas.microsoft.com/office/drawing/2016/5/11/chartex" xmlns:cx6="http://schemas.microsoft.com/office/drawing/2016/5/12/chartex" xmlns:cx7="http://schemas.microsoft.com/office/drawing/2016/5/13/chartex" xmlns:cx8="http://schemas.microsoft.com/office/drawing/2016/5/14/chartex" xmlns:mc="http://schemas.openxmlformats.org/markup-compatibility/2006" xmlns:aink="http://schemas.microsoft.com/office/drawing/2016/ink" xmlns:am3d="http://schemas.microsoft.com/office/drawing/2017/model3d" xmlns:o="urn:schemas-microsoft-com:office:office" xmlns:oel="http://schemas.microsoft.com/office/2019/extlst" xmlns:r="http://schemas.openxmlformats.org/officeDocument/2006/relationships" xmlns:m="http://schemas.openxmlformats.org/officeDocument/2006/math" xmlns:v="urn:schemas-microsoft-com:vml" xmlns:wp14="http://schemas.microsoft.com/office/word/2010/wordprocessingDrawing" xmlns:wp="http://schemas.openxmlformats.org/drawingml/2006/wordprocessingDrawing" xmlns:w10="urn:schemas-microsoft-com:office:word" xmlns:w="http://schemas.openxmlformats.org/wordprocessingml/2006/main" xmlns:w14="http://schemas.microsoft.com/office/word/2010/wordml" xmlns:w15="http://schemas.microsoft.com/office/word/2012/wordml" xmlns:w16cex="http://schemas.microsoft.com/office/word/2018/wordml/cex" xmlns:w16cid="http://schemas.microsoft.com/office/word/2016/wordml/cid" xmlns:w16="http://schemas.microsoft.com/office/word/2018/wordml" xmlns:w16sdtdh="http://schemas.microsoft.com/office/word/2020/wordml/sdtdatahash" xmlns:w16se="http://schemas.microsoft.com/office/word/2015/wordml/symex" xmlns:wpg="http://schemas.microsoft.com/office/word/2010/wordprocessingGroup" xmlns:wpi="http://schemas.microsoft.com/office/word/2010/wordprocessingInk" xmlns:wne="http://schemas.microsoft.com/office/word/2006/wordml" xmlns:wps="http://schemas.microsoft.com/office/word/2010/wordprocessingShape" mc:Ignorable="w14 w15 w16se w16cid w16 w16cex w16sdtdh wp14">
+<w:ftr xmlns:wpc="http://schemas.microsoft.com/office/word/2010/wordprocessingCanvas" xmlns:cx="http://schemas.microsoft.com/office/drawing/2014/chartex" xmlns:cx1="http://schemas.microsoft.com/office/drawing/2015/9/8/chartex" xmlns:cx2="http://schemas.microsoft.com/office/drawing/2015/10/21/chartex" xmlns:cx3="http://schemas.microsoft.com/office/drawing/2016/5/9/chartex" xmlns:cx4="http://schemas.microsoft.com/office/drawing/2016/5/10/chartex" xmlns:cx5="http://schemas.microsoft.com/office/drawing/2016/5/11/chartex" xmlns:cx6="http://schemas.microsoft.com/office/drawing/2016/5/12/chartex" xmlns:cx7="http://schemas.microsoft.com/office/drawing/2016/5/13/chartex" xmlns:cx8="http://schemas.microsoft.com/office/drawing/2016/5/14/chartex" xmlns:mc="http://schemas.openxmlformats.org/markup-compatibility/2006" xmlns:aink="http://schemas.microsoft.com/office/drawing/2016/ink" xmlns:am3d="http://schemas.microsoft.com/office/drawing/2017/model3d" xmlns:o="urn:schemas-microsoft-com:office:office" xmlns:oel="http://schemas.microsoft.com/office/2019/extlst" xmlns:r="http://schemas.openxmlformats.org/officeDocument/2006/relationships" xmlns:m="http://schemas.openxmlformats.org/officeDocument/2006/math" xmlns:v="urn:schemas-microsoft-com:vml" xmlns:wp14="http://schemas.microsoft.com/office/word/2010/wordprocessingDrawing" xmlns:wp="http://schemas.openxmlformats.org/drawingml/2006/wordprocessingDrawing" xmlns:w10="urn:schemas-microsoft-com:office:word" xmlns:w="http://schemas.openxmlformats.org/wordprocessingml/2006/main" xmlns:w14="http://schemas.microsoft.com/office/word/2010/wordml" xmlns:w15="http://schemas.microsoft.com/office/word/2012/wordml" xmlns:w16cex="http://schemas.microsoft.com/office/word/2018/wordml/cex" xmlns:w16cid="http://schemas.microsoft.com/office/word/2016/wordml/cid" xmlns:w16="http://schemas.microsoft.com/office/word/2018/wordml" xmlns:w16du="http://schemas.microsoft.com/office/word/2023/wordml/word16du" xmlns:w16sdtdh="http://schemas.microsoft.com/office/word/2020/wordml/sdtdatahash" xmlns:w16sdtfl="http://schemas.microsoft.com/office/word/2024/wordml/sdtformatlock" xmlns:w16se="http://schemas.microsoft.com/office/word/2015/wordml/symex" xmlns:wpg="http://schemas.microsoft.com/office/word/2010/wordprocessingGroup" xmlns:wpi="http://schemas.microsoft.com/office/word/2010/wordprocessingInk" xmlns:wne="http://schemas.microsoft.com/office/word/2006/wordml" xmlns:wps="http://schemas.microsoft.com/office/word/2010/wordprocessingShape" mc:Ignorable="w14 w15 w16se w16cid w16 w16cex w16sdtdh w16sdtfl w16du wp14">
   <w:p>
     <w:pPr>
-      <w:pStyle w:val="Footer"/>
+      <w:pStyle w:val="Rodap"/>
       <w:pBdr>
         <w:top w:val="single" w:sz="4" w:space="1" w:color="000000"/>
         <w:left w:val="none" w:sz="0" w:space="0" w:color="000000"/>
@@ -8186,56 +8612,56 @@
     </w:pPr>
     <w:r>
       <w:rPr>
-        <w:rStyle w:val="PageNumber"/>
+        <w:rStyle w:val="Nmerodepgina"/>
       </w:rPr>
       <w:t>«Autor»</w:t>
     </w:r>
     <w:r>
       <w:rPr>
-        <w:rStyle w:val="PageNumber"/>
+        <w:rStyle w:val="Nmerodepgina"/>
       </w:rPr>
       <w:tab/>
     </w:r>
     <w:r>
       <w:rPr>
-        <w:rStyle w:val="PageNumber"/>
+        <w:rStyle w:val="Nmerodepgina"/>
       </w:rPr>
       <w:tab/>
     </w:r>
     <w:r>
       <w:rPr>
-        <w:rStyle w:val="PageNumber"/>
+        <w:rStyle w:val="Nmerodepgina"/>
       </w:rPr>
       <w:tab/>
     </w:r>
     <w:r>
       <w:rPr>
-        <w:rStyle w:val="PageNumber"/>
+        <w:rStyle w:val="Nmerodepgina"/>
       </w:rPr>
       <w:fldChar w:fldCharType="begin"/>
     </w:r>
     <w:r>
       <w:rPr>
-        <w:rStyle w:val="PageNumber"/>
+        <w:rStyle w:val="Nmerodepgina"/>
       </w:rPr>
       <w:instrText xml:space="preserve"> PAGE </w:instrText>
     </w:r>
     <w:r>
       <w:rPr>
-        <w:rStyle w:val="PageNumber"/>
+        <w:rStyle w:val="Nmerodepgina"/>
       </w:rPr>
       <w:fldChar w:fldCharType="separate"/>
     </w:r>
     <w:r>
       <w:rPr>
-        <w:rStyle w:val="PageNumber"/>
+        <w:rStyle w:val="Nmerodepgina"/>
         <w:noProof/>
       </w:rPr>
       <w:t>iv</w:t>
     </w:r>
     <w:r>
       <w:rPr>
-        <w:rStyle w:val="PageNumber"/>
+        <w:rStyle w:val="Nmerodepgina"/>
       </w:rPr>
       <w:fldChar w:fldCharType="end"/>
     </w:r>
@@ -8244,10 +8670,10 @@
 </file>
 
 <file path=word/footer10.xml><?xml version="1.0" encoding="utf-8"?>
-<w:ftr xmlns:wpc="http://schemas.microsoft.com/office/word/2010/wordprocessingCanvas" xmlns:cx="http://schemas.microsoft.com/office/drawing/2014/chartex" xmlns:cx1="http://schemas.microsoft.com/office/drawing/2015/9/8/chartex" xmlns:cx2="http://schemas.microsoft.com/office/drawing/2015/10/21/chartex" xmlns:cx3="http://schemas.microsoft.com/office/drawing/2016/5/9/chartex" xmlns:cx4="http://schemas.microsoft.com/office/drawing/2016/5/10/chartex" xmlns:cx5="http://schemas.microsoft.com/office/drawing/2016/5/11/chartex" xmlns:cx6="http://schemas.microsoft.com/office/drawing/2016/5/12/chartex" xmlns:cx7="http://schemas.microsoft.com/office/drawing/2016/5/13/chartex" xmlns:cx8="http://schemas.microsoft.com/office/drawing/2016/5/14/chartex" xmlns:mc="http://schemas.openxmlformats.org/markup-compatibility/2006" xmlns:aink="http://schemas.microsoft.com/office/drawing/2016/ink" xmlns:am3d="http://schemas.microsoft.com/office/drawing/2017/model3d" xmlns:o="urn:schemas-microsoft-com:office:office" xmlns:oel="http://schemas.microsoft.com/office/2019/extlst" xmlns:r="http://schemas.openxmlformats.org/officeDocument/2006/relationships" xmlns:m="http://schemas.openxmlformats.org/officeDocument/2006/math" xmlns:v="urn:schemas-microsoft-com:vml" xmlns:wp14="http://schemas.microsoft.com/office/word/2010/wordprocessingDrawing" xmlns:wp="http://schemas.openxmlformats.org/drawingml/2006/wordprocessingDrawing" xmlns:w10="urn:schemas-microsoft-com:office:word" xmlns:w="http://schemas.openxmlformats.org/wordprocessingml/2006/main" xmlns:w14="http://schemas.microsoft.com/office/word/2010/wordml" xmlns:w15="http://schemas.microsoft.com/office/word/2012/wordml" xmlns:w16cex="http://schemas.microsoft.com/office/word/2018/wordml/cex" xmlns:w16cid="http://schemas.microsoft.com/office/word/2016/wordml/cid" xmlns:w16="http://schemas.microsoft.com/office/word/2018/wordml" xmlns:w16sdtdh="http://schemas.microsoft.com/office/word/2020/wordml/sdtdatahash" xmlns:w16se="http://schemas.microsoft.com/office/word/2015/wordml/symex" xmlns:wpg="http://schemas.microsoft.com/office/word/2010/wordprocessingGroup" xmlns:wpi="http://schemas.microsoft.com/office/word/2010/wordprocessingInk" xmlns:wne="http://schemas.microsoft.com/office/word/2006/wordml" xmlns:wps="http://schemas.microsoft.com/office/word/2010/wordprocessingShape" mc:Ignorable="w14 w15 w16se w16cid w16 w16cex w16sdtdh wp14">
+<w:ftr xmlns:wpc="http://schemas.microsoft.com/office/word/2010/wordprocessingCanvas" xmlns:cx="http://schemas.microsoft.com/office/drawing/2014/chartex" xmlns:cx1="http://schemas.microsoft.com/office/drawing/2015/9/8/chartex" xmlns:cx2="http://schemas.microsoft.com/office/drawing/2015/10/21/chartex" xmlns:cx3="http://schemas.microsoft.com/office/drawing/2016/5/9/chartex" xmlns:cx4="http://schemas.microsoft.com/office/drawing/2016/5/10/chartex" xmlns:cx5="http://schemas.microsoft.com/office/drawing/2016/5/11/chartex" xmlns:cx6="http://schemas.microsoft.com/office/drawing/2016/5/12/chartex" xmlns:cx7="http://schemas.microsoft.com/office/drawing/2016/5/13/chartex" xmlns:cx8="http://schemas.microsoft.com/office/drawing/2016/5/14/chartex" xmlns:mc="http://schemas.openxmlformats.org/markup-compatibility/2006" xmlns:aink="http://schemas.microsoft.com/office/drawing/2016/ink" xmlns:am3d="http://schemas.microsoft.com/office/drawing/2017/model3d" xmlns:o="urn:schemas-microsoft-com:office:office" xmlns:oel="http://schemas.microsoft.com/office/2019/extlst" xmlns:r="http://schemas.openxmlformats.org/officeDocument/2006/relationships" xmlns:m="http://schemas.openxmlformats.org/officeDocument/2006/math" xmlns:v="urn:schemas-microsoft-com:vml" xmlns:wp14="http://schemas.microsoft.com/office/word/2010/wordprocessingDrawing" xmlns:wp="http://schemas.openxmlformats.org/drawingml/2006/wordprocessingDrawing" xmlns:w10="urn:schemas-microsoft-com:office:word" xmlns:w="http://schemas.openxmlformats.org/wordprocessingml/2006/main" xmlns:w14="http://schemas.microsoft.com/office/word/2010/wordml" xmlns:w15="http://schemas.microsoft.com/office/word/2012/wordml" xmlns:w16cex="http://schemas.microsoft.com/office/word/2018/wordml/cex" xmlns:w16cid="http://schemas.microsoft.com/office/word/2016/wordml/cid" xmlns:w16="http://schemas.microsoft.com/office/word/2018/wordml" xmlns:w16du="http://schemas.microsoft.com/office/word/2023/wordml/word16du" xmlns:w16sdtdh="http://schemas.microsoft.com/office/word/2020/wordml/sdtdatahash" xmlns:w16sdtfl="http://schemas.microsoft.com/office/word/2024/wordml/sdtformatlock" xmlns:w16se="http://schemas.microsoft.com/office/word/2015/wordml/symex" xmlns:wpg="http://schemas.microsoft.com/office/word/2010/wordprocessingGroup" xmlns:wpi="http://schemas.microsoft.com/office/word/2010/wordprocessingInk" xmlns:wne="http://schemas.microsoft.com/office/word/2006/wordml" xmlns:wps="http://schemas.microsoft.com/office/word/2010/wordprocessingShape" mc:Ignorable="w14 w15 w16se w16cid w16 w16cex w16sdtdh w16sdtfl w16du wp14">
   <w:p>
     <w:pPr>
-      <w:pStyle w:val="Footer"/>
+      <w:pStyle w:val="Rodap"/>
       <w:pBdr>
         <w:top w:val="single" w:sz="4" w:space="1" w:color="000000"/>
         <w:left w:val="none" w:sz="0" w:space="0" w:color="000000"/>
@@ -8263,56 +8689,56 @@
     </w:pPr>
     <w:r>
       <w:rPr>
-        <w:rStyle w:val="PageNumber"/>
+        <w:rStyle w:val="Nmerodepgina"/>
       </w:rPr>
       <w:t>«Autor»</w:t>
     </w:r>
     <w:r>
       <w:rPr>
-        <w:rStyle w:val="PageNumber"/>
+        <w:rStyle w:val="Nmerodepgina"/>
       </w:rPr>
       <w:tab/>
     </w:r>
     <w:r>
       <w:rPr>
-        <w:rStyle w:val="PageNumber"/>
+        <w:rStyle w:val="Nmerodepgina"/>
       </w:rPr>
       <w:tab/>
     </w:r>
     <w:r>
       <w:rPr>
-        <w:rStyle w:val="PageNumber"/>
+        <w:rStyle w:val="Nmerodepgina"/>
       </w:rPr>
       <w:tab/>
     </w:r>
     <w:r>
       <w:rPr>
-        <w:rStyle w:val="PageNumber"/>
+        <w:rStyle w:val="Nmerodepgina"/>
       </w:rPr>
       <w:fldChar w:fldCharType="begin"/>
     </w:r>
     <w:r>
       <w:rPr>
-        <w:rStyle w:val="PageNumber"/>
+        <w:rStyle w:val="Nmerodepgina"/>
       </w:rPr>
       <w:instrText xml:space="preserve"> PAGE </w:instrText>
     </w:r>
     <w:r>
       <w:rPr>
-        <w:rStyle w:val="PageNumber"/>
+        <w:rStyle w:val="Nmerodepgina"/>
       </w:rPr>
       <w:fldChar w:fldCharType="separate"/>
     </w:r>
     <w:r>
       <w:rPr>
-        <w:rStyle w:val="PageNumber"/>
+        <w:rStyle w:val="Nmerodepgina"/>
         <w:noProof/>
       </w:rPr>
       <w:t>xii</w:t>
     </w:r>
     <w:r>
       <w:rPr>
-        <w:rStyle w:val="PageNumber"/>
+        <w:rStyle w:val="Nmerodepgina"/>
       </w:rPr>
       <w:fldChar w:fldCharType="end"/>
     </w:r>
@@ -8321,10 +8747,10 @@
 </file>
 
 <file path=word/footer11.xml><?xml version="1.0" encoding="utf-8"?>
-<w:ftr xmlns:wpc="http://schemas.microsoft.com/office/word/2010/wordprocessingCanvas" xmlns:cx="http://schemas.microsoft.com/office/drawing/2014/chartex" xmlns:cx1="http://schemas.microsoft.com/office/drawing/2015/9/8/chartex" xmlns:cx2="http://schemas.microsoft.com/office/drawing/2015/10/21/chartex" xmlns:cx3="http://schemas.microsoft.com/office/drawing/2016/5/9/chartex" xmlns:cx4="http://schemas.microsoft.com/office/drawing/2016/5/10/chartex" xmlns:cx5="http://schemas.microsoft.com/office/drawing/2016/5/11/chartex" xmlns:cx6="http://schemas.microsoft.com/office/drawing/2016/5/12/chartex" xmlns:cx7="http://schemas.microsoft.com/office/drawing/2016/5/13/chartex" xmlns:cx8="http://schemas.microsoft.com/office/drawing/2016/5/14/chartex" xmlns:mc="http://schemas.openxmlformats.org/markup-compatibility/2006" xmlns:aink="http://schemas.microsoft.com/office/drawing/2016/ink" xmlns:am3d="http://schemas.microsoft.com/office/drawing/2017/model3d" xmlns:o="urn:schemas-microsoft-com:office:office" xmlns:oel="http://schemas.microsoft.com/office/2019/extlst" xmlns:r="http://schemas.openxmlformats.org/officeDocument/2006/relationships" xmlns:m="http://schemas.openxmlformats.org/officeDocument/2006/math" xmlns:v="urn:schemas-microsoft-com:vml" xmlns:wp14="http://schemas.microsoft.com/office/word/2010/wordprocessingDrawing" xmlns:wp="http://schemas.openxmlformats.org/drawingml/2006/wordprocessingDrawing" xmlns:w10="urn:schemas-microsoft-com:office:word" xmlns:w="http://schemas.openxmlformats.org/wordprocessingml/2006/main" xmlns:w14="http://schemas.microsoft.com/office/word/2010/wordml" xmlns:w15="http://schemas.microsoft.com/office/word/2012/wordml" xmlns:w16cex="http://schemas.microsoft.com/office/word/2018/wordml/cex" xmlns:w16cid="http://schemas.microsoft.com/office/word/2016/wordml/cid" xmlns:w16="http://schemas.microsoft.com/office/word/2018/wordml" xmlns:w16sdtdh="http://schemas.microsoft.com/office/word/2020/wordml/sdtdatahash" xmlns:w16se="http://schemas.microsoft.com/office/word/2015/wordml/symex" xmlns:wpg="http://schemas.microsoft.com/office/word/2010/wordprocessingGroup" xmlns:wpi="http://schemas.microsoft.com/office/word/2010/wordprocessingInk" xmlns:wne="http://schemas.microsoft.com/office/word/2006/wordml" xmlns:wps="http://schemas.microsoft.com/office/word/2010/wordprocessingShape" mc:Ignorable="w14 w15 w16se w16cid w16 w16cex w16sdtdh wp14">
+<w:ftr xmlns:wpc="http://schemas.microsoft.com/office/word/2010/wordprocessingCanvas" xmlns:cx="http://schemas.microsoft.com/office/drawing/2014/chartex" xmlns:cx1="http://schemas.microsoft.com/office/drawing/2015/9/8/chartex" xmlns:cx2="http://schemas.microsoft.com/office/drawing/2015/10/21/chartex" xmlns:cx3="http://schemas.microsoft.com/office/drawing/2016/5/9/chartex" xmlns:cx4="http://schemas.microsoft.com/office/drawing/2016/5/10/chartex" xmlns:cx5="http://schemas.microsoft.com/office/drawing/2016/5/11/chartex" xmlns:cx6="http://schemas.microsoft.com/office/drawing/2016/5/12/chartex" xmlns:cx7="http://schemas.microsoft.com/office/drawing/2016/5/13/chartex" xmlns:cx8="http://schemas.microsoft.com/office/drawing/2016/5/14/chartex" xmlns:mc="http://schemas.openxmlformats.org/markup-compatibility/2006" xmlns:aink="http://schemas.microsoft.com/office/drawing/2016/ink" xmlns:am3d="http://schemas.microsoft.com/office/drawing/2017/model3d" xmlns:o="urn:schemas-microsoft-com:office:office" xmlns:oel="http://schemas.microsoft.com/office/2019/extlst" xmlns:r="http://schemas.openxmlformats.org/officeDocument/2006/relationships" xmlns:m="http://schemas.openxmlformats.org/officeDocument/2006/math" xmlns:v="urn:schemas-microsoft-com:vml" xmlns:wp14="http://schemas.microsoft.com/office/word/2010/wordprocessingDrawing" xmlns:wp="http://schemas.openxmlformats.org/drawingml/2006/wordprocessingDrawing" xmlns:w10="urn:schemas-microsoft-com:office:word" xmlns:w="http://schemas.openxmlformats.org/wordprocessingml/2006/main" xmlns:w14="http://schemas.microsoft.com/office/word/2010/wordml" xmlns:w15="http://schemas.microsoft.com/office/word/2012/wordml" xmlns:w16cex="http://schemas.microsoft.com/office/word/2018/wordml/cex" xmlns:w16cid="http://schemas.microsoft.com/office/word/2016/wordml/cid" xmlns:w16="http://schemas.microsoft.com/office/word/2018/wordml" xmlns:w16du="http://schemas.microsoft.com/office/word/2023/wordml/word16du" xmlns:w16sdtdh="http://schemas.microsoft.com/office/word/2020/wordml/sdtdatahash" xmlns:w16sdtfl="http://schemas.microsoft.com/office/word/2024/wordml/sdtformatlock" xmlns:w16se="http://schemas.microsoft.com/office/word/2015/wordml/symex" xmlns:wpg="http://schemas.microsoft.com/office/word/2010/wordprocessingGroup" xmlns:wpi="http://schemas.microsoft.com/office/word/2010/wordprocessingInk" xmlns:wne="http://schemas.microsoft.com/office/word/2006/wordml" xmlns:wps="http://schemas.microsoft.com/office/word/2010/wordprocessingShape" mc:Ignorable="w14 w15 w16se w16cid w16 w16cex w16sdtdh w16sdtfl w16du wp14">
   <w:p>
     <w:pPr>
-      <w:pStyle w:val="Footer"/>
+      <w:pStyle w:val="Rodap"/>
       <w:pBdr>
         <w:top w:val="single" w:sz="4" w:space="1" w:color="000000"/>
         <w:left w:val="none" w:sz="0" w:space="0" w:color="000000"/>
@@ -8340,56 +8766,56 @@
     </w:pPr>
     <w:r>
       <w:rPr>
-        <w:rStyle w:val="PageNumber"/>
+        <w:rStyle w:val="Nmerodepgina"/>
       </w:rPr>
       <w:t>«Autor»</w:t>
     </w:r>
     <w:r>
       <w:rPr>
-        <w:rStyle w:val="PageNumber"/>
+        <w:rStyle w:val="Nmerodepgina"/>
       </w:rPr>
       <w:tab/>
     </w:r>
     <w:r>
       <w:rPr>
-        <w:rStyle w:val="PageNumber"/>
+        <w:rStyle w:val="Nmerodepgina"/>
       </w:rPr>
       <w:tab/>
     </w:r>
     <w:r>
       <w:rPr>
-        <w:rStyle w:val="PageNumber"/>
+        <w:rStyle w:val="Nmerodepgina"/>
       </w:rPr>
       <w:tab/>
     </w:r>
     <w:r>
       <w:rPr>
-        <w:rStyle w:val="PageNumber"/>
+        <w:rStyle w:val="Nmerodepgina"/>
       </w:rPr>
       <w:fldChar w:fldCharType="begin"/>
     </w:r>
     <w:r>
       <w:rPr>
-        <w:rStyle w:val="PageNumber"/>
+        <w:rStyle w:val="Nmerodepgina"/>
       </w:rPr>
       <w:instrText xml:space="preserve"> PAGE </w:instrText>
     </w:r>
     <w:r>
       <w:rPr>
-        <w:rStyle w:val="PageNumber"/>
+        <w:rStyle w:val="Nmerodepgina"/>
       </w:rPr>
       <w:fldChar w:fldCharType="separate"/>
     </w:r>
     <w:r>
       <w:rPr>
-        <w:rStyle w:val="PageNumber"/>
+        <w:rStyle w:val="Nmerodepgina"/>
         <w:noProof/>
       </w:rPr>
       <w:t>xi</w:t>
     </w:r>
     <w:r>
       <w:rPr>
-        <w:rStyle w:val="PageNumber"/>
+        <w:rStyle w:val="Nmerodepgina"/>
       </w:rPr>
       <w:fldChar w:fldCharType="end"/>
     </w:r>
@@ -8398,16 +8824,16 @@
 </file>
 
 <file path=word/footer12.xml><?xml version="1.0" encoding="utf-8"?>
-<w:ftr xmlns:wpc="http://schemas.microsoft.com/office/word/2010/wordprocessingCanvas" xmlns:cx="http://schemas.microsoft.com/office/drawing/2014/chartex" xmlns:cx1="http://schemas.microsoft.com/office/drawing/2015/9/8/chartex" xmlns:cx2="http://schemas.microsoft.com/office/drawing/2015/10/21/chartex" xmlns:cx3="http://schemas.microsoft.com/office/drawing/2016/5/9/chartex" xmlns:cx4="http://schemas.microsoft.com/office/drawing/2016/5/10/chartex" xmlns:cx5="http://schemas.microsoft.com/office/drawing/2016/5/11/chartex" xmlns:cx6="http://schemas.microsoft.com/office/drawing/2016/5/12/chartex" xmlns:cx7="http://schemas.microsoft.com/office/drawing/2016/5/13/chartex" xmlns:cx8="http://schemas.microsoft.com/office/drawing/2016/5/14/chartex" xmlns:mc="http://schemas.openxmlformats.org/markup-compatibility/2006" xmlns:aink="http://schemas.microsoft.com/office/drawing/2016/ink" xmlns:am3d="http://schemas.microsoft.com/office/drawing/2017/model3d" xmlns:o="urn:schemas-microsoft-com:office:office" xmlns:oel="http://schemas.microsoft.com/office/2019/extlst" xmlns:r="http://schemas.openxmlformats.org/officeDocument/2006/relationships" xmlns:m="http://schemas.openxmlformats.org/officeDocument/2006/math" xmlns:v="urn:schemas-microsoft-com:vml" xmlns:wp14="http://schemas.microsoft.com/office/word/2010/wordprocessingDrawing" xmlns:wp="http://schemas.openxmlformats.org/drawingml/2006/wordprocessingDrawing" xmlns:w10="urn:schemas-microsoft-com:office:word" xmlns:w="http://schemas.openxmlformats.org/wordprocessingml/2006/main" xmlns:w14="http://schemas.microsoft.com/office/word/2010/wordml" xmlns:w15="http://schemas.microsoft.com/office/word/2012/wordml" xmlns:w16cex="http://schemas.microsoft.com/office/word/2018/wordml/cex" xmlns:w16cid="http://schemas.microsoft.com/office/word/2016/wordml/cid" xmlns:w16="http://schemas.microsoft.com/office/word/2018/wordml" xmlns:w16sdtdh="http://schemas.microsoft.com/office/word/2020/wordml/sdtdatahash" xmlns:w16se="http://schemas.microsoft.com/office/word/2015/wordml/symex" xmlns:wpg="http://schemas.microsoft.com/office/word/2010/wordprocessingGroup" xmlns:wpi="http://schemas.microsoft.com/office/word/2010/wordprocessingInk" xmlns:wne="http://schemas.microsoft.com/office/word/2006/wordml" xmlns:wps="http://schemas.microsoft.com/office/word/2010/wordprocessingShape" mc:Ignorable="w14 w15 w16se w16cid w16 w16cex w16sdtdh wp14">
+<w:ftr xmlns:wpc="http://schemas.microsoft.com/office/word/2010/wordprocessingCanvas" xmlns:cx="http://schemas.microsoft.com/office/drawing/2014/chartex" xmlns:cx1="http://schemas.microsoft.com/office/drawing/2015/9/8/chartex" xmlns:cx2="http://schemas.microsoft.com/office/drawing/2015/10/21/chartex" xmlns:cx3="http://schemas.microsoft.com/office/drawing/2016/5/9/chartex" xmlns:cx4="http://schemas.microsoft.com/office/drawing/2016/5/10/chartex" xmlns:cx5="http://schemas.microsoft.com/office/drawing/2016/5/11/chartex" xmlns:cx6="http://schemas.microsoft.com/office/drawing/2016/5/12/chartex" xmlns:cx7="http://schemas.microsoft.com/office/drawing/2016/5/13/chartex" xmlns:cx8="http://schemas.microsoft.com/office/drawing/2016/5/14/chartex" xmlns:mc="http://schemas.openxmlformats.org/markup-compatibility/2006" xmlns:aink="http://schemas.microsoft.com/office/drawing/2016/ink" xmlns:am3d="http://schemas.microsoft.com/office/drawing/2017/model3d" xmlns:o="urn:schemas-microsoft-com:office:office" xmlns:oel="http://schemas.microsoft.com/office/2019/extlst" xmlns:r="http://schemas.openxmlformats.org/officeDocument/2006/relationships" xmlns:m="http://schemas.openxmlformats.org/officeDocument/2006/math" xmlns:v="urn:schemas-microsoft-com:vml" xmlns:wp14="http://schemas.microsoft.com/office/word/2010/wordprocessingDrawing" xmlns:wp="http://schemas.openxmlformats.org/drawingml/2006/wordprocessingDrawing" xmlns:w10="urn:schemas-microsoft-com:office:word" xmlns:w="http://schemas.openxmlformats.org/wordprocessingml/2006/main" xmlns:w14="http://schemas.microsoft.com/office/word/2010/wordml" xmlns:w15="http://schemas.microsoft.com/office/word/2012/wordml" xmlns:w16cex="http://schemas.microsoft.com/office/word/2018/wordml/cex" xmlns:w16cid="http://schemas.microsoft.com/office/word/2016/wordml/cid" xmlns:w16="http://schemas.microsoft.com/office/word/2018/wordml" xmlns:w16du="http://schemas.microsoft.com/office/word/2023/wordml/word16du" xmlns:w16sdtdh="http://schemas.microsoft.com/office/word/2020/wordml/sdtdatahash" xmlns:w16sdtfl="http://schemas.microsoft.com/office/word/2024/wordml/sdtformatlock" xmlns:w16se="http://schemas.microsoft.com/office/word/2015/wordml/symex" xmlns:wpg="http://schemas.microsoft.com/office/word/2010/wordprocessingGroup" xmlns:wpi="http://schemas.microsoft.com/office/word/2010/wordprocessingInk" xmlns:wne="http://schemas.microsoft.com/office/word/2006/wordml" xmlns:wps="http://schemas.microsoft.com/office/word/2010/wordprocessingShape" mc:Ignorable="w14 w15 w16se w16cid w16 w16cex w16sdtdh w16sdtfl w16du wp14">
   <w:p/>
 </w:ftr>
 </file>
 
 <file path=word/footer13.xml><?xml version="1.0" encoding="utf-8"?>
-<w:ftr xmlns:wpc="http://schemas.microsoft.com/office/word/2010/wordprocessingCanvas" xmlns:cx="http://schemas.microsoft.com/office/drawing/2014/chartex" xmlns:cx1="http://schemas.microsoft.com/office/drawing/2015/9/8/chartex" xmlns:cx2="http://schemas.microsoft.com/office/drawing/2015/10/21/chartex" xmlns:cx3="http://schemas.microsoft.com/office/drawing/2016/5/9/chartex" xmlns:cx4="http://schemas.microsoft.com/office/drawing/2016/5/10/chartex" xmlns:cx5="http://schemas.microsoft.com/office/drawing/2016/5/11/chartex" xmlns:cx6="http://schemas.microsoft.com/office/drawing/2016/5/12/chartex" xmlns:cx7="http://schemas.microsoft.com/office/drawing/2016/5/13/chartex" xmlns:cx8="http://schemas.microsoft.com/office/drawing/2016/5/14/chartex" xmlns:mc="http://schemas.openxmlformats.org/markup-compatibility/2006" xmlns:aink="http://schemas.microsoft.com/office/drawing/2016/ink" xmlns:am3d="http://schemas.microsoft.com/office/drawing/2017/model3d" xmlns:o="urn:schemas-microsoft-com:office:office" xmlns:oel="http://schemas.microsoft.com/office/2019/extlst" xmlns:r="http://schemas.openxmlformats.org/officeDocument/2006/relationships" xmlns:m="http://schemas.openxmlformats.org/officeDocument/2006/math" xmlns:v="urn:schemas-microsoft-com:vml" xmlns:wp14="http://schemas.microsoft.com/office/word/2010/wordprocessingDrawing" xmlns:wp="http://schemas.openxmlformats.org/drawingml/2006/wordprocessingDrawing" xmlns:w10="urn:schemas-microsoft-com:office:word" xmlns:w="http://schemas.openxmlformats.org/wordprocessingml/2006/main" xmlns:w14="http://schemas.microsoft.com/office/word/2010/wordml" xmlns:w15="http://schemas.microsoft.com/office/word/2012/wordml" xmlns:w16cex="http://schemas.microsoft.com/office/word/2018/wordml/cex" xmlns:w16cid="http://schemas.microsoft.com/office/word/2016/wordml/cid" xmlns:w16="http://schemas.microsoft.com/office/word/2018/wordml" xmlns:w16sdtdh="http://schemas.microsoft.com/office/word/2020/wordml/sdtdatahash" xmlns:w16se="http://schemas.microsoft.com/office/word/2015/wordml/symex" xmlns:wpg="http://schemas.microsoft.com/office/word/2010/wordprocessingGroup" xmlns:wpi="http://schemas.microsoft.com/office/word/2010/wordprocessingInk" xmlns:wne="http://schemas.microsoft.com/office/word/2006/wordml" xmlns:wps="http://schemas.microsoft.com/office/word/2010/wordprocessingShape" mc:Ignorable="w14 w15 w16se w16cid w16 w16cex w16sdtdh wp14">
+<w:ftr xmlns:wpc="http://schemas.microsoft.com/office/word/2010/wordprocessingCanvas" xmlns:cx="http://schemas.microsoft.com/office/drawing/2014/chartex" xmlns:cx1="http://schemas.microsoft.com/office/drawing/2015/9/8/chartex" xmlns:cx2="http://schemas.microsoft.com/office/drawing/2015/10/21/chartex" xmlns:cx3="http://schemas.microsoft.com/office/drawing/2016/5/9/chartex" xmlns:cx4="http://schemas.microsoft.com/office/drawing/2016/5/10/chartex" xmlns:cx5="http://schemas.microsoft.com/office/drawing/2016/5/11/chartex" xmlns:cx6="http://schemas.microsoft.com/office/drawing/2016/5/12/chartex" xmlns:cx7="http://schemas.microsoft.com/office/drawing/2016/5/13/chartex" xmlns:cx8="http://schemas.microsoft.com/office/drawing/2016/5/14/chartex" xmlns:mc="http://schemas.openxmlformats.org/markup-compatibility/2006" xmlns:aink="http://schemas.microsoft.com/office/drawing/2016/ink" xmlns:am3d="http://schemas.microsoft.com/office/drawing/2017/model3d" xmlns:o="urn:schemas-microsoft-com:office:office" xmlns:oel="http://schemas.microsoft.com/office/2019/extlst" xmlns:r="http://schemas.openxmlformats.org/officeDocument/2006/relationships" xmlns:m="http://schemas.openxmlformats.org/officeDocument/2006/math" xmlns:v="urn:schemas-microsoft-com:vml" xmlns:wp14="http://schemas.microsoft.com/office/word/2010/wordprocessingDrawing" xmlns:wp="http://schemas.openxmlformats.org/drawingml/2006/wordprocessingDrawing" xmlns:w10="urn:schemas-microsoft-com:office:word" xmlns:w="http://schemas.openxmlformats.org/wordprocessingml/2006/main" xmlns:w14="http://schemas.microsoft.com/office/word/2010/wordml" xmlns:w15="http://schemas.microsoft.com/office/word/2012/wordml" xmlns:w16cex="http://schemas.microsoft.com/office/word/2018/wordml/cex" xmlns:w16cid="http://schemas.microsoft.com/office/word/2016/wordml/cid" xmlns:w16="http://schemas.microsoft.com/office/word/2018/wordml" xmlns:w16du="http://schemas.microsoft.com/office/word/2023/wordml/word16du" xmlns:w16sdtdh="http://schemas.microsoft.com/office/word/2020/wordml/sdtdatahash" xmlns:w16sdtfl="http://schemas.microsoft.com/office/word/2024/wordml/sdtformatlock" xmlns:w16se="http://schemas.microsoft.com/office/word/2015/wordml/symex" xmlns:wpg="http://schemas.microsoft.com/office/word/2010/wordprocessingGroup" xmlns:wpi="http://schemas.microsoft.com/office/word/2010/wordprocessingInk" xmlns:wne="http://schemas.microsoft.com/office/word/2006/wordml" xmlns:wps="http://schemas.microsoft.com/office/word/2010/wordprocessingShape" mc:Ignorable="w14 w15 w16se w16cid w16 w16cex w16sdtdh w16sdtfl w16du wp14">
   <w:p>
     <w:pPr>
-      <w:pStyle w:val="Footer"/>
+      <w:pStyle w:val="Rodap"/>
       <w:pBdr>
         <w:top w:val="single" w:sz="4" w:space="1" w:color="000000"/>
         <w:left w:val="none" w:sz="0" w:space="0" w:color="000000"/>
@@ -8423,56 +8849,56 @@
     </w:pPr>
     <w:r>
       <w:rPr>
-        <w:rStyle w:val="PageNumber"/>
+        <w:rStyle w:val="Nmerodepgina"/>
       </w:rPr>
       <w:t>«Autor»</w:t>
     </w:r>
     <w:r>
       <w:rPr>
-        <w:rStyle w:val="PageNumber"/>
+        <w:rStyle w:val="Nmerodepgina"/>
       </w:rPr>
       <w:tab/>
     </w:r>
     <w:r>
       <w:rPr>
-        <w:rStyle w:val="PageNumber"/>
+        <w:rStyle w:val="Nmerodepgina"/>
       </w:rPr>
       <w:tab/>
     </w:r>
     <w:r>
       <w:rPr>
-        <w:rStyle w:val="PageNumber"/>
+        <w:rStyle w:val="Nmerodepgina"/>
       </w:rPr>
       <w:tab/>
     </w:r>
     <w:r>
       <w:rPr>
-        <w:rStyle w:val="PageNumber"/>
+        <w:rStyle w:val="Nmerodepgina"/>
       </w:rPr>
       <w:fldChar w:fldCharType="begin"/>
     </w:r>
     <w:r>
       <w:rPr>
-        <w:rStyle w:val="PageNumber"/>
+        <w:rStyle w:val="Nmerodepgina"/>
       </w:rPr>
       <w:instrText xml:space="preserve"> PAGE </w:instrText>
     </w:r>
     <w:r>
       <w:rPr>
-        <w:rStyle w:val="PageNumber"/>
+        <w:rStyle w:val="Nmerodepgina"/>
       </w:rPr>
       <w:fldChar w:fldCharType="separate"/>
     </w:r>
     <w:r>
       <w:rPr>
-        <w:rStyle w:val="PageNumber"/>
+        <w:rStyle w:val="Nmerodepgina"/>
         <w:noProof/>
       </w:rPr>
       <w:t>2</w:t>
     </w:r>
     <w:r>
       <w:rPr>
-        <w:rStyle w:val="PageNumber"/>
+        <w:rStyle w:val="Nmerodepgina"/>
       </w:rPr>
       <w:fldChar w:fldCharType="end"/>
     </w:r>
@@ -8481,10 +8907,10 @@
 </file>
 
 <file path=word/footer14.xml><?xml version="1.0" encoding="utf-8"?>
-<w:ftr xmlns:wpc="http://schemas.microsoft.com/office/word/2010/wordprocessingCanvas" xmlns:cx="http://schemas.microsoft.com/office/drawing/2014/chartex" xmlns:cx1="http://schemas.microsoft.com/office/drawing/2015/9/8/chartex" xmlns:cx2="http://schemas.microsoft.com/office/drawing/2015/10/21/chartex" xmlns:cx3="http://schemas.microsoft.com/office/drawing/2016/5/9/chartex" xmlns:cx4="http://schemas.microsoft.com/office/drawing/2016/5/10/chartex" xmlns:cx5="http://schemas.microsoft.com/office/drawing/2016/5/11/chartex" xmlns:cx6="http://schemas.microsoft.com/office/drawing/2016/5/12/chartex" xmlns:cx7="http://schemas.microsoft.com/office/drawing/2016/5/13/chartex" xmlns:cx8="http://schemas.microsoft.com/office/drawing/2016/5/14/chartex" xmlns:mc="http://schemas.openxmlformats.org/markup-compatibility/2006" xmlns:aink="http://schemas.microsoft.com/office/drawing/2016/ink" xmlns:am3d="http://schemas.microsoft.com/office/drawing/2017/model3d" xmlns:o="urn:schemas-microsoft-com:office:office" xmlns:oel="http://schemas.microsoft.com/office/2019/extlst" xmlns:r="http://schemas.openxmlformats.org/officeDocument/2006/relationships" xmlns:m="http://schemas.openxmlformats.org/officeDocument/2006/math" xmlns:v="urn:schemas-microsoft-com:vml" xmlns:wp14="http://schemas.microsoft.com/office/word/2010/wordprocessingDrawing" xmlns:wp="http://schemas.openxmlformats.org/drawingml/2006/wordprocessingDrawing" xmlns:w10="urn:schemas-microsoft-com:office:word" xmlns:w="http://schemas.openxmlformats.org/wordprocessingml/2006/main" xmlns:w14="http://schemas.microsoft.com/office/word/2010/wordml" xmlns:w15="http://schemas.microsoft.com/office/word/2012/wordml" xmlns:w16cex="http://schemas.microsoft.com/office/word/2018/wordml/cex" xmlns:w16cid="http://schemas.microsoft.com/office/word/2016/wordml/cid" xmlns:w16="http://schemas.microsoft.com/office/word/2018/wordml" xmlns:w16sdtdh="http://schemas.microsoft.com/office/word/2020/wordml/sdtdatahash" xmlns:w16se="http://schemas.microsoft.com/office/word/2015/wordml/symex" xmlns:wpg="http://schemas.microsoft.com/office/word/2010/wordprocessingGroup" xmlns:wpi="http://schemas.microsoft.com/office/word/2010/wordprocessingInk" xmlns:wne="http://schemas.microsoft.com/office/word/2006/wordml" xmlns:wps="http://schemas.microsoft.com/office/word/2010/wordprocessingShape" mc:Ignorable="w14 w15 w16se w16cid w16 w16cex w16sdtdh wp14">
+<w:ftr xmlns:wpc="http://schemas.microsoft.com/office/word/2010/wordprocessingCanvas" xmlns:cx="http://schemas.microsoft.com/office/drawing/2014/chartex" xmlns:cx1="http://schemas.microsoft.com/office/drawing/2015/9/8/chartex" xmlns:cx2="http://schemas.microsoft.com/office/drawing/2015/10/21/chartex" xmlns:cx3="http://schemas.microsoft.com/office/drawing/2016/5/9/chartex" xmlns:cx4="http://schemas.microsoft.com/office/drawing/2016/5/10/chartex" xmlns:cx5="http://schemas.microsoft.com/office/drawing/2016/5/11/chartex" xmlns:cx6="http://schemas.microsoft.com/office/drawing/2016/5/12/chartex" xmlns:cx7="http://schemas.microsoft.com/office/drawing/2016/5/13/chartex" xmlns:cx8="http://schemas.microsoft.com/office/drawing/2016/5/14/chartex" xmlns:mc="http://schemas.openxmlformats.org/markup-compatibility/2006" xmlns:aink="http://schemas.microsoft.com/office/drawing/2016/ink" xmlns:am3d="http://schemas.microsoft.com/office/drawing/2017/model3d" xmlns:o="urn:schemas-microsoft-com:office:office" xmlns:oel="http://schemas.microsoft.com/office/2019/extlst" xmlns:r="http://schemas.openxmlformats.org/officeDocument/2006/relationships" xmlns:m="http://schemas.openxmlformats.org/officeDocument/2006/math" xmlns:v="urn:schemas-microsoft-com:vml" xmlns:wp14="http://schemas.microsoft.com/office/word/2010/wordprocessingDrawing" xmlns:wp="http://schemas.openxmlformats.org/drawingml/2006/wordprocessingDrawing" xmlns:w10="urn:schemas-microsoft-com:office:word" xmlns:w="http://schemas.openxmlformats.org/wordprocessingml/2006/main" xmlns:w14="http://schemas.microsoft.com/office/word/2010/wordml" xmlns:w15="http://schemas.microsoft.com/office/word/2012/wordml" xmlns:w16cex="http://schemas.microsoft.com/office/word/2018/wordml/cex" xmlns:w16cid="http://schemas.microsoft.com/office/word/2016/wordml/cid" xmlns:w16="http://schemas.microsoft.com/office/word/2018/wordml" xmlns:w16du="http://schemas.microsoft.com/office/word/2023/wordml/word16du" xmlns:w16sdtdh="http://schemas.microsoft.com/office/word/2020/wordml/sdtdatahash" xmlns:w16sdtfl="http://schemas.microsoft.com/office/word/2024/wordml/sdtformatlock" xmlns:w16se="http://schemas.microsoft.com/office/word/2015/wordml/symex" xmlns:wpg="http://schemas.microsoft.com/office/word/2010/wordprocessingGroup" xmlns:wpi="http://schemas.microsoft.com/office/word/2010/wordprocessingInk" xmlns:wne="http://schemas.microsoft.com/office/word/2006/wordml" xmlns:wps="http://schemas.microsoft.com/office/word/2010/wordprocessingShape" mc:Ignorable="w14 w15 w16se w16cid w16 w16cex w16sdtdh w16sdtfl w16du wp14">
   <w:p>
     <w:pPr>
-      <w:pStyle w:val="Footer"/>
+      <w:pStyle w:val="Rodap"/>
       <w:pBdr>
         <w:top w:val="single" w:sz="4" w:space="1" w:color="000000"/>
         <w:left w:val="none" w:sz="0" w:space="0" w:color="000000"/>
@@ -8500,55 +8926,55 @@
     </w:pPr>
     <w:r>
       <w:rPr>
-        <w:rStyle w:val="PageNumber"/>
+        <w:rStyle w:val="Nmerodepgina"/>
       </w:rPr>
       <w:t>«Autor»</w:t>
     </w:r>
     <w:r>
       <w:rPr>
-        <w:rStyle w:val="PageNumber"/>
+        <w:rStyle w:val="Nmerodepgina"/>
       </w:rPr>
       <w:tab/>
     </w:r>
     <w:r>
       <w:rPr>
-        <w:rStyle w:val="PageNumber"/>
+        <w:rStyle w:val="Nmerodepgina"/>
       </w:rPr>
       <w:tab/>
     </w:r>
     <w:r>
       <w:rPr>
-        <w:rStyle w:val="PageNumber"/>
+        <w:rStyle w:val="Nmerodepgina"/>
       </w:rPr>
       <w:tab/>
     </w:r>
     <w:r>
       <w:rPr>
-        <w:rStyle w:val="PageNumber"/>
+        <w:rStyle w:val="Nmerodepgina"/>
       </w:rPr>
       <w:fldChar w:fldCharType="begin"/>
     </w:r>
     <w:r>
       <w:rPr>
-        <w:rStyle w:val="PageNumber"/>
+        <w:rStyle w:val="Nmerodepgina"/>
       </w:rPr>
       <w:instrText xml:space="preserve"> PAGE </w:instrText>
     </w:r>
     <w:r>
       <w:rPr>
-        <w:rStyle w:val="PageNumber"/>
+        <w:rStyle w:val="Nmerodepgina"/>
       </w:rPr>
       <w:fldChar w:fldCharType="separate"/>
     </w:r>
     <w:r>
       <w:rPr>
-        <w:rStyle w:val="PageNumber"/>
+        <w:rStyle w:val="Nmerodepgina"/>
       </w:rPr>
       <w:t>2</w:t>
     </w:r>
     <w:r>
       <w:rPr>
-        <w:rStyle w:val="PageNumber"/>
+        <w:rStyle w:val="Nmerodepgina"/>
       </w:rPr>
       <w:fldChar w:fldCharType="end"/>
     </w:r>
@@ -8557,10 +8983,10 @@
 </file>
 
 <file path=word/footer15.xml><?xml version="1.0" encoding="utf-8"?>
-<w:ftr xmlns:wpc="http://schemas.microsoft.com/office/word/2010/wordprocessingCanvas" xmlns:cx="http://schemas.microsoft.com/office/drawing/2014/chartex" xmlns:cx1="http://schemas.microsoft.com/office/drawing/2015/9/8/chartex" xmlns:cx2="http://schemas.microsoft.com/office/drawing/2015/10/21/chartex" xmlns:cx3="http://schemas.microsoft.com/office/drawing/2016/5/9/chartex" xmlns:cx4="http://schemas.microsoft.com/office/drawing/2016/5/10/chartex" xmlns:cx5="http://schemas.microsoft.com/office/drawing/2016/5/11/chartex" xmlns:cx6="http://schemas.microsoft.com/office/drawing/2016/5/12/chartex" xmlns:cx7="http://schemas.microsoft.com/office/drawing/2016/5/13/chartex" xmlns:cx8="http://schemas.microsoft.com/office/drawing/2016/5/14/chartex" xmlns:mc="http://schemas.openxmlformats.org/markup-compatibility/2006" xmlns:aink="http://schemas.microsoft.com/office/drawing/2016/ink" xmlns:am3d="http://schemas.microsoft.com/office/drawing/2017/model3d" xmlns:o="urn:schemas-microsoft-com:office:office" xmlns:oel="http://schemas.microsoft.com/office/2019/extlst" xmlns:r="http://schemas.openxmlformats.org/officeDocument/2006/relationships" xmlns:m="http://schemas.openxmlformats.org/officeDocument/2006/math" xmlns:v="urn:schemas-microsoft-com:vml" xmlns:wp14="http://schemas.microsoft.com/office/word/2010/wordprocessingDrawing" xmlns:wp="http://schemas.openxmlformats.org/drawingml/2006/wordprocessingDrawing" xmlns:w10="urn:schemas-microsoft-com:office:word" xmlns:w="http://schemas.openxmlformats.org/wordprocessingml/2006/main" xmlns:w14="http://schemas.microsoft.com/office/word/2010/wordml" xmlns:w15="http://schemas.microsoft.com/office/word/2012/wordml" xmlns:w16cex="http://schemas.microsoft.com/office/word/2018/wordml/cex" xmlns:w16cid="http://schemas.microsoft.com/office/word/2016/wordml/cid" xmlns:w16="http://schemas.microsoft.com/office/word/2018/wordml" xmlns:w16sdtdh="http://schemas.microsoft.com/office/word/2020/wordml/sdtdatahash" xmlns:w16se="http://schemas.microsoft.com/office/word/2015/wordml/symex" xmlns:wpg="http://schemas.microsoft.com/office/word/2010/wordprocessingGroup" xmlns:wpi="http://schemas.microsoft.com/office/word/2010/wordprocessingInk" xmlns:wne="http://schemas.microsoft.com/office/word/2006/wordml" xmlns:wps="http://schemas.microsoft.com/office/word/2010/wordprocessingShape" mc:Ignorable="w14 w15 w16se w16cid w16 w16cex w16sdtdh wp14">
+<w:ftr xmlns:wpc="http://schemas.microsoft.com/office/word/2010/wordprocessingCanvas" xmlns:cx="http://schemas.microsoft.com/office/drawing/2014/chartex" xmlns:cx1="http://schemas.microsoft.com/office/drawing/2015/9/8/chartex" xmlns:cx2="http://schemas.microsoft.com/office/drawing/2015/10/21/chartex" xmlns:cx3="http://schemas.microsoft.com/office/drawing/2016/5/9/chartex" xmlns:cx4="http://schemas.microsoft.com/office/drawing/2016/5/10/chartex" xmlns:cx5="http://schemas.microsoft.com/office/drawing/2016/5/11/chartex" xmlns:cx6="http://schemas.microsoft.com/office/drawing/2016/5/12/chartex" xmlns:cx7="http://schemas.microsoft.com/office/drawing/2016/5/13/chartex" xmlns:cx8="http://schemas.microsoft.com/office/drawing/2016/5/14/chartex" xmlns:mc="http://schemas.openxmlformats.org/markup-compatibility/2006" xmlns:aink="http://schemas.microsoft.com/office/drawing/2016/ink" xmlns:am3d="http://schemas.microsoft.com/office/drawing/2017/model3d" xmlns:o="urn:schemas-microsoft-com:office:office" xmlns:oel="http://schemas.microsoft.com/office/2019/extlst" xmlns:r="http://schemas.openxmlformats.org/officeDocument/2006/relationships" xmlns:m="http://schemas.openxmlformats.org/officeDocument/2006/math" xmlns:v="urn:schemas-microsoft-com:vml" xmlns:wp14="http://schemas.microsoft.com/office/word/2010/wordprocessingDrawing" xmlns:wp="http://schemas.openxmlformats.org/drawingml/2006/wordprocessingDrawing" xmlns:w10="urn:schemas-microsoft-com:office:word" xmlns:w="http://schemas.openxmlformats.org/wordprocessingml/2006/main" xmlns:w14="http://schemas.microsoft.com/office/word/2010/wordml" xmlns:w15="http://schemas.microsoft.com/office/word/2012/wordml" xmlns:w16cex="http://schemas.microsoft.com/office/word/2018/wordml/cex" xmlns:w16cid="http://schemas.microsoft.com/office/word/2016/wordml/cid" xmlns:w16="http://schemas.microsoft.com/office/word/2018/wordml" xmlns:w16du="http://schemas.microsoft.com/office/word/2023/wordml/word16du" xmlns:w16sdtdh="http://schemas.microsoft.com/office/word/2020/wordml/sdtdatahash" xmlns:w16sdtfl="http://schemas.microsoft.com/office/word/2024/wordml/sdtformatlock" xmlns:w16se="http://schemas.microsoft.com/office/word/2015/wordml/symex" xmlns:wpg="http://schemas.microsoft.com/office/word/2010/wordprocessingGroup" xmlns:wpi="http://schemas.microsoft.com/office/word/2010/wordprocessingInk" xmlns:wne="http://schemas.microsoft.com/office/word/2006/wordml" xmlns:wps="http://schemas.microsoft.com/office/word/2010/wordprocessingShape" mc:Ignorable="w14 w15 w16se w16cid w16 w16cex w16sdtdh w16sdtfl w16du wp14">
   <w:p>
     <w:pPr>
-      <w:pStyle w:val="Footer"/>
+      <w:pStyle w:val="Rodap"/>
       <w:pBdr>
         <w:top w:val="single" w:sz="4" w:space="1" w:color="000000"/>
         <w:left w:val="none" w:sz="0" w:space="0" w:color="000000"/>
@@ -8576,63 +9002,63 @@
     </w:pPr>
     <w:r>
       <w:rPr>
-        <w:rStyle w:val="PageNumber"/>
+        <w:rStyle w:val="Nmerodepgina"/>
       </w:rPr>
       <w:t>«Autor»</w:t>
     </w:r>
     <w:r>
       <w:rPr>
-        <w:rStyle w:val="PageNumber"/>
+        <w:rStyle w:val="Nmerodepgina"/>
       </w:rPr>
       <w:tab/>
     </w:r>
     <w:r>
       <w:rPr>
-        <w:rStyle w:val="PageNumber"/>
+        <w:rStyle w:val="Nmerodepgina"/>
       </w:rPr>
       <w:tab/>
     </w:r>
     <w:r>
       <w:rPr>
-        <w:rStyle w:val="PageNumber"/>
+        <w:rStyle w:val="Nmerodepgina"/>
       </w:rPr>
       <w:tab/>
     </w:r>
     <w:r>
       <w:rPr>
-        <w:rStyle w:val="PageNumber"/>
+        <w:rStyle w:val="Nmerodepgina"/>
       </w:rPr>
       <w:fldChar w:fldCharType="begin"/>
     </w:r>
     <w:r>
       <w:rPr>
-        <w:rStyle w:val="PageNumber"/>
+        <w:rStyle w:val="Nmerodepgina"/>
       </w:rPr>
       <w:instrText xml:space="preserve"> PAGE </w:instrText>
     </w:r>
     <w:r>
       <w:rPr>
-        <w:rStyle w:val="PageNumber"/>
+        <w:rStyle w:val="Nmerodepgina"/>
       </w:rPr>
       <w:fldChar w:fldCharType="separate"/>
     </w:r>
     <w:r>
       <w:rPr>
-        <w:rStyle w:val="PageNumber"/>
+        <w:rStyle w:val="Nmerodepgina"/>
         <w:noProof/>
       </w:rPr>
       <w:t>xvii</w:t>
     </w:r>
     <w:r>
       <w:rPr>
-        <w:rStyle w:val="PageNumber"/>
+        <w:rStyle w:val="Nmerodepgina"/>
       </w:rPr>
       <w:fldChar w:fldCharType="end"/>
     </w:r>
   </w:p>
   <w:p>
     <w:pPr>
-      <w:pStyle w:val="Footer"/>
+      <w:pStyle w:val="Rodap"/>
       <w:jc w:val="center"/>
     </w:pPr>
   </w:p>
@@ -8640,10 +9066,10 @@
 </file>
 
 <file path=word/footer16.xml><?xml version="1.0" encoding="utf-8"?>
-<w:ftr xmlns:wpc="http://schemas.microsoft.com/office/word/2010/wordprocessingCanvas" xmlns:cx="http://schemas.microsoft.com/office/drawing/2014/chartex" xmlns:cx1="http://schemas.microsoft.com/office/drawing/2015/9/8/chartex" xmlns:cx2="http://schemas.microsoft.com/office/drawing/2015/10/21/chartex" xmlns:cx3="http://schemas.microsoft.com/office/drawing/2016/5/9/chartex" xmlns:cx4="http://schemas.microsoft.com/office/drawing/2016/5/10/chartex" xmlns:cx5="http://schemas.microsoft.com/office/drawing/2016/5/11/chartex" xmlns:cx6="http://schemas.microsoft.com/office/drawing/2016/5/12/chartex" xmlns:cx7="http://schemas.microsoft.com/office/drawing/2016/5/13/chartex" xmlns:cx8="http://schemas.microsoft.com/office/drawing/2016/5/14/chartex" xmlns:mc="http://schemas.openxmlformats.org/markup-compatibility/2006" xmlns:aink="http://schemas.microsoft.com/office/drawing/2016/ink" xmlns:am3d="http://schemas.microsoft.com/office/drawing/2017/model3d" xmlns:o="urn:schemas-microsoft-com:office:office" xmlns:oel="http://schemas.microsoft.com/office/2019/extlst" xmlns:r="http://schemas.openxmlformats.org/officeDocument/2006/relationships" xmlns:m="http://schemas.openxmlformats.org/officeDocument/2006/math" xmlns:v="urn:schemas-microsoft-com:vml" xmlns:wp14="http://schemas.microsoft.com/office/word/2010/wordprocessingDrawing" xmlns:wp="http://schemas.openxmlformats.org/drawingml/2006/wordprocessingDrawing" xmlns:w10="urn:schemas-microsoft-com:office:word" xmlns:w="http://schemas.openxmlformats.org/wordprocessingml/2006/main" xmlns:w14="http://schemas.microsoft.com/office/word/2010/wordml" xmlns:w15="http://schemas.microsoft.com/office/word/2012/wordml" xmlns:w16cex="http://schemas.microsoft.com/office/word/2018/wordml/cex" xmlns:w16cid="http://schemas.microsoft.com/office/word/2016/wordml/cid" xmlns:w16="http://schemas.microsoft.com/office/word/2018/wordml" xmlns:w16sdtdh="http://schemas.microsoft.com/office/word/2020/wordml/sdtdatahash" xmlns:w16se="http://schemas.microsoft.com/office/word/2015/wordml/symex" xmlns:wpg="http://schemas.microsoft.com/office/word/2010/wordprocessingGroup" xmlns:wpi="http://schemas.microsoft.com/office/word/2010/wordprocessingInk" xmlns:wne="http://schemas.microsoft.com/office/word/2006/wordml" xmlns:wps="http://schemas.microsoft.com/office/word/2010/wordprocessingShape" mc:Ignorable="w14 w15 w16se w16cid w16 w16cex w16sdtdh wp14">
+<w:ftr xmlns:wpc="http://schemas.microsoft.com/office/word/2010/wordprocessingCanvas" xmlns:cx="http://schemas.microsoft.com/office/drawing/2014/chartex" xmlns:cx1="http://schemas.microsoft.com/office/drawing/2015/9/8/chartex" xmlns:cx2="http://schemas.microsoft.com/office/drawing/2015/10/21/chartex" xmlns:cx3="http://schemas.microsoft.com/office/drawing/2016/5/9/chartex" xmlns:cx4="http://schemas.microsoft.com/office/drawing/2016/5/10/chartex" xmlns:cx5="http://schemas.microsoft.com/office/drawing/2016/5/11/chartex" xmlns:cx6="http://schemas.microsoft.com/office/drawing/2016/5/12/chartex" xmlns:cx7="http://schemas.microsoft.com/office/drawing/2016/5/13/chartex" xmlns:cx8="http://schemas.microsoft.com/office/drawing/2016/5/14/chartex" xmlns:mc="http://schemas.openxmlformats.org/markup-compatibility/2006" xmlns:aink="http://schemas.microsoft.com/office/drawing/2016/ink" xmlns:am3d="http://schemas.microsoft.com/office/drawing/2017/model3d" xmlns:o="urn:schemas-microsoft-com:office:office" xmlns:oel="http://schemas.microsoft.com/office/2019/extlst" xmlns:r="http://schemas.openxmlformats.org/officeDocument/2006/relationships" xmlns:m="http://schemas.openxmlformats.org/officeDocument/2006/math" xmlns:v="urn:schemas-microsoft-com:vml" xmlns:wp14="http://schemas.microsoft.com/office/word/2010/wordprocessingDrawing" xmlns:wp="http://schemas.openxmlformats.org/drawingml/2006/wordprocessingDrawing" xmlns:w10="urn:schemas-microsoft-com:office:word" xmlns:w="http://schemas.openxmlformats.org/wordprocessingml/2006/main" xmlns:w14="http://schemas.microsoft.com/office/word/2010/wordml" xmlns:w15="http://schemas.microsoft.com/office/word/2012/wordml" xmlns:w16cex="http://schemas.microsoft.com/office/word/2018/wordml/cex" xmlns:w16cid="http://schemas.microsoft.com/office/word/2016/wordml/cid" xmlns:w16="http://schemas.microsoft.com/office/word/2018/wordml" xmlns:w16du="http://schemas.microsoft.com/office/word/2023/wordml/word16du" xmlns:w16sdtdh="http://schemas.microsoft.com/office/word/2020/wordml/sdtdatahash" xmlns:w16sdtfl="http://schemas.microsoft.com/office/word/2024/wordml/sdtformatlock" xmlns:w16se="http://schemas.microsoft.com/office/word/2015/wordml/symex" xmlns:wpg="http://schemas.microsoft.com/office/word/2010/wordprocessingGroup" xmlns:wpi="http://schemas.microsoft.com/office/word/2010/wordprocessingInk" xmlns:wne="http://schemas.microsoft.com/office/word/2006/wordml" xmlns:wps="http://schemas.microsoft.com/office/word/2010/wordprocessingShape" mc:Ignorable="w14 w15 w16se w16cid w16 w16cex w16sdtdh w16sdtfl w16du wp14">
   <w:p>
     <w:pPr>
-      <w:pStyle w:val="Footer"/>
+      <w:pStyle w:val="Rodap"/>
       <w:pBdr>
         <w:top w:val="single" w:sz="4" w:space="1" w:color="000000"/>
         <w:left w:val="none" w:sz="0" w:space="0" w:color="000000"/>
@@ -8659,63 +9085,63 @@
     </w:pPr>
     <w:r>
       <w:rPr>
-        <w:rStyle w:val="PageNumber"/>
+        <w:rStyle w:val="Nmerodepgina"/>
       </w:rPr>
       <w:t>«Autor»</w:t>
     </w:r>
     <w:r>
       <w:rPr>
-        <w:rStyle w:val="PageNumber"/>
+        <w:rStyle w:val="Nmerodepgina"/>
       </w:rPr>
       <w:tab/>
     </w:r>
     <w:r>
       <w:rPr>
-        <w:rStyle w:val="PageNumber"/>
+        <w:rStyle w:val="Nmerodepgina"/>
       </w:rPr>
       <w:tab/>
     </w:r>
     <w:r>
       <w:rPr>
-        <w:rStyle w:val="PageNumber"/>
+        <w:rStyle w:val="Nmerodepgina"/>
       </w:rPr>
       <w:tab/>
     </w:r>
     <w:r>
       <w:rPr>
-        <w:rStyle w:val="PageNumber"/>
+        <w:rStyle w:val="Nmerodepgina"/>
       </w:rPr>
       <w:fldChar w:fldCharType="begin"/>
     </w:r>
     <w:r>
       <w:rPr>
-        <w:rStyle w:val="PageNumber"/>
+        <w:rStyle w:val="Nmerodepgina"/>
       </w:rPr>
       <w:instrText xml:space="preserve"> PAGE </w:instrText>
     </w:r>
     <w:r>
       <w:rPr>
-        <w:rStyle w:val="PageNumber"/>
+        <w:rStyle w:val="Nmerodepgina"/>
       </w:rPr>
       <w:fldChar w:fldCharType="separate"/>
     </w:r>
     <w:r>
       <w:rPr>
-        <w:rStyle w:val="PageNumber"/>
+        <w:rStyle w:val="Nmerodepgina"/>
         <w:noProof/>
       </w:rPr>
       <w:t>1</w:t>
     </w:r>
     <w:r>
       <w:rPr>
-        <w:rStyle w:val="PageNumber"/>
+        <w:rStyle w:val="Nmerodepgina"/>
       </w:rPr>
       <w:fldChar w:fldCharType="end"/>
     </w:r>
   </w:p>
   <w:p>
     <w:pPr>
-      <w:pStyle w:val="Footer"/>
+      <w:pStyle w:val="Rodap"/>
       <w:jc w:val="center"/>
     </w:pPr>
   </w:p>
@@ -8723,10 +9149,10 @@
 </file>
 
 <file path=word/footer17.xml><?xml version="1.0" encoding="utf-8"?>
-<w:ftr xmlns:wpc="http://schemas.microsoft.com/office/word/2010/wordprocessingCanvas" xmlns:cx="http://schemas.microsoft.com/office/drawing/2014/chartex" xmlns:cx1="http://schemas.microsoft.com/office/drawing/2015/9/8/chartex" xmlns:cx2="http://schemas.microsoft.com/office/drawing/2015/10/21/chartex" xmlns:cx3="http://schemas.microsoft.com/office/drawing/2016/5/9/chartex" xmlns:cx4="http://schemas.microsoft.com/office/drawing/2016/5/10/chartex" xmlns:cx5="http://schemas.microsoft.com/office/drawing/2016/5/11/chartex" xmlns:cx6="http://schemas.microsoft.com/office/drawing/2016/5/12/chartex" xmlns:cx7="http://schemas.microsoft.com/office/drawing/2016/5/13/chartex" xmlns:cx8="http://schemas.microsoft.com/office/drawing/2016/5/14/chartex" xmlns:mc="http://schemas.openxmlformats.org/markup-compatibility/2006" xmlns:aink="http://schemas.microsoft.com/office/drawing/2016/ink" xmlns:am3d="http://schemas.microsoft.com/office/drawing/2017/model3d" xmlns:o="urn:schemas-microsoft-com:office:office" xmlns:oel="http://schemas.microsoft.com/office/2019/extlst" xmlns:r="http://schemas.openxmlformats.org/officeDocument/2006/relationships" xmlns:m="http://schemas.openxmlformats.org/officeDocument/2006/math" xmlns:v="urn:schemas-microsoft-com:vml" xmlns:wp14="http://schemas.microsoft.com/office/word/2010/wordprocessingDrawing" xmlns:wp="http://schemas.openxmlformats.org/drawingml/2006/wordprocessingDrawing" xmlns:w10="urn:schemas-microsoft-com:office:word" xmlns:w="http://schemas.openxmlformats.org/wordprocessingml/2006/main" xmlns:w14="http://schemas.microsoft.com/office/word/2010/wordml" xmlns:w15="http://schemas.microsoft.com/office/word/2012/wordml" xmlns:w16cex="http://schemas.microsoft.com/office/word/2018/wordml/cex" xmlns:w16cid="http://schemas.microsoft.com/office/word/2016/wordml/cid" xmlns:w16="http://schemas.microsoft.com/office/word/2018/wordml" xmlns:w16sdtdh="http://schemas.microsoft.com/office/word/2020/wordml/sdtdatahash" xmlns:w16se="http://schemas.microsoft.com/office/word/2015/wordml/symex" xmlns:wpg="http://schemas.microsoft.com/office/word/2010/wordprocessingGroup" xmlns:wpi="http://schemas.microsoft.com/office/word/2010/wordprocessingInk" xmlns:wne="http://schemas.microsoft.com/office/word/2006/wordml" xmlns:wps="http://schemas.microsoft.com/office/word/2010/wordprocessingShape" mc:Ignorable="w14 w15 w16se w16cid w16 w16cex w16sdtdh wp14">
+<w:ftr xmlns:wpc="http://schemas.microsoft.com/office/word/2010/wordprocessingCanvas" xmlns:cx="http://schemas.microsoft.com/office/drawing/2014/chartex" xmlns:cx1="http://schemas.microsoft.com/office/drawing/2015/9/8/chartex" xmlns:cx2="http://schemas.microsoft.com/office/drawing/2015/10/21/chartex" xmlns:cx3="http://schemas.microsoft.com/office/drawing/2016/5/9/chartex" xmlns:cx4="http://schemas.microsoft.com/office/drawing/2016/5/10/chartex" xmlns:cx5="http://schemas.microsoft.com/office/drawing/2016/5/11/chartex" xmlns:cx6="http://schemas.microsoft.com/office/drawing/2016/5/12/chartex" xmlns:cx7="http://schemas.microsoft.com/office/drawing/2016/5/13/chartex" xmlns:cx8="http://schemas.microsoft.com/office/drawing/2016/5/14/chartex" xmlns:mc="http://schemas.openxmlformats.org/markup-compatibility/2006" xmlns:aink="http://schemas.microsoft.com/office/drawing/2016/ink" xmlns:am3d="http://schemas.microsoft.com/office/drawing/2017/model3d" xmlns:o="urn:schemas-microsoft-com:office:office" xmlns:oel="http://schemas.microsoft.com/office/2019/extlst" xmlns:r="http://schemas.openxmlformats.org/officeDocument/2006/relationships" xmlns:m="http://schemas.openxmlformats.org/officeDocument/2006/math" xmlns:v="urn:schemas-microsoft-com:vml" xmlns:wp14="http://schemas.microsoft.com/office/word/2010/wordprocessingDrawing" xmlns:wp="http://schemas.openxmlformats.org/drawingml/2006/wordprocessingDrawing" xmlns:w10="urn:schemas-microsoft-com:office:word" xmlns:w="http://schemas.openxmlformats.org/wordprocessingml/2006/main" xmlns:w14="http://schemas.microsoft.com/office/word/2010/wordml" xmlns:w15="http://schemas.microsoft.com/office/word/2012/wordml" xmlns:w16cex="http://schemas.microsoft.com/office/word/2018/wordml/cex" xmlns:w16cid="http://schemas.microsoft.com/office/word/2016/wordml/cid" xmlns:w16="http://schemas.microsoft.com/office/word/2018/wordml" xmlns:w16du="http://schemas.microsoft.com/office/word/2023/wordml/word16du" xmlns:w16sdtdh="http://schemas.microsoft.com/office/word/2020/wordml/sdtdatahash" xmlns:w16sdtfl="http://schemas.microsoft.com/office/word/2024/wordml/sdtformatlock" xmlns:w16se="http://schemas.microsoft.com/office/word/2015/wordml/symex" xmlns:wpg="http://schemas.microsoft.com/office/word/2010/wordprocessingGroup" xmlns:wpi="http://schemas.microsoft.com/office/word/2010/wordprocessingInk" xmlns:wne="http://schemas.microsoft.com/office/word/2006/wordml" xmlns:wps="http://schemas.microsoft.com/office/word/2010/wordprocessingShape" mc:Ignorable="w14 w15 w16se w16cid w16 w16cex w16sdtdh w16sdtfl w16du wp14">
   <w:p>
     <w:pPr>
-      <w:pStyle w:val="Footer"/>
+      <w:pStyle w:val="Rodap"/>
       <w:pBdr>
         <w:top w:val="single" w:sz="4" w:space="1" w:color="000000"/>
         <w:left w:val="none" w:sz="0" w:space="0" w:color="000000"/>
@@ -8742,56 +9168,56 @@
     </w:pPr>
     <w:r>
       <w:rPr>
-        <w:rStyle w:val="PageNumber"/>
+        <w:rStyle w:val="Nmerodepgina"/>
       </w:rPr>
       <w:t>«Autor»</w:t>
     </w:r>
     <w:r>
       <w:rPr>
-        <w:rStyle w:val="PageNumber"/>
+        <w:rStyle w:val="Nmerodepgina"/>
       </w:rPr>
       <w:tab/>
     </w:r>
     <w:r>
       <w:rPr>
-        <w:rStyle w:val="PageNumber"/>
+        <w:rStyle w:val="Nmerodepgina"/>
       </w:rPr>
       <w:tab/>
     </w:r>
     <w:r>
       <w:rPr>
-        <w:rStyle w:val="PageNumber"/>
+        <w:rStyle w:val="Nmerodepgina"/>
       </w:rPr>
       <w:tab/>
     </w:r>
     <w:r>
       <w:rPr>
-        <w:rStyle w:val="PageNumber"/>
+        <w:rStyle w:val="Nmerodepgina"/>
       </w:rPr>
       <w:fldChar w:fldCharType="begin"/>
     </w:r>
     <w:r>
       <w:rPr>
-        <w:rStyle w:val="PageNumber"/>
+        <w:rStyle w:val="Nmerodepgina"/>
       </w:rPr>
       <w:instrText xml:space="preserve"> PAGE </w:instrText>
     </w:r>
     <w:r>
       <w:rPr>
-        <w:rStyle w:val="PageNumber"/>
+        <w:rStyle w:val="Nmerodepgina"/>
       </w:rPr>
       <w:fldChar w:fldCharType="separate"/>
     </w:r>
     <w:r>
       <w:rPr>
-        <w:rStyle w:val="PageNumber"/>
+        <w:rStyle w:val="Nmerodepgina"/>
         <w:noProof/>
       </w:rPr>
       <w:t>8</w:t>
     </w:r>
     <w:r>
       <w:rPr>
-        <w:rStyle w:val="PageNumber"/>
+        <w:rStyle w:val="Nmerodepgina"/>
       </w:rPr>
       <w:fldChar w:fldCharType="end"/>
     </w:r>
@@ -8800,10 +9226,10 @@
 </file>
 
 <file path=word/footer18.xml><?xml version="1.0" encoding="utf-8"?>
-<w:ftr xmlns:wpc="http://schemas.microsoft.com/office/word/2010/wordprocessingCanvas" xmlns:cx="http://schemas.microsoft.com/office/drawing/2014/chartex" xmlns:cx1="http://schemas.microsoft.com/office/drawing/2015/9/8/chartex" xmlns:cx2="http://schemas.microsoft.com/office/drawing/2015/10/21/chartex" xmlns:cx3="http://schemas.microsoft.com/office/drawing/2016/5/9/chartex" xmlns:cx4="http://schemas.microsoft.com/office/drawing/2016/5/10/chartex" xmlns:cx5="http://schemas.microsoft.com/office/drawing/2016/5/11/chartex" xmlns:cx6="http://schemas.microsoft.com/office/drawing/2016/5/12/chartex" xmlns:cx7="http://schemas.microsoft.com/office/drawing/2016/5/13/chartex" xmlns:cx8="http://schemas.microsoft.com/office/drawing/2016/5/14/chartex" xmlns:mc="http://schemas.openxmlformats.org/markup-compatibility/2006" xmlns:aink="http://schemas.microsoft.com/office/drawing/2016/ink" xmlns:am3d="http://schemas.microsoft.com/office/drawing/2017/model3d" xmlns:o="urn:schemas-microsoft-com:office:office" xmlns:oel="http://schemas.microsoft.com/office/2019/extlst" xmlns:r="http://schemas.openxmlformats.org/officeDocument/2006/relationships" xmlns:m="http://schemas.openxmlformats.org/officeDocument/2006/math" xmlns:v="urn:schemas-microsoft-com:vml" xmlns:wp14="http://schemas.microsoft.com/office/word/2010/wordprocessingDrawing" xmlns:wp="http://schemas.openxmlformats.org/drawingml/2006/wordprocessingDrawing" xmlns:w10="urn:schemas-microsoft-com:office:word" xmlns:w="http://schemas.openxmlformats.org/wordprocessingml/2006/main" xmlns:w14="http://schemas.microsoft.com/office/word/2010/wordml" xmlns:w15="http://schemas.microsoft.com/office/word/2012/wordml" xmlns:w16cex="http://schemas.microsoft.com/office/word/2018/wordml/cex" xmlns:w16cid="http://schemas.microsoft.com/office/word/2016/wordml/cid" xmlns:w16="http://schemas.microsoft.com/office/word/2018/wordml" xmlns:w16sdtdh="http://schemas.microsoft.com/office/word/2020/wordml/sdtdatahash" xmlns:w16se="http://schemas.microsoft.com/office/word/2015/wordml/symex" xmlns:wpg="http://schemas.microsoft.com/office/word/2010/wordprocessingGroup" xmlns:wpi="http://schemas.microsoft.com/office/word/2010/wordprocessingInk" xmlns:wne="http://schemas.microsoft.com/office/word/2006/wordml" xmlns:wps="http://schemas.microsoft.com/office/word/2010/wordprocessingShape" mc:Ignorable="w14 w15 w16se w16cid w16 w16cex w16sdtdh wp14">
+<w:ftr xmlns:wpc="http://schemas.microsoft.com/office/word/2010/wordprocessingCanvas" xmlns:cx="http://schemas.microsoft.com/office/drawing/2014/chartex" xmlns:cx1="http://schemas.microsoft.com/office/drawing/2015/9/8/chartex" xmlns:cx2="http://schemas.microsoft.com/office/drawing/2015/10/21/chartex" xmlns:cx3="http://schemas.microsoft.com/office/drawing/2016/5/9/chartex" xmlns:cx4="http://schemas.microsoft.com/office/drawing/2016/5/10/chartex" xmlns:cx5="http://schemas.microsoft.com/office/drawing/2016/5/11/chartex" xmlns:cx6="http://schemas.microsoft.com/office/drawing/2016/5/12/chartex" xmlns:cx7="http://schemas.microsoft.com/office/drawing/2016/5/13/chartex" xmlns:cx8="http://schemas.microsoft.com/office/drawing/2016/5/14/chartex" xmlns:mc="http://schemas.openxmlformats.org/markup-compatibility/2006" xmlns:aink="http://schemas.microsoft.com/office/drawing/2016/ink" xmlns:am3d="http://schemas.microsoft.com/office/drawing/2017/model3d" xmlns:o="urn:schemas-microsoft-com:office:office" xmlns:oel="http://schemas.microsoft.com/office/2019/extlst" xmlns:r="http://schemas.openxmlformats.org/officeDocument/2006/relationships" xmlns:m="http://schemas.openxmlformats.org/officeDocument/2006/math" xmlns:v="urn:schemas-microsoft-com:vml" xmlns:wp14="http://schemas.microsoft.com/office/word/2010/wordprocessingDrawing" xmlns:wp="http://schemas.openxmlformats.org/drawingml/2006/wordprocessingDrawing" xmlns:w10="urn:schemas-microsoft-com:office:word" xmlns:w="http://schemas.openxmlformats.org/wordprocessingml/2006/main" xmlns:w14="http://schemas.microsoft.com/office/word/2010/wordml" xmlns:w15="http://schemas.microsoft.com/office/word/2012/wordml" xmlns:w16cex="http://schemas.microsoft.com/office/word/2018/wordml/cex" xmlns:w16cid="http://schemas.microsoft.com/office/word/2016/wordml/cid" xmlns:w16="http://schemas.microsoft.com/office/word/2018/wordml" xmlns:w16du="http://schemas.microsoft.com/office/word/2023/wordml/word16du" xmlns:w16sdtdh="http://schemas.microsoft.com/office/word/2020/wordml/sdtdatahash" xmlns:w16sdtfl="http://schemas.microsoft.com/office/word/2024/wordml/sdtformatlock" xmlns:w16se="http://schemas.microsoft.com/office/word/2015/wordml/symex" xmlns:wpg="http://schemas.microsoft.com/office/word/2010/wordprocessingGroup" xmlns:wpi="http://schemas.microsoft.com/office/word/2010/wordprocessingInk" xmlns:wne="http://schemas.microsoft.com/office/word/2006/wordml" xmlns:wps="http://schemas.microsoft.com/office/word/2010/wordprocessingShape" mc:Ignorable="w14 w15 w16se w16cid w16 w16cex w16sdtdh w16sdtfl w16du wp14">
   <w:p>
     <w:pPr>
-      <w:pStyle w:val="Footer"/>
+      <w:pStyle w:val="Rodap"/>
       <w:pBdr>
         <w:top w:val="single" w:sz="4" w:space="1" w:color="000000"/>
         <w:left w:val="none" w:sz="0" w:space="0" w:color="000000"/>
@@ -8819,56 +9245,56 @@
     </w:pPr>
     <w:r>
       <w:rPr>
-        <w:rStyle w:val="PageNumber"/>
+        <w:rStyle w:val="Nmerodepgina"/>
       </w:rPr>
       <w:t>«Autor»</w:t>
     </w:r>
     <w:r>
       <w:rPr>
-        <w:rStyle w:val="PageNumber"/>
+        <w:rStyle w:val="Nmerodepgina"/>
       </w:rPr>
       <w:tab/>
     </w:r>
     <w:r>
       <w:rPr>
-        <w:rStyle w:val="PageNumber"/>
+        <w:rStyle w:val="Nmerodepgina"/>
       </w:rPr>
       <w:tab/>
     </w:r>
     <w:r>
       <w:rPr>
-        <w:rStyle w:val="PageNumber"/>
+        <w:rStyle w:val="Nmerodepgina"/>
       </w:rPr>
       <w:tab/>
     </w:r>
     <w:r>
       <w:rPr>
-        <w:rStyle w:val="PageNumber"/>
+        <w:rStyle w:val="Nmerodepgina"/>
       </w:rPr>
       <w:fldChar w:fldCharType="begin"/>
     </w:r>
     <w:r>
       <w:rPr>
-        <w:rStyle w:val="PageNumber"/>
+        <w:rStyle w:val="Nmerodepgina"/>
       </w:rPr>
       <w:instrText xml:space="preserve"> PAGE </w:instrText>
     </w:r>
     <w:r>
       <w:rPr>
-        <w:rStyle w:val="PageNumber"/>
+        <w:rStyle w:val="Nmerodepgina"/>
       </w:rPr>
       <w:fldChar w:fldCharType="separate"/>
     </w:r>
     <w:r>
       <w:rPr>
-        <w:rStyle w:val="PageNumber"/>
+        <w:rStyle w:val="Nmerodepgina"/>
         <w:noProof/>
       </w:rPr>
       <w:t>7</w:t>
     </w:r>
     <w:r>
       <w:rPr>
-        <w:rStyle w:val="PageNumber"/>
+        <w:rStyle w:val="Nmerodepgina"/>
       </w:rPr>
       <w:fldChar w:fldCharType="end"/>
     </w:r>
@@ -8877,10 +9303,10 @@
 </file>
 
 <file path=word/footer19.xml><?xml version="1.0" encoding="utf-8"?>
-<w:ftr xmlns:wpc="http://schemas.microsoft.com/office/word/2010/wordprocessingCanvas" xmlns:cx="http://schemas.microsoft.com/office/drawing/2014/chartex" xmlns:cx1="http://schemas.microsoft.com/office/drawing/2015/9/8/chartex" xmlns:cx2="http://schemas.microsoft.com/office/drawing/2015/10/21/chartex" xmlns:cx3="http://schemas.microsoft.com/office/drawing/2016/5/9/chartex" xmlns:cx4="http://schemas.microsoft.com/office/drawing/2016/5/10/chartex" xmlns:cx5="http://schemas.microsoft.com/office/drawing/2016/5/11/chartex" xmlns:cx6="http://schemas.microsoft.com/office/drawing/2016/5/12/chartex" xmlns:cx7="http://schemas.microsoft.com/office/drawing/2016/5/13/chartex" xmlns:cx8="http://schemas.microsoft.com/office/drawing/2016/5/14/chartex" xmlns:mc="http://schemas.openxmlformats.org/markup-compatibility/2006" xmlns:aink="http://schemas.microsoft.com/office/drawing/2016/ink" xmlns:am3d="http://schemas.microsoft.com/office/drawing/2017/model3d" xmlns:o="urn:schemas-microsoft-com:office:office" xmlns:oel="http://schemas.microsoft.com/office/2019/extlst" xmlns:r="http://schemas.openxmlformats.org/officeDocument/2006/relationships" xmlns:m="http://schemas.openxmlformats.org/officeDocument/2006/math" xmlns:v="urn:schemas-microsoft-com:vml" xmlns:wp14="http://schemas.microsoft.com/office/word/2010/wordprocessingDrawing" xmlns:wp="http://schemas.openxmlformats.org/drawingml/2006/wordprocessingDrawing" xmlns:w10="urn:schemas-microsoft-com:office:word" xmlns:w="http://schemas.openxmlformats.org/wordprocessingml/2006/main" xmlns:w14="http://schemas.microsoft.com/office/word/2010/wordml" xmlns:w15="http://schemas.microsoft.com/office/word/2012/wordml" xmlns:w16cex="http://schemas.microsoft.com/office/word/2018/wordml/cex" xmlns:w16cid="http://schemas.microsoft.com/office/word/2016/wordml/cid" xmlns:w16="http://schemas.microsoft.com/office/word/2018/wordml" xmlns:w16sdtdh="http://schemas.microsoft.com/office/word/2020/wordml/sdtdatahash" xmlns:w16se="http://schemas.microsoft.com/office/word/2015/wordml/symex" xmlns:wpg="http://schemas.microsoft.com/office/word/2010/wordprocessingGroup" xmlns:wpi="http://schemas.microsoft.com/office/word/2010/wordprocessingInk" xmlns:wne="http://schemas.microsoft.com/office/word/2006/wordml" xmlns:wps="http://schemas.microsoft.com/office/word/2010/wordprocessingShape" mc:Ignorable="w14 w15 w16se w16cid w16 w16cex w16sdtdh wp14">
+<w:ftr xmlns:wpc="http://schemas.microsoft.com/office/word/2010/wordprocessingCanvas" xmlns:cx="http://schemas.microsoft.com/office/drawing/2014/chartex" xmlns:cx1="http://schemas.microsoft.com/office/drawing/2015/9/8/chartex" xmlns:cx2="http://schemas.microsoft.com/office/drawing/2015/10/21/chartex" xmlns:cx3="http://schemas.microsoft.com/office/drawing/2016/5/9/chartex" xmlns:cx4="http://schemas.microsoft.com/office/drawing/2016/5/10/chartex" xmlns:cx5="http://schemas.microsoft.com/office/drawing/2016/5/11/chartex" xmlns:cx6="http://schemas.microsoft.com/office/drawing/2016/5/12/chartex" xmlns:cx7="http://schemas.microsoft.com/office/drawing/2016/5/13/chartex" xmlns:cx8="http://schemas.microsoft.com/office/drawing/2016/5/14/chartex" xmlns:mc="http://schemas.openxmlformats.org/markup-compatibility/2006" xmlns:aink="http://schemas.microsoft.com/office/drawing/2016/ink" xmlns:am3d="http://schemas.microsoft.com/office/drawing/2017/model3d" xmlns:o="urn:schemas-microsoft-com:office:office" xmlns:oel="http://schemas.microsoft.com/office/2019/extlst" xmlns:r="http://schemas.openxmlformats.org/officeDocument/2006/relationships" xmlns:m="http://schemas.openxmlformats.org/officeDocument/2006/math" xmlns:v="urn:schemas-microsoft-com:vml" xmlns:wp14="http://schemas.microsoft.com/office/word/2010/wordprocessingDrawing" xmlns:wp="http://schemas.openxmlformats.org/drawingml/2006/wordprocessingDrawing" xmlns:w10="urn:schemas-microsoft-com:office:word" xmlns:w="http://schemas.openxmlformats.org/wordprocessingml/2006/main" xmlns:w14="http://schemas.microsoft.com/office/word/2010/wordml" xmlns:w15="http://schemas.microsoft.com/office/word/2012/wordml" xmlns:w16cex="http://schemas.microsoft.com/office/word/2018/wordml/cex" xmlns:w16cid="http://schemas.microsoft.com/office/word/2016/wordml/cid" xmlns:w16="http://schemas.microsoft.com/office/word/2018/wordml" xmlns:w16du="http://schemas.microsoft.com/office/word/2023/wordml/word16du" xmlns:w16sdtdh="http://schemas.microsoft.com/office/word/2020/wordml/sdtdatahash" xmlns:w16sdtfl="http://schemas.microsoft.com/office/word/2024/wordml/sdtformatlock" xmlns:w16se="http://schemas.microsoft.com/office/word/2015/wordml/symex" xmlns:wpg="http://schemas.microsoft.com/office/word/2010/wordprocessingGroup" xmlns:wpi="http://schemas.microsoft.com/office/word/2010/wordprocessingInk" xmlns:wne="http://schemas.microsoft.com/office/word/2006/wordml" xmlns:wps="http://schemas.microsoft.com/office/word/2010/wordprocessingShape" mc:Ignorable="w14 w15 w16se w16cid w16 w16cex w16sdtdh w16sdtfl w16du wp14">
   <w:p>
     <w:pPr>
-      <w:pStyle w:val="Footer"/>
+      <w:pStyle w:val="Rodap"/>
       <w:pBdr>
         <w:top w:val="single" w:sz="4" w:space="1" w:color="000000"/>
         <w:left w:val="none" w:sz="0" w:space="0" w:color="000000"/>
@@ -8896,63 +9322,63 @@
     </w:pPr>
     <w:r>
       <w:rPr>
-        <w:rStyle w:val="PageNumber"/>
+        <w:rStyle w:val="Nmerodepgina"/>
       </w:rPr>
       <w:t>«Autor»</w:t>
     </w:r>
     <w:r>
       <w:rPr>
-        <w:rStyle w:val="PageNumber"/>
+        <w:rStyle w:val="Nmerodepgina"/>
       </w:rPr>
       <w:tab/>
     </w:r>
     <w:r>
       <w:rPr>
-        <w:rStyle w:val="PageNumber"/>
+        <w:rStyle w:val="Nmerodepgina"/>
       </w:rPr>
       <w:tab/>
     </w:r>
     <w:r>
       <w:rPr>
-        <w:rStyle w:val="PageNumber"/>
+        <w:rStyle w:val="Nmerodepgina"/>
       </w:rPr>
       <w:tab/>
     </w:r>
     <w:r>
       <w:rPr>
-        <w:rStyle w:val="PageNumber"/>
+        <w:rStyle w:val="Nmerodepgina"/>
       </w:rPr>
       <w:fldChar w:fldCharType="begin"/>
     </w:r>
     <w:r>
       <w:rPr>
-        <w:rStyle w:val="PageNumber"/>
+        <w:rStyle w:val="Nmerodepgina"/>
       </w:rPr>
       <w:instrText xml:space="preserve"> PAGE </w:instrText>
     </w:r>
     <w:r>
       <w:rPr>
-        <w:rStyle w:val="PageNumber"/>
+        <w:rStyle w:val="Nmerodepgina"/>
       </w:rPr>
       <w:fldChar w:fldCharType="separate"/>
     </w:r>
     <w:r>
       <w:rPr>
-        <w:rStyle w:val="PageNumber"/>
+        <w:rStyle w:val="Nmerodepgina"/>
         <w:noProof/>
       </w:rPr>
       <w:t>9</w:t>
     </w:r>
     <w:r>
       <w:rPr>
-        <w:rStyle w:val="PageNumber"/>
+        <w:rStyle w:val="Nmerodepgina"/>
       </w:rPr>
       <w:fldChar w:fldCharType="end"/>
     </w:r>
   </w:p>
   <w:p>
     <w:pPr>
-      <w:pStyle w:val="Footer"/>
+      <w:pStyle w:val="Rodap"/>
       <w:jc w:val="center"/>
     </w:pPr>
   </w:p>
@@ -8960,39 +9386,39 @@
 </file>
 
 <file path=word/footer2.xml><?xml version="1.0" encoding="utf-8"?>
-<w:ftr xmlns:wpc="http://schemas.microsoft.com/office/word/2010/wordprocessingCanvas" xmlns:cx="http://schemas.microsoft.com/office/drawing/2014/chartex" xmlns:cx1="http://schemas.microsoft.com/office/drawing/2015/9/8/chartex" xmlns:cx2="http://schemas.microsoft.com/office/drawing/2015/10/21/chartex" xmlns:cx3="http://schemas.microsoft.com/office/drawing/2016/5/9/chartex" xmlns:cx4="http://schemas.microsoft.com/office/drawing/2016/5/10/chartex" xmlns:cx5="http://schemas.microsoft.com/office/drawing/2016/5/11/chartex" xmlns:cx6="http://schemas.microsoft.com/office/drawing/2016/5/12/chartex" xmlns:cx7="http://schemas.microsoft.com/office/drawing/2016/5/13/chartex" xmlns:cx8="http://schemas.microsoft.com/office/drawing/2016/5/14/chartex" xmlns:mc="http://schemas.openxmlformats.org/markup-compatibility/2006" xmlns:aink="http://schemas.microsoft.com/office/drawing/2016/ink" xmlns:am3d="http://schemas.microsoft.com/office/drawing/2017/model3d" xmlns:o="urn:schemas-microsoft-com:office:office" xmlns:oel="http://schemas.microsoft.com/office/2019/extlst" xmlns:r="http://schemas.openxmlformats.org/officeDocument/2006/relationships" xmlns:m="http://schemas.openxmlformats.org/officeDocument/2006/math" xmlns:v="urn:schemas-microsoft-com:vml" xmlns:wp14="http://schemas.microsoft.com/office/word/2010/wordprocessingDrawing" xmlns:wp="http://schemas.openxmlformats.org/drawingml/2006/wordprocessingDrawing" xmlns:w10="urn:schemas-microsoft-com:office:word" xmlns:w="http://schemas.openxmlformats.org/wordprocessingml/2006/main" xmlns:w14="http://schemas.microsoft.com/office/word/2010/wordml" xmlns:w15="http://schemas.microsoft.com/office/word/2012/wordml" xmlns:w16cex="http://schemas.microsoft.com/office/word/2018/wordml/cex" xmlns:w16cid="http://schemas.microsoft.com/office/word/2016/wordml/cid" xmlns:w16="http://schemas.microsoft.com/office/word/2018/wordml" xmlns:w16sdtdh="http://schemas.microsoft.com/office/word/2020/wordml/sdtdatahash" xmlns:w16se="http://schemas.microsoft.com/office/word/2015/wordml/symex" xmlns:wpg="http://schemas.microsoft.com/office/word/2010/wordprocessingGroup" xmlns:wpi="http://schemas.microsoft.com/office/word/2010/wordprocessingInk" xmlns:wne="http://schemas.microsoft.com/office/word/2006/wordml" xmlns:wps="http://schemas.microsoft.com/office/word/2010/wordprocessingShape" mc:Ignorable="w14 w15 w16se w16cid w16 w16cex w16sdtdh wp14">
+<w:ftr xmlns:wpc="http://schemas.microsoft.com/office/word/2010/wordprocessingCanvas" xmlns:cx="http://schemas.microsoft.com/office/drawing/2014/chartex" xmlns:cx1="http://schemas.microsoft.com/office/drawing/2015/9/8/chartex" xmlns:cx2="http://schemas.microsoft.com/office/drawing/2015/10/21/chartex" xmlns:cx3="http://schemas.microsoft.com/office/drawing/2016/5/9/chartex" xmlns:cx4="http://schemas.microsoft.com/office/drawing/2016/5/10/chartex" xmlns:cx5="http://schemas.microsoft.com/office/drawing/2016/5/11/chartex" xmlns:cx6="http://schemas.microsoft.com/office/drawing/2016/5/12/chartex" xmlns:cx7="http://schemas.microsoft.com/office/drawing/2016/5/13/chartex" xmlns:cx8="http://schemas.microsoft.com/office/drawing/2016/5/14/chartex" xmlns:mc="http://schemas.openxmlformats.org/markup-compatibility/2006" xmlns:aink="http://schemas.microsoft.com/office/drawing/2016/ink" xmlns:am3d="http://schemas.microsoft.com/office/drawing/2017/model3d" xmlns:o="urn:schemas-microsoft-com:office:office" xmlns:oel="http://schemas.microsoft.com/office/2019/extlst" xmlns:r="http://schemas.openxmlformats.org/officeDocument/2006/relationships" xmlns:m="http://schemas.openxmlformats.org/officeDocument/2006/math" xmlns:v="urn:schemas-microsoft-com:vml" xmlns:wp14="http://schemas.microsoft.com/office/word/2010/wordprocessingDrawing" xmlns:wp="http://schemas.openxmlformats.org/drawingml/2006/wordprocessingDrawing" xmlns:w10="urn:schemas-microsoft-com:office:word" xmlns:w="http://schemas.openxmlformats.org/wordprocessingml/2006/main" xmlns:w14="http://schemas.microsoft.com/office/word/2010/wordml" xmlns:w15="http://schemas.microsoft.com/office/word/2012/wordml" xmlns:w16cex="http://schemas.microsoft.com/office/word/2018/wordml/cex" xmlns:w16cid="http://schemas.microsoft.com/office/word/2016/wordml/cid" xmlns:w16="http://schemas.microsoft.com/office/word/2018/wordml" xmlns:w16du="http://schemas.microsoft.com/office/word/2023/wordml/word16du" xmlns:w16sdtdh="http://schemas.microsoft.com/office/word/2020/wordml/sdtdatahash" xmlns:w16sdtfl="http://schemas.microsoft.com/office/word/2024/wordml/sdtformatlock" xmlns:w16se="http://schemas.microsoft.com/office/word/2015/wordml/symex" xmlns:wpg="http://schemas.microsoft.com/office/word/2010/wordprocessingGroup" xmlns:wpi="http://schemas.microsoft.com/office/word/2010/wordprocessingInk" xmlns:wne="http://schemas.microsoft.com/office/word/2006/wordml" xmlns:wps="http://schemas.microsoft.com/office/word/2010/wordprocessingShape" mc:Ignorable="w14 w15 w16se w16cid w16 w16cex w16sdtdh w16sdtfl w16du wp14">
   <w:p>
     <w:pPr>
-      <w:pStyle w:val="Footer"/>
+      <w:pStyle w:val="Rodap"/>
     </w:pPr>
     <w:r>
       <w:rPr>
-        <w:rStyle w:val="PageNumber"/>
+        <w:rStyle w:val="Nmerodepgina"/>
       </w:rPr>
       <w:fldChar w:fldCharType="begin"/>
     </w:r>
     <w:r>
       <w:rPr>
-        <w:rStyle w:val="PageNumber"/>
+        <w:rStyle w:val="Nmerodepgina"/>
       </w:rPr>
       <w:instrText xml:space="preserve"> PAGE </w:instrText>
     </w:r>
     <w:r>
       <w:rPr>
-        <w:rStyle w:val="PageNumber"/>
+        <w:rStyle w:val="Nmerodepgina"/>
       </w:rPr>
       <w:fldChar w:fldCharType="separate"/>
     </w:r>
     <w:r>
       <w:rPr>
-        <w:rStyle w:val="PageNumber"/>
+        <w:rStyle w:val="Nmerodepgina"/>
         <w:noProof/>
       </w:rPr>
       <w:t>v</w:t>
     </w:r>
     <w:r>
       <w:rPr>
-        <w:rStyle w:val="PageNumber"/>
+        <w:rStyle w:val="Nmerodepgina"/>
       </w:rPr>
       <w:fldChar w:fldCharType="end"/>
     </w:r>
@@ -9001,20 +9427,20 @@
 </file>
 
 <file path=word/footer20.xml><?xml version="1.0" encoding="utf-8"?>
-<w:ftr xmlns:wpc="http://schemas.microsoft.com/office/word/2010/wordprocessingCanvas" xmlns:cx="http://schemas.microsoft.com/office/drawing/2014/chartex" xmlns:cx1="http://schemas.microsoft.com/office/drawing/2015/9/8/chartex" xmlns:cx2="http://schemas.microsoft.com/office/drawing/2015/10/21/chartex" xmlns:cx3="http://schemas.microsoft.com/office/drawing/2016/5/9/chartex" xmlns:cx4="http://schemas.microsoft.com/office/drawing/2016/5/10/chartex" xmlns:cx5="http://schemas.microsoft.com/office/drawing/2016/5/11/chartex" xmlns:cx6="http://schemas.microsoft.com/office/drawing/2016/5/12/chartex" xmlns:cx7="http://schemas.microsoft.com/office/drawing/2016/5/13/chartex" xmlns:cx8="http://schemas.microsoft.com/office/drawing/2016/5/14/chartex" xmlns:mc="http://schemas.openxmlformats.org/markup-compatibility/2006" xmlns:aink="http://schemas.microsoft.com/office/drawing/2016/ink" xmlns:am3d="http://schemas.microsoft.com/office/drawing/2017/model3d" xmlns:o="urn:schemas-microsoft-com:office:office" xmlns:oel="http://schemas.microsoft.com/office/2019/extlst" xmlns:r="http://schemas.openxmlformats.org/officeDocument/2006/relationships" xmlns:m="http://schemas.openxmlformats.org/officeDocument/2006/math" xmlns:v="urn:schemas-microsoft-com:vml" xmlns:wp14="http://schemas.microsoft.com/office/word/2010/wordprocessingDrawing" xmlns:wp="http://schemas.openxmlformats.org/drawingml/2006/wordprocessingDrawing" xmlns:w10="urn:schemas-microsoft-com:office:word" xmlns:w="http://schemas.openxmlformats.org/wordprocessingml/2006/main" xmlns:w14="http://schemas.microsoft.com/office/word/2010/wordml" xmlns:w15="http://schemas.microsoft.com/office/word/2012/wordml" xmlns:w16cex="http://schemas.microsoft.com/office/word/2018/wordml/cex" xmlns:w16cid="http://schemas.microsoft.com/office/word/2016/wordml/cid" xmlns:w16="http://schemas.microsoft.com/office/word/2018/wordml" xmlns:w16sdtdh="http://schemas.microsoft.com/office/word/2020/wordml/sdtdatahash" xmlns:w16se="http://schemas.microsoft.com/office/word/2015/wordml/symex" xmlns:wpg="http://schemas.microsoft.com/office/word/2010/wordprocessingGroup" xmlns:wpi="http://schemas.microsoft.com/office/word/2010/wordprocessingInk" xmlns:wne="http://schemas.microsoft.com/office/word/2006/wordml" xmlns:wps="http://schemas.microsoft.com/office/word/2010/wordprocessingShape" mc:Ignorable="w14 w15 w16se w16cid w16 w16cex w16sdtdh wp14">
+<w:ftr xmlns:wpc="http://schemas.microsoft.com/office/word/2010/wordprocessingCanvas" xmlns:cx="http://schemas.microsoft.com/office/drawing/2014/chartex" xmlns:cx1="http://schemas.microsoft.com/office/drawing/2015/9/8/chartex" xmlns:cx2="http://schemas.microsoft.com/office/drawing/2015/10/21/chartex" xmlns:cx3="http://schemas.microsoft.com/office/drawing/2016/5/9/chartex" xmlns:cx4="http://schemas.microsoft.com/office/drawing/2016/5/10/chartex" xmlns:cx5="http://schemas.microsoft.com/office/drawing/2016/5/11/chartex" xmlns:cx6="http://schemas.microsoft.com/office/drawing/2016/5/12/chartex" xmlns:cx7="http://schemas.microsoft.com/office/drawing/2016/5/13/chartex" xmlns:cx8="http://schemas.microsoft.com/office/drawing/2016/5/14/chartex" xmlns:mc="http://schemas.openxmlformats.org/markup-compatibility/2006" xmlns:aink="http://schemas.microsoft.com/office/drawing/2016/ink" xmlns:am3d="http://schemas.microsoft.com/office/drawing/2017/model3d" xmlns:o="urn:schemas-microsoft-com:office:office" xmlns:oel="http://schemas.microsoft.com/office/2019/extlst" xmlns:r="http://schemas.openxmlformats.org/officeDocument/2006/relationships" xmlns:m="http://schemas.openxmlformats.org/officeDocument/2006/math" xmlns:v="urn:schemas-microsoft-com:vml" xmlns:wp14="http://schemas.microsoft.com/office/word/2010/wordprocessingDrawing" xmlns:wp="http://schemas.openxmlformats.org/drawingml/2006/wordprocessingDrawing" xmlns:w10="urn:schemas-microsoft-com:office:word" xmlns:w="http://schemas.openxmlformats.org/wordprocessingml/2006/main" xmlns:w14="http://schemas.microsoft.com/office/word/2010/wordml" xmlns:w15="http://schemas.microsoft.com/office/word/2012/wordml" xmlns:w16cex="http://schemas.microsoft.com/office/word/2018/wordml/cex" xmlns:w16cid="http://schemas.microsoft.com/office/word/2016/wordml/cid" xmlns:w16="http://schemas.microsoft.com/office/word/2018/wordml" xmlns:w16du="http://schemas.microsoft.com/office/word/2023/wordml/word16du" xmlns:w16sdtdh="http://schemas.microsoft.com/office/word/2020/wordml/sdtdatahash" xmlns:w16sdtfl="http://schemas.microsoft.com/office/word/2024/wordml/sdtformatlock" xmlns:w16se="http://schemas.microsoft.com/office/word/2015/wordml/symex" xmlns:wpg="http://schemas.microsoft.com/office/word/2010/wordprocessingGroup" xmlns:wpi="http://schemas.microsoft.com/office/word/2010/wordprocessingInk" xmlns:wne="http://schemas.microsoft.com/office/word/2006/wordml" xmlns:wps="http://schemas.microsoft.com/office/word/2010/wordprocessingShape" mc:Ignorable="w14 w15 w16se w16cid w16 w16cex w16sdtdh w16sdtfl w16du wp14">
   <w:p>
     <w:pPr>
-      <w:pStyle w:val="Footer"/>
+      <w:pStyle w:val="Rodap"/>
     </w:pPr>
   </w:p>
 </w:ftr>
 </file>
 
 <file path=word/footer21.xml><?xml version="1.0" encoding="utf-8"?>
-<w:ftr xmlns:wpc="http://schemas.microsoft.com/office/word/2010/wordprocessingCanvas" xmlns:cx="http://schemas.microsoft.com/office/drawing/2014/chartex" xmlns:cx1="http://schemas.microsoft.com/office/drawing/2015/9/8/chartex" xmlns:cx2="http://schemas.microsoft.com/office/drawing/2015/10/21/chartex" xmlns:cx3="http://schemas.microsoft.com/office/drawing/2016/5/9/chartex" xmlns:cx4="http://schemas.microsoft.com/office/drawing/2016/5/10/chartex" xmlns:cx5="http://schemas.microsoft.com/office/drawing/2016/5/11/chartex" xmlns:cx6="http://schemas.microsoft.com/office/drawing/2016/5/12/chartex" xmlns:cx7="http://schemas.microsoft.com/office/drawing/2016/5/13/chartex" xmlns:cx8="http://schemas.microsoft.com/office/drawing/2016/5/14/chartex" xmlns:mc="http://schemas.openxmlformats.org/markup-compatibility/2006" xmlns:aink="http://schemas.microsoft.com/office/drawing/2016/ink" xmlns:am3d="http://schemas.microsoft.com/office/drawing/2017/model3d" xmlns:o="urn:schemas-microsoft-com:office:office" xmlns:oel="http://schemas.microsoft.com/office/2019/extlst" xmlns:r="http://schemas.openxmlformats.org/officeDocument/2006/relationships" xmlns:m="http://schemas.openxmlformats.org/officeDocument/2006/math" xmlns:v="urn:schemas-microsoft-com:vml" xmlns:wp14="http://schemas.microsoft.com/office/word/2010/wordprocessingDrawing" xmlns:wp="http://schemas.openxmlformats.org/drawingml/2006/wordprocessingDrawing" xmlns:w10="urn:schemas-microsoft-com:office:word" xmlns:w="http://schemas.openxmlformats.org/wordprocessingml/2006/main" xmlns:w14="http://schemas.microsoft.com/office/word/2010/wordml" xmlns:w15="http://schemas.microsoft.com/office/word/2012/wordml" xmlns:w16cex="http://schemas.microsoft.com/office/word/2018/wordml/cex" xmlns:w16cid="http://schemas.microsoft.com/office/word/2016/wordml/cid" xmlns:w16="http://schemas.microsoft.com/office/word/2018/wordml" xmlns:w16sdtdh="http://schemas.microsoft.com/office/word/2020/wordml/sdtdatahash" xmlns:w16se="http://schemas.microsoft.com/office/word/2015/wordml/symex" xmlns:wpg="http://schemas.microsoft.com/office/word/2010/wordprocessingGroup" xmlns:wpi="http://schemas.microsoft.com/office/word/2010/wordprocessingInk" xmlns:wne="http://schemas.microsoft.com/office/word/2006/wordml" xmlns:wps="http://schemas.microsoft.com/office/word/2010/wordprocessingShape" mc:Ignorable="w14 w15 w16se w16cid w16 w16cex w16sdtdh wp14">
+<w:ftr xmlns:wpc="http://schemas.microsoft.com/office/word/2010/wordprocessingCanvas" xmlns:cx="http://schemas.microsoft.com/office/drawing/2014/chartex" xmlns:cx1="http://schemas.microsoft.com/office/drawing/2015/9/8/chartex" xmlns:cx2="http://schemas.microsoft.com/office/drawing/2015/10/21/chartex" xmlns:cx3="http://schemas.microsoft.com/office/drawing/2016/5/9/chartex" xmlns:cx4="http://schemas.microsoft.com/office/drawing/2016/5/10/chartex" xmlns:cx5="http://schemas.microsoft.com/office/drawing/2016/5/11/chartex" xmlns:cx6="http://schemas.microsoft.com/office/drawing/2016/5/12/chartex" xmlns:cx7="http://schemas.microsoft.com/office/drawing/2016/5/13/chartex" xmlns:cx8="http://schemas.microsoft.com/office/drawing/2016/5/14/chartex" xmlns:mc="http://schemas.openxmlformats.org/markup-compatibility/2006" xmlns:aink="http://schemas.microsoft.com/office/drawing/2016/ink" xmlns:am3d="http://schemas.microsoft.com/office/drawing/2017/model3d" xmlns:o="urn:schemas-microsoft-com:office:office" xmlns:oel="http://schemas.microsoft.com/office/2019/extlst" xmlns:r="http://schemas.openxmlformats.org/officeDocument/2006/relationships" xmlns:m="http://schemas.openxmlformats.org/officeDocument/2006/math" xmlns:v="urn:schemas-microsoft-com:vml" xmlns:wp14="http://schemas.microsoft.com/office/word/2010/wordprocessingDrawing" xmlns:wp="http://schemas.openxmlformats.org/drawingml/2006/wordprocessingDrawing" xmlns:w10="urn:schemas-microsoft-com:office:word" xmlns:w="http://schemas.openxmlformats.org/wordprocessingml/2006/main" xmlns:w14="http://schemas.microsoft.com/office/word/2010/wordml" xmlns:w15="http://schemas.microsoft.com/office/word/2012/wordml" xmlns:w16cex="http://schemas.microsoft.com/office/word/2018/wordml/cex" xmlns:w16cid="http://schemas.microsoft.com/office/word/2016/wordml/cid" xmlns:w16="http://schemas.microsoft.com/office/word/2018/wordml" xmlns:w16du="http://schemas.microsoft.com/office/word/2023/wordml/word16du" xmlns:w16sdtdh="http://schemas.microsoft.com/office/word/2020/wordml/sdtdatahash" xmlns:w16sdtfl="http://schemas.microsoft.com/office/word/2024/wordml/sdtformatlock" xmlns:w16se="http://schemas.microsoft.com/office/word/2015/wordml/symex" xmlns:wpg="http://schemas.microsoft.com/office/word/2010/wordprocessingGroup" xmlns:wpi="http://schemas.microsoft.com/office/word/2010/wordprocessingInk" xmlns:wne="http://schemas.microsoft.com/office/word/2006/wordml" xmlns:wps="http://schemas.microsoft.com/office/word/2010/wordprocessingShape" mc:Ignorable="w14 w15 w16se w16cid w16 w16cex w16sdtdh w16sdtfl w16du wp14">
   <w:p>
     <w:pPr>
-      <w:pStyle w:val="Footer"/>
+      <w:pStyle w:val="Rodap"/>
       <w:pBdr>
         <w:top w:val="single" w:sz="4" w:space="1" w:color="000000"/>
         <w:left w:val="none" w:sz="0" w:space="0" w:color="000000"/>
@@ -9030,56 +9456,56 @@
     </w:pPr>
     <w:r>
       <w:rPr>
-        <w:rStyle w:val="PageNumber"/>
+        <w:rStyle w:val="Nmerodepgina"/>
       </w:rPr>
       <w:t>«Autor»</w:t>
     </w:r>
     <w:r>
       <w:rPr>
-        <w:rStyle w:val="PageNumber"/>
+        <w:rStyle w:val="Nmerodepgina"/>
       </w:rPr>
       <w:tab/>
     </w:r>
     <w:r>
       <w:rPr>
-        <w:rStyle w:val="PageNumber"/>
+        <w:rStyle w:val="Nmerodepgina"/>
       </w:rPr>
       <w:tab/>
     </w:r>
     <w:r>
       <w:rPr>
-        <w:rStyle w:val="PageNumber"/>
+        <w:rStyle w:val="Nmerodepgina"/>
       </w:rPr>
       <w:tab/>
     </w:r>
     <w:r>
       <w:rPr>
-        <w:rStyle w:val="PageNumber"/>
+        <w:rStyle w:val="Nmerodepgina"/>
       </w:rPr>
       <w:fldChar w:fldCharType="begin"/>
     </w:r>
     <w:r>
       <w:rPr>
-        <w:rStyle w:val="PageNumber"/>
+        <w:rStyle w:val="Nmerodepgina"/>
       </w:rPr>
       <w:instrText xml:space="preserve"> PAGE </w:instrText>
     </w:r>
     <w:r>
       <w:rPr>
-        <w:rStyle w:val="PageNumber"/>
+        <w:rStyle w:val="Nmerodepgina"/>
       </w:rPr>
       <w:fldChar w:fldCharType="separate"/>
     </w:r>
     <w:r>
       <w:rPr>
-        <w:rStyle w:val="PageNumber"/>
+        <w:rStyle w:val="Nmerodepgina"/>
         <w:noProof/>
       </w:rPr>
       <w:t>11</w:t>
     </w:r>
     <w:r>
       <w:rPr>
-        <w:rStyle w:val="PageNumber"/>
+        <w:rStyle w:val="Nmerodepgina"/>
       </w:rPr>
       <w:fldChar w:fldCharType="end"/>
     </w:r>
@@ -9088,26 +9514,26 @@
 </file>
 
 <file path=word/footer22.xml><?xml version="1.0" encoding="utf-8"?>
-<w:ftr xmlns:wpc="http://schemas.microsoft.com/office/word/2010/wordprocessingCanvas" xmlns:cx="http://schemas.microsoft.com/office/drawing/2014/chartex" xmlns:cx1="http://schemas.microsoft.com/office/drawing/2015/9/8/chartex" xmlns:cx2="http://schemas.microsoft.com/office/drawing/2015/10/21/chartex" xmlns:cx3="http://schemas.microsoft.com/office/drawing/2016/5/9/chartex" xmlns:cx4="http://schemas.microsoft.com/office/drawing/2016/5/10/chartex" xmlns:cx5="http://schemas.microsoft.com/office/drawing/2016/5/11/chartex" xmlns:cx6="http://schemas.microsoft.com/office/drawing/2016/5/12/chartex" xmlns:cx7="http://schemas.microsoft.com/office/drawing/2016/5/13/chartex" xmlns:cx8="http://schemas.microsoft.com/office/drawing/2016/5/14/chartex" xmlns:mc="http://schemas.openxmlformats.org/markup-compatibility/2006" xmlns:aink="http://schemas.microsoft.com/office/drawing/2016/ink" xmlns:am3d="http://schemas.microsoft.com/office/drawing/2017/model3d" xmlns:o="urn:schemas-microsoft-com:office:office" xmlns:oel="http://schemas.microsoft.com/office/2019/extlst" xmlns:r="http://schemas.openxmlformats.org/officeDocument/2006/relationships" xmlns:m="http://schemas.openxmlformats.org/officeDocument/2006/math" xmlns:v="urn:schemas-microsoft-com:vml" xmlns:wp14="http://schemas.microsoft.com/office/word/2010/wordprocessingDrawing" xmlns:wp="http://schemas.openxmlformats.org/drawingml/2006/wordprocessingDrawing" xmlns:w10="urn:schemas-microsoft-com:office:word" xmlns:w="http://schemas.openxmlformats.org/wordprocessingml/2006/main" xmlns:w14="http://schemas.microsoft.com/office/word/2010/wordml" xmlns:w15="http://schemas.microsoft.com/office/word/2012/wordml" xmlns:w16cex="http://schemas.microsoft.com/office/word/2018/wordml/cex" xmlns:w16cid="http://schemas.microsoft.com/office/word/2016/wordml/cid" xmlns:w16="http://schemas.microsoft.com/office/word/2018/wordml" xmlns:w16sdtdh="http://schemas.microsoft.com/office/word/2020/wordml/sdtdatahash" xmlns:w16se="http://schemas.microsoft.com/office/word/2015/wordml/symex" xmlns:wpg="http://schemas.microsoft.com/office/word/2010/wordprocessingGroup" xmlns:wpi="http://schemas.microsoft.com/office/word/2010/wordprocessingInk" xmlns:wne="http://schemas.microsoft.com/office/word/2006/wordml" xmlns:wps="http://schemas.microsoft.com/office/word/2010/wordprocessingShape" mc:Ignorable="w14 w15 w16se w16cid w16 w16cex w16sdtdh wp14">
+<w:ftr xmlns:wpc="http://schemas.microsoft.com/office/word/2010/wordprocessingCanvas" xmlns:cx="http://schemas.microsoft.com/office/drawing/2014/chartex" xmlns:cx1="http://schemas.microsoft.com/office/drawing/2015/9/8/chartex" xmlns:cx2="http://schemas.microsoft.com/office/drawing/2015/10/21/chartex" xmlns:cx3="http://schemas.microsoft.com/office/drawing/2016/5/9/chartex" xmlns:cx4="http://schemas.microsoft.com/office/drawing/2016/5/10/chartex" xmlns:cx5="http://schemas.microsoft.com/office/drawing/2016/5/11/chartex" xmlns:cx6="http://schemas.microsoft.com/office/drawing/2016/5/12/chartex" xmlns:cx7="http://schemas.microsoft.com/office/drawing/2016/5/13/chartex" xmlns:cx8="http://schemas.microsoft.com/office/drawing/2016/5/14/chartex" xmlns:mc="http://schemas.openxmlformats.org/markup-compatibility/2006" xmlns:aink="http://schemas.microsoft.com/office/drawing/2016/ink" xmlns:am3d="http://schemas.microsoft.com/office/drawing/2017/model3d" xmlns:o="urn:schemas-microsoft-com:office:office" xmlns:oel="http://schemas.microsoft.com/office/2019/extlst" xmlns:r="http://schemas.openxmlformats.org/officeDocument/2006/relationships" xmlns:m="http://schemas.openxmlformats.org/officeDocument/2006/math" xmlns:v="urn:schemas-microsoft-com:vml" xmlns:wp14="http://schemas.microsoft.com/office/word/2010/wordprocessingDrawing" xmlns:wp="http://schemas.openxmlformats.org/drawingml/2006/wordprocessingDrawing" xmlns:w10="urn:schemas-microsoft-com:office:word" xmlns:w="http://schemas.openxmlformats.org/wordprocessingml/2006/main" xmlns:w14="http://schemas.microsoft.com/office/word/2010/wordml" xmlns:w15="http://schemas.microsoft.com/office/word/2012/wordml" xmlns:w16cex="http://schemas.microsoft.com/office/word/2018/wordml/cex" xmlns:w16cid="http://schemas.microsoft.com/office/word/2016/wordml/cid" xmlns:w16="http://schemas.microsoft.com/office/word/2018/wordml" xmlns:w16du="http://schemas.microsoft.com/office/word/2023/wordml/word16du" xmlns:w16sdtdh="http://schemas.microsoft.com/office/word/2020/wordml/sdtdatahash" xmlns:w16sdtfl="http://schemas.microsoft.com/office/word/2024/wordml/sdtformatlock" xmlns:w16se="http://schemas.microsoft.com/office/word/2015/wordml/symex" xmlns:wpg="http://schemas.microsoft.com/office/word/2010/wordprocessingGroup" xmlns:wpi="http://schemas.microsoft.com/office/word/2010/wordprocessingInk" xmlns:wne="http://schemas.microsoft.com/office/word/2006/wordml" xmlns:wps="http://schemas.microsoft.com/office/word/2010/wordprocessingShape" mc:Ignorable="w14 w15 w16se w16cid w16 w16cex w16sdtdh w16sdtfl w16du wp14">
   <w:p/>
 </w:ftr>
 </file>
 
 <file path=word/footer23.xml><?xml version="1.0" encoding="utf-8"?>
-<w:ftr xmlns:wpc="http://schemas.microsoft.com/office/word/2010/wordprocessingCanvas" xmlns:cx="http://schemas.microsoft.com/office/drawing/2014/chartex" xmlns:cx1="http://schemas.microsoft.com/office/drawing/2015/9/8/chartex" xmlns:cx2="http://schemas.microsoft.com/office/drawing/2015/10/21/chartex" xmlns:cx3="http://schemas.microsoft.com/office/drawing/2016/5/9/chartex" xmlns:cx4="http://schemas.microsoft.com/office/drawing/2016/5/10/chartex" xmlns:cx5="http://schemas.microsoft.com/office/drawing/2016/5/11/chartex" xmlns:cx6="http://schemas.microsoft.com/office/drawing/2016/5/12/chartex" xmlns:cx7="http://schemas.microsoft.com/office/drawing/2016/5/13/chartex" xmlns:cx8="http://schemas.microsoft.com/office/drawing/2016/5/14/chartex" xmlns:mc="http://schemas.openxmlformats.org/markup-compatibility/2006" xmlns:aink="http://schemas.microsoft.com/office/drawing/2016/ink" xmlns:am3d="http://schemas.microsoft.com/office/drawing/2017/model3d" xmlns:o="urn:schemas-microsoft-com:office:office" xmlns:oel="http://schemas.microsoft.com/office/2019/extlst" xmlns:r="http://schemas.openxmlformats.org/officeDocument/2006/relationships" xmlns:m="http://schemas.openxmlformats.org/officeDocument/2006/math" xmlns:v="urn:schemas-microsoft-com:vml" xmlns:wp14="http://schemas.microsoft.com/office/word/2010/wordprocessingDrawing" xmlns:wp="http://schemas.openxmlformats.org/drawingml/2006/wordprocessingDrawing" xmlns:w10="urn:schemas-microsoft-com:office:word" xmlns:w="http://schemas.openxmlformats.org/wordprocessingml/2006/main" xmlns:w14="http://schemas.microsoft.com/office/word/2010/wordml" xmlns:w15="http://schemas.microsoft.com/office/word/2012/wordml" xmlns:w16cex="http://schemas.microsoft.com/office/word/2018/wordml/cex" xmlns:w16cid="http://schemas.microsoft.com/office/word/2016/wordml/cid" xmlns:w16="http://schemas.microsoft.com/office/word/2018/wordml" xmlns:w16sdtdh="http://schemas.microsoft.com/office/word/2020/wordml/sdtdatahash" xmlns:w16se="http://schemas.microsoft.com/office/word/2015/wordml/symex" xmlns:wpg="http://schemas.microsoft.com/office/word/2010/wordprocessingGroup" xmlns:wpi="http://schemas.microsoft.com/office/word/2010/wordprocessingInk" xmlns:wne="http://schemas.microsoft.com/office/word/2006/wordml" xmlns:wps="http://schemas.microsoft.com/office/word/2010/wordprocessingShape" mc:Ignorable="w14 w15 w16se w16cid w16 w16cex w16sdtdh wp14">
+<w:ftr xmlns:wpc="http://schemas.microsoft.com/office/word/2010/wordprocessingCanvas" xmlns:cx="http://schemas.microsoft.com/office/drawing/2014/chartex" xmlns:cx1="http://schemas.microsoft.com/office/drawing/2015/9/8/chartex" xmlns:cx2="http://schemas.microsoft.com/office/drawing/2015/10/21/chartex" xmlns:cx3="http://schemas.microsoft.com/office/drawing/2016/5/9/chartex" xmlns:cx4="http://schemas.microsoft.com/office/drawing/2016/5/10/chartex" xmlns:cx5="http://schemas.microsoft.com/office/drawing/2016/5/11/chartex" xmlns:cx6="http://schemas.microsoft.com/office/drawing/2016/5/12/chartex" xmlns:cx7="http://schemas.microsoft.com/office/drawing/2016/5/13/chartex" xmlns:cx8="http://schemas.microsoft.com/office/drawing/2016/5/14/chartex" xmlns:mc="http://schemas.openxmlformats.org/markup-compatibility/2006" xmlns:aink="http://schemas.microsoft.com/office/drawing/2016/ink" xmlns:am3d="http://schemas.microsoft.com/office/drawing/2017/model3d" xmlns:o="urn:schemas-microsoft-com:office:office" xmlns:oel="http://schemas.microsoft.com/office/2019/extlst" xmlns:r="http://schemas.openxmlformats.org/officeDocument/2006/relationships" xmlns:m="http://schemas.openxmlformats.org/officeDocument/2006/math" xmlns:v="urn:schemas-microsoft-com:vml" xmlns:wp14="http://schemas.microsoft.com/office/word/2010/wordprocessingDrawing" xmlns:wp="http://schemas.openxmlformats.org/drawingml/2006/wordprocessingDrawing" xmlns:w10="urn:schemas-microsoft-com:office:word" xmlns:w="http://schemas.openxmlformats.org/wordprocessingml/2006/main" xmlns:w14="http://schemas.microsoft.com/office/word/2010/wordml" xmlns:w15="http://schemas.microsoft.com/office/word/2012/wordml" xmlns:w16cex="http://schemas.microsoft.com/office/word/2018/wordml/cex" xmlns:w16cid="http://schemas.microsoft.com/office/word/2016/wordml/cid" xmlns:w16="http://schemas.microsoft.com/office/word/2018/wordml" xmlns:w16du="http://schemas.microsoft.com/office/word/2023/wordml/word16du" xmlns:w16sdtdh="http://schemas.microsoft.com/office/word/2020/wordml/sdtdatahash" xmlns:w16sdtfl="http://schemas.microsoft.com/office/word/2024/wordml/sdtformatlock" xmlns:w16se="http://schemas.microsoft.com/office/word/2015/wordml/symex" xmlns:wpg="http://schemas.microsoft.com/office/word/2010/wordprocessingGroup" xmlns:wpi="http://schemas.microsoft.com/office/word/2010/wordprocessingInk" xmlns:wne="http://schemas.microsoft.com/office/word/2006/wordml" xmlns:wps="http://schemas.microsoft.com/office/word/2010/wordprocessingShape" mc:Ignorable="w14 w15 w16se w16cid w16 w16cex w16sdtdh w16sdtfl w16du wp14">
   <w:p>
     <w:pPr>
-      <w:pStyle w:val="Footer"/>
+      <w:pStyle w:val="Rodap"/>
     </w:pPr>
   </w:p>
 </w:ftr>
 </file>
 
 <file path=word/footer24.xml><?xml version="1.0" encoding="utf-8"?>
-<w:ftr xmlns:wpc="http://schemas.microsoft.com/office/word/2010/wordprocessingCanvas" xmlns:cx="http://schemas.microsoft.com/office/drawing/2014/chartex" xmlns:cx1="http://schemas.microsoft.com/office/drawing/2015/9/8/chartex" xmlns:cx2="http://schemas.microsoft.com/office/drawing/2015/10/21/chartex" xmlns:cx3="http://schemas.microsoft.com/office/drawing/2016/5/9/chartex" xmlns:cx4="http://schemas.microsoft.com/office/drawing/2016/5/10/chartex" xmlns:cx5="http://schemas.microsoft.com/office/drawing/2016/5/11/chartex" xmlns:cx6="http://schemas.microsoft.com/office/drawing/2016/5/12/chartex" xmlns:cx7="http://schemas.microsoft.com/office/drawing/2016/5/13/chartex" xmlns:cx8="http://schemas.microsoft.com/office/drawing/2016/5/14/chartex" xmlns:mc="http://schemas.openxmlformats.org/markup-compatibility/2006" xmlns:aink="http://schemas.microsoft.com/office/drawing/2016/ink" xmlns:am3d="http://schemas.microsoft.com/office/drawing/2017/model3d" xmlns:o="urn:schemas-microsoft-com:office:office" xmlns:oel="http://schemas.microsoft.com/office/2019/extlst" xmlns:r="http://schemas.openxmlformats.org/officeDocument/2006/relationships" xmlns:m="http://schemas.openxmlformats.org/officeDocument/2006/math" xmlns:v="urn:schemas-microsoft-com:vml" xmlns:wp14="http://schemas.microsoft.com/office/word/2010/wordprocessingDrawing" xmlns:wp="http://schemas.openxmlformats.org/drawingml/2006/wordprocessingDrawing" xmlns:w10="urn:schemas-microsoft-com:office:word" xmlns:w="http://schemas.openxmlformats.org/wordprocessingml/2006/main" xmlns:w14="http://schemas.microsoft.com/office/word/2010/wordml" xmlns:w15="http://schemas.microsoft.com/office/word/2012/wordml" xmlns:w16cex="http://schemas.microsoft.com/office/word/2018/wordml/cex" xmlns:w16cid="http://schemas.microsoft.com/office/word/2016/wordml/cid" xmlns:w16="http://schemas.microsoft.com/office/word/2018/wordml" xmlns:w16sdtdh="http://schemas.microsoft.com/office/word/2020/wordml/sdtdatahash" xmlns:w16se="http://schemas.microsoft.com/office/word/2015/wordml/symex" xmlns:wpg="http://schemas.microsoft.com/office/word/2010/wordprocessingGroup" xmlns:wpi="http://schemas.microsoft.com/office/word/2010/wordprocessingInk" xmlns:wne="http://schemas.microsoft.com/office/word/2006/wordml" xmlns:wps="http://schemas.microsoft.com/office/word/2010/wordprocessingShape" mc:Ignorable="w14 w15 w16se w16cid w16 w16cex w16sdtdh wp14">
+<w:ftr xmlns:wpc="http://schemas.microsoft.com/office/word/2010/wordprocessingCanvas" xmlns:cx="http://schemas.microsoft.com/office/drawing/2014/chartex" xmlns:cx1="http://schemas.microsoft.com/office/drawing/2015/9/8/chartex" xmlns:cx2="http://schemas.microsoft.com/office/drawing/2015/10/21/chartex" xmlns:cx3="http://schemas.microsoft.com/office/drawing/2016/5/9/chartex" xmlns:cx4="http://schemas.microsoft.com/office/drawing/2016/5/10/chartex" xmlns:cx5="http://schemas.microsoft.com/office/drawing/2016/5/11/chartex" xmlns:cx6="http://schemas.microsoft.com/office/drawing/2016/5/12/chartex" xmlns:cx7="http://schemas.microsoft.com/office/drawing/2016/5/13/chartex" xmlns:cx8="http://schemas.microsoft.com/office/drawing/2016/5/14/chartex" xmlns:mc="http://schemas.openxmlformats.org/markup-compatibility/2006" xmlns:aink="http://schemas.microsoft.com/office/drawing/2016/ink" xmlns:am3d="http://schemas.microsoft.com/office/drawing/2017/model3d" xmlns:o="urn:schemas-microsoft-com:office:office" xmlns:oel="http://schemas.microsoft.com/office/2019/extlst" xmlns:r="http://schemas.openxmlformats.org/officeDocument/2006/relationships" xmlns:m="http://schemas.openxmlformats.org/officeDocument/2006/math" xmlns:v="urn:schemas-microsoft-com:vml" xmlns:wp14="http://schemas.microsoft.com/office/word/2010/wordprocessingDrawing" xmlns:wp="http://schemas.openxmlformats.org/drawingml/2006/wordprocessingDrawing" xmlns:w10="urn:schemas-microsoft-com:office:word" xmlns:w="http://schemas.openxmlformats.org/wordprocessingml/2006/main" xmlns:w14="http://schemas.microsoft.com/office/word/2010/wordml" xmlns:w15="http://schemas.microsoft.com/office/word/2012/wordml" xmlns:w16cex="http://schemas.microsoft.com/office/word/2018/wordml/cex" xmlns:w16cid="http://schemas.microsoft.com/office/word/2016/wordml/cid" xmlns:w16="http://schemas.microsoft.com/office/word/2018/wordml" xmlns:w16du="http://schemas.microsoft.com/office/word/2023/wordml/word16du" xmlns:w16sdtdh="http://schemas.microsoft.com/office/word/2020/wordml/sdtdatahash" xmlns:w16sdtfl="http://schemas.microsoft.com/office/word/2024/wordml/sdtformatlock" xmlns:w16se="http://schemas.microsoft.com/office/word/2015/wordml/symex" xmlns:wpg="http://schemas.microsoft.com/office/word/2010/wordprocessingGroup" xmlns:wpi="http://schemas.microsoft.com/office/word/2010/wordprocessingInk" xmlns:wne="http://schemas.microsoft.com/office/word/2006/wordml" xmlns:wps="http://schemas.microsoft.com/office/word/2010/wordprocessingShape" mc:Ignorable="w14 w15 w16se w16cid w16 w16cex w16sdtdh w16sdtfl w16du wp14">
   <w:p>
     <w:pPr>
-      <w:pStyle w:val="Footer"/>
+      <w:pStyle w:val="Rodap"/>
       <w:pBdr>
         <w:top w:val="single" w:sz="4" w:space="1" w:color="000000"/>
         <w:left w:val="none" w:sz="0" w:space="0" w:color="000000"/>
@@ -9123,56 +9549,56 @@
     </w:pPr>
     <w:r>
       <w:rPr>
-        <w:rStyle w:val="PageNumber"/>
+        <w:rStyle w:val="Nmerodepgina"/>
       </w:rPr>
       <w:t>«Autor»</w:t>
     </w:r>
     <w:r>
       <w:rPr>
-        <w:rStyle w:val="PageNumber"/>
+        <w:rStyle w:val="Nmerodepgina"/>
       </w:rPr>
       <w:tab/>
     </w:r>
     <w:r>
       <w:rPr>
-        <w:rStyle w:val="PageNumber"/>
+        <w:rStyle w:val="Nmerodepgina"/>
       </w:rPr>
       <w:tab/>
     </w:r>
     <w:r>
       <w:rPr>
-        <w:rStyle w:val="PageNumber"/>
+        <w:rStyle w:val="Nmerodepgina"/>
       </w:rPr>
       <w:tab/>
     </w:r>
     <w:r>
       <w:rPr>
-        <w:rStyle w:val="PageNumber"/>
+        <w:rStyle w:val="Nmerodepgina"/>
       </w:rPr>
       <w:fldChar w:fldCharType="begin"/>
     </w:r>
     <w:r>
       <w:rPr>
-        <w:rStyle w:val="PageNumber"/>
+        <w:rStyle w:val="Nmerodepgina"/>
       </w:rPr>
       <w:instrText xml:space="preserve"> PAGE </w:instrText>
     </w:r>
     <w:r>
       <w:rPr>
-        <w:rStyle w:val="PageNumber"/>
+        <w:rStyle w:val="Nmerodepgina"/>
       </w:rPr>
       <w:fldChar w:fldCharType="separate"/>
     </w:r>
     <w:r>
       <w:rPr>
-        <w:rStyle w:val="PageNumber"/>
+        <w:rStyle w:val="Nmerodepgina"/>
         <w:noProof/>
       </w:rPr>
       <w:t>13</w:t>
     </w:r>
     <w:r>
       <w:rPr>
-        <w:rStyle w:val="PageNumber"/>
+        <w:rStyle w:val="Nmerodepgina"/>
       </w:rPr>
       <w:fldChar w:fldCharType="end"/>
     </w:r>
@@ -9181,16 +9607,16 @@
 </file>
 
 <file path=word/footer25.xml><?xml version="1.0" encoding="utf-8"?>
-<w:ftr xmlns:wpc="http://schemas.microsoft.com/office/word/2010/wordprocessingCanvas" xmlns:cx="http://schemas.microsoft.com/office/drawing/2014/chartex" xmlns:cx1="http://schemas.microsoft.com/office/drawing/2015/9/8/chartex" xmlns:cx2="http://schemas.microsoft.com/office/drawing/2015/10/21/chartex" xmlns:cx3="http://schemas.microsoft.com/office/drawing/2016/5/9/chartex" xmlns:cx4="http://schemas.microsoft.com/office/drawing/2016/5/10/chartex" xmlns:cx5="http://schemas.microsoft.com/office/drawing/2016/5/11/chartex" xmlns:cx6="http://schemas.microsoft.com/office/drawing/2016/5/12/chartex" xmlns:cx7="http://schemas.microsoft.com/office/drawing/2016/5/13/chartex" xmlns:cx8="http://schemas.microsoft.com/office/drawing/2016/5/14/chartex" xmlns:mc="http://schemas.openxmlformats.org/markup-compatibility/2006" xmlns:aink="http://schemas.microsoft.com/office/drawing/2016/ink" xmlns:am3d="http://schemas.microsoft.com/office/drawing/2017/model3d" xmlns:o="urn:schemas-microsoft-com:office:office" xmlns:oel="http://schemas.microsoft.com/office/2019/extlst" xmlns:r="http://schemas.openxmlformats.org/officeDocument/2006/relationships" xmlns:m="http://schemas.openxmlformats.org/officeDocument/2006/math" xmlns:v="urn:schemas-microsoft-com:vml" xmlns:wp14="http://schemas.microsoft.com/office/word/2010/wordprocessingDrawing" xmlns:wp="http://schemas.openxmlformats.org/drawingml/2006/wordprocessingDrawing" xmlns:w10="urn:schemas-microsoft-com:office:word" xmlns:w="http://schemas.openxmlformats.org/wordprocessingml/2006/main" xmlns:w14="http://schemas.microsoft.com/office/word/2010/wordml" xmlns:w15="http://schemas.microsoft.com/office/word/2012/wordml" xmlns:w16cex="http://schemas.microsoft.com/office/word/2018/wordml/cex" xmlns:w16cid="http://schemas.microsoft.com/office/word/2016/wordml/cid" xmlns:w16="http://schemas.microsoft.com/office/word/2018/wordml" xmlns:w16sdtdh="http://schemas.microsoft.com/office/word/2020/wordml/sdtdatahash" xmlns:w16se="http://schemas.microsoft.com/office/word/2015/wordml/symex" xmlns:wpg="http://schemas.microsoft.com/office/word/2010/wordprocessingGroup" xmlns:wpi="http://schemas.microsoft.com/office/word/2010/wordprocessingInk" xmlns:wne="http://schemas.microsoft.com/office/word/2006/wordml" xmlns:wps="http://schemas.microsoft.com/office/word/2010/wordprocessingShape" mc:Ignorable="w14 w15 w16se w16cid w16 w16cex w16sdtdh wp14">
+<w:ftr xmlns:wpc="http://schemas.microsoft.com/office/word/2010/wordprocessingCanvas" xmlns:cx="http://schemas.microsoft.com/office/drawing/2014/chartex" xmlns:cx1="http://schemas.microsoft.com/office/drawing/2015/9/8/chartex" xmlns:cx2="http://schemas.microsoft.com/office/drawing/2015/10/21/chartex" xmlns:cx3="http://schemas.microsoft.com/office/drawing/2016/5/9/chartex" xmlns:cx4="http://schemas.microsoft.com/office/drawing/2016/5/10/chartex" xmlns:cx5="http://schemas.microsoft.com/office/drawing/2016/5/11/chartex" xmlns:cx6="http://schemas.microsoft.com/office/drawing/2016/5/12/chartex" xmlns:cx7="http://schemas.microsoft.com/office/drawing/2016/5/13/chartex" xmlns:cx8="http://schemas.microsoft.com/office/drawing/2016/5/14/chartex" xmlns:mc="http://schemas.openxmlformats.org/markup-compatibility/2006" xmlns:aink="http://schemas.microsoft.com/office/drawing/2016/ink" xmlns:am3d="http://schemas.microsoft.com/office/drawing/2017/model3d" xmlns:o="urn:schemas-microsoft-com:office:office" xmlns:oel="http://schemas.microsoft.com/office/2019/extlst" xmlns:r="http://schemas.openxmlformats.org/officeDocument/2006/relationships" xmlns:m="http://schemas.openxmlformats.org/officeDocument/2006/math" xmlns:v="urn:schemas-microsoft-com:vml" xmlns:wp14="http://schemas.microsoft.com/office/word/2010/wordprocessingDrawing" xmlns:wp="http://schemas.openxmlformats.org/drawingml/2006/wordprocessingDrawing" xmlns:w10="urn:schemas-microsoft-com:office:word" xmlns:w="http://schemas.openxmlformats.org/wordprocessingml/2006/main" xmlns:w14="http://schemas.microsoft.com/office/word/2010/wordml" xmlns:w15="http://schemas.microsoft.com/office/word/2012/wordml" xmlns:w16cex="http://schemas.microsoft.com/office/word/2018/wordml/cex" xmlns:w16cid="http://schemas.microsoft.com/office/word/2016/wordml/cid" xmlns:w16="http://schemas.microsoft.com/office/word/2018/wordml" xmlns:w16du="http://schemas.microsoft.com/office/word/2023/wordml/word16du" xmlns:w16sdtdh="http://schemas.microsoft.com/office/word/2020/wordml/sdtdatahash" xmlns:w16sdtfl="http://schemas.microsoft.com/office/word/2024/wordml/sdtformatlock" xmlns:w16se="http://schemas.microsoft.com/office/word/2015/wordml/symex" xmlns:wpg="http://schemas.microsoft.com/office/word/2010/wordprocessingGroup" xmlns:wpi="http://schemas.microsoft.com/office/word/2010/wordprocessingInk" xmlns:wne="http://schemas.microsoft.com/office/word/2006/wordml" xmlns:wps="http://schemas.microsoft.com/office/word/2010/wordprocessingShape" mc:Ignorable="w14 w15 w16se w16cid w16 w16cex w16sdtdh w16sdtfl w16du wp14">
   <w:p/>
 </w:ftr>
 </file>
 
 <file path=word/footer26.xml><?xml version="1.0" encoding="utf-8"?>
-<w:ftr xmlns:wpc="http://schemas.microsoft.com/office/word/2010/wordprocessingCanvas" xmlns:cx="http://schemas.microsoft.com/office/drawing/2014/chartex" xmlns:cx1="http://schemas.microsoft.com/office/drawing/2015/9/8/chartex" xmlns:cx2="http://schemas.microsoft.com/office/drawing/2015/10/21/chartex" xmlns:cx3="http://schemas.microsoft.com/office/drawing/2016/5/9/chartex" xmlns:cx4="http://schemas.microsoft.com/office/drawing/2016/5/10/chartex" xmlns:cx5="http://schemas.microsoft.com/office/drawing/2016/5/11/chartex" xmlns:cx6="http://schemas.microsoft.com/office/drawing/2016/5/12/chartex" xmlns:cx7="http://schemas.microsoft.com/office/drawing/2016/5/13/chartex" xmlns:cx8="http://schemas.microsoft.com/office/drawing/2016/5/14/chartex" xmlns:mc="http://schemas.openxmlformats.org/markup-compatibility/2006" xmlns:aink="http://schemas.microsoft.com/office/drawing/2016/ink" xmlns:am3d="http://schemas.microsoft.com/office/drawing/2017/model3d" xmlns:o="urn:schemas-microsoft-com:office:office" xmlns:oel="http://schemas.microsoft.com/office/2019/extlst" xmlns:r="http://schemas.openxmlformats.org/officeDocument/2006/relationships" xmlns:m="http://schemas.openxmlformats.org/officeDocument/2006/math" xmlns:v="urn:schemas-microsoft-com:vml" xmlns:wp14="http://schemas.microsoft.com/office/word/2010/wordprocessingDrawing" xmlns:wp="http://schemas.openxmlformats.org/drawingml/2006/wordprocessingDrawing" xmlns:w10="urn:schemas-microsoft-com:office:word" xmlns:w="http://schemas.openxmlformats.org/wordprocessingml/2006/main" xmlns:w14="http://schemas.microsoft.com/office/word/2010/wordml" xmlns:w15="http://schemas.microsoft.com/office/word/2012/wordml" xmlns:w16cex="http://schemas.microsoft.com/office/word/2018/wordml/cex" xmlns:w16cid="http://schemas.microsoft.com/office/word/2016/wordml/cid" xmlns:w16="http://schemas.microsoft.com/office/word/2018/wordml" xmlns:w16sdtdh="http://schemas.microsoft.com/office/word/2020/wordml/sdtdatahash" xmlns:w16se="http://schemas.microsoft.com/office/word/2015/wordml/symex" xmlns:wpg="http://schemas.microsoft.com/office/word/2010/wordprocessingGroup" xmlns:wpi="http://schemas.microsoft.com/office/word/2010/wordprocessingInk" xmlns:wne="http://schemas.microsoft.com/office/word/2006/wordml" xmlns:wps="http://schemas.microsoft.com/office/word/2010/wordprocessingShape" mc:Ignorable="w14 w15 w16se w16cid w16 w16cex w16sdtdh wp14">
+<w:ftr xmlns:wpc="http://schemas.microsoft.com/office/word/2010/wordprocessingCanvas" xmlns:cx="http://schemas.microsoft.com/office/drawing/2014/chartex" xmlns:cx1="http://schemas.microsoft.com/office/drawing/2015/9/8/chartex" xmlns:cx2="http://schemas.microsoft.com/office/drawing/2015/10/21/chartex" xmlns:cx3="http://schemas.microsoft.com/office/drawing/2016/5/9/chartex" xmlns:cx4="http://schemas.microsoft.com/office/drawing/2016/5/10/chartex" xmlns:cx5="http://schemas.microsoft.com/office/drawing/2016/5/11/chartex" xmlns:cx6="http://schemas.microsoft.com/office/drawing/2016/5/12/chartex" xmlns:cx7="http://schemas.microsoft.com/office/drawing/2016/5/13/chartex" xmlns:cx8="http://schemas.microsoft.com/office/drawing/2016/5/14/chartex" xmlns:mc="http://schemas.openxmlformats.org/markup-compatibility/2006" xmlns:aink="http://schemas.microsoft.com/office/drawing/2016/ink" xmlns:am3d="http://schemas.microsoft.com/office/drawing/2017/model3d" xmlns:o="urn:schemas-microsoft-com:office:office" xmlns:oel="http://schemas.microsoft.com/office/2019/extlst" xmlns:r="http://schemas.openxmlformats.org/officeDocument/2006/relationships" xmlns:m="http://schemas.openxmlformats.org/officeDocument/2006/math" xmlns:v="urn:schemas-microsoft-com:vml" xmlns:wp14="http://schemas.microsoft.com/office/word/2010/wordprocessingDrawing" xmlns:wp="http://schemas.openxmlformats.org/drawingml/2006/wordprocessingDrawing" xmlns:w10="urn:schemas-microsoft-com:office:word" xmlns:w="http://schemas.openxmlformats.org/wordprocessingml/2006/main" xmlns:w14="http://schemas.microsoft.com/office/word/2010/wordml" xmlns:w15="http://schemas.microsoft.com/office/word/2012/wordml" xmlns:w16cex="http://schemas.microsoft.com/office/word/2018/wordml/cex" xmlns:w16cid="http://schemas.microsoft.com/office/word/2016/wordml/cid" xmlns:w16="http://schemas.microsoft.com/office/word/2018/wordml" xmlns:w16du="http://schemas.microsoft.com/office/word/2023/wordml/word16du" xmlns:w16sdtdh="http://schemas.microsoft.com/office/word/2020/wordml/sdtdatahash" xmlns:w16sdtfl="http://schemas.microsoft.com/office/word/2024/wordml/sdtformatlock" xmlns:w16se="http://schemas.microsoft.com/office/word/2015/wordml/symex" xmlns:wpg="http://schemas.microsoft.com/office/word/2010/wordprocessingGroup" xmlns:wpi="http://schemas.microsoft.com/office/word/2010/wordprocessingInk" xmlns:wne="http://schemas.microsoft.com/office/word/2006/wordml" xmlns:wps="http://schemas.microsoft.com/office/word/2010/wordprocessingShape" mc:Ignorable="w14 w15 w16se w16cid w16 w16cex w16sdtdh w16sdtfl w16du wp14">
   <w:p>
     <w:pPr>
-      <w:pStyle w:val="Footer"/>
+      <w:pStyle w:val="Rodap"/>
       <w:pBdr>
         <w:top w:val="single" w:sz="4" w:space="1" w:color="000000"/>
         <w:left w:val="none" w:sz="0" w:space="0" w:color="000000"/>
@@ -9206,56 +9632,56 @@
     </w:pPr>
     <w:r>
       <w:rPr>
-        <w:rStyle w:val="PageNumber"/>
+        <w:rStyle w:val="Nmerodepgina"/>
       </w:rPr>
       <w:t>«Autor»</w:t>
     </w:r>
     <w:r>
       <w:rPr>
-        <w:rStyle w:val="PageNumber"/>
+        <w:rStyle w:val="Nmerodepgina"/>
       </w:rPr>
       <w:tab/>
     </w:r>
     <w:r>
       <w:rPr>
-        <w:rStyle w:val="PageNumber"/>
+        <w:rStyle w:val="Nmerodepgina"/>
       </w:rPr>
       <w:tab/>
     </w:r>
     <w:r>
       <w:rPr>
-        <w:rStyle w:val="PageNumber"/>
+        <w:rStyle w:val="Nmerodepgina"/>
       </w:rPr>
       <w:tab/>
     </w:r>
     <w:r>
       <w:rPr>
-        <w:rStyle w:val="PageNumber"/>
+        <w:rStyle w:val="Nmerodepgina"/>
       </w:rPr>
       <w:fldChar w:fldCharType="begin"/>
     </w:r>
     <w:r>
       <w:rPr>
-        <w:rStyle w:val="PageNumber"/>
+        <w:rStyle w:val="Nmerodepgina"/>
       </w:rPr>
       <w:instrText xml:space="preserve"> PAGE </w:instrText>
     </w:r>
     <w:r>
       <w:rPr>
-        <w:rStyle w:val="PageNumber"/>
+        <w:rStyle w:val="Nmerodepgina"/>
       </w:rPr>
       <w:fldChar w:fldCharType="separate"/>
     </w:r>
     <w:r>
       <w:rPr>
-        <w:rStyle w:val="PageNumber"/>
+        <w:rStyle w:val="Nmerodepgina"/>
         <w:noProof/>
       </w:rPr>
       <w:t>20</w:t>
     </w:r>
     <w:r>
       <w:rPr>
-        <w:rStyle w:val="PageNumber"/>
+        <w:rStyle w:val="Nmerodepgina"/>
       </w:rPr>
       <w:fldChar w:fldCharType="end"/>
     </w:r>
@@ -9264,10 +9690,10 @@
 </file>
 
 <file path=word/footer27.xml><?xml version="1.0" encoding="utf-8"?>
-<w:ftr xmlns:wpc="http://schemas.microsoft.com/office/word/2010/wordprocessingCanvas" xmlns:cx="http://schemas.microsoft.com/office/drawing/2014/chartex" xmlns:cx1="http://schemas.microsoft.com/office/drawing/2015/9/8/chartex" xmlns:cx2="http://schemas.microsoft.com/office/drawing/2015/10/21/chartex" xmlns:cx3="http://schemas.microsoft.com/office/drawing/2016/5/9/chartex" xmlns:cx4="http://schemas.microsoft.com/office/drawing/2016/5/10/chartex" xmlns:cx5="http://schemas.microsoft.com/office/drawing/2016/5/11/chartex" xmlns:cx6="http://schemas.microsoft.com/office/drawing/2016/5/12/chartex" xmlns:cx7="http://schemas.microsoft.com/office/drawing/2016/5/13/chartex" xmlns:cx8="http://schemas.microsoft.com/office/drawing/2016/5/14/chartex" xmlns:mc="http://schemas.openxmlformats.org/markup-compatibility/2006" xmlns:aink="http://schemas.microsoft.com/office/drawing/2016/ink" xmlns:am3d="http://schemas.microsoft.com/office/drawing/2017/model3d" xmlns:o="urn:schemas-microsoft-com:office:office" xmlns:oel="http://schemas.microsoft.com/office/2019/extlst" xmlns:r="http://schemas.openxmlformats.org/officeDocument/2006/relationships" xmlns:m="http://schemas.openxmlformats.org/officeDocument/2006/math" xmlns:v="urn:schemas-microsoft-com:vml" xmlns:wp14="http://schemas.microsoft.com/office/word/2010/wordprocessingDrawing" xmlns:wp="http://schemas.openxmlformats.org/drawingml/2006/wordprocessingDrawing" xmlns:w10="urn:schemas-microsoft-com:office:word" xmlns:w="http://schemas.openxmlformats.org/wordprocessingml/2006/main" xmlns:w14="http://schemas.microsoft.com/office/word/2010/wordml" xmlns:w15="http://schemas.microsoft.com/office/word/2012/wordml" xmlns:w16cex="http://schemas.microsoft.com/office/word/2018/wordml/cex" xmlns:w16cid="http://schemas.microsoft.com/office/word/2016/wordml/cid" xmlns:w16="http://schemas.microsoft.com/office/word/2018/wordml" xmlns:w16sdtdh="http://schemas.microsoft.com/office/word/2020/wordml/sdtdatahash" xmlns:w16se="http://schemas.microsoft.com/office/word/2015/wordml/symex" xmlns:wpg="http://schemas.microsoft.com/office/word/2010/wordprocessingGroup" xmlns:wpi="http://schemas.microsoft.com/office/word/2010/wordprocessingInk" xmlns:wne="http://schemas.microsoft.com/office/word/2006/wordml" xmlns:wps="http://schemas.microsoft.com/office/word/2010/wordprocessingShape" mc:Ignorable="w14 w15 w16se w16cid w16 w16cex w16sdtdh wp14">
+<w:ftr xmlns:wpc="http://schemas.microsoft.com/office/word/2010/wordprocessingCanvas" xmlns:cx="http://schemas.microsoft.com/office/drawing/2014/chartex" xmlns:cx1="http://schemas.microsoft.com/office/drawing/2015/9/8/chartex" xmlns:cx2="http://schemas.microsoft.com/office/drawing/2015/10/21/chartex" xmlns:cx3="http://schemas.microsoft.com/office/drawing/2016/5/9/chartex" xmlns:cx4="http://schemas.microsoft.com/office/drawing/2016/5/10/chartex" xmlns:cx5="http://schemas.microsoft.com/office/drawing/2016/5/11/chartex" xmlns:cx6="http://schemas.microsoft.com/office/drawing/2016/5/12/chartex" xmlns:cx7="http://schemas.microsoft.com/office/drawing/2016/5/13/chartex" xmlns:cx8="http://schemas.microsoft.com/office/drawing/2016/5/14/chartex" xmlns:mc="http://schemas.openxmlformats.org/markup-compatibility/2006" xmlns:aink="http://schemas.microsoft.com/office/drawing/2016/ink" xmlns:am3d="http://schemas.microsoft.com/office/drawing/2017/model3d" xmlns:o="urn:schemas-microsoft-com:office:office" xmlns:oel="http://schemas.microsoft.com/office/2019/extlst" xmlns:r="http://schemas.openxmlformats.org/officeDocument/2006/relationships" xmlns:m="http://schemas.openxmlformats.org/officeDocument/2006/math" xmlns:v="urn:schemas-microsoft-com:vml" xmlns:wp14="http://schemas.microsoft.com/office/word/2010/wordprocessingDrawing" xmlns:wp="http://schemas.openxmlformats.org/drawingml/2006/wordprocessingDrawing" xmlns:w10="urn:schemas-microsoft-com:office:word" xmlns:w="http://schemas.openxmlformats.org/wordprocessingml/2006/main" xmlns:w14="http://schemas.microsoft.com/office/word/2010/wordml" xmlns:w15="http://schemas.microsoft.com/office/word/2012/wordml" xmlns:w16cex="http://schemas.microsoft.com/office/word/2018/wordml/cex" xmlns:w16cid="http://schemas.microsoft.com/office/word/2016/wordml/cid" xmlns:w16="http://schemas.microsoft.com/office/word/2018/wordml" xmlns:w16du="http://schemas.microsoft.com/office/word/2023/wordml/word16du" xmlns:w16sdtdh="http://schemas.microsoft.com/office/word/2020/wordml/sdtdatahash" xmlns:w16sdtfl="http://schemas.microsoft.com/office/word/2024/wordml/sdtformatlock" xmlns:w16se="http://schemas.microsoft.com/office/word/2015/wordml/symex" xmlns:wpg="http://schemas.microsoft.com/office/word/2010/wordprocessingGroup" xmlns:wpi="http://schemas.microsoft.com/office/word/2010/wordprocessingInk" xmlns:wne="http://schemas.microsoft.com/office/word/2006/wordml" xmlns:wps="http://schemas.microsoft.com/office/word/2010/wordprocessingShape" mc:Ignorable="w14 w15 w16se w16cid w16 w16cex w16sdtdh w16sdtfl w16du wp14">
   <w:p>
     <w:pPr>
-      <w:pStyle w:val="Footer"/>
+      <w:pStyle w:val="Rodap"/>
       <w:pBdr>
         <w:top w:val="single" w:sz="4" w:space="1" w:color="000000"/>
         <w:left w:val="none" w:sz="0" w:space="0" w:color="000000"/>
@@ -9283,56 +9709,56 @@
     </w:pPr>
     <w:r>
       <w:rPr>
-        <w:rStyle w:val="PageNumber"/>
+        <w:rStyle w:val="Nmerodepgina"/>
       </w:rPr>
       <w:t>«Autor»</w:t>
     </w:r>
     <w:r>
       <w:rPr>
-        <w:rStyle w:val="PageNumber"/>
+        <w:rStyle w:val="Nmerodepgina"/>
       </w:rPr>
       <w:tab/>
     </w:r>
     <w:r>
       <w:rPr>
-        <w:rStyle w:val="PageNumber"/>
+        <w:rStyle w:val="Nmerodepgina"/>
       </w:rPr>
       <w:tab/>
     </w:r>
     <w:r>
       <w:rPr>
-        <w:rStyle w:val="PageNumber"/>
+        <w:rStyle w:val="Nmerodepgina"/>
       </w:rPr>
       <w:tab/>
     </w:r>
     <w:r>
       <w:rPr>
-        <w:rStyle w:val="PageNumber"/>
+        <w:rStyle w:val="Nmerodepgina"/>
       </w:rPr>
       <w:fldChar w:fldCharType="begin"/>
     </w:r>
     <w:r>
       <w:rPr>
-        <w:rStyle w:val="PageNumber"/>
+        <w:rStyle w:val="Nmerodepgina"/>
       </w:rPr>
       <w:instrText xml:space="preserve"> PAGE </w:instrText>
     </w:r>
     <w:r>
       <w:rPr>
-        <w:rStyle w:val="PageNumber"/>
+        <w:rStyle w:val="Nmerodepgina"/>
       </w:rPr>
       <w:fldChar w:fldCharType="separate"/>
     </w:r>
     <w:r>
       <w:rPr>
-        <w:rStyle w:val="PageNumber"/>
+        <w:rStyle w:val="Nmerodepgina"/>
         <w:noProof/>
       </w:rPr>
       <w:t>21</w:t>
     </w:r>
     <w:r>
       <w:rPr>
-        <w:rStyle w:val="PageNumber"/>
+        <w:rStyle w:val="Nmerodepgina"/>
       </w:rPr>
       <w:fldChar w:fldCharType="end"/>
     </w:r>
@@ -9341,10 +9767,10 @@
 </file>
 
 <file path=word/footer28.xml><?xml version="1.0" encoding="utf-8"?>
-<w:ftr xmlns:wpc="http://schemas.microsoft.com/office/word/2010/wordprocessingCanvas" xmlns:cx="http://schemas.microsoft.com/office/drawing/2014/chartex" xmlns:cx1="http://schemas.microsoft.com/office/drawing/2015/9/8/chartex" xmlns:cx2="http://schemas.microsoft.com/office/drawing/2015/10/21/chartex" xmlns:cx3="http://schemas.microsoft.com/office/drawing/2016/5/9/chartex" xmlns:cx4="http://schemas.microsoft.com/office/drawing/2016/5/10/chartex" xmlns:cx5="http://schemas.microsoft.com/office/drawing/2016/5/11/chartex" xmlns:cx6="http://schemas.microsoft.com/office/drawing/2016/5/12/chartex" xmlns:cx7="http://schemas.microsoft.com/office/drawing/2016/5/13/chartex" xmlns:cx8="http://schemas.microsoft.com/office/drawing/2016/5/14/chartex" xmlns:mc="http://schemas.openxmlformats.org/markup-compatibility/2006" xmlns:aink="http://schemas.microsoft.com/office/drawing/2016/ink" xmlns:am3d="http://schemas.microsoft.com/office/drawing/2017/model3d" xmlns:o="urn:schemas-microsoft-com:office:office" xmlns:oel="http://schemas.microsoft.com/office/2019/extlst" xmlns:r="http://schemas.openxmlformats.org/officeDocument/2006/relationships" xmlns:m="http://schemas.openxmlformats.org/officeDocument/2006/math" xmlns:v="urn:schemas-microsoft-com:vml" xmlns:wp14="http://schemas.microsoft.com/office/word/2010/wordprocessingDrawing" xmlns:wp="http://schemas.openxmlformats.org/drawingml/2006/wordprocessingDrawing" xmlns:w10="urn:schemas-microsoft-com:office:word" xmlns:w="http://schemas.openxmlformats.org/wordprocessingml/2006/main" xmlns:w14="http://schemas.microsoft.com/office/word/2010/wordml" xmlns:w15="http://schemas.microsoft.com/office/word/2012/wordml" xmlns:w16cex="http://schemas.microsoft.com/office/word/2018/wordml/cex" xmlns:w16cid="http://schemas.microsoft.com/office/word/2016/wordml/cid" xmlns:w16="http://schemas.microsoft.com/office/word/2018/wordml" xmlns:w16sdtdh="http://schemas.microsoft.com/office/word/2020/wordml/sdtdatahash" xmlns:w16se="http://schemas.microsoft.com/office/word/2015/wordml/symex" xmlns:wpg="http://schemas.microsoft.com/office/word/2010/wordprocessingGroup" xmlns:wpi="http://schemas.microsoft.com/office/word/2010/wordprocessingInk" xmlns:wne="http://schemas.microsoft.com/office/word/2006/wordml" xmlns:wps="http://schemas.microsoft.com/office/word/2010/wordprocessingShape" mc:Ignorable="w14 w15 w16se w16cid w16 w16cex w16sdtdh wp14">
+<w:ftr xmlns:wpc="http://schemas.microsoft.com/office/word/2010/wordprocessingCanvas" xmlns:cx="http://schemas.microsoft.com/office/drawing/2014/chartex" xmlns:cx1="http://schemas.microsoft.com/office/drawing/2015/9/8/chartex" xmlns:cx2="http://schemas.microsoft.com/office/drawing/2015/10/21/chartex" xmlns:cx3="http://schemas.microsoft.com/office/drawing/2016/5/9/chartex" xmlns:cx4="http://schemas.microsoft.com/office/drawing/2016/5/10/chartex" xmlns:cx5="http://schemas.microsoft.com/office/drawing/2016/5/11/chartex" xmlns:cx6="http://schemas.microsoft.com/office/drawing/2016/5/12/chartex" xmlns:cx7="http://schemas.microsoft.com/office/drawing/2016/5/13/chartex" xmlns:cx8="http://schemas.microsoft.com/office/drawing/2016/5/14/chartex" xmlns:mc="http://schemas.openxmlformats.org/markup-compatibility/2006" xmlns:aink="http://schemas.microsoft.com/office/drawing/2016/ink" xmlns:am3d="http://schemas.microsoft.com/office/drawing/2017/model3d" xmlns:o="urn:schemas-microsoft-com:office:office" xmlns:oel="http://schemas.microsoft.com/office/2019/extlst" xmlns:r="http://schemas.openxmlformats.org/officeDocument/2006/relationships" xmlns:m="http://schemas.openxmlformats.org/officeDocument/2006/math" xmlns:v="urn:schemas-microsoft-com:vml" xmlns:wp14="http://schemas.microsoft.com/office/word/2010/wordprocessingDrawing" xmlns:wp="http://schemas.openxmlformats.org/drawingml/2006/wordprocessingDrawing" xmlns:w10="urn:schemas-microsoft-com:office:word" xmlns:w="http://schemas.openxmlformats.org/wordprocessingml/2006/main" xmlns:w14="http://schemas.microsoft.com/office/word/2010/wordml" xmlns:w15="http://schemas.microsoft.com/office/word/2012/wordml" xmlns:w16cex="http://schemas.microsoft.com/office/word/2018/wordml/cex" xmlns:w16cid="http://schemas.microsoft.com/office/word/2016/wordml/cid" xmlns:w16="http://schemas.microsoft.com/office/word/2018/wordml" xmlns:w16du="http://schemas.microsoft.com/office/word/2023/wordml/word16du" xmlns:w16sdtdh="http://schemas.microsoft.com/office/word/2020/wordml/sdtdatahash" xmlns:w16sdtfl="http://schemas.microsoft.com/office/word/2024/wordml/sdtformatlock" xmlns:w16se="http://schemas.microsoft.com/office/word/2015/wordml/symex" xmlns:wpg="http://schemas.microsoft.com/office/word/2010/wordprocessingGroup" xmlns:wpi="http://schemas.microsoft.com/office/word/2010/wordprocessingInk" xmlns:wne="http://schemas.microsoft.com/office/word/2006/wordml" xmlns:wps="http://schemas.microsoft.com/office/word/2010/wordprocessingShape" mc:Ignorable="w14 w15 w16se w16cid w16 w16cex w16sdtdh w16sdtfl w16du wp14">
   <w:p>
     <w:pPr>
-      <w:pStyle w:val="Footer"/>
+      <w:pStyle w:val="Rodap"/>
       <w:pBdr>
         <w:top w:val="single" w:sz="4" w:space="1" w:color="000000"/>
         <w:left w:val="none" w:sz="0" w:space="0" w:color="000000"/>
@@ -9360,56 +9786,56 @@
     </w:pPr>
     <w:r>
       <w:rPr>
-        <w:rStyle w:val="PageNumber"/>
+        <w:rStyle w:val="Nmerodepgina"/>
       </w:rPr>
       <w:t>«Autor»</w:t>
     </w:r>
     <w:r>
       <w:rPr>
-        <w:rStyle w:val="PageNumber"/>
+        <w:rStyle w:val="Nmerodepgina"/>
       </w:rPr>
       <w:tab/>
     </w:r>
     <w:r>
       <w:rPr>
-        <w:rStyle w:val="PageNumber"/>
+        <w:rStyle w:val="Nmerodepgina"/>
       </w:rPr>
       <w:tab/>
     </w:r>
     <w:r>
       <w:rPr>
-        <w:rStyle w:val="PageNumber"/>
+        <w:rStyle w:val="Nmerodepgina"/>
       </w:rPr>
       <w:tab/>
     </w:r>
     <w:r>
       <w:rPr>
-        <w:rStyle w:val="PageNumber"/>
+        <w:rStyle w:val="Nmerodepgina"/>
       </w:rPr>
       <w:fldChar w:fldCharType="begin"/>
     </w:r>
     <w:r>
       <w:rPr>
-        <w:rStyle w:val="PageNumber"/>
+        <w:rStyle w:val="Nmerodepgina"/>
       </w:rPr>
       <w:instrText xml:space="preserve"> PAGE </w:instrText>
     </w:r>
     <w:r>
       <w:rPr>
-        <w:rStyle w:val="PageNumber"/>
+        <w:rStyle w:val="Nmerodepgina"/>
       </w:rPr>
       <w:fldChar w:fldCharType="separate"/>
     </w:r>
     <w:r>
       <w:rPr>
-        <w:rStyle w:val="PageNumber"/>
+        <w:rStyle w:val="Nmerodepgina"/>
         <w:noProof/>
       </w:rPr>
       <w:t>19</w:t>
     </w:r>
     <w:r>
       <w:rPr>
-        <w:rStyle w:val="PageNumber"/>
+        <w:rStyle w:val="Nmerodepgina"/>
       </w:rPr>
       <w:fldChar w:fldCharType="end"/>
     </w:r>
@@ -9418,26 +9844,26 @@
 </file>
 
 <file path=word/footer3.xml><?xml version="1.0" encoding="utf-8"?>
-<w:ftr xmlns:wpc="http://schemas.microsoft.com/office/word/2010/wordprocessingCanvas" xmlns:cx="http://schemas.microsoft.com/office/drawing/2014/chartex" xmlns:cx1="http://schemas.microsoft.com/office/drawing/2015/9/8/chartex" xmlns:cx2="http://schemas.microsoft.com/office/drawing/2015/10/21/chartex" xmlns:cx3="http://schemas.microsoft.com/office/drawing/2016/5/9/chartex" xmlns:cx4="http://schemas.microsoft.com/office/drawing/2016/5/10/chartex" xmlns:cx5="http://schemas.microsoft.com/office/drawing/2016/5/11/chartex" xmlns:cx6="http://schemas.microsoft.com/office/drawing/2016/5/12/chartex" xmlns:cx7="http://schemas.microsoft.com/office/drawing/2016/5/13/chartex" xmlns:cx8="http://schemas.microsoft.com/office/drawing/2016/5/14/chartex" xmlns:mc="http://schemas.openxmlformats.org/markup-compatibility/2006" xmlns:aink="http://schemas.microsoft.com/office/drawing/2016/ink" xmlns:am3d="http://schemas.microsoft.com/office/drawing/2017/model3d" xmlns:o="urn:schemas-microsoft-com:office:office" xmlns:oel="http://schemas.microsoft.com/office/2019/extlst" xmlns:r="http://schemas.openxmlformats.org/officeDocument/2006/relationships" xmlns:m="http://schemas.openxmlformats.org/officeDocument/2006/math" xmlns:v="urn:schemas-microsoft-com:vml" xmlns:wp14="http://schemas.microsoft.com/office/word/2010/wordprocessingDrawing" xmlns:wp="http://schemas.openxmlformats.org/drawingml/2006/wordprocessingDrawing" xmlns:w10="urn:schemas-microsoft-com:office:word" xmlns:w="http://schemas.openxmlformats.org/wordprocessingml/2006/main" xmlns:w14="http://schemas.microsoft.com/office/word/2010/wordml" xmlns:w15="http://schemas.microsoft.com/office/word/2012/wordml" xmlns:w16cex="http://schemas.microsoft.com/office/word/2018/wordml/cex" xmlns:w16cid="http://schemas.microsoft.com/office/word/2016/wordml/cid" xmlns:w16="http://schemas.microsoft.com/office/word/2018/wordml" xmlns:w16sdtdh="http://schemas.microsoft.com/office/word/2020/wordml/sdtdatahash" xmlns:w16se="http://schemas.microsoft.com/office/word/2015/wordml/symex" xmlns:wpg="http://schemas.microsoft.com/office/word/2010/wordprocessingGroup" xmlns:wpi="http://schemas.microsoft.com/office/word/2010/wordprocessingInk" xmlns:wne="http://schemas.microsoft.com/office/word/2006/wordml" xmlns:wps="http://schemas.microsoft.com/office/word/2010/wordprocessingShape" mc:Ignorable="w14 w15 w16se w16cid w16 w16cex w16sdtdh wp14">
+<w:ftr xmlns:wpc="http://schemas.microsoft.com/office/word/2010/wordprocessingCanvas" xmlns:cx="http://schemas.microsoft.com/office/drawing/2014/chartex" xmlns:cx1="http://schemas.microsoft.com/office/drawing/2015/9/8/chartex" xmlns:cx2="http://schemas.microsoft.com/office/drawing/2015/10/21/chartex" xmlns:cx3="http://schemas.microsoft.com/office/drawing/2016/5/9/chartex" xmlns:cx4="http://schemas.microsoft.com/office/drawing/2016/5/10/chartex" xmlns:cx5="http://schemas.microsoft.com/office/drawing/2016/5/11/chartex" xmlns:cx6="http://schemas.microsoft.com/office/drawing/2016/5/12/chartex" xmlns:cx7="http://schemas.microsoft.com/office/drawing/2016/5/13/chartex" xmlns:cx8="http://schemas.microsoft.com/office/drawing/2016/5/14/chartex" xmlns:mc="http://schemas.openxmlformats.org/markup-compatibility/2006" xmlns:aink="http://schemas.microsoft.com/office/drawing/2016/ink" xmlns:am3d="http://schemas.microsoft.com/office/drawing/2017/model3d" xmlns:o="urn:schemas-microsoft-com:office:office" xmlns:oel="http://schemas.microsoft.com/office/2019/extlst" xmlns:r="http://schemas.openxmlformats.org/officeDocument/2006/relationships" xmlns:m="http://schemas.openxmlformats.org/officeDocument/2006/math" xmlns:v="urn:schemas-microsoft-com:vml" xmlns:wp14="http://schemas.microsoft.com/office/word/2010/wordprocessingDrawing" xmlns:wp="http://schemas.openxmlformats.org/drawingml/2006/wordprocessingDrawing" xmlns:w10="urn:schemas-microsoft-com:office:word" xmlns:w="http://schemas.openxmlformats.org/wordprocessingml/2006/main" xmlns:w14="http://schemas.microsoft.com/office/word/2010/wordml" xmlns:w15="http://schemas.microsoft.com/office/word/2012/wordml" xmlns:w16cex="http://schemas.microsoft.com/office/word/2018/wordml/cex" xmlns:w16cid="http://schemas.microsoft.com/office/word/2016/wordml/cid" xmlns:w16="http://schemas.microsoft.com/office/word/2018/wordml" xmlns:w16du="http://schemas.microsoft.com/office/word/2023/wordml/word16du" xmlns:w16sdtdh="http://schemas.microsoft.com/office/word/2020/wordml/sdtdatahash" xmlns:w16sdtfl="http://schemas.microsoft.com/office/word/2024/wordml/sdtformatlock" xmlns:w16se="http://schemas.microsoft.com/office/word/2015/wordml/symex" xmlns:wpg="http://schemas.microsoft.com/office/word/2010/wordprocessingGroup" xmlns:wpi="http://schemas.microsoft.com/office/word/2010/wordprocessingInk" xmlns:wne="http://schemas.microsoft.com/office/word/2006/wordml" xmlns:wps="http://schemas.microsoft.com/office/word/2010/wordprocessingShape" mc:Ignorable="w14 w15 w16se w16cid w16 w16cex w16sdtdh w16sdtfl w16du wp14">
   <w:p/>
 </w:ftr>
 </file>
 
 <file path=word/footer4.xml><?xml version="1.0" encoding="utf-8"?>
-<w:ftr xmlns:wpc="http://schemas.microsoft.com/office/word/2010/wordprocessingCanvas" xmlns:cx="http://schemas.microsoft.com/office/drawing/2014/chartex" xmlns:cx1="http://schemas.microsoft.com/office/drawing/2015/9/8/chartex" xmlns:cx2="http://schemas.microsoft.com/office/drawing/2015/10/21/chartex" xmlns:cx3="http://schemas.microsoft.com/office/drawing/2016/5/9/chartex" xmlns:cx4="http://schemas.microsoft.com/office/drawing/2016/5/10/chartex" xmlns:cx5="http://schemas.microsoft.com/office/drawing/2016/5/11/chartex" xmlns:cx6="http://schemas.microsoft.com/office/drawing/2016/5/12/chartex" xmlns:cx7="http://schemas.microsoft.com/office/drawing/2016/5/13/chartex" xmlns:cx8="http://schemas.microsoft.com/office/drawing/2016/5/14/chartex" xmlns:mc="http://schemas.openxmlformats.org/markup-compatibility/2006" xmlns:aink="http://schemas.microsoft.com/office/drawing/2016/ink" xmlns:am3d="http://schemas.microsoft.com/office/drawing/2017/model3d" xmlns:o="urn:schemas-microsoft-com:office:office" xmlns:oel="http://schemas.microsoft.com/office/2019/extlst" xmlns:r="http://schemas.openxmlformats.org/officeDocument/2006/relationships" xmlns:m="http://schemas.openxmlformats.org/officeDocument/2006/math" xmlns:v="urn:schemas-microsoft-com:vml" xmlns:wp14="http://schemas.microsoft.com/office/word/2010/wordprocessingDrawing" xmlns:wp="http://schemas.openxmlformats.org/drawingml/2006/wordprocessingDrawing" xmlns:w10="urn:schemas-microsoft-com:office:word" xmlns:w="http://schemas.openxmlformats.org/wordprocessingml/2006/main" xmlns:w14="http://schemas.microsoft.com/office/word/2010/wordml" xmlns:w15="http://schemas.microsoft.com/office/word/2012/wordml" xmlns:w16cex="http://schemas.microsoft.com/office/word/2018/wordml/cex" xmlns:w16cid="http://schemas.microsoft.com/office/word/2016/wordml/cid" xmlns:w16="http://schemas.microsoft.com/office/word/2018/wordml" xmlns:w16sdtdh="http://schemas.microsoft.com/office/word/2020/wordml/sdtdatahash" xmlns:w16se="http://schemas.microsoft.com/office/word/2015/wordml/symex" xmlns:wpg="http://schemas.microsoft.com/office/word/2010/wordprocessingGroup" xmlns:wpi="http://schemas.microsoft.com/office/word/2010/wordprocessingInk" xmlns:wne="http://schemas.microsoft.com/office/word/2006/wordml" xmlns:wps="http://schemas.microsoft.com/office/word/2010/wordprocessingShape" mc:Ignorable="w14 w15 w16se w16cid w16 w16cex w16sdtdh wp14">
+<w:ftr xmlns:wpc="http://schemas.microsoft.com/office/word/2010/wordprocessingCanvas" xmlns:cx="http://schemas.microsoft.com/office/drawing/2014/chartex" xmlns:cx1="http://schemas.microsoft.com/office/drawing/2015/9/8/chartex" xmlns:cx2="http://schemas.microsoft.com/office/drawing/2015/10/21/chartex" xmlns:cx3="http://schemas.microsoft.com/office/drawing/2016/5/9/chartex" xmlns:cx4="http://schemas.microsoft.com/office/drawing/2016/5/10/chartex" xmlns:cx5="http://schemas.microsoft.com/office/drawing/2016/5/11/chartex" xmlns:cx6="http://schemas.microsoft.com/office/drawing/2016/5/12/chartex" xmlns:cx7="http://schemas.microsoft.com/office/drawing/2016/5/13/chartex" xmlns:cx8="http://schemas.microsoft.com/office/drawing/2016/5/14/chartex" xmlns:mc="http://schemas.openxmlformats.org/markup-compatibility/2006" xmlns:aink="http://schemas.microsoft.com/office/drawing/2016/ink" xmlns:am3d="http://schemas.microsoft.com/office/drawing/2017/model3d" xmlns:o="urn:schemas-microsoft-com:office:office" xmlns:oel="http://schemas.microsoft.com/office/2019/extlst" xmlns:r="http://schemas.openxmlformats.org/officeDocument/2006/relationships" xmlns:m="http://schemas.openxmlformats.org/officeDocument/2006/math" xmlns:v="urn:schemas-microsoft-com:vml" xmlns:wp14="http://schemas.microsoft.com/office/word/2010/wordprocessingDrawing" xmlns:wp="http://schemas.openxmlformats.org/drawingml/2006/wordprocessingDrawing" xmlns:w10="urn:schemas-microsoft-com:office:word" xmlns:w="http://schemas.openxmlformats.org/wordprocessingml/2006/main" xmlns:w14="http://schemas.microsoft.com/office/word/2010/wordml" xmlns:w15="http://schemas.microsoft.com/office/word/2012/wordml" xmlns:w16cex="http://schemas.microsoft.com/office/word/2018/wordml/cex" xmlns:w16cid="http://schemas.microsoft.com/office/word/2016/wordml/cid" xmlns:w16="http://schemas.microsoft.com/office/word/2018/wordml" xmlns:w16du="http://schemas.microsoft.com/office/word/2023/wordml/word16du" xmlns:w16sdtdh="http://schemas.microsoft.com/office/word/2020/wordml/sdtdatahash" xmlns:w16sdtfl="http://schemas.microsoft.com/office/word/2024/wordml/sdtformatlock" xmlns:w16se="http://schemas.microsoft.com/office/word/2015/wordml/symex" xmlns:wpg="http://schemas.microsoft.com/office/word/2010/wordprocessingGroup" xmlns:wpi="http://schemas.microsoft.com/office/word/2010/wordprocessingInk" xmlns:wne="http://schemas.microsoft.com/office/word/2006/wordml" xmlns:wps="http://schemas.microsoft.com/office/word/2010/wordprocessingShape" mc:Ignorable="w14 w15 w16se w16cid w16 w16cex w16sdtdh w16sdtfl w16du wp14">
   <w:p>
     <w:pPr>
-      <w:pStyle w:val="Footer"/>
+      <w:pStyle w:val="Rodap"/>
     </w:pPr>
   </w:p>
 </w:ftr>
 </file>
 
 <file path=word/footer5.xml><?xml version="1.0" encoding="utf-8"?>
-<w:ftr xmlns:wpc="http://schemas.microsoft.com/office/word/2010/wordprocessingCanvas" xmlns:cx="http://schemas.microsoft.com/office/drawing/2014/chartex" xmlns:cx1="http://schemas.microsoft.com/office/drawing/2015/9/8/chartex" xmlns:cx2="http://schemas.microsoft.com/office/drawing/2015/10/21/chartex" xmlns:cx3="http://schemas.microsoft.com/office/drawing/2016/5/9/chartex" xmlns:cx4="http://schemas.microsoft.com/office/drawing/2016/5/10/chartex" xmlns:cx5="http://schemas.microsoft.com/office/drawing/2016/5/11/chartex" xmlns:cx6="http://schemas.microsoft.com/office/drawing/2016/5/12/chartex" xmlns:cx7="http://schemas.microsoft.com/office/drawing/2016/5/13/chartex" xmlns:cx8="http://schemas.microsoft.com/office/drawing/2016/5/14/chartex" xmlns:mc="http://schemas.openxmlformats.org/markup-compatibility/2006" xmlns:aink="http://schemas.microsoft.com/office/drawing/2016/ink" xmlns:am3d="http://schemas.microsoft.com/office/drawing/2017/model3d" xmlns:o="urn:schemas-microsoft-com:office:office" xmlns:oel="http://schemas.microsoft.com/office/2019/extlst" xmlns:r="http://schemas.openxmlformats.org/officeDocument/2006/relationships" xmlns:m="http://schemas.openxmlformats.org/officeDocument/2006/math" xmlns:v="urn:schemas-microsoft-com:vml" xmlns:wp14="http://schemas.microsoft.com/office/word/2010/wordprocessingDrawing" xmlns:wp="http://schemas.openxmlformats.org/drawingml/2006/wordprocessingDrawing" xmlns:w10="urn:schemas-microsoft-com:office:word" xmlns:w="http://schemas.openxmlformats.org/wordprocessingml/2006/main" xmlns:w14="http://schemas.microsoft.com/office/word/2010/wordml" xmlns:w15="http://schemas.microsoft.com/office/word/2012/wordml" xmlns:w16cex="http://schemas.microsoft.com/office/word/2018/wordml/cex" xmlns:w16cid="http://schemas.microsoft.com/office/word/2016/wordml/cid" xmlns:w16="http://schemas.microsoft.com/office/word/2018/wordml" xmlns:w16sdtdh="http://schemas.microsoft.com/office/word/2020/wordml/sdtdatahash" xmlns:w16se="http://schemas.microsoft.com/office/word/2015/wordml/symex" xmlns:wpg="http://schemas.microsoft.com/office/word/2010/wordprocessingGroup" xmlns:wpi="http://schemas.microsoft.com/office/word/2010/wordprocessingInk" xmlns:wne="http://schemas.microsoft.com/office/word/2006/wordml" xmlns:wps="http://schemas.microsoft.com/office/word/2010/wordprocessingShape" mc:Ignorable="w14 w15 w16se w16cid w16 w16cex w16sdtdh wp14">
+<w:ftr xmlns:wpc="http://schemas.microsoft.com/office/word/2010/wordprocessingCanvas" xmlns:cx="http://schemas.microsoft.com/office/drawing/2014/chartex" xmlns:cx1="http://schemas.microsoft.com/office/drawing/2015/9/8/chartex" xmlns:cx2="http://schemas.microsoft.com/office/drawing/2015/10/21/chartex" xmlns:cx3="http://schemas.microsoft.com/office/drawing/2016/5/9/chartex" xmlns:cx4="http://schemas.microsoft.com/office/drawing/2016/5/10/chartex" xmlns:cx5="http://schemas.microsoft.com/office/drawing/2016/5/11/chartex" xmlns:cx6="http://schemas.microsoft.com/office/drawing/2016/5/12/chartex" xmlns:cx7="http://schemas.microsoft.com/office/drawing/2016/5/13/chartex" xmlns:cx8="http://schemas.microsoft.com/office/drawing/2016/5/14/chartex" xmlns:mc="http://schemas.openxmlformats.org/markup-compatibility/2006" xmlns:aink="http://schemas.microsoft.com/office/drawing/2016/ink" xmlns:am3d="http://schemas.microsoft.com/office/drawing/2017/model3d" xmlns:o="urn:schemas-microsoft-com:office:office" xmlns:oel="http://schemas.microsoft.com/office/2019/extlst" xmlns:r="http://schemas.openxmlformats.org/officeDocument/2006/relationships" xmlns:m="http://schemas.openxmlformats.org/officeDocument/2006/math" xmlns:v="urn:schemas-microsoft-com:vml" xmlns:wp14="http://schemas.microsoft.com/office/word/2010/wordprocessingDrawing" xmlns:wp="http://schemas.openxmlformats.org/drawingml/2006/wordprocessingDrawing" xmlns:w10="urn:schemas-microsoft-com:office:word" xmlns:w="http://schemas.openxmlformats.org/wordprocessingml/2006/main" xmlns:w14="http://schemas.microsoft.com/office/word/2010/wordml" xmlns:w15="http://schemas.microsoft.com/office/word/2012/wordml" xmlns:w16cex="http://schemas.microsoft.com/office/word/2018/wordml/cex" xmlns:w16cid="http://schemas.microsoft.com/office/word/2016/wordml/cid" xmlns:w16="http://schemas.microsoft.com/office/word/2018/wordml" xmlns:w16du="http://schemas.microsoft.com/office/word/2023/wordml/word16du" xmlns:w16sdtdh="http://schemas.microsoft.com/office/word/2020/wordml/sdtdatahash" xmlns:w16sdtfl="http://schemas.microsoft.com/office/word/2024/wordml/sdtformatlock" xmlns:w16se="http://schemas.microsoft.com/office/word/2015/wordml/symex" xmlns:wpg="http://schemas.microsoft.com/office/word/2010/wordprocessingGroup" xmlns:wpi="http://schemas.microsoft.com/office/word/2010/wordprocessingInk" xmlns:wne="http://schemas.microsoft.com/office/word/2006/wordml" xmlns:wps="http://schemas.microsoft.com/office/word/2010/wordprocessingShape" mc:Ignorable="w14 w15 w16se w16cid w16 w16cex w16sdtdh w16sdtfl w16du wp14">
   <w:p>
     <w:pPr>
-      <w:pStyle w:val="Footer"/>
+      <w:pStyle w:val="Rodap"/>
       <w:pBdr>
         <w:top w:val="single" w:sz="4" w:space="1" w:color="000000"/>
         <w:left w:val="none" w:sz="0" w:space="0" w:color="000000"/>
@@ -9453,56 +9879,56 @@
     </w:pPr>
     <w:r>
       <w:rPr>
-        <w:rStyle w:val="PageNumber"/>
+        <w:rStyle w:val="Nmerodepgina"/>
       </w:rPr>
       <w:t>«Autor»</w:t>
     </w:r>
     <w:r>
       <w:rPr>
-        <w:rStyle w:val="PageNumber"/>
+        <w:rStyle w:val="Nmerodepgina"/>
       </w:rPr>
       <w:tab/>
     </w:r>
     <w:r>
       <w:rPr>
-        <w:rStyle w:val="PageNumber"/>
+        <w:rStyle w:val="Nmerodepgina"/>
       </w:rPr>
       <w:tab/>
     </w:r>
     <w:r>
       <w:rPr>
-        <w:rStyle w:val="PageNumber"/>
+        <w:rStyle w:val="Nmerodepgina"/>
       </w:rPr>
       <w:tab/>
     </w:r>
     <w:r>
       <w:rPr>
-        <w:rStyle w:val="PageNumber"/>
+        <w:rStyle w:val="Nmerodepgina"/>
       </w:rPr>
       <w:fldChar w:fldCharType="begin"/>
     </w:r>
     <w:r>
       <w:rPr>
-        <w:rStyle w:val="PageNumber"/>
+        <w:rStyle w:val="Nmerodepgina"/>
       </w:rPr>
       <w:instrText xml:space="preserve"> PAGE </w:instrText>
     </w:r>
     <w:r>
       <w:rPr>
-        <w:rStyle w:val="PageNumber"/>
+        <w:rStyle w:val="Nmerodepgina"/>
       </w:rPr>
       <w:fldChar w:fldCharType="separate"/>
     </w:r>
     <w:r>
       <w:rPr>
-        <w:rStyle w:val="PageNumber"/>
+        <w:rStyle w:val="Nmerodepgina"/>
         <w:noProof/>
       </w:rPr>
       <w:t>vii</w:t>
     </w:r>
     <w:r>
       <w:rPr>
-        <w:rStyle w:val="PageNumber"/>
+        <w:rStyle w:val="Nmerodepgina"/>
       </w:rPr>
       <w:fldChar w:fldCharType="end"/>
     </w:r>
@@ -9511,26 +9937,26 @@
 </file>
 
 <file path=word/footer6.xml><?xml version="1.0" encoding="utf-8"?>
-<w:ftr xmlns:wpc="http://schemas.microsoft.com/office/word/2010/wordprocessingCanvas" xmlns:cx="http://schemas.microsoft.com/office/drawing/2014/chartex" xmlns:cx1="http://schemas.microsoft.com/office/drawing/2015/9/8/chartex" xmlns:cx2="http://schemas.microsoft.com/office/drawing/2015/10/21/chartex" xmlns:cx3="http://schemas.microsoft.com/office/drawing/2016/5/9/chartex" xmlns:cx4="http://schemas.microsoft.com/office/drawing/2016/5/10/chartex" xmlns:cx5="http://schemas.microsoft.com/office/drawing/2016/5/11/chartex" xmlns:cx6="http://schemas.microsoft.com/office/drawing/2016/5/12/chartex" xmlns:cx7="http://schemas.microsoft.com/office/drawing/2016/5/13/chartex" xmlns:cx8="http://schemas.microsoft.com/office/drawing/2016/5/14/chartex" xmlns:mc="http://schemas.openxmlformats.org/markup-compatibility/2006" xmlns:aink="http://schemas.microsoft.com/office/drawing/2016/ink" xmlns:am3d="http://schemas.microsoft.com/office/drawing/2017/model3d" xmlns:o="urn:schemas-microsoft-com:office:office" xmlns:oel="http://schemas.microsoft.com/office/2019/extlst" xmlns:r="http://schemas.openxmlformats.org/officeDocument/2006/relationships" xmlns:m="http://schemas.openxmlformats.org/officeDocument/2006/math" xmlns:v="urn:schemas-microsoft-com:vml" xmlns:wp14="http://schemas.microsoft.com/office/word/2010/wordprocessingDrawing" xmlns:wp="http://schemas.openxmlformats.org/drawingml/2006/wordprocessingDrawing" xmlns:w10="urn:schemas-microsoft-com:office:word" xmlns:w="http://schemas.openxmlformats.org/wordprocessingml/2006/main" xmlns:w14="http://schemas.microsoft.com/office/word/2010/wordml" xmlns:w15="http://schemas.microsoft.com/office/word/2012/wordml" xmlns:w16cex="http://schemas.microsoft.com/office/word/2018/wordml/cex" xmlns:w16cid="http://schemas.microsoft.com/office/word/2016/wordml/cid" xmlns:w16="http://schemas.microsoft.com/office/word/2018/wordml" xmlns:w16sdtdh="http://schemas.microsoft.com/office/word/2020/wordml/sdtdatahash" xmlns:w16se="http://schemas.microsoft.com/office/word/2015/wordml/symex" xmlns:wpg="http://schemas.microsoft.com/office/word/2010/wordprocessingGroup" xmlns:wpi="http://schemas.microsoft.com/office/word/2010/wordprocessingInk" xmlns:wne="http://schemas.microsoft.com/office/word/2006/wordml" xmlns:wps="http://schemas.microsoft.com/office/word/2010/wordprocessingShape" mc:Ignorable="w14 w15 w16se w16cid w16 w16cex w16sdtdh wp14">
+<w:ftr xmlns:wpc="http://schemas.microsoft.com/office/word/2010/wordprocessingCanvas" xmlns:cx="http://schemas.microsoft.com/office/drawing/2014/chartex" xmlns:cx1="http://schemas.microsoft.com/office/drawing/2015/9/8/chartex" xmlns:cx2="http://schemas.microsoft.com/office/drawing/2015/10/21/chartex" xmlns:cx3="http://schemas.microsoft.com/office/drawing/2016/5/9/chartex" xmlns:cx4="http://schemas.microsoft.com/office/drawing/2016/5/10/chartex" xmlns:cx5="http://schemas.microsoft.com/office/drawing/2016/5/11/chartex" xmlns:cx6="http://schemas.microsoft.com/office/drawing/2016/5/12/chartex" xmlns:cx7="http://schemas.microsoft.com/office/drawing/2016/5/13/chartex" xmlns:cx8="http://schemas.microsoft.com/office/drawing/2016/5/14/chartex" xmlns:mc="http://schemas.openxmlformats.org/markup-compatibility/2006" xmlns:aink="http://schemas.microsoft.com/office/drawing/2016/ink" xmlns:am3d="http://schemas.microsoft.com/office/drawing/2017/model3d" xmlns:o="urn:schemas-microsoft-com:office:office" xmlns:oel="http://schemas.microsoft.com/office/2019/extlst" xmlns:r="http://schemas.openxmlformats.org/officeDocument/2006/relationships" xmlns:m="http://schemas.openxmlformats.org/officeDocument/2006/math" xmlns:v="urn:schemas-microsoft-com:vml" xmlns:wp14="http://schemas.microsoft.com/office/word/2010/wordprocessingDrawing" xmlns:wp="http://schemas.openxmlformats.org/drawingml/2006/wordprocessingDrawing" xmlns:w10="urn:schemas-microsoft-com:office:word" xmlns:w="http://schemas.openxmlformats.org/wordprocessingml/2006/main" xmlns:w14="http://schemas.microsoft.com/office/word/2010/wordml" xmlns:w15="http://schemas.microsoft.com/office/word/2012/wordml" xmlns:w16cex="http://schemas.microsoft.com/office/word/2018/wordml/cex" xmlns:w16cid="http://schemas.microsoft.com/office/word/2016/wordml/cid" xmlns:w16="http://schemas.microsoft.com/office/word/2018/wordml" xmlns:w16du="http://schemas.microsoft.com/office/word/2023/wordml/word16du" xmlns:w16sdtdh="http://schemas.microsoft.com/office/word/2020/wordml/sdtdatahash" xmlns:w16sdtfl="http://schemas.microsoft.com/office/word/2024/wordml/sdtformatlock" xmlns:w16se="http://schemas.microsoft.com/office/word/2015/wordml/symex" xmlns:wpg="http://schemas.microsoft.com/office/word/2010/wordprocessingGroup" xmlns:wpi="http://schemas.microsoft.com/office/word/2010/wordprocessingInk" xmlns:wne="http://schemas.microsoft.com/office/word/2006/wordml" xmlns:wps="http://schemas.microsoft.com/office/word/2010/wordprocessingShape" mc:Ignorable="w14 w15 w16se w16cid w16 w16cex w16sdtdh w16sdtfl w16du wp14">
   <w:p/>
 </w:ftr>
 </file>
 
 <file path=word/footer7.xml><?xml version="1.0" encoding="utf-8"?>
-<w:ftr xmlns:wpc="http://schemas.microsoft.com/office/word/2010/wordprocessingCanvas" xmlns:cx="http://schemas.microsoft.com/office/drawing/2014/chartex" xmlns:cx1="http://schemas.microsoft.com/office/drawing/2015/9/8/chartex" xmlns:cx2="http://schemas.microsoft.com/office/drawing/2015/10/21/chartex" xmlns:cx3="http://schemas.microsoft.com/office/drawing/2016/5/9/chartex" xmlns:cx4="http://schemas.microsoft.com/office/drawing/2016/5/10/chartex" xmlns:cx5="http://schemas.microsoft.com/office/drawing/2016/5/11/chartex" xmlns:cx6="http://schemas.microsoft.com/office/drawing/2016/5/12/chartex" xmlns:cx7="http://schemas.microsoft.com/office/drawing/2016/5/13/chartex" xmlns:cx8="http://schemas.microsoft.com/office/drawing/2016/5/14/chartex" xmlns:mc="http://schemas.openxmlformats.org/markup-compatibility/2006" xmlns:aink="http://schemas.microsoft.com/office/drawing/2016/ink" xmlns:am3d="http://schemas.microsoft.com/office/drawing/2017/model3d" xmlns:o="urn:schemas-microsoft-com:office:office" xmlns:oel="http://schemas.microsoft.com/office/2019/extlst" xmlns:r="http://schemas.openxmlformats.org/officeDocument/2006/relationships" xmlns:m="http://schemas.openxmlformats.org/officeDocument/2006/math" xmlns:v="urn:schemas-microsoft-com:vml" xmlns:wp14="http://schemas.microsoft.com/office/word/2010/wordprocessingDrawing" xmlns:wp="http://schemas.openxmlformats.org/drawingml/2006/wordprocessingDrawing" xmlns:w10="urn:schemas-microsoft-com:office:word" xmlns:w="http://schemas.openxmlformats.org/wordprocessingml/2006/main" xmlns:w14="http://schemas.microsoft.com/office/word/2010/wordml" xmlns:w15="http://schemas.microsoft.com/office/word/2012/wordml" xmlns:w16cex="http://schemas.microsoft.com/office/word/2018/wordml/cex" xmlns:w16cid="http://schemas.microsoft.com/office/word/2016/wordml/cid" xmlns:w16="http://schemas.microsoft.com/office/word/2018/wordml" xmlns:w16sdtdh="http://schemas.microsoft.com/office/word/2020/wordml/sdtdatahash" xmlns:w16se="http://schemas.microsoft.com/office/word/2015/wordml/symex" xmlns:wpg="http://schemas.microsoft.com/office/word/2010/wordprocessingGroup" xmlns:wpi="http://schemas.microsoft.com/office/word/2010/wordprocessingInk" xmlns:wne="http://schemas.microsoft.com/office/word/2006/wordml" xmlns:wps="http://schemas.microsoft.com/office/word/2010/wordprocessingShape" mc:Ignorable="w14 w15 w16se w16cid w16 w16cex w16sdtdh wp14">
+<w:ftr xmlns:wpc="http://schemas.microsoft.com/office/word/2010/wordprocessingCanvas" xmlns:cx="http://schemas.microsoft.com/office/drawing/2014/chartex" xmlns:cx1="http://schemas.microsoft.com/office/drawing/2015/9/8/chartex" xmlns:cx2="http://schemas.microsoft.com/office/drawing/2015/10/21/chartex" xmlns:cx3="http://schemas.microsoft.com/office/drawing/2016/5/9/chartex" xmlns:cx4="http://schemas.microsoft.com/office/drawing/2016/5/10/chartex" xmlns:cx5="http://schemas.microsoft.com/office/drawing/2016/5/11/chartex" xmlns:cx6="http://schemas.microsoft.com/office/drawing/2016/5/12/chartex" xmlns:cx7="http://schemas.microsoft.com/office/drawing/2016/5/13/chartex" xmlns:cx8="http://schemas.microsoft.com/office/drawing/2016/5/14/chartex" xmlns:mc="http://schemas.openxmlformats.org/markup-compatibility/2006" xmlns:aink="http://schemas.microsoft.com/office/drawing/2016/ink" xmlns:am3d="http://schemas.microsoft.com/office/drawing/2017/model3d" xmlns:o="urn:schemas-microsoft-com:office:office" xmlns:oel="http://schemas.microsoft.com/office/2019/extlst" xmlns:r="http://schemas.openxmlformats.org/officeDocument/2006/relationships" xmlns:m="http://schemas.openxmlformats.org/officeDocument/2006/math" xmlns:v="urn:schemas-microsoft-com:vml" xmlns:wp14="http://schemas.microsoft.com/office/word/2010/wordprocessingDrawing" xmlns:wp="http://schemas.openxmlformats.org/drawingml/2006/wordprocessingDrawing" xmlns:w10="urn:schemas-microsoft-com:office:word" xmlns:w="http://schemas.openxmlformats.org/wordprocessingml/2006/main" xmlns:w14="http://schemas.microsoft.com/office/word/2010/wordml" xmlns:w15="http://schemas.microsoft.com/office/word/2012/wordml" xmlns:w16cex="http://schemas.microsoft.com/office/word/2018/wordml/cex" xmlns:w16cid="http://schemas.microsoft.com/office/word/2016/wordml/cid" xmlns:w16="http://schemas.microsoft.com/office/word/2018/wordml" xmlns:w16du="http://schemas.microsoft.com/office/word/2023/wordml/word16du" xmlns:w16sdtdh="http://schemas.microsoft.com/office/word/2020/wordml/sdtdatahash" xmlns:w16sdtfl="http://schemas.microsoft.com/office/word/2024/wordml/sdtformatlock" xmlns:w16se="http://schemas.microsoft.com/office/word/2015/wordml/symex" xmlns:wpg="http://schemas.microsoft.com/office/word/2010/wordprocessingGroup" xmlns:wpi="http://schemas.microsoft.com/office/word/2010/wordprocessingInk" xmlns:wne="http://schemas.microsoft.com/office/word/2006/wordml" xmlns:wps="http://schemas.microsoft.com/office/word/2010/wordprocessingShape" mc:Ignorable="w14 w15 w16se w16cid w16 w16cex w16sdtdh w16sdtfl w16du wp14">
   <w:p>
     <w:pPr>
-      <w:pStyle w:val="Footer"/>
+      <w:pStyle w:val="Rodap"/>
     </w:pPr>
   </w:p>
 </w:ftr>
 </file>
 
 <file path=word/footer8.xml><?xml version="1.0" encoding="utf-8"?>
-<w:ftr xmlns:wpc="http://schemas.microsoft.com/office/word/2010/wordprocessingCanvas" xmlns:cx="http://schemas.microsoft.com/office/drawing/2014/chartex" xmlns:cx1="http://schemas.microsoft.com/office/drawing/2015/9/8/chartex" xmlns:cx2="http://schemas.microsoft.com/office/drawing/2015/10/21/chartex" xmlns:cx3="http://schemas.microsoft.com/office/drawing/2016/5/9/chartex" xmlns:cx4="http://schemas.microsoft.com/office/drawing/2016/5/10/chartex" xmlns:cx5="http://schemas.microsoft.com/office/drawing/2016/5/11/chartex" xmlns:cx6="http://schemas.microsoft.com/office/drawing/2016/5/12/chartex" xmlns:cx7="http://schemas.microsoft.com/office/drawing/2016/5/13/chartex" xmlns:cx8="http://schemas.microsoft.com/office/drawing/2016/5/14/chartex" xmlns:mc="http://schemas.openxmlformats.org/markup-compatibility/2006" xmlns:aink="http://schemas.microsoft.com/office/drawing/2016/ink" xmlns:am3d="http://schemas.microsoft.com/office/drawing/2017/model3d" xmlns:o="urn:schemas-microsoft-com:office:office" xmlns:oel="http://schemas.microsoft.com/office/2019/extlst" xmlns:r="http://schemas.openxmlformats.org/officeDocument/2006/relationships" xmlns:m="http://schemas.openxmlformats.org/officeDocument/2006/math" xmlns:v="urn:schemas-microsoft-com:vml" xmlns:wp14="http://schemas.microsoft.com/office/word/2010/wordprocessingDrawing" xmlns:wp="http://schemas.openxmlformats.org/drawingml/2006/wordprocessingDrawing" xmlns:w10="urn:schemas-microsoft-com:office:word" xmlns:w="http://schemas.openxmlformats.org/wordprocessingml/2006/main" xmlns:w14="http://schemas.microsoft.com/office/word/2010/wordml" xmlns:w15="http://schemas.microsoft.com/office/word/2012/wordml" xmlns:w16cex="http://schemas.microsoft.com/office/word/2018/wordml/cex" xmlns:w16cid="http://schemas.microsoft.com/office/word/2016/wordml/cid" xmlns:w16="http://schemas.microsoft.com/office/word/2018/wordml" xmlns:w16sdtdh="http://schemas.microsoft.com/office/word/2020/wordml/sdtdatahash" xmlns:w16se="http://schemas.microsoft.com/office/word/2015/wordml/symex" xmlns:wpg="http://schemas.microsoft.com/office/word/2010/wordprocessingGroup" xmlns:wpi="http://schemas.microsoft.com/office/word/2010/wordprocessingInk" xmlns:wne="http://schemas.microsoft.com/office/word/2006/wordml" xmlns:wps="http://schemas.microsoft.com/office/word/2010/wordprocessingShape" mc:Ignorable="w14 w15 w16se w16cid w16 w16cex w16sdtdh wp14">
+<w:ftr xmlns:wpc="http://schemas.microsoft.com/office/word/2010/wordprocessingCanvas" xmlns:cx="http://schemas.microsoft.com/office/drawing/2014/chartex" xmlns:cx1="http://schemas.microsoft.com/office/drawing/2015/9/8/chartex" xmlns:cx2="http://schemas.microsoft.com/office/drawing/2015/10/21/chartex" xmlns:cx3="http://schemas.microsoft.com/office/drawing/2016/5/9/chartex" xmlns:cx4="http://schemas.microsoft.com/office/drawing/2016/5/10/chartex" xmlns:cx5="http://schemas.microsoft.com/office/drawing/2016/5/11/chartex" xmlns:cx6="http://schemas.microsoft.com/office/drawing/2016/5/12/chartex" xmlns:cx7="http://schemas.microsoft.com/office/drawing/2016/5/13/chartex" xmlns:cx8="http://schemas.microsoft.com/office/drawing/2016/5/14/chartex" xmlns:mc="http://schemas.openxmlformats.org/markup-compatibility/2006" xmlns:aink="http://schemas.microsoft.com/office/drawing/2016/ink" xmlns:am3d="http://schemas.microsoft.com/office/drawing/2017/model3d" xmlns:o="urn:schemas-microsoft-com:office:office" xmlns:oel="http://schemas.microsoft.com/office/2019/extlst" xmlns:r="http://schemas.openxmlformats.org/officeDocument/2006/relationships" xmlns:m="http://schemas.openxmlformats.org/officeDocument/2006/math" xmlns:v="urn:schemas-microsoft-com:vml" xmlns:wp14="http://schemas.microsoft.com/office/word/2010/wordprocessingDrawing" xmlns:wp="http://schemas.openxmlformats.org/drawingml/2006/wordprocessingDrawing" xmlns:w10="urn:schemas-microsoft-com:office:word" xmlns:w="http://schemas.openxmlformats.org/wordprocessingml/2006/main" xmlns:w14="http://schemas.microsoft.com/office/word/2010/wordml" xmlns:w15="http://schemas.microsoft.com/office/word/2012/wordml" xmlns:w16cex="http://schemas.microsoft.com/office/word/2018/wordml/cex" xmlns:w16cid="http://schemas.microsoft.com/office/word/2016/wordml/cid" xmlns:w16="http://schemas.microsoft.com/office/word/2018/wordml" xmlns:w16du="http://schemas.microsoft.com/office/word/2023/wordml/word16du" xmlns:w16sdtdh="http://schemas.microsoft.com/office/word/2020/wordml/sdtdatahash" xmlns:w16sdtfl="http://schemas.microsoft.com/office/word/2024/wordml/sdtformatlock" xmlns:w16se="http://schemas.microsoft.com/office/word/2015/wordml/symex" xmlns:wpg="http://schemas.microsoft.com/office/word/2010/wordprocessingGroup" xmlns:wpi="http://schemas.microsoft.com/office/word/2010/wordprocessingInk" xmlns:wne="http://schemas.microsoft.com/office/word/2006/wordml" xmlns:wps="http://schemas.microsoft.com/office/word/2010/wordprocessingShape" mc:Ignorable="w14 w15 w16se w16cid w16 w16cex w16sdtdh w16sdtfl w16du wp14">
   <w:p>
     <w:pPr>
-      <w:pStyle w:val="Footer"/>
+      <w:pStyle w:val="Rodap"/>
       <w:pBdr>
         <w:top w:val="single" w:sz="4" w:space="1" w:color="000000"/>
         <w:left w:val="none" w:sz="0" w:space="0" w:color="000000"/>
@@ -9546,56 +9972,56 @@
     </w:pPr>
     <w:r>
       <w:rPr>
-        <w:rStyle w:val="PageNumber"/>
+        <w:rStyle w:val="Nmerodepgina"/>
       </w:rPr>
       <w:t>«Autor»</w:t>
     </w:r>
     <w:r>
       <w:rPr>
-        <w:rStyle w:val="PageNumber"/>
+        <w:rStyle w:val="Nmerodepgina"/>
       </w:rPr>
       <w:tab/>
     </w:r>
     <w:r>
       <w:rPr>
-        <w:rStyle w:val="PageNumber"/>
+        <w:rStyle w:val="Nmerodepgina"/>
       </w:rPr>
       <w:tab/>
     </w:r>
     <w:r>
       <w:rPr>
-        <w:rStyle w:val="PageNumber"/>
+        <w:rStyle w:val="Nmerodepgina"/>
       </w:rPr>
       <w:tab/>
     </w:r>
     <w:r>
       <w:rPr>
-        <w:rStyle w:val="PageNumber"/>
+        <w:rStyle w:val="Nmerodepgina"/>
       </w:rPr>
       <w:fldChar w:fldCharType="begin"/>
     </w:r>
     <w:r>
       <w:rPr>
-        <w:rStyle w:val="PageNumber"/>
+        <w:rStyle w:val="Nmerodepgina"/>
       </w:rPr>
       <w:instrText xml:space="preserve"> PAGE </w:instrText>
     </w:r>
     <w:r>
       <w:rPr>
-        <w:rStyle w:val="PageNumber"/>
+        <w:rStyle w:val="Nmerodepgina"/>
       </w:rPr>
       <w:fldChar w:fldCharType="separate"/>
     </w:r>
     <w:r>
       <w:rPr>
-        <w:rStyle w:val="PageNumber"/>
+        <w:rStyle w:val="Nmerodepgina"/>
         <w:noProof/>
       </w:rPr>
       <w:t>ix</w:t>
     </w:r>
     <w:r>
       <w:rPr>
-        <w:rStyle w:val="PageNumber"/>
+        <w:rStyle w:val="Nmerodepgina"/>
       </w:rPr>
       <w:fldChar w:fldCharType="end"/>
     </w:r>
@@ -9604,13 +10030,13 @@
 </file>
 
 <file path=word/footer9.xml><?xml version="1.0" encoding="utf-8"?>
-<w:ftr xmlns:wpc="http://schemas.microsoft.com/office/word/2010/wordprocessingCanvas" xmlns:cx="http://schemas.microsoft.com/office/drawing/2014/chartex" xmlns:cx1="http://schemas.microsoft.com/office/drawing/2015/9/8/chartex" xmlns:cx2="http://schemas.microsoft.com/office/drawing/2015/10/21/chartex" xmlns:cx3="http://schemas.microsoft.com/office/drawing/2016/5/9/chartex" xmlns:cx4="http://schemas.microsoft.com/office/drawing/2016/5/10/chartex" xmlns:cx5="http://schemas.microsoft.com/office/drawing/2016/5/11/chartex" xmlns:cx6="http://schemas.microsoft.com/office/drawing/2016/5/12/chartex" xmlns:cx7="http://schemas.microsoft.com/office/drawing/2016/5/13/chartex" xmlns:cx8="http://schemas.microsoft.com/office/drawing/2016/5/14/chartex" xmlns:mc="http://schemas.openxmlformats.org/markup-compatibility/2006" xmlns:aink="http://schemas.microsoft.com/office/drawing/2016/ink" xmlns:am3d="http://schemas.microsoft.com/office/drawing/2017/model3d" xmlns:o="urn:schemas-microsoft-com:office:office" xmlns:oel="http://schemas.microsoft.com/office/2019/extlst" xmlns:r="http://schemas.openxmlformats.org/officeDocument/2006/relationships" xmlns:m="http://schemas.openxmlformats.org/officeDocument/2006/math" xmlns:v="urn:schemas-microsoft-com:vml" xmlns:wp14="http://schemas.microsoft.com/office/word/2010/wordprocessingDrawing" xmlns:wp="http://schemas.openxmlformats.org/drawingml/2006/wordprocessingDrawing" xmlns:w10="urn:schemas-microsoft-com:office:word" xmlns:w="http://schemas.openxmlformats.org/wordprocessingml/2006/main" xmlns:w14="http://schemas.microsoft.com/office/word/2010/wordml" xmlns:w15="http://schemas.microsoft.com/office/word/2012/wordml" xmlns:w16cex="http://schemas.microsoft.com/office/word/2018/wordml/cex" xmlns:w16cid="http://schemas.microsoft.com/office/word/2016/wordml/cid" xmlns:w16="http://schemas.microsoft.com/office/word/2018/wordml" xmlns:w16sdtdh="http://schemas.microsoft.com/office/word/2020/wordml/sdtdatahash" xmlns:w16se="http://schemas.microsoft.com/office/word/2015/wordml/symex" xmlns:wpg="http://schemas.microsoft.com/office/word/2010/wordprocessingGroup" xmlns:wpi="http://schemas.microsoft.com/office/word/2010/wordprocessingInk" xmlns:wne="http://schemas.microsoft.com/office/word/2006/wordml" xmlns:wps="http://schemas.microsoft.com/office/word/2010/wordprocessingShape" mc:Ignorable="w14 w15 w16se w16cid w16 w16cex w16sdtdh wp14">
+<w:ftr xmlns:wpc="http://schemas.microsoft.com/office/word/2010/wordprocessingCanvas" xmlns:cx="http://schemas.microsoft.com/office/drawing/2014/chartex" xmlns:cx1="http://schemas.microsoft.com/office/drawing/2015/9/8/chartex" xmlns:cx2="http://schemas.microsoft.com/office/drawing/2015/10/21/chartex" xmlns:cx3="http://schemas.microsoft.com/office/drawing/2016/5/9/chartex" xmlns:cx4="http://schemas.microsoft.com/office/drawing/2016/5/10/chartex" xmlns:cx5="http://schemas.microsoft.com/office/drawing/2016/5/11/chartex" xmlns:cx6="http://schemas.microsoft.com/office/drawing/2016/5/12/chartex" xmlns:cx7="http://schemas.microsoft.com/office/drawing/2016/5/13/chartex" xmlns:cx8="http://schemas.microsoft.com/office/drawing/2016/5/14/chartex" xmlns:mc="http://schemas.openxmlformats.org/markup-compatibility/2006" xmlns:aink="http://schemas.microsoft.com/office/drawing/2016/ink" xmlns:am3d="http://schemas.microsoft.com/office/drawing/2017/model3d" xmlns:o="urn:schemas-microsoft-com:office:office" xmlns:oel="http://schemas.microsoft.com/office/2019/extlst" xmlns:r="http://schemas.openxmlformats.org/officeDocument/2006/relationships" xmlns:m="http://schemas.openxmlformats.org/officeDocument/2006/math" xmlns:v="urn:schemas-microsoft-com:vml" xmlns:wp14="http://schemas.microsoft.com/office/word/2010/wordprocessingDrawing" xmlns:wp="http://schemas.openxmlformats.org/drawingml/2006/wordprocessingDrawing" xmlns:w10="urn:schemas-microsoft-com:office:word" xmlns:w="http://schemas.openxmlformats.org/wordprocessingml/2006/main" xmlns:w14="http://schemas.microsoft.com/office/word/2010/wordml" xmlns:w15="http://schemas.microsoft.com/office/word/2012/wordml" xmlns:w16cex="http://schemas.microsoft.com/office/word/2018/wordml/cex" xmlns:w16cid="http://schemas.microsoft.com/office/word/2016/wordml/cid" xmlns:w16="http://schemas.microsoft.com/office/word/2018/wordml" xmlns:w16du="http://schemas.microsoft.com/office/word/2023/wordml/word16du" xmlns:w16sdtdh="http://schemas.microsoft.com/office/word/2020/wordml/sdtdatahash" xmlns:w16sdtfl="http://schemas.microsoft.com/office/word/2024/wordml/sdtformatlock" xmlns:w16se="http://schemas.microsoft.com/office/word/2015/wordml/symex" xmlns:wpg="http://schemas.microsoft.com/office/word/2010/wordprocessingGroup" xmlns:wpi="http://schemas.microsoft.com/office/word/2010/wordprocessingInk" xmlns:wne="http://schemas.microsoft.com/office/word/2006/wordml" xmlns:wps="http://schemas.microsoft.com/office/word/2010/wordprocessingShape" mc:Ignorable="w14 w15 w16se w16cid w16 w16cex w16sdtdh w16sdtfl w16du wp14">
   <w:p/>
 </w:ftr>
 </file>
 
 <file path=word/footnotes.xml><?xml version="1.0" encoding="utf-8"?>
-<w:footnotes xmlns:wpc="http://schemas.microsoft.com/office/word/2010/wordprocessingCanvas" xmlns:cx="http://schemas.microsoft.com/office/drawing/2014/chartex" xmlns:cx1="http://schemas.microsoft.com/office/drawing/2015/9/8/chartex" xmlns:cx2="http://schemas.microsoft.com/office/drawing/2015/10/21/chartex" xmlns:cx3="http://schemas.microsoft.com/office/drawing/2016/5/9/chartex" xmlns:cx4="http://schemas.microsoft.com/office/drawing/2016/5/10/chartex" xmlns:cx5="http://schemas.microsoft.com/office/drawing/2016/5/11/chartex" xmlns:cx6="http://schemas.microsoft.com/office/drawing/2016/5/12/chartex" xmlns:cx7="http://schemas.microsoft.com/office/drawing/2016/5/13/chartex" xmlns:cx8="http://schemas.microsoft.com/office/drawing/2016/5/14/chartex" xmlns:mc="http://schemas.openxmlformats.org/markup-compatibility/2006" xmlns:aink="http://schemas.microsoft.com/office/drawing/2016/ink" xmlns:am3d="http://schemas.microsoft.com/office/drawing/2017/model3d" xmlns:o="urn:schemas-microsoft-com:office:office" xmlns:oel="http://schemas.microsoft.com/office/2019/extlst" xmlns:r="http://schemas.openxmlformats.org/officeDocument/2006/relationships" xmlns:m="http://schemas.openxmlformats.org/officeDocument/2006/math" xmlns:v="urn:schemas-microsoft-com:vml" xmlns:wp14="http://schemas.microsoft.com/office/word/2010/wordprocessingDrawing" xmlns:wp="http://schemas.openxmlformats.org/drawingml/2006/wordprocessingDrawing" xmlns:w10="urn:schemas-microsoft-com:office:word" xmlns:w="http://schemas.openxmlformats.org/wordprocessingml/2006/main" xmlns:w14="http://schemas.microsoft.com/office/word/2010/wordml" xmlns:w15="http://schemas.microsoft.com/office/word/2012/wordml" xmlns:w16cex="http://schemas.microsoft.com/office/word/2018/wordml/cex" xmlns:w16cid="http://schemas.microsoft.com/office/word/2016/wordml/cid" xmlns:w16="http://schemas.microsoft.com/office/word/2018/wordml" xmlns:w16sdtdh="http://schemas.microsoft.com/office/word/2020/wordml/sdtdatahash" xmlns:w16se="http://schemas.microsoft.com/office/word/2015/wordml/symex" xmlns:wpg="http://schemas.microsoft.com/office/word/2010/wordprocessingGroup" xmlns:wpi="http://schemas.microsoft.com/office/word/2010/wordprocessingInk" xmlns:wne="http://schemas.microsoft.com/office/word/2006/wordml" xmlns:wps="http://schemas.microsoft.com/office/word/2010/wordprocessingShape" mc:Ignorable="w14 w15 w16se w16cid w16 w16cex w16sdtdh wp14">
+<w:footnotes xmlns:wpc="http://schemas.microsoft.com/office/word/2010/wordprocessingCanvas" xmlns:cx="http://schemas.microsoft.com/office/drawing/2014/chartex" xmlns:cx1="http://schemas.microsoft.com/office/drawing/2015/9/8/chartex" xmlns:cx2="http://schemas.microsoft.com/office/drawing/2015/10/21/chartex" xmlns:cx3="http://schemas.microsoft.com/office/drawing/2016/5/9/chartex" xmlns:cx4="http://schemas.microsoft.com/office/drawing/2016/5/10/chartex" xmlns:cx5="http://schemas.microsoft.com/office/drawing/2016/5/11/chartex" xmlns:cx6="http://schemas.microsoft.com/office/drawing/2016/5/12/chartex" xmlns:cx7="http://schemas.microsoft.com/office/drawing/2016/5/13/chartex" xmlns:cx8="http://schemas.microsoft.com/office/drawing/2016/5/14/chartex" xmlns:mc="http://schemas.openxmlformats.org/markup-compatibility/2006" xmlns:aink="http://schemas.microsoft.com/office/drawing/2016/ink" xmlns:am3d="http://schemas.microsoft.com/office/drawing/2017/model3d" xmlns:o="urn:schemas-microsoft-com:office:office" xmlns:oel="http://schemas.microsoft.com/office/2019/extlst" xmlns:r="http://schemas.openxmlformats.org/officeDocument/2006/relationships" xmlns:m="http://schemas.openxmlformats.org/officeDocument/2006/math" xmlns:v="urn:schemas-microsoft-com:vml" xmlns:wp14="http://schemas.microsoft.com/office/word/2010/wordprocessingDrawing" xmlns:wp="http://schemas.openxmlformats.org/drawingml/2006/wordprocessingDrawing" xmlns:w10="urn:schemas-microsoft-com:office:word" xmlns:w="http://schemas.openxmlformats.org/wordprocessingml/2006/main" xmlns:w14="http://schemas.microsoft.com/office/word/2010/wordml" xmlns:w15="http://schemas.microsoft.com/office/word/2012/wordml" xmlns:w16cex="http://schemas.microsoft.com/office/word/2018/wordml/cex" xmlns:w16cid="http://schemas.microsoft.com/office/word/2016/wordml/cid" xmlns:w16="http://schemas.microsoft.com/office/word/2018/wordml" xmlns:w16du="http://schemas.microsoft.com/office/word/2023/wordml/word16du" xmlns:w16sdtdh="http://schemas.microsoft.com/office/word/2020/wordml/sdtdatahash" xmlns:w16sdtfl="http://schemas.microsoft.com/office/word/2024/wordml/sdtformatlock" xmlns:w16se="http://schemas.microsoft.com/office/word/2015/wordml/symex" xmlns:wpg="http://schemas.microsoft.com/office/word/2010/wordprocessingGroup" xmlns:wpi="http://schemas.microsoft.com/office/word/2010/wordprocessingInk" xmlns:wne="http://schemas.microsoft.com/office/word/2006/wordml" xmlns:wps="http://schemas.microsoft.com/office/word/2010/wordprocessingShape" mc:Ignorable="w14 w15 w16se w16cid w16 w16cex w16sdtdh w16sdtfl w16du wp14">
   <w:footnote w:type="separator" w:id="-1">
     <w:p>
       <w:pPr>
@@ -9642,10 +10068,10 @@
 </file>
 
 <file path=word/header1.xml><?xml version="1.0" encoding="utf-8"?>
-<w:hdr xmlns:wpc="http://schemas.microsoft.com/office/word/2010/wordprocessingCanvas" xmlns:cx="http://schemas.microsoft.com/office/drawing/2014/chartex" xmlns:cx1="http://schemas.microsoft.com/office/drawing/2015/9/8/chartex" xmlns:cx2="http://schemas.microsoft.com/office/drawing/2015/10/21/chartex" xmlns:cx3="http://schemas.microsoft.com/office/drawing/2016/5/9/chartex" xmlns:cx4="http://schemas.microsoft.com/office/drawing/2016/5/10/chartex" xmlns:cx5="http://schemas.microsoft.com/office/drawing/2016/5/11/chartex" xmlns:cx6="http://schemas.microsoft.com/office/drawing/2016/5/12/chartex" xmlns:cx7="http://schemas.microsoft.com/office/drawing/2016/5/13/chartex" xmlns:cx8="http://schemas.microsoft.com/office/drawing/2016/5/14/chartex" xmlns:mc="http://schemas.openxmlformats.org/markup-compatibility/2006" xmlns:aink="http://schemas.microsoft.com/office/drawing/2016/ink" xmlns:am3d="http://schemas.microsoft.com/office/drawing/2017/model3d" xmlns:o="urn:schemas-microsoft-com:office:office" xmlns:oel="http://schemas.microsoft.com/office/2019/extlst" xmlns:r="http://schemas.openxmlformats.org/officeDocument/2006/relationships" xmlns:m="http://schemas.openxmlformats.org/officeDocument/2006/math" xmlns:v="urn:schemas-microsoft-com:vml" xmlns:wp14="http://schemas.microsoft.com/office/word/2010/wordprocessingDrawing" xmlns:wp="http://schemas.openxmlformats.org/drawingml/2006/wordprocessingDrawing" xmlns:w10="urn:schemas-microsoft-com:office:word" xmlns:w="http://schemas.openxmlformats.org/wordprocessingml/2006/main" xmlns:w14="http://schemas.microsoft.com/office/word/2010/wordml" xmlns:w15="http://schemas.microsoft.com/office/word/2012/wordml" xmlns:w16cex="http://schemas.microsoft.com/office/word/2018/wordml/cex" xmlns:w16cid="http://schemas.microsoft.com/office/word/2016/wordml/cid" xmlns:w16="http://schemas.microsoft.com/office/word/2018/wordml" xmlns:w16sdtdh="http://schemas.microsoft.com/office/word/2020/wordml/sdtdatahash" xmlns:w16se="http://schemas.microsoft.com/office/word/2015/wordml/symex" xmlns:wpg="http://schemas.microsoft.com/office/word/2010/wordprocessingGroup" xmlns:wpi="http://schemas.microsoft.com/office/word/2010/wordprocessingInk" xmlns:wne="http://schemas.microsoft.com/office/word/2006/wordml" xmlns:wps="http://schemas.microsoft.com/office/word/2010/wordprocessingShape" mc:Ignorable="w14 w15 w16se w16cid w16 w16cex w16sdtdh wp14">
+<w:hdr xmlns:wpc="http://schemas.microsoft.com/office/word/2010/wordprocessingCanvas" xmlns:cx="http://schemas.microsoft.com/office/drawing/2014/chartex" xmlns:cx1="http://schemas.microsoft.com/office/drawing/2015/9/8/chartex" xmlns:cx2="http://schemas.microsoft.com/office/drawing/2015/10/21/chartex" xmlns:cx3="http://schemas.microsoft.com/office/drawing/2016/5/9/chartex" xmlns:cx4="http://schemas.microsoft.com/office/drawing/2016/5/10/chartex" xmlns:cx5="http://schemas.microsoft.com/office/drawing/2016/5/11/chartex" xmlns:cx6="http://schemas.microsoft.com/office/drawing/2016/5/12/chartex" xmlns:cx7="http://schemas.microsoft.com/office/drawing/2016/5/13/chartex" xmlns:cx8="http://schemas.microsoft.com/office/drawing/2016/5/14/chartex" xmlns:mc="http://schemas.openxmlformats.org/markup-compatibility/2006" xmlns:aink="http://schemas.microsoft.com/office/drawing/2016/ink" xmlns:am3d="http://schemas.microsoft.com/office/drawing/2017/model3d" xmlns:o="urn:schemas-microsoft-com:office:office" xmlns:oel="http://schemas.microsoft.com/office/2019/extlst" xmlns:r="http://schemas.openxmlformats.org/officeDocument/2006/relationships" xmlns:m="http://schemas.openxmlformats.org/officeDocument/2006/math" xmlns:v="urn:schemas-microsoft-com:vml" xmlns:wp14="http://schemas.microsoft.com/office/word/2010/wordprocessingDrawing" xmlns:wp="http://schemas.openxmlformats.org/drawingml/2006/wordprocessingDrawing" xmlns:w10="urn:schemas-microsoft-com:office:word" xmlns:w="http://schemas.openxmlformats.org/wordprocessingml/2006/main" xmlns:w14="http://schemas.microsoft.com/office/word/2010/wordml" xmlns:w15="http://schemas.microsoft.com/office/word/2012/wordml" xmlns:w16cex="http://schemas.microsoft.com/office/word/2018/wordml/cex" xmlns:w16cid="http://schemas.microsoft.com/office/word/2016/wordml/cid" xmlns:w16="http://schemas.microsoft.com/office/word/2018/wordml" xmlns:w16du="http://schemas.microsoft.com/office/word/2023/wordml/word16du" xmlns:w16sdtdh="http://schemas.microsoft.com/office/word/2020/wordml/sdtdatahash" xmlns:w16sdtfl="http://schemas.microsoft.com/office/word/2024/wordml/sdtformatlock" xmlns:w16se="http://schemas.microsoft.com/office/word/2015/wordml/symex" xmlns:wpg="http://schemas.microsoft.com/office/word/2010/wordprocessingGroup" xmlns:wpi="http://schemas.microsoft.com/office/word/2010/wordprocessingInk" xmlns:wne="http://schemas.microsoft.com/office/word/2006/wordml" xmlns:wps="http://schemas.microsoft.com/office/word/2010/wordprocessingShape" mc:Ignorable="w14 w15 w16se w16cid w16 w16cex w16sdtdh w16sdtfl w16du wp14">
   <w:p>
     <w:pPr>
-      <w:pStyle w:val="Header"/>
+      <w:pStyle w:val="Cabealho"/>
       <w:pBdr>
         <w:top w:val="none" w:sz="0" w:space="0" w:color="000000"/>
         <w:left w:val="none" w:sz="0" w:space="0" w:color="000000"/>
@@ -9659,17 +10085,17 @@
   </w:p>
   <w:p>
     <w:pPr>
-      <w:pStyle w:val="Header"/>
+      <w:pStyle w:val="Cabealho"/>
     </w:pPr>
   </w:p>
 </w:hdr>
 </file>
 
 <file path=word/header10.xml><?xml version="1.0" encoding="utf-8"?>
-<w:hdr xmlns:wpc="http://schemas.microsoft.com/office/word/2010/wordprocessingCanvas" xmlns:cx="http://schemas.microsoft.com/office/drawing/2014/chartex" xmlns:cx1="http://schemas.microsoft.com/office/drawing/2015/9/8/chartex" xmlns:cx2="http://schemas.microsoft.com/office/drawing/2015/10/21/chartex" xmlns:cx3="http://schemas.microsoft.com/office/drawing/2016/5/9/chartex" xmlns:cx4="http://schemas.microsoft.com/office/drawing/2016/5/10/chartex" xmlns:cx5="http://schemas.microsoft.com/office/drawing/2016/5/11/chartex" xmlns:cx6="http://schemas.microsoft.com/office/drawing/2016/5/12/chartex" xmlns:cx7="http://schemas.microsoft.com/office/drawing/2016/5/13/chartex" xmlns:cx8="http://schemas.microsoft.com/office/drawing/2016/5/14/chartex" xmlns:mc="http://schemas.openxmlformats.org/markup-compatibility/2006" xmlns:aink="http://schemas.microsoft.com/office/drawing/2016/ink" xmlns:am3d="http://schemas.microsoft.com/office/drawing/2017/model3d" xmlns:o="urn:schemas-microsoft-com:office:office" xmlns:oel="http://schemas.microsoft.com/office/2019/extlst" xmlns:r="http://schemas.openxmlformats.org/officeDocument/2006/relationships" xmlns:m="http://schemas.openxmlformats.org/officeDocument/2006/math" xmlns:v="urn:schemas-microsoft-com:vml" xmlns:wp14="http://schemas.microsoft.com/office/word/2010/wordprocessingDrawing" xmlns:wp="http://schemas.openxmlformats.org/drawingml/2006/wordprocessingDrawing" xmlns:w10="urn:schemas-microsoft-com:office:word" xmlns:w="http://schemas.openxmlformats.org/wordprocessingml/2006/main" xmlns:w14="http://schemas.microsoft.com/office/word/2010/wordml" xmlns:w15="http://schemas.microsoft.com/office/word/2012/wordml" xmlns:w16cex="http://schemas.microsoft.com/office/word/2018/wordml/cex" xmlns:w16cid="http://schemas.microsoft.com/office/word/2016/wordml/cid" xmlns:w16="http://schemas.microsoft.com/office/word/2018/wordml" xmlns:w16sdtdh="http://schemas.microsoft.com/office/word/2020/wordml/sdtdatahash" xmlns:w16se="http://schemas.microsoft.com/office/word/2015/wordml/symex" xmlns:wpg="http://schemas.microsoft.com/office/word/2010/wordprocessingGroup" xmlns:wpi="http://schemas.microsoft.com/office/word/2010/wordprocessingInk" xmlns:wne="http://schemas.microsoft.com/office/word/2006/wordml" xmlns:wps="http://schemas.microsoft.com/office/word/2010/wordprocessingShape" mc:Ignorable="w14 w15 w16se w16cid w16 w16cex w16sdtdh wp14">
+<w:hdr xmlns:wpc="http://schemas.microsoft.com/office/word/2010/wordprocessingCanvas" xmlns:cx="http://schemas.microsoft.com/office/drawing/2014/chartex" xmlns:cx1="http://schemas.microsoft.com/office/drawing/2015/9/8/chartex" xmlns:cx2="http://schemas.microsoft.com/office/drawing/2015/10/21/chartex" xmlns:cx3="http://schemas.microsoft.com/office/drawing/2016/5/9/chartex" xmlns:cx4="http://schemas.microsoft.com/office/drawing/2016/5/10/chartex" xmlns:cx5="http://schemas.microsoft.com/office/drawing/2016/5/11/chartex" xmlns:cx6="http://schemas.microsoft.com/office/drawing/2016/5/12/chartex" xmlns:cx7="http://schemas.microsoft.com/office/drawing/2016/5/13/chartex" xmlns:cx8="http://schemas.microsoft.com/office/drawing/2016/5/14/chartex" xmlns:mc="http://schemas.openxmlformats.org/markup-compatibility/2006" xmlns:aink="http://schemas.microsoft.com/office/drawing/2016/ink" xmlns:am3d="http://schemas.microsoft.com/office/drawing/2017/model3d" xmlns:o="urn:schemas-microsoft-com:office:office" xmlns:oel="http://schemas.microsoft.com/office/2019/extlst" xmlns:r="http://schemas.openxmlformats.org/officeDocument/2006/relationships" xmlns:m="http://schemas.openxmlformats.org/officeDocument/2006/math" xmlns:v="urn:schemas-microsoft-com:vml" xmlns:wp14="http://schemas.microsoft.com/office/word/2010/wordprocessingDrawing" xmlns:wp="http://schemas.openxmlformats.org/drawingml/2006/wordprocessingDrawing" xmlns:w10="urn:schemas-microsoft-com:office:word" xmlns:w="http://schemas.openxmlformats.org/wordprocessingml/2006/main" xmlns:w14="http://schemas.microsoft.com/office/word/2010/wordml" xmlns:w15="http://schemas.microsoft.com/office/word/2012/wordml" xmlns:w16cex="http://schemas.microsoft.com/office/word/2018/wordml/cex" xmlns:w16cid="http://schemas.microsoft.com/office/word/2016/wordml/cid" xmlns:w16="http://schemas.microsoft.com/office/word/2018/wordml" xmlns:w16du="http://schemas.microsoft.com/office/word/2023/wordml/word16du" xmlns:w16sdtdh="http://schemas.microsoft.com/office/word/2020/wordml/sdtdatahash" xmlns:w16sdtfl="http://schemas.microsoft.com/office/word/2024/wordml/sdtformatlock" xmlns:w16se="http://schemas.microsoft.com/office/word/2015/wordml/symex" xmlns:wpg="http://schemas.microsoft.com/office/word/2010/wordprocessingGroup" xmlns:wpi="http://schemas.microsoft.com/office/word/2010/wordprocessingInk" xmlns:wne="http://schemas.microsoft.com/office/word/2006/wordml" xmlns:wps="http://schemas.microsoft.com/office/word/2010/wordprocessingShape" mc:Ignorable="w14 w15 w16se w16cid w16 w16cex w16sdtdh w16sdtfl w16du wp14">
   <w:p>
     <w:pPr>
-      <w:pStyle w:val="Header"/>
+      <w:pStyle w:val="Cabealho"/>
       <w:pBdr>
         <w:top w:val="none" w:sz="0" w:space="0" w:color="000000"/>
         <w:left w:val="none" w:sz="0" w:space="0" w:color="000000"/>
@@ -9683,29 +10109,29 @@
   </w:p>
   <w:p>
     <w:pPr>
-      <w:pStyle w:val="Header"/>
+      <w:pStyle w:val="Cabealho"/>
     </w:pPr>
   </w:p>
 </w:hdr>
 </file>
 
 <file path=word/header11.xml><?xml version="1.0" encoding="utf-8"?>
-<w:hdr xmlns:wpc="http://schemas.microsoft.com/office/word/2010/wordprocessingCanvas" xmlns:cx="http://schemas.microsoft.com/office/drawing/2014/chartex" xmlns:cx1="http://schemas.microsoft.com/office/drawing/2015/9/8/chartex" xmlns:cx2="http://schemas.microsoft.com/office/drawing/2015/10/21/chartex" xmlns:cx3="http://schemas.microsoft.com/office/drawing/2016/5/9/chartex" xmlns:cx4="http://schemas.microsoft.com/office/drawing/2016/5/10/chartex" xmlns:cx5="http://schemas.microsoft.com/office/drawing/2016/5/11/chartex" xmlns:cx6="http://schemas.microsoft.com/office/drawing/2016/5/12/chartex" xmlns:cx7="http://schemas.microsoft.com/office/drawing/2016/5/13/chartex" xmlns:cx8="http://schemas.microsoft.com/office/drawing/2016/5/14/chartex" xmlns:mc="http://schemas.openxmlformats.org/markup-compatibility/2006" xmlns:aink="http://schemas.microsoft.com/office/drawing/2016/ink" xmlns:am3d="http://schemas.microsoft.com/office/drawing/2017/model3d" xmlns:o="urn:schemas-microsoft-com:office:office" xmlns:oel="http://schemas.microsoft.com/office/2019/extlst" xmlns:r="http://schemas.openxmlformats.org/officeDocument/2006/relationships" xmlns:m="http://schemas.openxmlformats.org/officeDocument/2006/math" xmlns:v="urn:schemas-microsoft-com:vml" xmlns:wp14="http://schemas.microsoft.com/office/word/2010/wordprocessingDrawing" xmlns:wp="http://schemas.openxmlformats.org/drawingml/2006/wordprocessingDrawing" xmlns:w10="urn:schemas-microsoft-com:office:word" xmlns:w="http://schemas.openxmlformats.org/wordprocessingml/2006/main" xmlns:w14="http://schemas.microsoft.com/office/word/2010/wordml" xmlns:w15="http://schemas.microsoft.com/office/word/2012/wordml" xmlns:w16cex="http://schemas.microsoft.com/office/word/2018/wordml/cex" xmlns:w16cid="http://schemas.microsoft.com/office/word/2016/wordml/cid" xmlns:w16="http://schemas.microsoft.com/office/word/2018/wordml" xmlns:w16sdtdh="http://schemas.microsoft.com/office/word/2020/wordml/sdtdatahash" xmlns:w16se="http://schemas.microsoft.com/office/word/2015/wordml/symex" xmlns:wpg="http://schemas.microsoft.com/office/word/2010/wordprocessingGroup" xmlns:wpi="http://schemas.microsoft.com/office/word/2010/wordprocessingInk" xmlns:wne="http://schemas.microsoft.com/office/word/2006/wordml" xmlns:wps="http://schemas.microsoft.com/office/word/2010/wordprocessingShape" mc:Ignorable="w14 w15 w16se w16cid w16 w16cex w16sdtdh wp14">
+<w:hdr xmlns:wpc="http://schemas.microsoft.com/office/word/2010/wordprocessingCanvas" xmlns:cx="http://schemas.microsoft.com/office/drawing/2014/chartex" xmlns:cx1="http://schemas.microsoft.com/office/drawing/2015/9/8/chartex" xmlns:cx2="http://schemas.microsoft.com/office/drawing/2015/10/21/chartex" xmlns:cx3="http://schemas.microsoft.com/office/drawing/2016/5/9/chartex" xmlns:cx4="http://schemas.microsoft.com/office/drawing/2016/5/10/chartex" xmlns:cx5="http://schemas.microsoft.com/office/drawing/2016/5/11/chartex" xmlns:cx6="http://schemas.microsoft.com/office/drawing/2016/5/12/chartex" xmlns:cx7="http://schemas.microsoft.com/office/drawing/2016/5/13/chartex" xmlns:cx8="http://schemas.microsoft.com/office/drawing/2016/5/14/chartex" xmlns:mc="http://schemas.openxmlformats.org/markup-compatibility/2006" xmlns:aink="http://schemas.microsoft.com/office/drawing/2016/ink" xmlns:am3d="http://schemas.microsoft.com/office/drawing/2017/model3d" xmlns:o="urn:schemas-microsoft-com:office:office" xmlns:oel="http://schemas.microsoft.com/office/2019/extlst" xmlns:r="http://schemas.openxmlformats.org/officeDocument/2006/relationships" xmlns:m="http://schemas.openxmlformats.org/officeDocument/2006/math" xmlns:v="urn:schemas-microsoft-com:vml" xmlns:wp14="http://schemas.microsoft.com/office/word/2010/wordprocessingDrawing" xmlns:wp="http://schemas.openxmlformats.org/drawingml/2006/wordprocessingDrawing" xmlns:w10="urn:schemas-microsoft-com:office:word" xmlns:w="http://schemas.openxmlformats.org/wordprocessingml/2006/main" xmlns:w14="http://schemas.microsoft.com/office/word/2010/wordml" xmlns:w15="http://schemas.microsoft.com/office/word/2012/wordml" xmlns:w16cex="http://schemas.microsoft.com/office/word/2018/wordml/cex" xmlns:w16cid="http://schemas.microsoft.com/office/word/2016/wordml/cid" xmlns:w16="http://schemas.microsoft.com/office/word/2018/wordml" xmlns:w16du="http://schemas.microsoft.com/office/word/2023/wordml/word16du" xmlns:w16sdtdh="http://schemas.microsoft.com/office/word/2020/wordml/sdtdatahash" xmlns:w16sdtfl="http://schemas.microsoft.com/office/word/2024/wordml/sdtformatlock" xmlns:w16se="http://schemas.microsoft.com/office/word/2015/wordml/symex" xmlns:wpg="http://schemas.microsoft.com/office/word/2010/wordprocessingGroup" xmlns:wpi="http://schemas.microsoft.com/office/word/2010/wordprocessingInk" xmlns:wne="http://schemas.microsoft.com/office/word/2006/wordml" xmlns:wps="http://schemas.microsoft.com/office/word/2010/wordprocessingShape" mc:Ignorable="w14 w15 w16se w16cid w16 w16cex w16sdtdh w16sdtfl w16du wp14">
   <w:p/>
 </w:hdr>
 </file>
 
 <file path=word/header12.xml><?xml version="1.0" encoding="utf-8"?>
-<w:hdr xmlns:wpc="http://schemas.microsoft.com/office/word/2010/wordprocessingCanvas" xmlns:cx="http://schemas.microsoft.com/office/drawing/2014/chartex" xmlns:cx1="http://schemas.microsoft.com/office/drawing/2015/9/8/chartex" xmlns:cx2="http://schemas.microsoft.com/office/drawing/2015/10/21/chartex" xmlns:cx3="http://schemas.microsoft.com/office/drawing/2016/5/9/chartex" xmlns:cx4="http://schemas.microsoft.com/office/drawing/2016/5/10/chartex" xmlns:cx5="http://schemas.microsoft.com/office/drawing/2016/5/11/chartex" xmlns:cx6="http://schemas.microsoft.com/office/drawing/2016/5/12/chartex" xmlns:cx7="http://schemas.microsoft.com/office/drawing/2016/5/13/chartex" xmlns:cx8="http://schemas.microsoft.com/office/drawing/2016/5/14/chartex" xmlns:mc="http://schemas.openxmlformats.org/markup-compatibility/2006" xmlns:aink="http://schemas.microsoft.com/office/drawing/2016/ink" xmlns:am3d="http://schemas.microsoft.com/office/drawing/2017/model3d" xmlns:o="urn:schemas-microsoft-com:office:office" xmlns:oel="http://schemas.microsoft.com/office/2019/extlst" xmlns:r="http://schemas.openxmlformats.org/officeDocument/2006/relationships" xmlns:m="http://schemas.openxmlformats.org/officeDocument/2006/math" xmlns:v="urn:schemas-microsoft-com:vml" xmlns:wp14="http://schemas.microsoft.com/office/word/2010/wordprocessingDrawing" xmlns:wp="http://schemas.openxmlformats.org/drawingml/2006/wordprocessingDrawing" xmlns:w10="urn:schemas-microsoft-com:office:word" xmlns:w="http://schemas.openxmlformats.org/wordprocessingml/2006/main" xmlns:w14="http://schemas.microsoft.com/office/word/2010/wordml" xmlns:w15="http://schemas.microsoft.com/office/word/2012/wordml" xmlns:w16cex="http://schemas.microsoft.com/office/word/2018/wordml/cex" xmlns:w16cid="http://schemas.microsoft.com/office/word/2016/wordml/cid" xmlns:w16="http://schemas.microsoft.com/office/word/2018/wordml" xmlns:w16sdtdh="http://schemas.microsoft.com/office/word/2020/wordml/sdtdatahash" xmlns:w16se="http://schemas.microsoft.com/office/word/2015/wordml/symex" xmlns:wpg="http://schemas.microsoft.com/office/word/2010/wordprocessingGroup" xmlns:wpi="http://schemas.microsoft.com/office/word/2010/wordprocessingInk" xmlns:wne="http://schemas.microsoft.com/office/word/2006/wordml" xmlns:wps="http://schemas.microsoft.com/office/word/2010/wordprocessingShape" mc:Ignorable="w14 w15 w16se w16cid w16 w16cex w16sdtdh wp14">
+<w:hdr xmlns:wpc="http://schemas.microsoft.com/office/word/2010/wordprocessingCanvas" xmlns:cx="http://schemas.microsoft.com/office/drawing/2014/chartex" xmlns:cx1="http://schemas.microsoft.com/office/drawing/2015/9/8/chartex" xmlns:cx2="http://schemas.microsoft.com/office/drawing/2015/10/21/chartex" xmlns:cx3="http://schemas.microsoft.com/office/drawing/2016/5/9/chartex" xmlns:cx4="http://schemas.microsoft.com/office/drawing/2016/5/10/chartex" xmlns:cx5="http://schemas.microsoft.com/office/drawing/2016/5/11/chartex" xmlns:cx6="http://schemas.microsoft.com/office/drawing/2016/5/12/chartex" xmlns:cx7="http://schemas.microsoft.com/office/drawing/2016/5/13/chartex" xmlns:cx8="http://schemas.microsoft.com/office/drawing/2016/5/14/chartex" xmlns:mc="http://schemas.openxmlformats.org/markup-compatibility/2006" xmlns:aink="http://schemas.microsoft.com/office/drawing/2016/ink" xmlns:am3d="http://schemas.microsoft.com/office/drawing/2017/model3d" xmlns:o="urn:schemas-microsoft-com:office:office" xmlns:oel="http://schemas.microsoft.com/office/2019/extlst" xmlns:r="http://schemas.openxmlformats.org/officeDocument/2006/relationships" xmlns:m="http://schemas.openxmlformats.org/officeDocument/2006/math" xmlns:v="urn:schemas-microsoft-com:vml" xmlns:wp14="http://schemas.microsoft.com/office/word/2010/wordprocessingDrawing" xmlns:wp="http://schemas.openxmlformats.org/drawingml/2006/wordprocessingDrawing" xmlns:w10="urn:schemas-microsoft-com:office:word" xmlns:w="http://schemas.openxmlformats.org/wordprocessingml/2006/main" xmlns:w14="http://schemas.microsoft.com/office/word/2010/wordml" xmlns:w15="http://schemas.microsoft.com/office/word/2012/wordml" xmlns:w16cex="http://schemas.microsoft.com/office/word/2018/wordml/cex" xmlns:w16cid="http://schemas.microsoft.com/office/word/2016/wordml/cid" xmlns:w16="http://schemas.microsoft.com/office/word/2018/wordml" xmlns:w16du="http://schemas.microsoft.com/office/word/2023/wordml/word16du" xmlns:w16sdtdh="http://schemas.microsoft.com/office/word/2020/wordml/sdtdatahash" xmlns:w16sdtfl="http://schemas.microsoft.com/office/word/2024/wordml/sdtformatlock" xmlns:w16se="http://schemas.microsoft.com/office/word/2015/wordml/symex" xmlns:wpg="http://schemas.microsoft.com/office/word/2010/wordprocessingGroup" xmlns:wpi="http://schemas.microsoft.com/office/word/2010/wordprocessingInk" xmlns:wne="http://schemas.microsoft.com/office/word/2006/wordml" xmlns:wps="http://schemas.microsoft.com/office/word/2010/wordprocessingShape" mc:Ignorable="w14 w15 w16se w16cid w16 w16cex w16sdtdh w16sdtfl w16du wp14">
   <w:p/>
 </w:hdr>
 </file>
 
 <file path=word/header13.xml><?xml version="1.0" encoding="utf-8"?>
-<w:hdr xmlns:wpc="http://schemas.microsoft.com/office/word/2010/wordprocessingCanvas" xmlns:cx="http://schemas.microsoft.com/office/drawing/2014/chartex" xmlns:cx1="http://schemas.microsoft.com/office/drawing/2015/9/8/chartex" xmlns:cx2="http://schemas.microsoft.com/office/drawing/2015/10/21/chartex" xmlns:cx3="http://schemas.microsoft.com/office/drawing/2016/5/9/chartex" xmlns:cx4="http://schemas.microsoft.com/office/drawing/2016/5/10/chartex" xmlns:cx5="http://schemas.microsoft.com/office/drawing/2016/5/11/chartex" xmlns:cx6="http://schemas.microsoft.com/office/drawing/2016/5/12/chartex" xmlns:cx7="http://schemas.microsoft.com/office/drawing/2016/5/13/chartex" xmlns:cx8="http://schemas.microsoft.com/office/drawing/2016/5/14/chartex" xmlns:mc="http://schemas.openxmlformats.org/markup-compatibility/2006" xmlns:aink="http://schemas.microsoft.com/office/drawing/2016/ink" xmlns:am3d="http://schemas.microsoft.com/office/drawing/2017/model3d" xmlns:o="urn:schemas-microsoft-com:office:office" xmlns:oel="http://schemas.microsoft.com/office/2019/extlst" xmlns:r="http://schemas.openxmlformats.org/officeDocument/2006/relationships" xmlns:m="http://schemas.openxmlformats.org/officeDocument/2006/math" xmlns:v="urn:schemas-microsoft-com:vml" xmlns:wp14="http://schemas.microsoft.com/office/word/2010/wordprocessingDrawing" xmlns:wp="http://schemas.openxmlformats.org/drawingml/2006/wordprocessingDrawing" xmlns:w10="urn:schemas-microsoft-com:office:word" xmlns:w="http://schemas.openxmlformats.org/wordprocessingml/2006/main" xmlns:w14="http://schemas.microsoft.com/office/word/2010/wordml" xmlns:w15="http://schemas.microsoft.com/office/word/2012/wordml" xmlns:w16cex="http://schemas.microsoft.com/office/word/2018/wordml/cex" xmlns:w16cid="http://schemas.microsoft.com/office/word/2016/wordml/cid" xmlns:w16="http://schemas.microsoft.com/office/word/2018/wordml" xmlns:w16sdtdh="http://schemas.microsoft.com/office/word/2020/wordml/sdtdatahash" xmlns:w16se="http://schemas.microsoft.com/office/word/2015/wordml/symex" xmlns:wpg="http://schemas.microsoft.com/office/word/2010/wordprocessingGroup" xmlns:wpi="http://schemas.microsoft.com/office/word/2010/wordprocessingInk" xmlns:wne="http://schemas.microsoft.com/office/word/2006/wordml" xmlns:wps="http://schemas.microsoft.com/office/word/2010/wordprocessingShape" mc:Ignorable="w14 w15 w16se w16cid w16 w16cex w16sdtdh wp14">
+<w:hdr xmlns:wpc="http://schemas.microsoft.com/office/word/2010/wordprocessingCanvas" xmlns:cx="http://schemas.microsoft.com/office/drawing/2014/chartex" xmlns:cx1="http://schemas.microsoft.com/office/drawing/2015/9/8/chartex" xmlns:cx2="http://schemas.microsoft.com/office/drawing/2015/10/21/chartex" xmlns:cx3="http://schemas.microsoft.com/office/drawing/2016/5/9/chartex" xmlns:cx4="http://schemas.microsoft.com/office/drawing/2016/5/10/chartex" xmlns:cx5="http://schemas.microsoft.com/office/drawing/2016/5/11/chartex" xmlns:cx6="http://schemas.microsoft.com/office/drawing/2016/5/12/chartex" xmlns:cx7="http://schemas.microsoft.com/office/drawing/2016/5/13/chartex" xmlns:cx8="http://schemas.microsoft.com/office/drawing/2016/5/14/chartex" xmlns:mc="http://schemas.openxmlformats.org/markup-compatibility/2006" xmlns:aink="http://schemas.microsoft.com/office/drawing/2016/ink" xmlns:am3d="http://schemas.microsoft.com/office/drawing/2017/model3d" xmlns:o="urn:schemas-microsoft-com:office:office" xmlns:oel="http://schemas.microsoft.com/office/2019/extlst" xmlns:r="http://schemas.openxmlformats.org/officeDocument/2006/relationships" xmlns:m="http://schemas.openxmlformats.org/officeDocument/2006/math" xmlns:v="urn:schemas-microsoft-com:vml" xmlns:wp14="http://schemas.microsoft.com/office/word/2010/wordprocessingDrawing" xmlns:wp="http://schemas.openxmlformats.org/drawingml/2006/wordprocessingDrawing" xmlns:w10="urn:schemas-microsoft-com:office:word" xmlns:w="http://schemas.openxmlformats.org/wordprocessingml/2006/main" xmlns:w14="http://schemas.microsoft.com/office/word/2010/wordml" xmlns:w15="http://schemas.microsoft.com/office/word/2012/wordml" xmlns:w16cex="http://schemas.microsoft.com/office/word/2018/wordml/cex" xmlns:w16cid="http://schemas.microsoft.com/office/word/2016/wordml/cid" xmlns:w16="http://schemas.microsoft.com/office/word/2018/wordml" xmlns:w16du="http://schemas.microsoft.com/office/word/2023/wordml/word16du" xmlns:w16sdtdh="http://schemas.microsoft.com/office/word/2020/wordml/sdtdatahash" xmlns:w16sdtfl="http://schemas.microsoft.com/office/word/2024/wordml/sdtformatlock" xmlns:w16se="http://schemas.microsoft.com/office/word/2015/wordml/symex" xmlns:wpg="http://schemas.microsoft.com/office/word/2010/wordprocessingGroup" xmlns:wpi="http://schemas.microsoft.com/office/word/2010/wordprocessingInk" xmlns:wne="http://schemas.microsoft.com/office/word/2006/wordml" xmlns:wps="http://schemas.microsoft.com/office/word/2010/wordprocessingShape" mc:Ignorable="w14 w15 w16se w16cid w16 w16cex w16sdtdh w16sdtfl w16du wp14">
   <w:p>
     <w:pPr>
-      <w:pStyle w:val="Header"/>
+      <w:pStyle w:val="Cabealho"/>
       <w:pBdr>
         <w:top w:val="none" w:sz="0" w:space="0" w:color="000000"/>
         <w:left w:val="none" w:sz="0" w:space="0" w:color="000000"/>
@@ -9721,10 +10147,10 @@
 </file>
 
 <file path=word/header14.xml><?xml version="1.0" encoding="utf-8"?>
-<w:hdr xmlns:wpc="http://schemas.microsoft.com/office/word/2010/wordprocessingCanvas" xmlns:cx="http://schemas.microsoft.com/office/drawing/2014/chartex" xmlns:cx1="http://schemas.microsoft.com/office/drawing/2015/9/8/chartex" xmlns:cx2="http://schemas.microsoft.com/office/drawing/2015/10/21/chartex" xmlns:cx3="http://schemas.microsoft.com/office/drawing/2016/5/9/chartex" xmlns:cx4="http://schemas.microsoft.com/office/drawing/2016/5/10/chartex" xmlns:cx5="http://schemas.microsoft.com/office/drawing/2016/5/11/chartex" xmlns:cx6="http://schemas.microsoft.com/office/drawing/2016/5/12/chartex" xmlns:cx7="http://schemas.microsoft.com/office/drawing/2016/5/13/chartex" xmlns:cx8="http://schemas.microsoft.com/office/drawing/2016/5/14/chartex" xmlns:mc="http://schemas.openxmlformats.org/markup-compatibility/2006" xmlns:aink="http://schemas.microsoft.com/office/drawing/2016/ink" xmlns:am3d="http://schemas.microsoft.com/office/drawing/2017/model3d" xmlns:o="urn:schemas-microsoft-com:office:office" xmlns:oel="http://schemas.microsoft.com/office/2019/extlst" xmlns:r="http://schemas.openxmlformats.org/officeDocument/2006/relationships" xmlns:m="http://schemas.openxmlformats.org/officeDocument/2006/math" xmlns:v="urn:schemas-microsoft-com:vml" xmlns:wp14="http://schemas.microsoft.com/office/word/2010/wordprocessingDrawing" xmlns:wp="http://schemas.openxmlformats.org/drawingml/2006/wordprocessingDrawing" xmlns:w10="urn:schemas-microsoft-com:office:word" xmlns:w="http://schemas.openxmlformats.org/wordprocessingml/2006/main" xmlns:w14="http://schemas.microsoft.com/office/word/2010/wordml" xmlns:w15="http://schemas.microsoft.com/office/word/2012/wordml" xmlns:w16cex="http://schemas.microsoft.com/office/word/2018/wordml/cex" xmlns:w16cid="http://schemas.microsoft.com/office/word/2016/wordml/cid" xmlns:w16="http://schemas.microsoft.com/office/word/2018/wordml" xmlns:w16sdtdh="http://schemas.microsoft.com/office/word/2020/wordml/sdtdatahash" xmlns:w16se="http://schemas.microsoft.com/office/word/2015/wordml/symex" xmlns:wpg="http://schemas.microsoft.com/office/word/2010/wordprocessingGroup" xmlns:wpi="http://schemas.microsoft.com/office/word/2010/wordprocessingInk" xmlns:wne="http://schemas.microsoft.com/office/word/2006/wordml" xmlns:wps="http://schemas.microsoft.com/office/word/2010/wordprocessingShape" mc:Ignorable="w14 w15 w16se w16cid w16 w16cex w16sdtdh wp14">
+<w:hdr xmlns:wpc="http://schemas.microsoft.com/office/word/2010/wordprocessingCanvas" xmlns:cx="http://schemas.microsoft.com/office/drawing/2014/chartex" xmlns:cx1="http://schemas.microsoft.com/office/drawing/2015/9/8/chartex" xmlns:cx2="http://schemas.microsoft.com/office/drawing/2015/10/21/chartex" xmlns:cx3="http://schemas.microsoft.com/office/drawing/2016/5/9/chartex" xmlns:cx4="http://schemas.microsoft.com/office/drawing/2016/5/10/chartex" xmlns:cx5="http://schemas.microsoft.com/office/drawing/2016/5/11/chartex" xmlns:cx6="http://schemas.microsoft.com/office/drawing/2016/5/12/chartex" xmlns:cx7="http://schemas.microsoft.com/office/drawing/2016/5/13/chartex" xmlns:cx8="http://schemas.microsoft.com/office/drawing/2016/5/14/chartex" xmlns:mc="http://schemas.openxmlformats.org/markup-compatibility/2006" xmlns:aink="http://schemas.microsoft.com/office/drawing/2016/ink" xmlns:am3d="http://schemas.microsoft.com/office/drawing/2017/model3d" xmlns:o="urn:schemas-microsoft-com:office:office" xmlns:oel="http://schemas.microsoft.com/office/2019/extlst" xmlns:r="http://schemas.openxmlformats.org/officeDocument/2006/relationships" xmlns:m="http://schemas.openxmlformats.org/officeDocument/2006/math" xmlns:v="urn:schemas-microsoft-com:vml" xmlns:wp14="http://schemas.microsoft.com/office/word/2010/wordprocessingDrawing" xmlns:wp="http://schemas.openxmlformats.org/drawingml/2006/wordprocessingDrawing" xmlns:w10="urn:schemas-microsoft-com:office:word" xmlns:w="http://schemas.openxmlformats.org/wordprocessingml/2006/main" xmlns:w14="http://schemas.microsoft.com/office/word/2010/wordml" xmlns:w15="http://schemas.microsoft.com/office/word/2012/wordml" xmlns:w16cex="http://schemas.microsoft.com/office/word/2018/wordml/cex" xmlns:w16cid="http://schemas.microsoft.com/office/word/2016/wordml/cid" xmlns:w16="http://schemas.microsoft.com/office/word/2018/wordml" xmlns:w16du="http://schemas.microsoft.com/office/word/2023/wordml/word16du" xmlns:w16sdtdh="http://schemas.microsoft.com/office/word/2020/wordml/sdtdatahash" xmlns:w16sdtfl="http://schemas.microsoft.com/office/word/2024/wordml/sdtformatlock" xmlns:w16se="http://schemas.microsoft.com/office/word/2015/wordml/symex" xmlns:wpg="http://schemas.microsoft.com/office/word/2010/wordprocessingGroup" xmlns:wpi="http://schemas.microsoft.com/office/word/2010/wordprocessingInk" xmlns:wne="http://schemas.microsoft.com/office/word/2006/wordml" xmlns:wps="http://schemas.microsoft.com/office/word/2010/wordprocessingShape" mc:Ignorable="w14 w15 w16se w16cid w16 w16cex w16sdtdh w16sdtfl w16du wp14">
   <w:p>
     <w:pPr>
-      <w:pStyle w:val="Header"/>
+      <w:pStyle w:val="Cabealho"/>
       <w:pBdr>
         <w:top w:val="none" w:sz="0" w:space="0" w:color="000000"/>
         <w:left w:val="none" w:sz="0" w:space="0" w:color="000000"/>
@@ -9740,7 +10166,7 @@
 </file>
 
 <file path=word/header15.xml><?xml version="1.0" encoding="utf-8"?>
-<w:hdr xmlns:wpc="http://schemas.microsoft.com/office/word/2010/wordprocessingCanvas" xmlns:cx="http://schemas.microsoft.com/office/drawing/2014/chartex" xmlns:cx1="http://schemas.microsoft.com/office/drawing/2015/9/8/chartex" xmlns:cx2="http://schemas.microsoft.com/office/drawing/2015/10/21/chartex" xmlns:cx3="http://schemas.microsoft.com/office/drawing/2016/5/9/chartex" xmlns:cx4="http://schemas.microsoft.com/office/drawing/2016/5/10/chartex" xmlns:cx5="http://schemas.microsoft.com/office/drawing/2016/5/11/chartex" xmlns:cx6="http://schemas.microsoft.com/office/drawing/2016/5/12/chartex" xmlns:cx7="http://schemas.microsoft.com/office/drawing/2016/5/13/chartex" xmlns:cx8="http://schemas.microsoft.com/office/drawing/2016/5/14/chartex" xmlns:mc="http://schemas.openxmlformats.org/markup-compatibility/2006" xmlns:aink="http://schemas.microsoft.com/office/drawing/2016/ink" xmlns:am3d="http://schemas.microsoft.com/office/drawing/2017/model3d" xmlns:o="urn:schemas-microsoft-com:office:office" xmlns:oel="http://schemas.microsoft.com/office/2019/extlst" xmlns:r="http://schemas.openxmlformats.org/officeDocument/2006/relationships" xmlns:m="http://schemas.openxmlformats.org/officeDocument/2006/math" xmlns:v="urn:schemas-microsoft-com:vml" xmlns:wp14="http://schemas.microsoft.com/office/word/2010/wordprocessingDrawing" xmlns:wp="http://schemas.openxmlformats.org/drawingml/2006/wordprocessingDrawing" xmlns:w10="urn:schemas-microsoft-com:office:word" xmlns:w="http://schemas.openxmlformats.org/wordprocessingml/2006/main" xmlns:w14="http://schemas.microsoft.com/office/word/2010/wordml" xmlns:w15="http://schemas.microsoft.com/office/word/2012/wordml" xmlns:w16cex="http://schemas.microsoft.com/office/word/2018/wordml/cex" xmlns:w16cid="http://schemas.microsoft.com/office/word/2016/wordml/cid" xmlns:w16="http://schemas.microsoft.com/office/word/2018/wordml" xmlns:w16sdtdh="http://schemas.microsoft.com/office/word/2020/wordml/sdtdatahash" xmlns:w16se="http://schemas.microsoft.com/office/word/2015/wordml/symex" xmlns:wpg="http://schemas.microsoft.com/office/word/2010/wordprocessingGroup" xmlns:wpi="http://schemas.microsoft.com/office/word/2010/wordprocessingInk" xmlns:wne="http://schemas.microsoft.com/office/word/2006/wordml" xmlns:wps="http://schemas.microsoft.com/office/word/2010/wordprocessingShape" mc:Ignorable="w14 w15 w16se w16cid w16 w16cex w16sdtdh wp14">
+<w:hdr xmlns:wpc="http://schemas.microsoft.com/office/word/2010/wordprocessingCanvas" xmlns:cx="http://schemas.microsoft.com/office/drawing/2014/chartex" xmlns:cx1="http://schemas.microsoft.com/office/drawing/2015/9/8/chartex" xmlns:cx2="http://schemas.microsoft.com/office/drawing/2015/10/21/chartex" xmlns:cx3="http://schemas.microsoft.com/office/drawing/2016/5/9/chartex" xmlns:cx4="http://schemas.microsoft.com/office/drawing/2016/5/10/chartex" xmlns:cx5="http://schemas.microsoft.com/office/drawing/2016/5/11/chartex" xmlns:cx6="http://schemas.microsoft.com/office/drawing/2016/5/12/chartex" xmlns:cx7="http://schemas.microsoft.com/office/drawing/2016/5/13/chartex" xmlns:cx8="http://schemas.microsoft.com/office/drawing/2016/5/14/chartex" xmlns:mc="http://schemas.openxmlformats.org/markup-compatibility/2006" xmlns:aink="http://schemas.microsoft.com/office/drawing/2016/ink" xmlns:am3d="http://schemas.microsoft.com/office/drawing/2017/model3d" xmlns:o="urn:schemas-microsoft-com:office:office" xmlns:oel="http://schemas.microsoft.com/office/2019/extlst" xmlns:r="http://schemas.openxmlformats.org/officeDocument/2006/relationships" xmlns:m="http://schemas.openxmlformats.org/officeDocument/2006/math" xmlns:v="urn:schemas-microsoft-com:vml" xmlns:wp14="http://schemas.microsoft.com/office/word/2010/wordprocessingDrawing" xmlns:wp="http://schemas.openxmlformats.org/drawingml/2006/wordprocessingDrawing" xmlns:w10="urn:schemas-microsoft-com:office:word" xmlns:w="http://schemas.openxmlformats.org/wordprocessingml/2006/main" xmlns:w14="http://schemas.microsoft.com/office/word/2010/wordml" xmlns:w15="http://schemas.microsoft.com/office/word/2012/wordml" xmlns:w16cex="http://schemas.microsoft.com/office/word/2018/wordml/cex" xmlns:w16cid="http://schemas.microsoft.com/office/word/2016/wordml/cid" xmlns:w16="http://schemas.microsoft.com/office/word/2018/wordml" xmlns:w16du="http://schemas.microsoft.com/office/word/2023/wordml/word16du" xmlns:w16sdtdh="http://schemas.microsoft.com/office/word/2020/wordml/sdtdatahash" xmlns:w16sdtfl="http://schemas.microsoft.com/office/word/2024/wordml/sdtformatlock" xmlns:w16se="http://schemas.microsoft.com/office/word/2015/wordml/symex" xmlns:wpg="http://schemas.microsoft.com/office/word/2010/wordprocessingGroup" xmlns:wpi="http://schemas.microsoft.com/office/word/2010/wordprocessingInk" xmlns:wne="http://schemas.microsoft.com/office/word/2006/wordml" xmlns:wps="http://schemas.microsoft.com/office/word/2010/wordprocessingShape" mc:Ignorable="w14 w15 w16se w16cid w16 w16cex w16sdtdh w16sdtfl w16du wp14">
   <w:p>
     <w:pPr>
       <w:pStyle w:val="HeaderLeft"/>
@@ -9750,10 +10176,10 @@
 </file>
 
 <file path=word/header16.xml><?xml version="1.0" encoding="utf-8"?>
-<w:hdr xmlns:wpc="http://schemas.microsoft.com/office/word/2010/wordprocessingCanvas" xmlns:cx="http://schemas.microsoft.com/office/drawing/2014/chartex" xmlns:cx1="http://schemas.microsoft.com/office/drawing/2015/9/8/chartex" xmlns:cx2="http://schemas.microsoft.com/office/drawing/2015/10/21/chartex" xmlns:cx3="http://schemas.microsoft.com/office/drawing/2016/5/9/chartex" xmlns:cx4="http://schemas.microsoft.com/office/drawing/2016/5/10/chartex" xmlns:cx5="http://schemas.microsoft.com/office/drawing/2016/5/11/chartex" xmlns:cx6="http://schemas.microsoft.com/office/drawing/2016/5/12/chartex" xmlns:cx7="http://schemas.microsoft.com/office/drawing/2016/5/13/chartex" xmlns:cx8="http://schemas.microsoft.com/office/drawing/2016/5/14/chartex" xmlns:mc="http://schemas.openxmlformats.org/markup-compatibility/2006" xmlns:aink="http://schemas.microsoft.com/office/drawing/2016/ink" xmlns:am3d="http://schemas.microsoft.com/office/drawing/2017/model3d" xmlns:o="urn:schemas-microsoft-com:office:office" xmlns:oel="http://schemas.microsoft.com/office/2019/extlst" xmlns:r="http://schemas.openxmlformats.org/officeDocument/2006/relationships" xmlns:m="http://schemas.openxmlformats.org/officeDocument/2006/math" xmlns:v="urn:schemas-microsoft-com:vml" xmlns:wp14="http://schemas.microsoft.com/office/word/2010/wordprocessingDrawing" xmlns:wp="http://schemas.openxmlformats.org/drawingml/2006/wordprocessingDrawing" xmlns:w10="urn:schemas-microsoft-com:office:word" xmlns:w="http://schemas.openxmlformats.org/wordprocessingml/2006/main" xmlns:w14="http://schemas.microsoft.com/office/word/2010/wordml" xmlns:w15="http://schemas.microsoft.com/office/word/2012/wordml" xmlns:w16cex="http://schemas.microsoft.com/office/word/2018/wordml/cex" xmlns:w16cid="http://schemas.microsoft.com/office/word/2016/wordml/cid" xmlns:w16="http://schemas.microsoft.com/office/word/2018/wordml" xmlns:w16sdtdh="http://schemas.microsoft.com/office/word/2020/wordml/sdtdatahash" xmlns:w16se="http://schemas.microsoft.com/office/word/2015/wordml/symex" xmlns:wpg="http://schemas.microsoft.com/office/word/2010/wordprocessingGroup" xmlns:wpi="http://schemas.microsoft.com/office/word/2010/wordprocessingInk" xmlns:wne="http://schemas.microsoft.com/office/word/2006/wordml" xmlns:wps="http://schemas.microsoft.com/office/word/2010/wordprocessingShape" mc:Ignorable="w14 w15 w16se w16cid w16 w16cex w16sdtdh wp14">
+<w:hdr xmlns:wpc="http://schemas.microsoft.com/office/word/2010/wordprocessingCanvas" xmlns:cx="http://schemas.microsoft.com/office/drawing/2014/chartex" xmlns:cx1="http://schemas.microsoft.com/office/drawing/2015/9/8/chartex" xmlns:cx2="http://schemas.microsoft.com/office/drawing/2015/10/21/chartex" xmlns:cx3="http://schemas.microsoft.com/office/drawing/2016/5/9/chartex" xmlns:cx4="http://schemas.microsoft.com/office/drawing/2016/5/10/chartex" xmlns:cx5="http://schemas.microsoft.com/office/drawing/2016/5/11/chartex" xmlns:cx6="http://schemas.microsoft.com/office/drawing/2016/5/12/chartex" xmlns:cx7="http://schemas.microsoft.com/office/drawing/2016/5/13/chartex" xmlns:cx8="http://schemas.microsoft.com/office/drawing/2016/5/14/chartex" xmlns:mc="http://schemas.openxmlformats.org/markup-compatibility/2006" xmlns:aink="http://schemas.microsoft.com/office/drawing/2016/ink" xmlns:am3d="http://schemas.microsoft.com/office/drawing/2017/model3d" xmlns:o="urn:schemas-microsoft-com:office:office" xmlns:oel="http://schemas.microsoft.com/office/2019/extlst" xmlns:r="http://schemas.openxmlformats.org/officeDocument/2006/relationships" xmlns:m="http://schemas.openxmlformats.org/officeDocument/2006/math" xmlns:v="urn:schemas-microsoft-com:vml" xmlns:wp14="http://schemas.microsoft.com/office/word/2010/wordprocessingDrawing" xmlns:wp="http://schemas.openxmlformats.org/drawingml/2006/wordprocessingDrawing" xmlns:w10="urn:schemas-microsoft-com:office:word" xmlns:w="http://schemas.openxmlformats.org/wordprocessingml/2006/main" xmlns:w14="http://schemas.microsoft.com/office/word/2010/wordml" xmlns:w15="http://schemas.microsoft.com/office/word/2012/wordml" xmlns:w16cex="http://schemas.microsoft.com/office/word/2018/wordml/cex" xmlns:w16cid="http://schemas.microsoft.com/office/word/2016/wordml/cid" xmlns:w16="http://schemas.microsoft.com/office/word/2018/wordml" xmlns:w16du="http://schemas.microsoft.com/office/word/2023/wordml/word16du" xmlns:w16sdtdh="http://schemas.microsoft.com/office/word/2020/wordml/sdtdatahash" xmlns:w16sdtfl="http://schemas.microsoft.com/office/word/2024/wordml/sdtformatlock" xmlns:w16se="http://schemas.microsoft.com/office/word/2015/wordml/symex" xmlns:wpg="http://schemas.microsoft.com/office/word/2010/wordprocessingGroup" xmlns:wpi="http://schemas.microsoft.com/office/word/2010/wordprocessingInk" xmlns:wne="http://schemas.microsoft.com/office/word/2006/wordml" xmlns:wps="http://schemas.microsoft.com/office/word/2010/wordprocessingShape" mc:Ignorable="w14 w15 w16se w16cid w16 w16cex w16sdtdh w16sdtfl w16du wp14">
   <w:p>
     <w:pPr>
-      <w:pStyle w:val="Header"/>
+      <w:pStyle w:val="Cabealho"/>
       <w:pBdr>
         <w:top w:val="none" w:sz="0" w:space="0" w:color="000000"/>
         <w:left w:val="none" w:sz="0" w:space="0" w:color="000000"/>
@@ -9769,10 +10195,10 @@
 </file>
 
 <file path=word/header17.xml><?xml version="1.0" encoding="utf-8"?>
-<w:hdr xmlns:wpc="http://schemas.microsoft.com/office/word/2010/wordprocessingCanvas" xmlns:cx="http://schemas.microsoft.com/office/drawing/2014/chartex" xmlns:cx1="http://schemas.microsoft.com/office/drawing/2015/9/8/chartex" xmlns:cx2="http://schemas.microsoft.com/office/drawing/2015/10/21/chartex" xmlns:cx3="http://schemas.microsoft.com/office/drawing/2016/5/9/chartex" xmlns:cx4="http://schemas.microsoft.com/office/drawing/2016/5/10/chartex" xmlns:cx5="http://schemas.microsoft.com/office/drawing/2016/5/11/chartex" xmlns:cx6="http://schemas.microsoft.com/office/drawing/2016/5/12/chartex" xmlns:cx7="http://schemas.microsoft.com/office/drawing/2016/5/13/chartex" xmlns:cx8="http://schemas.microsoft.com/office/drawing/2016/5/14/chartex" xmlns:mc="http://schemas.openxmlformats.org/markup-compatibility/2006" xmlns:aink="http://schemas.microsoft.com/office/drawing/2016/ink" xmlns:am3d="http://schemas.microsoft.com/office/drawing/2017/model3d" xmlns:o="urn:schemas-microsoft-com:office:office" xmlns:oel="http://schemas.microsoft.com/office/2019/extlst" xmlns:r="http://schemas.openxmlformats.org/officeDocument/2006/relationships" xmlns:m="http://schemas.openxmlformats.org/officeDocument/2006/math" xmlns:v="urn:schemas-microsoft-com:vml" xmlns:wp14="http://schemas.microsoft.com/office/word/2010/wordprocessingDrawing" xmlns:wp="http://schemas.openxmlformats.org/drawingml/2006/wordprocessingDrawing" xmlns:w10="urn:schemas-microsoft-com:office:word" xmlns:w="http://schemas.openxmlformats.org/wordprocessingml/2006/main" xmlns:w14="http://schemas.microsoft.com/office/word/2010/wordml" xmlns:w15="http://schemas.microsoft.com/office/word/2012/wordml" xmlns:w16cex="http://schemas.microsoft.com/office/word/2018/wordml/cex" xmlns:w16cid="http://schemas.microsoft.com/office/word/2016/wordml/cid" xmlns:w16="http://schemas.microsoft.com/office/word/2018/wordml" xmlns:w16sdtdh="http://schemas.microsoft.com/office/word/2020/wordml/sdtdatahash" xmlns:w16se="http://schemas.microsoft.com/office/word/2015/wordml/symex" xmlns:wpg="http://schemas.microsoft.com/office/word/2010/wordprocessingGroup" xmlns:wpi="http://schemas.microsoft.com/office/word/2010/wordprocessingInk" xmlns:wne="http://schemas.microsoft.com/office/word/2006/wordml" xmlns:wps="http://schemas.microsoft.com/office/word/2010/wordprocessingShape" mc:Ignorable="w14 w15 w16se w16cid w16 w16cex w16sdtdh wp14">
+<w:hdr xmlns:wpc="http://schemas.microsoft.com/office/word/2010/wordprocessingCanvas" xmlns:cx="http://schemas.microsoft.com/office/drawing/2014/chartex" xmlns:cx1="http://schemas.microsoft.com/office/drawing/2015/9/8/chartex" xmlns:cx2="http://schemas.microsoft.com/office/drawing/2015/10/21/chartex" xmlns:cx3="http://schemas.microsoft.com/office/drawing/2016/5/9/chartex" xmlns:cx4="http://schemas.microsoft.com/office/drawing/2016/5/10/chartex" xmlns:cx5="http://schemas.microsoft.com/office/drawing/2016/5/11/chartex" xmlns:cx6="http://schemas.microsoft.com/office/drawing/2016/5/12/chartex" xmlns:cx7="http://schemas.microsoft.com/office/drawing/2016/5/13/chartex" xmlns:cx8="http://schemas.microsoft.com/office/drawing/2016/5/14/chartex" xmlns:mc="http://schemas.openxmlformats.org/markup-compatibility/2006" xmlns:aink="http://schemas.microsoft.com/office/drawing/2016/ink" xmlns:am3d="http://schemas.microsoft.com/office/drawing/2017/model3d" xmlns:o="urn:schemas-microsoft-com:office:office" xmlns:oel="http://schemas.microsoft.com/office/2019/extlst" xmlns:r="http://schemas.openxmlformats.org/officeDocument/2006/relationships" xmlns:m="http://schemas.openxmlformats.org/officeDocument/2006/math" xmlns:v="urn:schemas-microsoft-com:vml" xmlns:wp14="http://schemas.microsoft.com/office/word/2010/wordprocessingDrawing" xmlns:wp="http://schemas.openxmlformats.org/drawingml/2006/wordprocessingDrawing" xmlns:w10="urn:schemas-microsoft-com:office:word" xmlns:w="http://schemas.openxmlformats.org/wordprocessingml/2006/main" xmlns:w14="http://schemas.microsoft.com/office/word/2010/wordml" xmlns:w15="http://schemas.microsoft.com/office/word/2012/wordml" xmlns:w16cex="http://schemas.microsoft.com/office/word/2018/wordml/cex" xmlns:w16cid="http://schemas.microsoft.com/office/word/2016/wordml/cid" xmlns:w16="http://schemas.microsoft.com/office/word/2018/wordml" xmlns:w16du="http://schemas.microsoft.com/office/word/2023/wordml/word16du" xmlns:w16sdtdh="http://schemas.microsoft.com/office/word/2020/wordml/sdtdatahash" xmlns:w16sdtfl="http://schemas.microsoft.com/office/word/2024/wordml/sdtformatlock" xmlns:w16se="http://schemas.microsoft.com/office/word/2015/wordml/symex" xmlns:wpg="http://schemas.microsoft.com/office/word/2010/wordprocessingGroup" xmlns:wpi="http://schemas.microsoft.com/office/word/2010/wordprocessingInk" xmlns:wne="http://schemas.microsoft.com/office/word/2006/wordml" xmlns:wps="http://schemas.microsoft.com/office/word/2010/wordprocessingShape" mc:Ignorable="w14 w15 w16se w16cid w16 w16cex w16sdtdh w16sdtfl w16du wp14">
   <w:p>
     <w:pPr>
-      <w:pStyle w:val="Header"/>
+      <w:pStyle w:val="Cabealho"/>
       <w:pBdr>
         <w:top w:val="none" w:sz="0" w:space="0" w:color="000000"/>
         <w:left w:val="none" w:sz="0" w:space="0" w:color="000000"/>
@@ -9788,7 +10214,7 @@
 </file>
 
 <file path=word/header18.xml><?xml version="1.0" encoding="utf-8"?>
-<w:hdr xmlns:wpc="http://schemas.microsoft.com/office/word/2010/wordprocessingCanvas" xmlns:cx="http://schemas.microsoft.com/office/drawing/2014/chartex" xmlns:cx1="http://schemas.microsoft.com/office/drawing/2015/9/8/chartex" xmlns:cx2="http://schemas.microsoft.com/office/drawing/2015/10/21/chartex" xmlns:cx3="http://schemas.microsoft.com/office/drawing/2016/5/9/chartex" xmlns:cx4="http://schemas.microsoft.com/office/drawing/2016/5/10/chartex" xmlns:cx5="http://schemas.microsoft.com/office/drawing/2016/5/11/chartex" xmlns:cx6="http://schemas.microsoft.com/office/drawing/2016/5/12/chartex" xmlns:cx7="http://schemas.microsoft.com/office/drawing/2016/5/13/chartex" xmlns:cx8="http://schemas.microsoft.com/office/drawing/2016/5/14/chartex" xmlns:mc="http://schemas.openxmlformats.org/markup-compatibility/2006" xmlns:aink="http://schemas.microsoft.com/office/drawing/2016/ink" xmlns:am3d="http://schemas.microsoft.com/office/drawing/2017/model3d" xmlns:o="urn:schemas-microsoft-com:office:office" xmlns:oel="http://schemas.microsoft.com/office/2019/extlst" xmlns:r="http://schemas.openxmlformats.org/officeDocument/2006/relationships" xmlns:m="http://schemas.openxmlformats.org/officeDocument/2006/math" xmlns:v="urn:schemas-microsoft-com:vml" xmlns:wp14="http://schemas.microsoft.com/office/word/2010/wordprocessingDrawing" xmlns:wp="http://schemas.openxmlformats.org/drawingml/2006/wordprocessingDrawing" xmlns:w10="urn:schemas-microsoft-com:office:word" xmlns:w="http://schemas.openxmlformats.org/wordprocessingml/2006/main" xmlns:w14="http://schemas.microsoft.com/office/word/2010/wordml" xmlns:w15="http://schemas.microsoft.com/office/word/2012/wordml" xmlns:w16cex="http://schemas.microsoft.com/office/word/2018/wordml/cex" xmlns:w16cid="http://schemas.microsoft.com/office/word/2016/wordml/cid" xmlns:w16="http://schemas.microsoft.com/office/word/2018/wordml" xmlns:w16sdtdh="http://schemas.microsoft.com/office/word/2020/wordml/sdtdatahash" xmlns:w16se="http://schemas.microsoft.com/office/word/2015/wordml/symex" xmlns:wpg="http://schemas.microsoft.com/office/word/2010/wordprocessingGroup" xmlns:wpi="http://schemas.microsoft.com/office/word/2010/wordprocessingInk" xmlns:wne="http://schemas.microsoft.com/office/word/2006/wordml" xmlns:wps="http://schemas.microsoft.com/office/word/2010/wordprocessingShape" mc:Ignorable="w14 w15 w16se w16cid w16 w16cex w16sdtdh wp14">
+<w:hdr xmlns:wpc="http://schemas.microsoft.com/office/word/2010/wordprocessingCanvas" xmlns:cx="http://schemas.microsoft.com/office/drawing/2014/chartex" xmlns:cx1="http://schemas.microsoft.com/office/drawing/2015/9/8/chartex" xmlns:cx2="http://schemas.microsoft.com/office/drawing/2015/10/21/chartex" xmlns:cx3="http://schemas.microsoft.com/office/drawing/2016/5/9/chartex" xmlns:cx4="http://schemas.microsoft.com/office/drawing/2016/5/10/chartex" xmlns:cx5="http://schemas.microsoft.com/office/drawing/2016/5/11/chartex" xmlns:cx6="http://schemas.microsoft.com/office/drawing/2016/5/12/chartex" xmlns:cx7="http://schemas.microsoft.com/office/drawing/2016/5/13/chartex" xmlns:cx8="http://schemas.microsoft.com/office/drawing/2016/5/14/chartex" xmlns:mc="http://schemas.openxmlformats.org/markup-compatibility/2006" xmlns:aink="http://schemas.microsoft.com/office/drawing/2016/ink" xmlns:am3d="http://schemas.microsoft.com/office/drawing/2017/model3d" xmlns:o="urn:schemas-microsoft-com:office:office" xmlns:oel="http://schemas.microsoft.com/office/2019/extlst" xmlns:r="http://schemas.openxmlformats.org/officeDocument/2006/relationships" xmlns:m="http://schemas.openxmlformats.org/officeDocument/2006/math" xmlns:v="urn:schemas-microsoft-com:vml" xmlns:wp14="http://schemas.microsoft.com/office/word/2010/wordprocessingDrawing" xmlns:wp="http://schemas.openxmlformats.org/drawingml/2006/wordprocessingDrawing" xmlns:w10="urn:schemas-microsoft-com:office:word" xmlns:w="http://schemas.openxmlformats.org/wordprocessingml/2006/main" xmlns:w14="http://schemas.microsoft.com/office/word/2010/wordml" xmlns:w15="http://schemas.microsoft.com/office/word/2012/wordml" xmlns:w16cex="http://schemas.microsoft.com/office/word/2018/wordml/cex" xmlns:w16cid="http://schemas.microsoft.com/office/word/2016/wordml/cid" xmlns:w16="http://schemas.microsoft.com/office/word/2018/wordml" xmlns:w16du="http://schemas.microsoft.com/office/word/2023/wordml/word16du" xmlns:w16sdtdh="http://schemas.microsoft.com/office/word/2020/wordml/sdtdatahash" xmlns:w16sdtfl="http://schemas.microsoft.com/office/word/2024/wordml/sdtformatlock" xmlns:w16se="http://schemas.microsoft.com/office/word/2015/wordml/symex" xmlns:wpg="http://schemas.microsoft.com/office/word/2010/wordprocessingGroup" xmlns:wpi="http://schemas.microsoft.com/office/word/2010/wordprocessingInk" xmlns:wne="http://schemas.microsoft.com/office/word/2006/wordml" xmlns:wps="http://schemas.microsoft.com/office/word/2010/wordprocessingShape" mc:Ignorable="w14 w15 w16se w16cid w16 w16cex w16sdtdh w16sdtfl w16du wp14">
   <w:p>
     <w:pPr>
       <w:pStyle w:val="HeaderLeft"/>
@@ -9798,7 +10224,7 @@
 </file>
 
 <file path=word/header19.xml><?xml version="1.0" encoding="utf-8"?>
-<w:hdr xmlns:wpc="http://schemas.microsoft.com/office/word/2010/wordprocessingCanvas" xmlns:cx="http://schemas.microsoft.com/office/drawing/2014/chartex" xmlns:cx1="http://schemas.microsoft.com/office/drawing/2015/9/8/chartex" xmlns:cx2="http://schemas.microsoft.com/office/drawing/2015/10/21/chartex" xmlns:cx3="http://schemas.microsoft.com/office/drawing/2016/5/9/chartex" xmlns:cx4="http://schemas.microsoft.com/office/drawing/2016/5/10/chartex" xmlns:cx5="http://schemas.microsoft.com/office/drawing/2016/5/11/chartex" xmlns:cx6="http://schemas.microsoft.com/office/drawing/2016/5/12/chartex" xmlns:cx7="http://schemas.microsoft.com/office/drawing/2016/5/13/chartex" xmlns:cx8="http://schemas.microsoft.com/office/drawing/2016/5/14/chartex" xmlns:mc="http://schemas.openxmlformats.org/markup-compatibility/2006" xmlns:aink="http://schemas.microsoft.com/office/drawing/2016/ink" xmlns:am3d="http://schemas.microsoft.com/office/drawing/2017/model3d" xmlns:o="urn:schemas-microsoft-com:office:office" xmlns:oel="http://schemas.microsoft.com/office/2019/extlst" xmlns:r="http://schemas.openxmlformats.org/officeDocument/2006/relationships" xmlns:m="http://schemas.openxmlformats.org/officeDocument/2006/math" xmlns:v="urn:schemas-microsoft-com:vml" xmlns:wp14="http://schemas.microsoft.com/office/word/2010/wordprocessingDrawing" xmlns:wp="http://schemas.openxmlformats.org/drawingml/2006/wordprocessingDrawing" xmlns:w10="urn:schemas-microsoft-com:office:word" xmlns:w="http://schemas.openxmlformats.org/wordprocessingml/2006/main" xmlns:w14="http://schemas.microsoft.com/office/word/2010/wordml" xmlns:w15="http://schemas.microsoft.com/office/word/2012/wordml" xmlns:w16cex="http://schemas.microsoft.com/office/word/2018/wordml/cex" xmlns:w16cid="http://schemas.microsoft.com/office/word/2016/wordml/cid" xmlns:w16="http://schemas.microsoft.com/office/word/2018/wordml" xmlns:w16sdtdh="http://schemas.microsoft.com/office/word/2020/wordml/sdtdatahash" xmlns:w16se="http://schemas.microsoft.com/office/word/2015/wordml/symex" xmlns:wpg="http://schemas.microsoft.com/office/word/2010/wordprocessingGroup" xmlns:wpi="http://schemas.microsoft.com/office/word/2010/wordprocessingInk" xmlns:wne="http://schemas.microsoft.com/office/word/2006/wordml" xmlns:wps="http://schemas.microsoft.com/office/word/2010/wordprocessingShape" mc:Ignorable="w14 w15 w16se w16cid w16 w16cex w16sdtdh wp14">
+<w:hdr xmlns:wpc="http://schemas.microsoft.com/office/word/2010/wordprocessingCanvas" xmlns:cx="http://schemas.microsoft.com/office/drawing/2014/chartex" xmlns:cx1="http://schemas.microsoft.com/office/drawing/2015/9/8/chartex" xmlns:cx2="http://schemas.microsoft.com/office/drawing/2015/10/21/chartex" xmlns:cx3="http://schemas.microsoft.com/office/drawing/2016/5/9/chartex" xmlns:cx4="http://schemas.microsoft.com/office/drawing/2016/5/10/chartex" xmlns:cx5="http://schemas.microsoft.com/office/drawing/2016/5/11/chartex" xmlns:cx6="http://schemas.microsoft.com/office/drawing/2016/5/12/chartex" xmlns:cx7="http://schemas.microsoft.com/office/drawing/2016/5/13/chartex" xmlns:cx8="http://schemas.microsoft.com/office/drawing/2016/5/14/chartex" xmlns:mc="http://schemas.openxmlformats.org/markup-compatibility/2006" xmlns:aink="http://schemas.microsoft.com/office/drawing/2016/ink" xmlns:am3d="http://schemas.microsoft.com/office/drawing/2017/model3d" xmlns:o="urn:schemas-microsoft-com:office:office" xmlns:oel="http://schemas.microsoft.com/office/2019/extlst" xmlns:r="http://schemas.openxmlformats.org/officeDocument/2006/relationships" xmlns:m="http://schemas.openxmlformats.org/officeDocument/2006/math" xmlns:v="urn:schemas-microsoft-com:vml" xmlns:wp14="http://schemas.microsoft.com/office/word/2010/wordprocessingDrawing" xmlns:wp="http://schemas.openxmlformats.org/drawingml/2006/wordprocessingDrawing" xmlns:w10="urn:schemas-microsoft-com:office:word" xmlns:w="http://schemas.openxmlformats.org/wordprocessingml/2006/main" xmlns:w14="http://schemas.microsoft.com/office/word/2010/wordml" xmlns:w15="http://schemas.microsoft.com/office/word/2012/wordml" xmlns:w16cex="http://schemas.microsoft.com/office/word/2018/wordml/cex" xmlns:w16cid="http://schemas.microsoft.com/office/word/2016/wordml/cid" xmlns:w16="http://schemas.microsoft.com/office/word/2018/wordml" xmlns:w16du="http://schemas.microsoft.com/office/word/2023/wordml/word16du" xmlns:w16sdtdh="http://schemas.microsoft.com/office/word/2020/wordml/sdtdatahash" xmlns:w16sdtfl="http://schemas.microsoft.com/office/word/2024/wordml/sdtformatlock" xmlns:w16se="http://schemas.microsoft.com/office/word/2015/wordml/symex" xmlns:wpg="http://schemas.microsoft.com/office/word/2010/wordprocessingGroup" xmlns:wpi="http://schemas.microsoft.com/office/word/2010/wordprocessingInk" xmlns:wne="http://schemas.microsoft.com/office/word/2006/wordml" xmlns:wps="http://schemas.microsoft.com/office/word/2010/wordprocessingShape" mc:Ignorable="w14 w15 w16se w16cid w16 w16cex w16sdtdh w16sdtfl w16du wp14">
   <w:p>
     <w:pPr>
       <w:pStyle w:val="HeaderLeft"/>
@@ -9808,29 +10234,29 @@
 </file>
 
 <file path=word/header2.xml><?xml version="1.0" encoding="utf-8"?>
-<w:hdr xmlns:wpc="http://schemas.microsoft.com/office/word/2010/wordprocessingCanvas" xmlns:cx="http://schemas.microsoft.com/office/drawing/2014/chartex" xmlns:cx1="http://schemas.microsoft.com/office/drawing/2015/9/8/chartex" xmlns:cx2="http://schemas.microsoft.com/office/drawing/2015/10/21/chartex" xmlns:cx3="http://schemas.microsoft.com/office/drawing/2016/5/9/chartex" xmlns:cx4="http://schemas.microsoft.com/office/drawing/2016/5/10/chartex" xmlns:cx5="http://schemas.microsoft.com/office/drawing/2016/5/11/chartex" xmlns:cx6="http://schemas.microsoft.com/office/drawing/2016/5/12/chartex" xmlns:cx7="http://schemas.microsoft.com/office/drawing/2016/5/13/chartex" xmlns:cx8="http://schemas.microsoft.com/office/drawing/2016/5/14/chartex" xmlns:mc="http://schemas.openxmlformats.org/markup-compatibility/2006" xmlns:aink="http://schemas.microsoft.com/office/drawing/2016/ink" xmlns:am3d="http://schemas.microsoft.com/office/drawing/2017/model3d" xmlns:o="urn:schemas-microsoft-com:office:office" xmlns:oel="http://schemas.microsoft.com/office/2019/extlst" xmlns:r="http://schemas.openxmlformats.org/officeDocument/2006/relationships" xmlns:m="http://schemas.openxmlformats.org/officeDocument/2006/math" xmlns:v="urn:schemas-microsoft-com:vml" xmlns:wp14="http://schemas.microsoft.com/office/word/2010/wordprocessingDrawing" xmlns:wp="http://schemas.openxmlformats.org/drawingml/2006/wordprocessingDrawing" xmlns:w10="urn:schemas-microsoft-com:office:word" xmlns:w="http://schemas.openxmlformats.org/wordprocessingml/2006/main" xmlns:w14="http://schemas.microsoft.com/office/word/2010/wordml" xmlns:w15="http://schemas.microsoft.com/office/word/2012/wordml" xmlns:w16cex="http://schemas.microsoft.com/office/word/2018/wordml/cex" xmlns:w16cid="http://schemas.microsoft.com/office/word/2016/wordml/cid" xmlns:w16="http://schemas.microsoft.com/office/word/2018/wordml" xmlns:w16sdtdh="http://schemas.microsoft.com/office/word/2020/wordml/sdtdatahash" xmlns:w16se="http://schemas.microsoft.com/office/word/2015/wordml/symex" xmlns:wpg="http://schemas.microsoft.com/office/word/2010/wordprocessingGroup" xmlns:wpi="http://schemas.microsoft.com/office/word/2010/wordprocessingInk" xmlns:wne="http://schemas.microsoft.com/office/word/2006/wordml" xmlns:wps="http://schemas.microsoft.com/office/word/2010/wordprocessingShape" mc:Ignorable="w14 w15 w16se w16cid w16 w16cex w16sdtdh wp14">
+<w:hdr xmlns:wpc="http://schemas.microsoft.com/office/word/2010/wordprocessingCanvas" xmlns:cx="http://schemas.microsoft.com/office/drawing/2014/chartex" xmlns:cx1="http://schemas.microsoft.com/office/drawing/2015/9/8/chartex" xmlns:cx2="http://schemas.microsoft.com/office/drawing/2015/10/21/chartex" xmlns:cx3="http://schemas.microsoft.com/office/drawing/2016/5/9/chartex" xmlns:cx4="http://schemas.microsoft.com/office/drawing/2016/5/10/chartex" xmlns:cx5="http://schemas.microsoft.com/office/drawing/2016/5/11/chartex" xmlns:cx6="http://schemas.microsoft.com/office/drawing/2016/5/12/chartex" xmlns:cx7="http://schemas.microsoft.com/office/drawing/2016/5/13/chartex" xmlns:cx8="http://schemas.microsoft.com/office/drawing/2016/5/14/chartex" xmlns:mc="http://schemas.openxmlformats.org/markup-compatibility/2006" xmlns:aink="http://schemas.microsoft.com/office/drawing/2016/ink" xmlns:am3d="http://schemas.microsoft.com/office/drawing/2017/model3d" xmlns:o="urn:schemas-microsoft-com:office:office" xmlns:oel="http://schemas.microsoft.com/office/2019/extlst" xmlns:r="http://schemas.openxmlformats.org/officeDocument/2006/relationships" xmlns:m="http://schemas.openxmlformats.org/officeDocument/2006/math" xmlns:v="urn:schemas-microsoft-com:vml" xmlns:wp14="http://schemas.microsoft.com/office/word/2010/wordprocessingDrawing" xmlns:wp="http://schemas.openxmlformats.org/drawingml/2006/wordprocessingDrawing" xmlns:w10="urn:schemas-microsoft-com:office:word" xmlns:w="http://schemas.openxmlformats.org/wordprocessingml/2006/main" xmlns:w14="http://schemas.microsoft.com/office/word/2010/wordml" xmlns:w15="http://schemas.microsoft.com/office/word/2012/wordml" xmlns:w16cex="http://schemas.microsoft.com/office/word/2018/wordml/cex" xmlns:w16cid="http://schemas.microsoft.com/office/word/2016/wordml/cid" xmlns:w16="http://schemas.microsoft.com/office/word/2018/wordml" xmlns:w16du="http://schemas.microsoft.com/office/word/2023/wordml/word16du" xmlns:w16sdtdh="http://schemas.microsoft.com/office/word/2020/wordml/sdtdatahash" xmlns:w16sdtfl="http://schemas.microsoft.com/office/word/2024/wordml/sdtformatlock" xmlns:w16se="http://schemas.microsoft.com/office/word/2015/wordml/symex" xmlns:wpg="http://schemas.microsoft.com/office/word/2010/wordprocessingGroup" xmlns:wpi="http://schemas.microsoft.com/office/word/2010/wordprocessingInk" xmlns:wne="http://schemas.microsoft.com/office/word/2006/wordml" xmlns:wps="http://schemas.microsoft.com/office/word/2010/wordprocessingShape" mc:Ignorable="w14 w15 w16se w16cid w16 w16cex w16sdtdh w16sdtfl w16du wp14">
   <w:p/>
 </w:hdr>
 </file>
 
 <file path=word/header20.xml><?xml version="1.0" encoding="utf-8"?>
-<w:hdr xmlns:wpc="http://schemas.microsoft.com/office/word/2010/wordprocessingCanvas" xmlns:cx="http://schemas.microsoft.com/office/drawing/2014/chartex" xmlns:cx1="http://schemas.microsoft.com/office/drawing/2015/9/8/chartex" xmlns:cx2="http://schemas.microsoft.com/office/drawing/2015/10/21/chartex" xmlns:cx3="http://schemas.microsoft.com/office/drawing/2016/5/9/chartex" xmlns:cx4="http://schemas.microsoft.com/office/drawing/2016/5/10/chartex" xmlns:cx5="http://schemas.microsoft.com/office/drawing/2016/5/11/chartex" xmlns:cx6="http://schemas.microsoft.com/office/drawing/2016/5/12/chartex" xmlns:cx7="http://schemas.microsoft.com/office/drawing/2016/5/13/chartex" xmlns:cx8="http://schemas.microsoft.com/office/drawing/2016/5/14/chartex" xmlns:mc="http://schemas.openxmlformats.org/markup-compatibility/2006" xmlns:aink="http://schemas.microsoft.com/office/drawing/2016/ink" xmlns:am3d="http://schemas.microsoft.com/office/drawing/2017/model3d" xmlns:o="urn:schemas-microsoft-com:office:office" xmlns:oel="http://schemas.microsoft.com/office/2019/extlst" xmlns:r="http://schemas.openxmlformats.org/officeDocument/2006/relationships" xmlns:m="http://schemas.openxmlformats.org/officeDocument/2006/math" xmlns:v="urn:schemas-microsoft-com:vml" xmlns:wp14="http://schemas.microsoft.com/office/word/2010/wordprocessingDrawing" xmlns:wp="http://schemas.openxmlformats.org/drawingml/2006/wordprocessingDrawing" xmlns:w10="urn:schemas-microsoft-com:office:word" xmlns:w="http://schemas.openxmlformats.org/wordprocessingml/2006/main" xmlns:w14="http://schemas.microsoft.com/office/word/2010/wordml" xmlns:w15="http://schemas.microsoft.com/office/word/2012/wordml" xmlns:w16cex="http://schemas.microsoft.com/office/word/2018/wordml/cex" xmlns:w16cid="http://schemas.microsoft.com/office/word/2016/wordml/cid" xmlns:w16="http://schemas.microsoft.com/office/word/2018/wordml" xmlns:w16sdtdh="http://schemas.microsoft.com/office/word/2020/wordml/sdtdatahash" xmlns:w16se="http://schemas.microsoft.com/office/word/2015/wordml/symex" xmlns:wpg="http://schemas.microsoft.com/office/word/2010/wordprocessingGroup" xmlns:wpi="http://schemas.microsoft.com/office/word/2010/wordprocessingInk" xmlns:wne="http://schemas.microsoft.com/office/word/2006/wordml" xmlns:wps="http://schemas.microsoft.com/office/word/2010/wordprocessingShape" mc:Ignorable="w14 w15 w16se w16cid w16 w16cex w16sdtdh wp14">
+<w:hdr xmlns:wpc="http://schemas.microsoft.com/office/word/2010/wordprocessingCanvas" xmlns:cx="http://schemas.microsoft.com/office/drawing/2014/chartex" xmlns:cx1="http://schemas.microsoft.com/office/drawing/2015/9/8/chartex" xmlns:cx2="http://schemas.microsoft.com/office/drawing/2015/10/21/chartex" xmlns:cx3="http://schemas.microsoft.com/office/drawing/2016/5/9/chartex" xmlns:cx4="http://schemas.microsoft.com/office/drawing/2016/5/10/chartex" xmlns:cx5="http://schemas.microsoft.com/office/drawing/2016/5/11/chartex" xmlns:cx6="http://schemas.microsoft.com/office/drawing/2016/5/12/chartex" xmlns:cx7="http://schemas.microsoft.com/office/drawing/2016/5/13/chartex" xmlns:cx8="http://schemas.microsoft.com/office/drawing/2016/5/14/chartex" xmlns:mc="http://schemas.openxmlformats.org/markup-compatibility/2006" xmlns:aink="http://schemas.microsoft.com/office/drawing/2016/ink" xmlns:am3d="http://schemas.microsoft.com/office/drawing/2017/model3d" xmlns:o="urn:schemas-microsoft-com:office:office" xmlns:oel="http://schemas.microsoft.com/office/2019/extlst" xmlns:r="http://schemas.openxmlformats.org/officeDocument/2006/relationships" xmlns:m="http://schemas.openxmlformats.org/officeDocument/2006/math" xmlns:v="urn:schemas-microsoft-com:vml" xmlns:wp14="http://schemas.microsoft.com/office/word/2010/wordprocessingDrawing" xmlns:wp="http://schemas.openxmlformats.org/drawingml/2006/wordprocessingDrawing" xmlns:w10="urn:schemas-microsoft-com:office:word" xmlns:w="http://schemas.openxmlformats.org/wordprocessingml/2006/main" xmlns:w14="http://schemas.microsoft.com/office/word/2010/wordml" xmlns:w15="http://schemas.microsoft.com/office/word/2012/wordml" xmlns:w16cex="http://schemas.microsoft.com/office/word/2018/wordml/cex" xmlns:w16cid="http://schemas.microsoft.com/office/word/2016/wordml/cid" xmlns:w16="http://schemas.microsoft.com/office/word/2018/wordml" xmlns:w16du="http://schemas.microsoft.com/office/word/2023/wordml/word16du" xmlns:w16sdtdh="http://schemas.microsoft.com/office/word/2020/wordml/sdtdatahash" xmlns:w16sdtfl="http://schemas.microsoft.com/office/word/2024/wordml/sdtformatlock" xmlns:w16se="http://schemas.microsoft.com/office/word/2015/wordml/symex" xmlns:wpg="http://schemas.microsoft.com/office/word/2010/wordprocessingGroup" xmlns:wpi="http://schemas.microsoft.com/office/word/2010/wordprocessingInk" xmlns:wne="http://schemas.microsoft.com/office/word/2006/wordml" xmlns:wps="http://schemas.microsoft.com/office/word/2010/wordprocessingShape" mc:Ignorable="w14 w15 w16se w16cid w16 w16cex w16sdtdh w16sdtfl w16du wp14">
   <w:p>
     <w:pPr>
-      <w:pStyle w:val="Header"/>
+      <w:pStyle w:val="Cabealho"/>
     </w:pPr>
   </w:p>
 </w:hdr>
 </file>
 
 <file path=word/header21.xml><?xml version="1.0" encoding="utf-8"?>
-<w:hdr xmlns:wpc="http://schemas.microsoft.com/office/word/2010/wordprocessingCanvas" xmlns:cx="http://schemas.microsoft.com/office/drawing/2014/chartex" xmlns:cx1="http://schemas.microsoft.com/office/drawing/2015/9/8/chartex" xmlns:cx2="http://schemas.microsoft.com/office/drawing/2015/10/21/chartex" xmlns:cx3="http://schemas.microsoft.com/office/drawing/2016/5/9/chartex" xmlns:cx4="http://schemas.microsoft.com/office/drawing/2016/5/10/chartex" xmlns:cx5="http://schemas.microsoft.com/office/drawing/2016/5/11/chartex" xmlns:cx6="http://schemas.microsoft.com/office/drawing/2016/5/12/chartex" xmlns:cx7="http://schemas.microsoft.com/office/drawing/2016/5/13/chartex" xmlns:cx8="http://schemas.microsoft.com/office/drawing/2016/5/14/chartex" xmlns:mc="http://schemas.openxmlformats.org/markup-compatibility/2006" xmlns:aink="http://schemas.microsoft.com/office/drawing/2016/ink" xmlns:am3d="http://schemas.microsoft.com/office/drawing/2017/model3d" xmlns:o="urn:schemas-microsoft-com:office:office" xmlns:oel="http://schemas.microsoft.com/office/2019/extlst" xmlns:r="http://schemas.openxmlformats.org/officeDocument/2006/relationships" xmlns:m="http://schemas.openxmlformats.org/officeDocument/2006/math" xmlns:v="urn:schemas-microsoft-com:vml" xmlns:wp14="http://schemas.microsoft.com/office/word/2010/wordprocessingDrawing" xmlns:wp="http://schemas.openxmlformats.org/drawingml/2006/wordprocessingDrawing" xmlns:w10="urn:schemas-microsoft-com:office:word" xmlns:w="http://schemas.openxmlformats.org/wordprocessingml/2006/main" xmlns:w14="http://schemas.microsoft.com/office/word/2010/wordml" xmlns:w15="http://schemas.microsoft.com/office/word/2012/wordml" xmlns:w16cex="http://schemas.microsoft.com/office/word/2018/wordml/cex" xmlns:w16cid="http://schemas.microsoft.com/office/word/2016/wordml/cid" xmlns:w16="http://schemas.microsoft.com/office/word/2018/wordml" xmlns:w16sdtdh="http://schemas.microsoft.com/office/word/2020/wordml/sdtdatahash" xmlns:w16se="http://schemas.microsoft.com/office/word/2015/wordml/symex" xmlns:wpg="http://schemas.microsoft.com/office/word/2010/wordprocessingGroup" xmlns:wpi="http://schemas.microsoft.com/office/word/2010/wordprocessingInk" xmlns:wne="http://schemas.microsoft.com/office/word/2006/wordml" xmlns:wps="http://schemas.microsoft.com/office/word/2010/wordprocessingShape" mc:Ignorable="w14 w15 w16se w16cid w16 w16cex w16sdtdh wp14">
+<w:hdr xmlns:wpc="http://schemas.microsoft.com/office/word/2010/wordprocessingCanvas" xmlns:cx="http://schemas.microsoft.com/office/drawing/2014/chartex" xmlns:cx1="http://schemas.microsoft.com/office/drawing/2015/9/8/chartex" xmlns:cx2="http://schemas.microsoft.com/office/drawing/2015/10/21/chartex" xmlns:cx3="http://schemas.microsoft.com/office/drawing/2016/5/9/chartex" xmlns:cx4="http://schemas.microsoft.com/office/drawing/2016/5/10/chartex" xmlns:cx5="http://schemas.microsoft.com/office/drawing/2016/5/11/chartex" xmlns:cx6="http://schemas.microsoft.com/office/drawing/2016/5/12/chartex" xmlns:cx7="http://schemas.microsoft.com/office/drawing/2016/5/13/chartex" xmlns:cx8="http://schemas.microsoft.com/office/drawing/2016/5/14/chartex" xmlns:mc="http://schemas.openxmlformats.org/markup-compatibility/2006" xmlns:aink="http://schemas.microsoft.com/office/drawing/2016/ink" xmlns:am3d="http://schemas.microsoft.com/office/drawing/2017/model3d" xmlns:o="urn:schemas-microsoft-com:office:office" xmlns:oel="http://schemas.microsoft.com/office/2019/extlst" xmlns:r="http://schemas.openxmlformats.org/officeDocument/2006/relationships" xmlns:m="http://schemas.openxmlformats.org/officeDocument/2006/math" xmlns:v="urn:schemas-microsoft-com:vml" xmlns:wp14="http://schemas.microsoft.com/office/word/2010/wordprocessingDrawing" xmlns:wp="http://schemas.openxmlformats.org/drawingml/2006/wordprocessingDrawing" xmlns:w10="urn:schemas-microsoft-com:office:word" xmlns:w="http://schemas.openxmlformats.org/wordprocessingml/2006/main" xmlns:w14="http://schemas.microsoft.com/office/word/2010/wordml" xmlns:w15="http://schemas.microsoft.com/office/word/2012/wordml" xmlns:w16cex="http://schemas.microsoft.com/office/word/2018/wordml/cex" xmlns:w16cid="http://schemas.microsoft.com/office/word/2016/wordml/cid" xmlns:w16="http://schemas.microsoft.com/office/word/2018/wordml" xmlns:w16du="http://schemas.microsoft.com/office/word/2023/wordml/word16du" xmlns:w16sdtdh="http://schemas.microsoft.com/office/word/2020/wordml/sdtdatahash" xmlns:w16sdtfl="http://schemas.microsoft.com/office/word/2024/wordml/sdtformatlock" xmlns:w16se="http://schemas.microsoft.com/office/word/2015/wordml/symex" xmlns:wpg="http://schemas.microsoft.com/office/word/2010/wordprocessingGroup" xmlns:wpi="http://schemas.microsoft.com/office/word/2010/wordprocessingInk" xmlns:wne="http://schemas.microsoft.com/office/word/2006/wordml" xmlns:wps="http://schemas.microsoft.com/office/word/2010/wordprocessingShape" mc:Ignorable="w14 w15 w16se w16cid w16 w16cex w16sdtdh w16sdtfl w16du wp14">
   <w:p/>
 </w:hdr>
 </file>
 
 <file path=word/header22.xml><?xml version="1.0" encoding="utf-8"?>
-<w:hdr xmlns:wpc="http://schemas.microsoft.com/office/word/2010/wordprocessingCanvas" xmlns:cx="http://schemas.microsoft.com/office/drawing/2014/chartex" xmlns:cx1="http://schemas.microsoft.com/office/drawing/2015/9/8/chartex" xmlns:cx2="http://schemas.microsoft.com/office/drawing/2015/10/21/chartex" xmlns:cx3="http://schemas.microsoft.com/office/drawing/2016/5/9/chartex" xmlns:cx4="http://schemas.microsoft.com/office/drawing/2016/5/10/chartex" xmlns:cx5="http://schemas.microsoft.com/office/drawing/2016/5/11/chartex" xmlns:cx6="http://schemas.microsoft.com/office/drawing/2016/5/12/chartex" xmlns:cx7="http://schemas.microsoft.com/office/drawing/2016/5/13/chartex" xmlns:cx8="http://schemas.microsoft.com/office/drawing/2016/5/14/chartex" xmlns:mc="http://schemas.openxmlformats.org/markup-compatibility/2006" xmlns:aink="http://schemas.microsoft.com/office/drawing/2016/ink" xmlns:am3d="http://schemas.microsoft.com/office/drawing/2017/model3d" xmlns:o="urn:schemas-microsoft-com:office:office" xmlns:oel="http://schemas.microsoft.com/office/2019/extlst" xmlns:r="http://schemas.openxmlformats.org/officeDocument/2006/relationships" xmlns:m="http://schemas.openxmlformats.org/officeDocument/2006/math" xmlns:v="urn:schemas-microsoft-com:vml" xmlns:wp14="http://schemas.microsoft.com/office/word/2010/wordprocessingDrawing" xmlns:wp="http://schemas.openxmlformats.org/drawingml/2006/wordprocessingDrawing" xmlns:w10="urn:schemas-microsoft-com:office:word" xmlns:w="http://schemas.openxmlformats.org/wordprocessingml/2006/main" xmlns:w14="http://schemas.microsoft.com/office/word/2010/wordml" xmlns:w15="http://schemas.microsoft.com/office/word/2012/wordml" xmlns:w16cex="http://schemas.microsoft.com/office/word/2018/wordml/cex" xmlns:w16cid="http://schemas.microsoft.com/office/word/2016/wordml/cid" xmlns:w16="http://schemas.microsoft.com/office/word/2018/wordml" xmlns:w16sdtdh="http://schemas.microsoft.com/office/word/2020/wordml/sdtdatahash" xmlns:w16se="http://schemas.microsoft.com/office/word/2015/wordml/symex" xmlns:wpg="http://schemas.microsoft.com/office/word/2010/wordprocessingGroup" xmlns:wpi="http://schemas.microsoft.com/office/word/2010/wordprocessingInk" xmlns:wne="http://schemas.microsoft.com/office/word/2006/wordml" xmlns:wps="http://schemas.microsoft.com/office/word/2010/wordprocessingShape" mc:Ignorable="w14 w15 w16se w16cid w16 w16cex w16sdtdh wp14">
+<w:hdr xmlns:wpc="http://schemas.microsoft.com/office/word/2010/wordprocessingCanvas" xmlns:cx="http://schemas.microsoft.com/office/drawing/2014/chartex" xmlns:cx1="http://schemas.microsoft.com/office/drawing/2015/9/8/chartex" xmlns:cx2="http://schemas.microsoft.com/office/drawing/2015/10/21/chartex" xmlns:cx3="http://schemas.microsoft.com/office/drawing/2016/5/9/chartex" xmlns:cx4="http://schemas.microsoft.com/office/drawing/2016/5/10/chartex" xmlns:cx5="http://schemas.microsoft.com/office/drawing/2016/5/11/chartex" xmlns:cx6="http://schemas.microsoft.com/office/drawing/2016/5/12/chartex" xmlns:cx7="http://schemas.microsoft.com/office/drawing/2016/5/13/chartex" xmlns:cx8="http://schemas.microsoft.com/office/drawing/2016/5/14/chartex" xmlns:mc="http://schemas.openxmlformats.org/markup-compatibility/2006" xmlns:aink="http://schemas.microsoft.com/office/drawing/2016/ink" xmlns:am3d="http://schemas.microsoft.com/office/drawing/2017/model3d" xmlns:o="urn:schemas-microsoft-com:office:office" xmlns:oel="http://schemas.microsoft.com/office/2019/extlst" xmlns:r="http://schemas.openxmlformats.org/officeDocument/2006/relationships" xmlns:m="http://schemas.openxmlformats.org/officeDocument/2006/math" xmlns:v="urn:schemas-microsoft-com:vml" xmlns:wp14="http://schemas.microsoft.com/office/word/2010/wordprocessingDrawing" xmlns:wp="http://schemas.openxmlformats.org/drawingml/2006/wordprocessingDrawing" xmlns:w10="urn:schemas-microsoft-com:office:word" xmlns:w="http://schemas.openxmlformats.org/wordprocessingml/2006/main" xmlns:w14="http://schemas.microsoft.com/office/word/2010/wordml" xmlns:w15="http://schemas.microsoft.com/office/word/2012/wordml" xmlns:w16cex="http://schemas.microsoft.com/office/word/2018/wordml/cex" xmlns:w16cid="http://schemas.microsoft.com/office/word/2016/wordml/cid" xmlns:w16="http://schemas.microsoft.com/office/word/2018/wordml" xmlns:w16du="http://schemas.microsoft.com/office/word/2023/wordml/word16du" xmlns:w16sdtdh="http://schemas.microsoft.com/office/word/2020/wordml/sdtdatahash" xmlns:w16sdtfl="http://schemas.microsoft.com/office/word/2024/wordml/sdtformatlock" xmlns:w16se="http://schemas.microsoft.com/office/word/2015/wordml/symex" xmlns:wpg="http://schemas.microsoft.com/office/word/2010/wordprocessingGroup" xmlns:wpi="http://schemas.microsoft.com/office/word/2010/wordprocessingInk" xmlns:wne="http://schemas.microsoft.com/office/word/2006/wordml" xmlns:wps="http://schemas.microsoft.com/office/word/2010/wordprocessingShape" mc:Ignorable="w14 w15 w16se w16cid w16 w16cex w16sdtdh w16sdtfl w16du wp14">
   <w:p>
     <w:pPr>
       <w:pStyle w:val="HeaderLeft"/>
@@ -9840,26 +10266,26 @@
 </file>
 
 <file path=word/header23.xml><?xml version="1.0" encoding="utf-8"?>
-<w:hdr xmlns:wpc="http://schemas.microsoft.com/office/word/2010/wordprocessingCanvas" xmlns:cx="http://schemas.microsoft.com/office/drawing/2014/chartex" xmlns:cx1="http://schemas.microsoft.com/office/drawing/2015/9/8/chartex" xmlns:cx2="http://schemas.microsoft.com/office/drawing/2015/10/21/chartex" xmlns:cx3="http://schemas.microsoft.com/office/drawing/2016/5/9/chartex" xmlns:cx4="http://schemas.microsoft.com/office/drawing/2016/5/10/chartex" xmlns:cx5="http://schemas.microsoft.com/office/drawing/2016/5/11/chartex" xmlns:cx6="http://schemas.microsoft.com/office/drawing/2016/5/12/chartex" xmlns:cx7="http://schemas.microsoft.com/office/drawing/2016/5/13/chartex" xmlns:cx8="http://schemas.microsoft.com/office/drawing/2016/5/14/chartex" xmlns:mc="http://schemas.openxmlformats.org/markup-compatibility/2006" xmlns:aink="http://schemas.microsoft.com/office/drawing/2016/ink" xmlns:am3d="http://schemas.microsoft.com/office/drawing/2017/model3d" xmlns:o="urn:schemas-microsoft-com:office:office" xmlns:oel="http://schemas.microsoft.com/office/2019/extlst" xmlns:r="http://schemas.openxmlformats.org/officeDocument/2006/relationships" xmlns:m="http://schemas.openxmlformats.org/officeDocument/2006/math" xmlns:v="urn:schemas-microsoft-com:vml" xmlns:wp14="http://schemas.microsoft.com/office/word/2010/wordprocessingDrawing" xmlns:wp="http://schemas.openxmlformats.org/drawingml/2006/wordprocessingDrawing" xmlns:w10="urn:schemas-microsoft-com:office:word" xmlns:w="http://schemas.openxmlformats.org/wordprocessingml/2006/main" xmlns:w14="http://schemas.microsoft.com/office/word/2010/wordml" xmlns:w15="http://schemas.microsoft.com/office/word/2012/wordml" xmlns:w16cex="http://schemas.microsoft.com/office/word/2018/wordml/cex" xmlns:w16cid="http://schemas.microsoft.com/office/word/2016/wordml/cid" xmlns:w16="http://schemas.microsoft.com/office/word/2018/wordml" xmlns:w16sdtdh="http://schemas.microsoft.com/office/word/2020/wordml/sdtdatahash" xmlns:w16se="http://schemas.microsoft.com/office/word/2015/wordml/symex" xmlns:wpg="http://schemas.microsoft.com/office/word/2010/wordprocessingGroup" xmlns:wpi="http://schemas.microsoft.com/office/word/2010/wordprocessingInk" xmlns:wne="http://schemas.microsoft.com/office/word/2006/wordml" xmlns:wps="http://schemas.microsoft.com/office/word/2010/wordprocessingShape" mc:Ignorable="w14 w15 w16se w16cid w16 w16cex w16sdtdh wp14">
+<w:hdr xmlns:wpc="http://schemas.microsoft.com/office/word/2010/wordprocessingCanvas" xmlns:cx="http://schemas.microsoft.com/office/drawing/2014/chartex" xmlns:cx1="http://schemas.microsoft.com/office/drawing/2015/9/8/chartex" xmlns:cx2="http://schemas.microsoft.com/office/drawing/2015/10/21/chartex" xmlns:cx3="http://schemas.microsoft.com/office/drawing/2016/5/9/chartex" xmlns:cx4="http://schemas.microsoft.com/office/drawing/2016/5/10/chartex" xmlns:cx5="http://schemas.microsoft.com/office/drawing/2016/5/11/chartex" xmlns:cx6="http://schemas.microsoft.com/office/drawing/2016/5/12/chartex" xmlns:cx7="http://schemas.microsoft.com/office/drawing/2016/5/13/chartex" xmlns:cx8="http://schemas.microsoft.com/office/drawing/2016/5/14/chartex" xmlns:mc="http://schemas.openxmlformats.org/markup-compatibility/2006" xmlns:aink="http://schemas.microsoft.com/office/drawing/2016/ink" xmlns:am3d="http://schemas.microsoft.com/office/drawing/2017/model3d" xmlns:o="urn:schemas-microsoft-com:office:office" xmlns:oel="http://schemas.microsoft.com/office/2019/extlst" xmlns:r="http://schemas.openxmlformats.org/officeDocument/2006/relationships" xmlns:m="http://schemas.openxmlformats.org/officeDocument/2006/math" xmlns:v="urn:schemas-microsoft-com:vml" xmlns:wp14="http://schemas.microsoft.com/office/word/2010/wordprocessingDrawing" xmlns:wp="http://schemas.openxmlformats.org/drawingml/2006/wordprocessingDrawing" xmlns:w10="urn:schemas-microsoft-com:office:word" xmlns:w="http://schemas.openxmlformats.org/wordprocessingml/2006/main" xmlns:w14="http://schemas.microsoft.com/office/word/2010/wordml" xmlns:w15="http://schemas.microsoft.com/office/word/2012/wordml" xmlns:w16cex="http://schemas.microsoft.com/office/word/2018/wordml/cex" xmlns:w16cid="http://schemas.microsoft.com/office/word/2016/wordml/cid" xmlns:w16="http://schemas.microsoft.com/office/word/2018/wordml" xmlns:w16du="http://schemas.microsoft.com/office/word/2023/wordml/word16du" xmlns:w16sdtdh="http://schemas.microsoft.com/office/word/2020/wordml/sdtdatahash" xmlns:w16sdtfl="http://schemas.microsoft.com/office/word/2024/wordml/sdtformatlock" xmlns:w16se="http://schemas.microsoft.com/office/word/2015/wordml/symex" xmlns:wpg="http://schemas.microsoft.com/office/word/2010/wordprocessingGroup" xmlns:wpi="http://schemas.microsoft.com/office/word/2010/wordprocessingInk" xmlns:wne="http://schemas.microsoft.com/office/word/2006/wordml" xmlns:wps="http://schemas.microsoft.com/office/word/2010/wordprocessingShape" mc:Ignorable="w14 w15 w16se w16cid w16 w16cex w16sdtdh w16sdtfl w16du wp14">
   <w:p>
     <w:pPr>
-      <w:pStyle w:val="Header"/>
+      <w:pStyle w:val="Cabealho"/>
     </w:pPr>
   </w:p>
 </w:hdr>
 </file>
 
 <file path=word/header24.xml><?xml version="1.0" encoding="utf-8"?>
-<w:hdr xmlns:wpc="http://schemas.microsoft.com/office/word/2010/wordprocessingCanvas" xmlns:cx="http://schemas.microsoft.com/office/drawing/2014/chartex" xmlns:cx1="http://schemas.microsoft.com/office/drawing/2015/9/8/chartex" xmlns:cx2="http://schemas.microsoft.com/office/drawing/2015/10/21/chartex" xmlns:cx3="http://schemas.microsoft.com/office/drawing/2016/5/9/chartex" xmlns:cx4="http://schemas.microsoft.com/office/drawing/2016/5/10/chartex" xmlns:cx5="http://schemas.microsoft.com/office/drawing/2016/5/11/chartex" xmlns:cx6="http://schemas.microsoft.com/office/drawing/2016/5/12/chartex" xmlns:cx7="http://schemas.microsoft.com/office/drawing/2016/5/13/chartex" xmlns:cx8="http://schemas.microsoft.com/office/drawing/2016/5/14/chartex" xmlns:mc="http://schemas.openxmlformats.org/markup-compatibility/2006" xmlns:aink="http://schemas.microsoft.com/office/drawing/2016/ink" xmlns:am3d="http://schemas.microsoft.com/office/drawing/2017/model3d" xmlns:o="urn:schemas-microsoft-com:office:office" xmlns:oel="http://schemas.microsoft.com/office/2019/extlst" xmlns:r="http://schemas.openxmlformats.org/officeDocument/2006/relationships" xmlns:m="http://schemas.openxmlformats.org/officeDocument/2006/math" xmlns:v="urn:schemas-microsoft-com:vml" xmlns:wp14="http://schemas.microsoft.com/office/word/2010/wordprocessingDrawing" xmlns:wp="http://schemas.openxmlformats.org/drawingml/2006/wordprocessingDrawing" xmlns:w10="urn:schemas-microsoft-com:office:word" xmlns:w="http://schemas.openxmlformats.org/wordprocessingml/2006/main" xmlns:w14="http://schemas.microsoft.com/office/word/2010/wordml" xmlns:w15="http://schemas.microsoft.com/office/word/2012/wordml" xmlns:w16cex="http://schemas.microsoft.com/office/word/2018/wordml/cex" xmlns:w16cid="http://schemas.microsoft.com/office/word/2016/wordml/cid" xmlns:w16="http://schemas.microsoft.com/office/word/2018/wordml" xmlns:w16sdtdh="http://schemas.microsoft.com/office/word/2020/wordml/sdtdatahash" xmlns:w16se="http://schemas.microsoft.com/office/word/2015/wordml/symex" xmlns:wpg="http://schemas.microsoft.com/office/word/2010/wordprocessingGroup" xmlns:wpi="http://schemas.microsoft.com/office/word/2010/wordprocessingInk" xmlns:wne="http://schemas.microsoft.com/office/word/2006/wordml" xmlns:wps="http://schemas.microsoft.com/office/word/2010/wordprocessingShape" mc:Ignorable="w14 w15 w16se w16cid w16 w16cex w16sdtdh wp14">
+<w:hdr xmlns:wpc="http://schemas.microsoft.com/office/word/2010/wordprocessingCanvas" xmlns:cx="http://schemas.microsoft.com/office/drawing/2014/chartex" xmlns:cx1="http://schemas.microsoft.com/office/drawing/2015/9/8/chartex" xmlns:cx2="http://schemas.microsoft.com/office/drawing/2015/10/21/chartex" xmlns:cx3="http://schemas.microsoft.com/office/drawing/2016/5/9/chartex" xmlns:cx4="http://schemas.microsoft.com/office/drawing/2016/5/10/chartex" xmlns:cx5="http://schemas.microsoft.com/office/drawing/2016/5/11/chartex" xmlns:cx6="http://schemas.microsoft.com/office/drawing/2016/5/12/chartex" xmlns:cx7="http://schemas.microsoft.com/office/drawing/2016/5/13/chartex" xmlns:cx8="http://schemas.microsoft.com/office/drawing/2016/5/14/chartex" xmlns:mc="http://schemas.openxmlformats.org/markup-compatibility/2006" xmlns:aink="http://schemas.microsoft.com/office/drawing/2016/ink" xmlns:am3d="http://schemas.microsoft.com/office/drawing/2017/model3d" xmlns:o="urn:schemas-microsoft-com:office:office" xmlns:oel="http://schemas.microsoft.com/office/2019/extlst" xmlns:r="http://schemas.openxmlformats.org/officeDocument/2006/relationships" xmlns:m="http://schemas.openxmlformats.org/officeDocument/2006/math" xmlns:v="urn:schemas-microsoft-com:vml" xmlns:wp14="http://schemas.microsoft.com/office/word/2010/wordprocessingDrawing" xmlns:wp="http://schemas.openxmlformats.org/drawingml/2006/wordprocessingDrawing" xmlns:w10="urn:schemas-microsoft-com:office:word" xmlns:w="http://schemas.openxmlformats.org/wordprocessingml/2006/main" xmlns:w14="http://schemas.microsoft.com/office/word/2010/wordml" xmlns:w15="http://schemas.microsoft.com/office/word/2012/wordml" xmlns:w16cex="http://schemas.microsoft.com/office/word/2018/wordml/cex" xmlns:w16cid="http://schemas.microsoft.com/office/word/2016/wordml/cid" xmlns:w16="http://schemas.microsoft.com/office/word/2018/wordml" xmlns:w16du="http://schemas.microsoft.com/office/word/2023/wordml/word16du" xmlns:w16sdtdh="http://schemas.microsoft.com/office/word/2020/wordml/sdtdatahash" xmlns:w16sdtfl="http://schemas.microsoft.com/office/word/2024/wordml/sdtformatlock" xmlns:w16se="http://schemas.microsoft.com/office/word/2015/wordml/symex" xmlns:wpg="http://schemas.microsoft.com/office/word/2010/wordprocessingGroup" xmlns:wpi="http://schemas.microsoft.com/office/word/2010/wordprocessingInk" xmlns:wne="http://schemas.microsoft.com/office/word/2006/wordml" xmlns:wps="http://schemas.microsoft.com/office/word/2010/wordprocessingShape" mc:Ignorable="w14 w15 w16se w16cid w16 w16cex w16sdtdh w16sdtfl w16du wp14">
   <w:p/>
 </w:hdr>
 </file>
 
 <file path=word/header25.xml><?xml version="1.0" encoding="utf-8"?>
-<w:hdr xmlns:wpc="http://schemas.microsoft.com/office/word/2010/wordprocessingCanvas" xmlns:cx="http://schemas.microsoft.com/office/drawing/2014/chartex" xmlns:cx1="http://schemas.microsoft.com/office/drawing/2015/9/8/chartex" xmlns:cx2="http://schemas.microsoft.com/office/drawing/2015/10/21/chartex" xmlns:cx3="http://schemas.microsoft.com/office/drawing/2016/5/9/chartex" xmlns:cx4="http://schemas.microsoft.com/office/drawing/2016/5/10/chartex" xmlns:cx5="http://schemas.microsoft.com/office/drawing/2016/5/11/chartex" xmlns:cx6="http://schemas.microsoft.com/office/drawing/2016/5/12/chartex" xmlns:cx7="http://schemas.microsoft.com/office/drawing/2016/5/13/chartex" xmlns:cx8="http://schemas.microsoft.com/office/drawing/2016/5/14/chartex" xmlns:mc="http://schemas.openxmlformats.org/markup-compatibility/2006" xmlns:aink="http://schemas.microsoft.com/office/drawing/2016/ink" xmlns:am3d="http://schemas.microsoft.com/office/drawing/2017/model3d" xmlns:o="urn:schemas-microsoft-com:office:office" xmlns:oel="http://schemas.microsoft.com/office/2019/extlst" xmlns:r="http://schemas.openxmlformats.org/officeDocument/2006/relationships" xmlns:m="http://schemas.openxmlformats.org/officeDocument/2006/math" xmlns:v="urn:schemas-microsoft-com:vml" xmlns:wp14="http://schemas.microsoft.com/office/word/2010/wordprocessingDrawing" xmlns:wp="http://schemas.openxmlformats.org/drawingml/2006/wordprocessingDrawing" xmlns:w10="urn:schemas-microsoft-com:office:word" xmlns:w="http://schemas.openxmlformats.org/wordprocessingml/2006/main" xmlns:w14="http://schemas.microsoft.com/office/word/2010/wordml" xmlns:w15="http://schemas.microsoft.com/office/word/2012/wordml" xmlns:w16cex="http://schemas.microsoft.com/office/word/2018/wordml/cex" xmlns:w16cid="http://schemas.microsoft.com/office/word/2016/wordml/cid" xmlns:w16="http://schemas.microsoft.com/office/word/2018/wordml" xmlns:w16sdtdh="http://schemas.microsoft.com/office/word/2020/wordml/sdtdatahash" xmlns:w16se="http://schemas.microsoft.com/office/word/2015/wordml/symex" xmlns:wpg="http://schemas.microsoft.com/office/word/2010/wordprocessingGroup" xmlns:wpi="http://schemas.microsoft.com/office/word/2010/wordprocessingInk" xmlns:wne="http://schemas.microsoft.com/office/word/2006/wordml" xmlns:wps="http://schemas.microsoft.com/office/word/2010/wordprocessingShape" mc:Ignorable="w14 w15 w16se w16cid w16 w16cex w16sdtdh wp14">
+<w:hdr xmlns:wpc="http://schemas.microsoft.com/office/word/2010/wordprocessingCanvas" xmlns:cx="http://schemas.microsoft.com/office/drawing/2014/chartex" xmlns:cx1="http://schemas.microsoft.com/office/drawing/2015/9/8/chartex" xmlns:cx2="http://schemas.microsoft.com/office/drawing/2015/10/21/chartex" xmlns:cx3="http://schemas.microsoft.com/office/drawing/2016/5/9/chartex" xmlns:cx4="http://schemas.microsoft.com/office/drawing/2016/5/10/chartex" xmlns:cx5="http://schemas.microsoft.com/office/drawing/2016/5/11/chartex" xmlns:cx6="http://schemas.microsoft.com/office/drawing/2016/5/12/chartex" xmlns:cx7="http://schemas.microsoft.com/office/drawing/2016/5/13/chartex" xmlns:cx8="http://schemas.microsoft.com/office/drawing/2016/5/14/chartex" xmlns:mc="http://schemas.openxmlformats.org/markup-compatibility/2006" xmlns:aink="http://schemas.microsoft.com/office/drawing/2016/ink" xmlns:am3d="http://schemas.microsoft.com/office/drawing/2017/model3d" xmlns:o="urn:schemas-microsoft-com:office:office" xmlns:oel="http://schemas.microsoft.com/office/2019/extlst" xmlns:r="http://schemas.openxmlformats.org/officeDocument/2006/relationships" xmlns:m="http://schemas.openxmlformats.org/officeDocument/2006/math" xmlns:v="urn:schemas-microsoft-com:vml" xmlns:wp14="http://schemas.microsoft.com/office/word/2010/wordprocessingDrawing" xmlns:wp="http://schemas.openxmlformats.org/drawingml/2006/wordprocessingDrawing" xmlns:w10="urn:schemas-microsoft-com:office:word" xmlns:w="http://schemas.openxmlformats.org/wordprocessingml/2006/main" xmlns:w14="http://schemas.microsoft.com/office/word/2010/wordml" xmlns:w15="http://schemas.microsoft.com/office/word/2012/wordml" xmlns:w16cex="http://schemas.microsoft.com/office/word/2018/wordml/cex" xmlns:w16cid="http://schemas.microsoft.com/office/word/2016/wordml/cid" xmlns:w16="http://schemas.microsoft.com/office/word/2018/wordml" xmlns:w16du="http://schemas.microsoft.com/office/word/2023/wordml/word16du" xmlns:w16sdtdh="http://schemas.microsoft.com/office/word/2020/wordml/sdtdatahash" xmlns:w16sdtfl="http://schemas.microsoft.com/office/word/2024/wordml/sdtformatlock" xmlns:w16se="http://schemas.microsoft.com/office/word/2015/wordml/symex" xmlns:wpg="http://schemas.microsoft.com/office/word/2010/wordprocessingGroup" xmlns:wpi="http://schemas.microsoft.com/office/word/2010/wordprocessingInk" xmlns:wne="http://schemas.microsoft.com/office/word/2006/wordml" xmlns:wps="http://schemas.microsoft.com/office/word/2010/wordprocessingShape" mc:Ignorable="w14 w15 w16se w16cid w16 w16cex w16sdtdh w16sdtfl w16du wp14">
   <w:p>
     <w:pPr>
-      <w:pStyle w:val="Header"/>
+      <w:pStyle w:val="Cabealho"/>
       <w:pBdr>
         <w:top w:val="none" w:sz="0" w:space="0" w:color="000000"/>
         <w:left w:val="none" w:sz="0" w:space="0" w:color="000000"/>
@@ -9875,10 +10301,10 @@
 </file>
 
 <file path=word/header26.xml><?xml version="1.0" encoding="utf-8"?>
-<w:hdr xmlns:wpc="http://schemas.microsoft.com/office/word/2010/wordprocessingCanvas" xmlns:cx="http://schemas.microsoft.com/office/drawing/2014/chartex" xmlns:cx1="http://schemas.microsoft.com/office/drawing/2015/9/8/chartex" xmlns:cx2="http://schemas.microsoft.com/office/drawing/2015/10/21/chartex" xmlns:cx3="http://schemas.microsoft.com/office/drawing/2016/5/9/chartex" xmlns:cx4="http://schemas.microsoft.com/office/drawing/2016/5/10/chartex" xmlns:cx5="http://schemas.microsoft.com/office/drawing/2016/5/11/chartex" xmlns:cx6="http://schemas.microsoft.com/office/drawing/2016/5/12/chartex" xmlns:cx7="http://schemas.microsoft.com/office/drawing/2016/5/13/chartex" xmlns:cx8="http://schemas.microsoft.com/office/drawing/2016/5/14/chartex" xmlns:mc="http://schemas.openxmlformats.org/markup-compatibility/2006" xmlns:aink="http://schemas.microsoft.com/office/drawing/2016/ink" xmlns:am3d="http://schemas.microsoft.com/office/drawing/2017/model3d" xmlns:o="urn:schemas-microsoft-com:office:office" xmlns:oel="http://schemas.microsoft.com/office/2019/extlst" xmlns:r="http://schemas.openxmlformats.org/officeDocument/2006/relationships" xmlns:m="http://schemas.openxmlformats.org/officeDocument/2006/math" xmlns:v="urn:schemas-microsoft-com:vml" xmlns:wp14="http://schemas.microsoft.com/office/word/2010/wordprocessingDrawing" xmlns:wp="http://schemas.openxmlformats.org/drawingml/2006/wordprocessingDrawing" xmlns:w10="urn:schemas-microsoft-com:office:word" xmlns:w="http://schemas.openxmlformats.org/wordprocessingml/2006/main" xmlns:w14="http://schemas.microsoft.com/office/word/2010/wordml" xmlns:w15="http://schemas.microsoft.com/office/word/2012/wordml" xmlns:w16cex="http://schemas.microsoft.com/office/word/2018/wordml/cex" xmlns:w16cid="http://schemas.microsoft.com/office/word/2016/wordml/cid" xmlns:w16="http://schemas.microsoft.com/office/word/2018/wordml" xmlns:w16sdtdh="http://schemas.microsoft.com/office/word/2020/wordml/sdtdatahash" xmlns:w16se="http://schemas.microsoft.com/office/word/2015/wordml/symex" xmlns:wpg="http://schemas.microsoft.com/office/word/2010/wordprocessingGroup" xmlns:wpi="http://schemas.microsoft.com/office/word/2010/wordprocessingInk" xmlns:wne="http://schemas.microsoft.com/office/word/2006/wordml" xmlns:wps="http://schemas.microsoft.com/office/word/2010/wordprocessingShape" mc:Ignorable="w14 w15 w16se w16cid w16 w16cex w16sdtdh wp14">
+<w:hdr xmlns:wpc="http://schemas.microsoft.com/office/word/2010/wordprocessingCanvas" xmlns:cx="http://schemas.microsoft.com/office/drawing/2014/chartex" xmlns:cx1="http://schemas.microsoft.com/office/drawing/2015/9/8/chartex" xmlns:cx2="http://schemas.microsoft.com/office/drawing/2015/10/21/chartex" xmlns:cx3="http://schemas.microsoft.com/office/drawing/2016/5/9/chartex" xmlns:cx4="http://schemas.microsoft.com/office/drawing/2016/5/10/chartex" xmlns:cx5="http://schemas.microsoft.com/office/drawing/2016/5/11/chartex" xmlns:cx6="http://schemas.microsoft.com/office/drawing/2016/5/12/chartex" xmlns:cx7="http://schemas.microsoft.com/office/drawing/2016/5/13/chartex" xmlns:cx8="http://schemas.microsoft.com/office/drawing/2016/5/14/chartex" xmlns:mc="http://schemas.openxmlformats.org/markup-compatibility/2006" xmlns:aink="http://schemas.microsoft.com/office/drawing/2016/ink" xmlns:am3d="http://schemas.microsoft.com/office/drawing/2017/model3d" xmlns:o="urn:schemas-microsoft-com:office:office" xmlns:oel="http://schemas.microsoft.com/office/2019/extlst" xmlns:r="http://schemas.openxmlformats.org/officeDocument/2006/relationships" xmlns:m="http://schemas.openxmlformats.org/officeDocument/2006/math" xmlns:v="urn:schemas-microsoft-com:vml" xmlns:wp14="http://schemas.microsoft.com/office/word/2010/wordprocessingDrawing" xmlns:wp="http://schemas.openxmlformats.org/drawingml/2006/wordprocessingDrawing" xmlns:w10="urn:schemas-microsoft-com:office:word" xmlns:w="http://schemas.openxmlformats.org/wordprocessingml/2006/main" xmlns:w14="http://schemas.microsoft.com/office/word/2010/wordml" xmlns:w15="http://schemas.microsoft.com/office/word/2012/wordml" xmlns:w16cex="http://schemas.microsoft.com/office/word/2018/wordml/cex" xmlns:w16cid="http://schemas.microsoft.com/office/word/2016/wordml/cid" xmlns:w16="http://schemas.microsoft.com/office/word/2018/wordml" xmlns:w16du="http://schemas.microsoft.com/office/word/2023/wordml/word16du" xmlns:w16sdtdh="http://schemas.microsoft.com/office/word/2020/wordml/sdtdatahash" xmlns:w16sdtfl="http://schemas.microsoft.com/office/word/2024/wordml/sdtformatlock" xmlns:w16se="http://schemas.microsoft.com/office/word/2015/wordml/symex" xmlns:wpg="http://schemas.microsoft.com/office/word/2010/wordprocessingGroup" xmlns:wpi="http://schemas.microsoft.com/office/word/2010/wordprocessingInk" xmlns:wne="http://schemas.microsoft.com/office/word/2006/wordml" xmlns:wps="http://schemas.microsoft.com/office/word/2010/wordprocessingShape" mc:Ignorable="w14 w15 w16se w16cid w16 w16cex w16sdtdh w16sdtfl w16du wp14">
   <w:p>
     <w:pPr>
-      <w:pStyle w:val="Header"/>
+      <w:pStyle w:val="Cabealho"/>
       <w:pBdr>
         <w:top w:val="none" w:sz="0" w:space="0" w:color="000000"/>
         <w:left w:val="none" w:sz="0" w:space="0" w:color="000000"/>
@@ -9894,19 +10320,19 @@
 </file>
 
 <file path=word/header27.xml><?xml version="1.0" encoding="utf-8"?>
-<w:hdr xmlns:wpc="http://schemas.microsoft.com/office/word/2010/wordprocessingCanvas" xmlns:cx="http://schemas.microsoft.com/office/drawing/2014/chartex" xmlns:cx1="http://schemas.microsoft.com/office/drawing/2015/9/8/chartex" xmlns:cx2="http://schemas.microsoft.com/office/drawing/2015/10/21/chartex" xmlns:cx3="http://schemas.microsoft.com/office/drawing/2016/5/9/chartex" xmlns:cx4="http://schemas.microsoft.com/office/drawing/2016/5/10/chartex" xmlns:cx5="http://schemas.microsoft.com/office/drawing/2016/5/11/chartex" xmlns:cx6="http://schemas.microsoft.com/office/drawing/2016/5/12/chartex" xmlns:cx7="http://schemas.microsoft.com/office/drawing/2016/5/13/chartex" xmlns:cx8="http://schemas.microsoft.com/office/drawing/2016/5/14/chartex" xmlns:mc="http://schemas.openxmlformats.org/markup-compatibility/2006" xmlns:aink="http://schemas.microsoft.com/office/drawing/2016/ink" xmlns:am3d="http://schemas.microsoft.com/office/drawing/2017/model3d" xmlns:o="urn:schemas-microsoft-com:office:office" xmlns:oel="http://schemas.microsoft.com/office/2019/extlst" xmlns:r="http://schemas.openxmlformats.org/officeDocument/2006/relationships" xmlns:m="http://schemas.openxmlformats.org/officeDocument/2006/math" xmlns:v="urn:schemas-microsoft-com:vml" xmlns:wp14="http://schemas.microsoft.com/office/word/2010/wordprocessingDrawing" xmlns:wp="http://schemas.openxmlformats.org/drawingml/2006/wordprocessingDrawing" xmlns:w10="urn:schemas-microsoft-com:office:word" xmlns:w="http://schemas.openxmlformats.org/wordprocessingml/2006/main" xmlns:w14="http://schemas.microsoft.com/office/word/2010/wordml" xmlns:w15="http://schemas.microsoft.com/office/word/2012/wordml" xmlns:w16cex="http://schemas.microsoft.com/office/word/2018/wordml/cex" xmlns:w16cid="http://schemas.microsoft.com/office/word/2016/wordml/cid" xmlns:w16="http://schemas.microsoft.com/office/word/2018/wordml" xmlns:w16sdtdh="http://schemas.microsoft.com/office/word/2020/wordml/sdtdatahash" xmlns:w16se="http://schemas.microsoft.com/office/word/2015/wordml/symex" xmlns:wpg="http://schemas.microsoft.com/office/word/2010/wordprocessingGroup" xmlns:wpi="http://schemas.microsoft.com/office/word/2010/wordprocessingInk" xmlns:wne="http://schemas.microsoft.com/office/word/2006/wordml" xmlns:wps="http://schemas.microsoft.com/office/word/2010/wordprocessingShape" mc:Ignorable="w14 w15 w16se w16cid w16 w16cex w16sdtdh wp14">
+<w:hdr xmlns:wpc="http://schemas.microsoft.com/office/word/2010/wordprocessingCanvas" xmlns:cx="http://schemas.microsoft.com/office/drawing/2014/chartex" xmlns:cx1="http://schemas.microsoft.com/office/drawing/2015/9/8/chartex" xmlns:cx2="http://schemas.microsoft.com/office/drawing/2015/10/21/chartex" xmlns:cx3="http://schemas.microsoft.com/office/drawing/2016/5/9/chartex" xmlns:cx4="http://schemas.microsoft.com/office/drawing/2016/5/10/chartex" xmlns:cx5="http://schemas.microsoft.com/office/drawing/2016/5/11/chartex" xmlns:cx6="http://schemas.microsoft.com/office/drawing/2016/5/12/chartex" xmlns:cx7="http://schemas.microsoft.com/office/drawing/2016/5/13/chartex" xmlns:cx8="http://schemas.microsoft.com/office/drawing/2016/5/14/chartex" xmlns:mc="http://schemas.openxmlformats.org/markup-compatibility/2006" xmlns:aink="http://schemas.microsoft.com/office/drawing/2016/ink" xmlns:am3d="http://schemas.microsoft.com/office/drawing/2017/model3d" xmlns:o="urn:schemas-microsoft-com:office:office" xmlns:oel="http://schemas.microsoft.com/office/2019/extlst" xmlns:r="http://schemas.openxmlformats.org/officeDocument/2006/relationships" xmlns:m="http://schemas.openxmlformats.org/officeDocument/2006/math" xmlns:v="urn:schemas-microsoft-com:vml" xmlns:wp14="http://schemas.microsoft.com/office/word/2010/wordprocessingDrawing" xmlns:wp="http://schemas.openxmlformats.org/drawingml/2006/wordprocessingDrawing" xmlns:w10="urn:schemas-microsoft-com:office:word" xmlns:w="http://schemas.openxmlformats.org/wordprocessingml/2006/main" xmlns:w14="http://schemas.microsoft.com/office/word/2010/wordml" xmlns:w15="http://schemas.microsoft.com/office/word/2012/wordml" xmlns:w16cex="http://schemas.microsoft.com/office/word/2018/wordml/cex" xmlns:w16cid="http://schemas.microsoft.com/office/word/2016/wordml/cid" xmlns:w16="http://schemas.microsoft.com/office/word/2018/wordml" xmlns:w16du="http://schemas.microsoft.com/office/word/2023/wordml/word16du" xmlns:w16sdtdh="http://schemas.microsoft.com/office/word/2020/wordml/sdtdatahash" xmlns:w16sdtfl="http://schemas.microsoft.com/office/word/2024/wordml/sdtformatlock" xmlns:w16se="http://schemas.microsoft.com/office/word/2015/wordml/symex" xmlns:wpg="http://schemas.microsoft.com/office/word/2010/wordprocessingGroup" xmlns:wpi="http://schemas.microsoft.com/office/word/2010/wordprocessingInk" xmlns:wne="http://schemas.microsoft.com/office/word/2006/wordml" xmlns:wps="http://schemas.microsoft.com/office/word/2010/wordprocessingShape" mc:Ignorable="w14 w15 w16se w16cid w16 w16cex w16sdtdh w16sdtfl w16du wp14">
   <w:p/>
 </w:hdr>
 </file>
 
 <file path=word/header3.xml><?xml version="1.0" encoding="utf-8"?>
-<w:hdr xmlns:wpc="http://schemas.microsoft.com/office/word/2010/wordprocessingCanvas" xmlns:cx="http://schemas.microsoft.com/office/drawing/2014/chartex" xmlns:cx1="http://schemas.microsoft.com/office/drawing/2015/9/8/chartex" xmlns:cx2="http://schemas.microsoft.com/office/drawing/2015/10/21/chartex" xmlns:cx3="http://schemas.microsoft.com/office/drawing/2016/5/9/chartex" xmlns:cx4="http://schemas.microsoft.com/office/drawing/2016/5/10/chartex" xmlns:cx5="http://schemas.microsoft.com/office/drawing/2016/5/11/chartex" xmlns:cx6="http://schemas.microsoft.com/office/drawing/2016/5/12/chartex" xmlns:cx7="http://schemas.microsoft.com/office/drawing/2016/5/13/chartex" xmlns:cx8="http://schemas.microsoft.com/office/drawing/2016/5/14/chartex" xmlns:mc="http://schemas.openxmlformats.org/markup-compatibility/2006" xmlns:aink="http://schemas.microsoft.com/office/drawing/2016/ink" xmlns:am3d="http://schemas.microsoft.com/office/drawing/2017/model3d" xmlns:o="urn:schemas-microsoft-com:office:office" xmlns:oel="http://schemas.microsoft.com/office/2019/extlst" xmlns:r="http://schemas.openxmlformats.org/officeDocument/2006/relationships" xmlns:m="http://schemas.openxmlformats.org/officeDocument/2006/math" xmlns:v="urn:schemas-microsoft-com:vml" xmlns:wp14="http://schemas.microsoft.com/office/word/2010/wordprocessingDrawing" xmlns:wp="http://schemas.openxmlformats.org/drawingml/2006/wordprocessingDrawing" xmlns:w10="urn:schemas-microsoft-com:office:word" xmlns:w="http://schemas.openxmlformats.org/wordprocessingml/2006/main" xmlns:w14="http://schemas.microsoft.com/office/word/2010/wordml" xmlns:w15="http://schemas.microsoft.com/office/word/2012/wordml" xmlns:w16cex="http://schemas.microsoft.com/office/word/2018/wordml/cex" xmlns:w16cid="http://schemas.microsoft.com/office/word/2016/wordml/cid" xmlns:w16="http://schemas.microsoft.com/office/word/2018/wordml" xmlns:w16sdtdh="http://schemas.microsoft.com/office/word/2020/wordml/sdtdatahash" xmlns:w16se="http://schemas.microsoft.com/office/word/2015/wordml/symex" xmlns:wpg="http://schemas.microsoft.com/office/word/2010/wordprocessingGroup" xmlns:wpi="http://schemas.microsoft.com/office/word/2010/wordprocessingInk" xmlns:wne="http://schemas.microsoft.com/office/word/2006/wordml" xmlns:wps="http://schemas.microsoft.com/office/word/2010/wordprocessingShape" mc:Ignorable="w14 w15 w16se w16cid w16 w16cex w16sdtdh wp14">
+<w:hdr xmlns:wpc="http://schemas.microsoft.com/office/word/2010/wordprocessingCanvas" xmlns:cx="http://schemas.microsoft.com/office/drawing/2014/chartex" xmlns:cx1="http://schemas.microsoft.com/office/drawing/2015/9/8/chartex" xmlns:cx2="http://schemas.microsoft.com/office/drawing/2015/10/21/chartex" xmlns:cx3="http://schemas.microsoft.com/office/drawing/2016/5/9/chartex" xmlns:cx4="http://schemas.microsoft.com/office/drawing/2016/5/10/chartex" xmlns:cx5="http://schemas.microsoft.com/office/drawing/2016/5/11/chartex" xmlns:cx6="http://schemas.microsoft.com/office/drawing/2016/5/12/chartex" xmlns:cx7="http://schemas.microsoft.com/office/drawing/2016/5/13/chartex" xmlns:cx8="http://schemas.microsoft.com/office/drawing/2016/5/14/chartex" xmlns:mc="http://schemas.openxmlformats.org/markup-compatibility/2006" xmlns:aink="http://schemas.microsoft.com/office/drawing/2016/ink" xmlns:am3d="http://schemas.microsoft.com/office/drawing/2017/model3d" xmlns:o="urn:schemas-microsoft-com:office:office" xmlns:oel="http://schemas.microsoft.com/office/2019/extlst" xmlns:r="http://schemas.openxmlformats.org/officeDocument/2006/relationships" xmlns:m="http://schemas.openxmlformats.org/officeDocument/2006/math" xmlns:v="urn:schemas-microsoft-com:vml" xmlns:wp14="http://schemas.microsoft.com/office/word/2010/wordprocessingDrawing" xmlns:wp="http://schemas.openxmlformats.org/drawingml/2006/wordprocessingDrawing" xmlns:w10="urn:schemas-microsoft-com:office:word" xmlns:w="http://schemas.openxmlformats.org/wordprocessingml/2006/main" xmlns:w14="http://schemas.microsoft.com/office/word/2010/wordml" xmlns:w15="http://schemas.microsoft.com/office/word/2012/wordml" xmlns:w16cex="http://schemas.microsoft.com/office/word/2018/wordml/cex" xmlns:w16cid="http://schemas.microsoft.com/office/word/2016/wordml/cid" xmlns:w16="http://schemas.microsoft.com/office/word/2018/wordml" xmlns:w16du="http://schemas.microsoft.com/office/word/2023/wordml/word16du" xmlns:w16sdtdh="http://schemas.microsoft.com/office/word/2020/wordml/sdtdatahash" xmlns:w16sdtfl="http://schemas.microsoft.com/office/word/2024/wordml/sdtformatlock" xmlns:w16se="http://schemas.microsoft.com/office/word/2015/wordml/symex" xmlns:wpg="http://schemas.microsoft.com/office/word/2010/wordprocessingGroup" xmlns:wpi="http://schemas.microsoft.com/office/word/2010/wordprocessingInk" xmlns:wne="http://schemas.microsoft.com/office/word/2006/wordml" xmlns:wps="http://schemas.microsoft.com/office/word/2010/wordprocessingShape" mc:Ignorable="w14 w15 w16se w16cid w16 w16cex w16sdtdh w16sdtfl w16du wp14">
   <w:p/>
 </w:hdr>
 </file>
 
 <file path=word/header4.xml><?xml version="1.0" encoding="utf-8"?>
-<w:hdr xmlns:wpc="http://schemas.microsoft.com/office/word/2010/wordprocessingCanvas" xmlns:cx="http://schemas.microsoft.com/office/drawing/2014/chartex" xmlns:cx1="http://schemas.microsoft.com/office/drawing/2015/9/8/chartex" xmlns:cx2="http://schemas.microsoft.com/office/drawing/2015/10/21/chartex" xmlns:cx3="http://schemas.microsoft.com/office/drawing/2016/5/9/chartex" xmlns:cx4="http://schemas.microsoft.com/office/drawing/2016/5/10/chartex" xmlns:cx5="http://schemas.microsoft.com/office/drawing/2016/5/11/chartex" xmlns:cx6="http://schemas.microsoft.com/office/drawing/2016/5/12/chartex" xmlns:cx7="http://schemas.microsoft.com/office/drawing/2016/5/13/chartex" xmlns:cx8="http://schemas.microsoft.com/office/drawing/2016/5/14/chartex" xmlns:mc="http://schemas.openxmlformats.org/markup-compatibility/2006" xmlns:aink="http://schemas.microsoft.com/office/drawing/2016/ink" xmlns:am3d="http://schemas.microsoft.com/office/drawing/2017/model3d" xmlns:o="urn:schemas-microsoft-com:office:office" xmlns:oel="http://schemas.microsoft.com/office/2019/extlst" xmlns:r="http://schemas.openxmlformats.org/officeDocument/2006/relationships" xmlns:m="http://schemas.openxmlformats.org/officeDocument/2006/math" xmlns:v="urn:schemas-microsoft-com:vml" xmlns:wp14="http://schemas.microsoft.com/office/word/2010/wordprocessingDrawing" xmlns:wp="http://schemas.openxmlformats.org/drawingml/2006/wordprocessingDrawing" xmlns:w10="urn:schemas-microsoft-com:office:word" xmlns:w="http://schemas.openxmlformats.org/wordprocessingml/2006/main" xmlns:w14="http://schemas.microsoft.com/office/word/2010/wordml" xmlns:w15="http://schemas.microsoft.com/office/word/2012/wordml" xmlns:w16cex="http://schemas.microsoft.com/office/word/2018/wordml/cex" xmlns:w16cid="http://schemas.microsoft.com/office/word/2016/wordml/cid" xmlns:w16="http://schemas.microsoft.com/office/word/2018/wordml" xmlns:w16sdtdh="http://schemas.microsoft.com/office/word/2020/wordml/sdtdatahash" xmlns:w16se="http://schemas.microsoft.com/office/word/2015/wordml/symex" xmlns:wpg="http://schemas.microsoft.com/office/word/2010/wordprocessingGroup" xmlns:wpi="http://schemas.microsoft.com/office/word/2010/wordprocessingInk" xmlns:wne="http://schemas.microsoft.com/office/word/2006/wordml" xmlns:wps="http://schemas.microsoft.com/office/word/2010/wordprocessingShape" mc:Ignorable="w14 w15 w16se w16cid w16 w16cex w16sdtdh wp14">
+<w:hdr xmlns:wpc="http://schemas.microsoft.com/office/word/2010/wordprocessingCanvas" xmlns:cx="http://schemas.microsoft.com/office/drawing/2014/chartex" xmlns:cx1="http://schemas.microsoft.com/office/drawing/2015/9/8/chartex" xmlns:cx2="http://schemas.microsoft.com/office/drawing/2015/10/21/chartex" xmlns:cx3="http://schemas.microsoft.com/office/drawing/2016/5/9/chartex" xmlns:cx4="http://schemas.microsoft.com/office/drawing/2016/5/10/chartex" xmlns:cx5="http://schemas.microsoft.com/office/drawing/2016/5/11/chartex" xmlns:cx6="http://schemas.microsoft.com/office/drawing/2016/5/12/chartex" xmlns:cx7="http://schemas.microsoft.com/office/drawing/2016/5/13/chartex" xmlns:cx8="http://schemas.microsoft.com/office/drawing/2016/5/14/chartex" xmlns:mc="http://schemas.openxmlformats.org/markup-compatibility/2006" xmlns:aink="http://schemas.microsoft.com/office/drawing/2016/ink" xmlns:am3d="http://schemas.microsoft.com/office/drawing/2017/model3d" xmlns:o="urn:schemas-microsoft-com:office:office" xmlns:oel="http://schemas.microsoft.com/office/2019/extlst" xmlns:r="http://schemas.openxmlformats.org/officeDocument/2006/relationships" xmlns:m="http://schemas.openxmlformats.org/officeDocument/2006/math" xmlns:v="urn:schemas-microsoft-com:vml" xmlns:wp14="http://schemas.microsoft.com/office/word/2010/wordprocessingDrawing" xmlns:wp="http://schemas.openxmlformats.org/drawingml/2006/wordprocessingDrawing" xmlns:w10="urn:schemas-microsoft-com:office:word" xmlns:w="http://schemas.openxmlformats.org/wordprocessingml/2006/main" xmlns:w14="http://schemas.microsoft.com/office/word/2010/wordml" xmlns:w15="http://schemas.microsoft.com/office/word/2012/wordml" xmlns:w16cex="http://schemas.microsoft.com/office/word/2018/wordml/cex" xmlns:w16cid="http://schemas.microsoft.com/office/word/2016/wordml/cid" xmlns:w16="http://schemas.microsoft.com/office/word/2018/wordml" xmlns:w16du="http://schemas.microsoft.com/office/word/2023/wordml/word16du" xmlns:w16sdtdh="http://schemas.microsoft.com/office/word/2020/wordml/sdtdatahash" xmlns:w16sdtfl="http://schemas.microsoft.com/office/word/2024/wordml/sdtformatlock" xmlns:w16se="http://schemas.microsoft.com/office/word/2015/wordml/symex" xmlns:wpg="http://schemas.microsoft.com/office/word/2010/wordprocessingGroup" xmlns:wpi="http://schemas.microsoft.com/office/word/2010/wordprocessingInk" xmlns:wne="http://schemas.microsoft.com/office/word/2006/wordml" xmlns:wps="http://schemas.microsoft.com/office/word/2010/wordprocessingShape" mc:Ignorable="w14 w15 w16se w16cid w16 w16cex w16sdtdh w16sdtfl w16du wp14">
   <w:p>
     <w:pPr>
       <w:pStyle w:val="HeaderLeft"/>
@@ -9916,19 +10342,19 @@
 </file>
 
 <file path=word/header5.xml><?xml version="1.0" encoding="utf-8"?>
-<w:hdr xmlns:wpc="http://schemas.microsoft.com/office/word/2010/wordprocessingCanvas" xmlns:cx="http://schemas.microsoft.com/office/drawing/2014/chartex" xmlns:cx1="http://schemas.microsoft.com/office/drawing/2015/9/8/chartex" xmlns:cx2="http://schemas.microsoft.com/office/drawing/2015/10/21/chartex" xmlns:cx3="http://schemas.microsoft.com/office/drawing/2016/5/9/chartex" xmlns:cx4="http://schemas.microsoft.com/office/drawing/2016/5/10/chartex" xmlns:cx5="http://schemas.microsoft.com/office/drawing/2016/5/11/chartex" xmlns:cx6="http://schemas.microsoft.com/office/drawing/2016/5/12/chartex" xmlns:cx7="http://schemas.microsoft.com/office/drawing/2016/5/13/chartex" xmlns:cx8="http://schemas.microsoft.com/office/drawing/2016/5/14/chartex" xmlns:mc="http://schemas.openxmlformats.org/markup-compatibility/2006" xmlns:aink="http://schemas.microsoft.com/office/drawing/2016/ink" xmlns:am3d="http://schemas.microsoft.com/office/drawing/2017/model3d" xmlns:o="urn:schemas-microsoft-com:office:office" xmlns:oel="http://schemas.microsoft.com/office/2019/extlst" xmlns:r="http://schemas.openxmlformats.org/officeDocument/2006/relationships" xmlns:m="http://schemas.openxmlformats.org/officeDocument/2006/math" xmlns:v="urn:schemas-microsoft-com:vml" xmlns:wp14="http://schemas.microsoft.com/office/word/2010/wordprocessingDrawing" xmlns:wp="http://schemas.openxmlformats.org/drawingml/2006/wordprocessingDrawing" xmlns:w10="urn:schemas-microsoft-com:office:word" xmlns:w="http://schemas.openxmlformats.org/wordprocessingml/2006/main" xmlns:w14="http://schemas.microsoft.com/office/word/2010/wordml" xmlns:w15="http://schemas.microsoft.com/office/word/2012/wordml" xmlns:w16cex="http://schemas.microsoft.com/office/word/2018/wordml/cex" xmlns:w16cid="http://schemas.microsoft.com/office/word/2016/wordml/cid" xmlns:w16="http://schemas.microsoft.com/office/word/2018/wordml" xmlns:w16sdtdh="http://schemas.microsoft.com/office/word/2020/wordml/sdtdatahash" xmlns:w16se="http://schemas.microsoft.com/office/word/2015/wordml/symex" xmlns:wpg="http://schemas.microsoft.com/office/word/2010/wordprocessingGroup" xmlns:wpi="http://schemas.microsoft.com/office/word/2010/wordprocessingInk" xmlns:wne="http://schemas.microsoft.com/office/word/2006/wordml" xmlns:wps="http://schemas.microsoft.com/office/word/2010/wordprocessingShape" mc:Ignorable="w14 w15 w16se w16cid w16 w16cex w16sdtdh wp14">
+<w:hdr xmlns:wpc="http://schemas.microsoft.com/office/word/2010/wordprocessingCanvas" xmlns:cx="http://schemas.microsoft.com/office/drawing/2014/chartex" xmlns:cx1="http://schemas.microsoft.com/office/drawing/2015/9/8/chartex" xmlns:cx2="http://schemas.microsoft.com/office/drawing/2015/10/21/chartex" xmlns:cx3="http://schemas.microsoft.com/office/drawing/2016/5/9/chartex" xmlns:cx4="http://schemas.microsoft.com/office/drawing/2016/5/10/chartex" xmlns:cx5="http://schemas.microsoft.com/office/drawing/2016/5/11/chartex" xmlns:cx6="http://schemas.microsoft.com/office/drawing/2016/5/12/chartex" xmlns:cx7="http://schemas.microsoft.com/office/drawing/2016/5/13/chartex" xmlns:cx8="http://schemas.microsoft.com/office/drawing/2016/5/14/chartex" xmlns:mc="http://schemas.openxmlformats.org/markup-compatibility/2006" xmlns:aink="http://schemas.microsoft.com/office/drawing/2016/ink" xmlns:am3d="http://schemas.microsoft.com/office/drawing/2017/model3d" xmlns:o="urn:schemas-microsoft-com:office:office" xmlns:oel="http://schemas.microsoft.com/office/2019/extlst" xmlns:r="http://schemas.openxmlformats.org/officeDocument/2006/relationships" xmlns:m="http://schemas.openxmlformats.org/officeDocument/2006/math" xmlns:v="urn:schemas-microsoft-com:vml" xmlns:wp14="http://schemas.microsoft.com/office/word/2010/wordprocessingDrawing" xmlns:wp="http://schemas.openxmlformats.org/drawingml/2006/wordprocessingDrawing" xmlns:w10="urn:schemas-microsoft-com:office:word" xmlns:w="http://schemas.openxmlformats.org/wordprocessingml/2006/main" xmlns:w14="http://schemas.microsoft.com/office/word/2010/wordml" xmlns:w15="http://schemas.microsoft.com/office/word/2012/wordml" xmlns:w16cex="http://schemas.microsoft.com/office/word/2018/wordml/cex" xmlns:w16cid="http://schemas.microsoft.com/office/word/2016/wordml/cid" xmlns:w16="http://schemas.microsoft.com/office/word/2018/wordml" xmlns:w16du="http://schemas.microsoft.com/office/word/2023/wordml/word16du" xmlns:w16sdtdh="http://schemas.microsoft.com/office/word/2020/wordml/sdtdatahash" xmlns:w16sdtfl="http://schemas.microsoft.com/office/word/2024/wordml/sdtformatlock" xmlns:w16se="http://schemas.microsoft.com/office/word/2015/wordml/symex" xmlns:wpg="http://schemas.microsoft.com/office/word/2010/wordprocessingGroup" xmlns:wpi="http://schemas.microsoft.com/office/word/2010/wordprocessingInk" xmlns:wne="http://schemas.microsoft.com/office/word/2006/wordml" xmlns:wps="http://schemas.microsoft.com/office/word/2010/wordprocessingShape" mc:Ignorable="w14 w15 w16se w16cid w16 w16cex w16sdtdh w16sdtfl w16du wp14">
   <w:p/>
 </w:hdr>
 </file>
 
 <file path=word/header6.xml><?xml version="1.0" encoding="utf-8"?>
-<w:hdr xmlns:wpc="http://schemas.microsoft.com/office/word/2010/wordprocessingCanvas" xmlns:cx="http://schemas.microsoft.com/office/drawing/2014/chartex" xmlns:cx1="http://schemas.microsoft.com/office/drawing/2015/9/8/chartex" xmlns:cx2="http://schemas.microsoft.com/office/drawing/2015/10/21/chartex" xmlns:cx3="http://schemas.microsoft.com/office/drawing/2016/5/9/chartex" xmlns:cx4="http://schemas.microsoft.com/office/drawing/2016/5/10/chartex" xmlns:cx5="http://schemas.microsoft.com/office/drawing/2016/5/11/chartex" xmlns:cx6="http://schemas.microsoft.com/office/drawing/2016/5/12/chartex" xmlns:cx7="http://schemas.microsoft.com/office/drawing/2016/5/13/chartex" xmlns:cx8="http://schemas.microsoft.com/office/drawing/2016/5/14/chartex" xmlns:mc="http://schemas.openxmlformats.org/markup-compatibility/2006" xmlns:aink="http://schemas.microsoft.com/office/drawing/2016/ink" xmlns:am3d="http://schemas.microsoft.com/office/drawing/2017/model3d" xmlns:o="urn:schemas-microsoft-com:office:office" xmlns:oel="http://schemas.microsoft.com/office/2019/extlst" xmlns:r="http://schemas.openxmlformats.org/officeDocument/2006/relationships" xmlns:m="http://schemas.openxmlformats.org/officeDocument/2006/math" xmlns:v="urn:schemas-microsoft-com:vml" xmlns:wp14="http://schemas.microsoft.com/office/word/2010/wordprocessingDrawing" xmlns:wp="http://schemas.openxmlformats.org/drawingml/2006/wordprocessingDrawing" xmlns:w10="urn:schemas-microsoft-com:office:word" xmlns:w="http://schemas.openxmlformats.org/wordprocessingml/2006/main" xmlns:w14="http://schemas.microsoft.com/office/word/2010/wordml" xmlns:w15="http://schemas.microsoft.com/office/word/2012/wordml" xmlns:w16cex="http://schemas.microsoft.com/office/word/2018/wordml/cex" xmlns:w16cid="http://schemas.microsoft.com/office/word/2016/wordml/cid" xmlns:w16="http://schemas.microsoft.com/office/word/2018/wordml" xmlns:w16sdtdh="http://schemas.microsoft.com/office/word/2020/wordml/sdtdatahash" xmlns:w16se="http://schemas.microsoft.com/office/word/2015/wordml/symex" xmlns:wpg="http://schemas.microsoft.com/office/word/2010/wordprocessingGroup" xmlns:wpi="http://schemas.microsoft.com/office/word/2010/wordprocessingInk" xmlns:wne="http://schemas.microsoft.com/office/word/2006/wordml" xmlns:wps="http://schemas.microsoft.com/office/word/2010/wordprocessingShape" mc:Ignorable="w14 w15 w16se w16cid w16 w16cex w16sdtdh wp14">
+<w:hdr xmlns:wpc="http://schemas.microsoft.com/office/word/2010/wordprocessingCanvas" xmlns:cx="http://schemas.microsoft.com/office/drawing/2014/chartex" xmlns:cx1="http://schemas.microsoft.com/office/drawing/2015/9/8/chartex" xmlns:cx2="http://schemas.microsoft.com/office/drawing/2015/10/21/chartex" xmlns:cx3="http://schemas.microsoft.com/office/drawing/2016/5/9/chartex" xmlns:cx4="http://schemas.microsoft.com/office/drawing/2016/5/10/chartex" xmlns:cx5="http://schemas.microsoft.com/office/drawing/2016/5/11/chartex" xmlns:cx6="http://schemas.microsoft.com/office/drawing/2016/5/12/chartex" xmlns:cx7="http://schemas.microsoft.com/office/drawing/2016/5/13/chartex" xmlns:cx8="http://schemas.microsoft.com/office/drawing/2016/5/14/chartex" xmlns:mc="http://schemas.openxmlformats.org/markup-compatibility/2006" xmlns:aink="http://schemas.microsoft.com/office/drawing/2016/ink" xmlns:am3d="http://schemas.microsoft.com/office/drawing/2017/model3d" xmlns:o="urn:schemas-microsoft-com:office:office" xmlns:oel="http://schemas.microsoft.com/office/2019/extlst" xmlns:r="http://schemas.openxmlformats.org/officeDocument/2006/relationships" xmlns:m="http://schemas.openxmlformats.org/officeDocument/2006/math" xmlns:v="urn:schemas-microsoft-com:vml" xmlns:wp14="http://schemas.microsoft.com/office/word/2010/wordprocessingDrawing" xmlns:wp="http://schemas.openxmlformats.org/drawingml/2006/wordprocessingDrawing" xmlns:w10="urn:schemas-microsoft-com:office:word" xmlns:w="http://schemas.openxmlformats.org/wordprocessingml/2006/main" xmlns:w14="http://schemas.microsoft.com/office/word/2010/wordml" xmlns:w15="http://schemas.microsoft.com/office/word/2012/wordml" xmlns:w16cex="http://schemas.microsoft.com/office/word/2018/wordml/cex" xmlns:w16cid="http://schemas.microsoft.com/office/word/2016/wordml/cid" xmlns:w16="http://schemas.microsoft.com/office/word/2018/wordml" xmlns:w16du="http://schemas.microsoft.com/office/word/2023/wordml/word16du" xmlns:w16sdtdh="http://schemas.microsoft.com/office/word/2020/wordml/sdtdatahash" xmlns:w16sdtfl="http://schemas.microsoft.com/office/word/2024/wordml/sdtformatlock" xmlns:w16se="http://schemas.microsoft.com/office/word/2015/wordml/symex" xmlns:wpg="http://schemas.microsoft.com/office/word/2010/wordprocessingGroup" xmlns:wpi="http://schemas.microsoft.com/office/word/2010/wordprocessingInk" xmlns:wne="http://schemas.microsoft.com/office/word/2006/wordml" xmlns:wps="http://schemas.microsoft.com/office/word/2010/wordprocessingShape" mc:Ignorable="w14 w15 w16se w16cid w16 w16cex w16sdtdh w16sdtfl w16du wp14">
   <w:p/>
 </w:hdr>
 </file>
 
 <file path=word/header7.xml><?xml version="1.0" encoding="utf-8"?>
-<w:hdr xmlns:wpc="http://schemas.microsoft.com/office/word/2010/wordprocessingCanvas" xmlns:cx="http://schemas.microsoft.com/office/drawing/2014/chartex" xmlns:cx1="http://schemas.microsoft.com/office/drawing/2015/9/8/chartex" xmlns:cx2="http://schemas.microsoft.com/office/drawing/2015/10/21/chartex" xmlns:cx3="http://schemas.microsoft.com/office/drawing/2016/5/9/chartex" xmlns:cx4="http://schemas.microsoft.com/office/drawing/2016/5/10/chartex" xmlns:cx5="http://schemas.microsoft.com/office/drawing/2016/5/11/chartex" xmlns:cx6="http://schemas.microsoft.com/office/drawing/2016/5/12/chartex" xmlns:cx7="http://schemas.microsoft.com/office/drawing/2016/5/13/chartex" xmlns:cx8="http://schemas.microsoft.com/office/drawing/2016/5/14/chartex" xmlns:mc="http://schemas.openxmlformats.org/markup-compatibility/2006" xmlns:aink="http://schemas.microsoft.com/office/drawing/2016/ink" xmlns:am3d="http://schemas.microsoft.com/office/drawing/2017/model3d" xmlns:o="urn:schemas-microsoft-com:office:office" xmlns:oel="http://schemas.microsoft.com/office/2019/extlst" xmlns:r="http://schemas.openxmlformats.org/officeDocument/2006/relationships" xmlns:m="http://schemas.openxmlformats.org/officeDocument/2006/math" xmlns:v="urn:schemas-microsoft-com:vml" xmlns:wp14="http://schemas.microsoft.com/office/word/2010/wordprocessingDrawing" xmlns:wp="http://schemas.openxmlformats.org/drawingml/2006/wordprocessingDrawing" xmlns:w10="urn:schemas-microsoft-com:office:word" xmlns:w="http://schemas.openxmlformats.org/wordprocessingml/2006/main" xmlns:w14="http://schemas.microsoft.com/office/word/2010/wordml" xmlns:w15="http://schemas.microsoft.com/office/word/2012/wordml" xmlns:w16cex="http://schemas.microsoft.com/office/word/2018/wordml/cex" xmlns:w16cid="http://schemas.microsoft.com/office/word/2016/wordml/cid" xmlns:w16="http://schemas.microsoft.com/office/word/2018/wordml" xmlns:w16sdtdh="http://schemas.microsoft.com/office/word/2020/wordml/sdtdatahash" xmlns:w16se="http://schemas.microsoft.com/office/word/2015/wordml/symex" xmlns:wpg="http://schemas.microsoft.com/office/word/2010/wordprocessingGroup" xmlns:wpi="http://schemas.microsoft.com/office/word/2010/wordprocessingInk" xmlns:wne="http://schemas.microsoft.com/office/word/2006/wordml" xmlns:wps="http://schemas.microsoft.com/office/word/2010/wordprocessingShape" mc:Ignorable="w14 w15 w16se w16cid w16 w16cex w16sdtdh wp14">
+<w:hdr xmlns:wpc="http://schemas.microsoft.com/office/word/2010/wordprocessingCanvas" xmlns:cx="http://schemas.microsoft.com/office/drawing/2014/chartex" xmlns:cx1="http://schemas.microsoft.com/office/drawing/2015/9/8/chartex" xmlns:cx2="http://schemas.microsoft.com/office/drawing/2015/10/21/chartex" xmlns:cx3="http://schemas.microsoft.com/office/drawing/2016/5/9/chartex" xmlns:cx4="http://schemas.microsoft.com/office/drawing/2016/5/10/chartex" xmlns:cx5="http://schemas.microsoft.com/office/drawing/2016/5/11/chartex" xmlns:cx6="http://schemas.microsoft.com/office/drawing/2016/5/12/chartex" xmlns:cx7="http://schemas.microsoft.com/office/drawing/2016/5/13/chartex" xmlns:cx8="http://schemas.microsoft.com/office/drawing/2016/5/14/chartex" xmlns:mc="http://schemas.openxmlformats.org/markup-compatibility/2006" xmlns:aink="http://schemas.microsoft.com/office/drawing/2016/ink" xmlns:am3d="http://schemas.microsoft.com/office/drawing/2017/model3d" xmlns:o="urn:schemas-microsoft-com:office:office" xmlns:oel="http://schemas.microsoft.com/office/2019/extlst" xmlns:r="http://schemas.openxmlformats.org/officeDocument/2006/relationships" xmlns:m="http://schemas.openxmlformats.org/officeDocument/2006/math" xmlns:v="urn:schemas-microsoft-com:vml" xmlns:wp14="http://schemas.microsoft.com/office/word/2010/wordprocessingDrawing" xmlns:wp="http://schemas.openxmlformats.org/drawingml/2006/wordprocessingDrawing" xmlns:w10="urn:schemas-microsoft-com:office:word" xmlns:w="http://schemas.openxmlformats.org/wordprocessingml/2006/main" xmlns:w14="http://schemas.microsoft.com/office/word/2010/wordml" xmlns:w15="http://schemas.microsoft.com/office/word/2012/wordml" xmlns:w16cex="http://schemas.microsoft.com/office/word/2018/wordml/cex" xmlns:w16cid="http://schemas.microsoft.com/office/word/2016/wordml/cid" xmlns:w16="http://schemas.microsoft.com/office/word/2018/wordml" xmlns:w16du="http://schemas.microsoft.com/office/word/2023/wordml/word16du" xmlns:w16sdtdh="http://schemas.microsoft.com/office/word/2020/wordml/sdtdatahash" xmlns:w16sdtfl="http://schemas.microsoft.com/office/word/2024/wordml/sdtformatlock" xmlns:w16se="http://schemas.microsoft.com/office/word/2015/wordml/symex" xmlns:wpg="http://schemas.microsoft.com/office/word/2010/wordprocessingGroup" xmlns:wpi="http://schemas.microsoft.com/office/word/2010/wordprocessingInk" xmlns:wne="http://schemas.microsoft.com/office/word/2006/wordml" xmlns:wps="http://schemas.microsoft.com/office/word/2010/wordprocessingShape" mc:Ignorable="w14 w15 w16se w16cid w16 w16cex w16sdtdh w16sdtfl w16du wp14">
   <w:p>
     <w:pPr>
       <w:pStyle w:val="HeaderLeft"/>
@@ -9938,19 +10364,19 @@
 </file>
 
 <file path=word/header8.xml><?xml version="1.0" encoding="utf-8"?>
-<w:hdr xmlns:wpc="http://schemas.microsoft.com/office/word/2010/wordprocessingCanvas" xmlns:cx="http://schemas.microsoft.com/office/drawing/2014/chartex" xmlns:cx1="http://schemas.microsoft.com/office/drawing/2015/9/8/chartex" xmlns:cx2="http://schemas.microsoft.com/office/drawing/2015/10/21/chartex" xmlns:cx3="http://schemas.microsoft.com/office/drawing/2016/5/9/chartex" xmlns:cx4="http://schemas.microsoft.com/office/drawing/2016/5/10/chartex" xmlns:cx5="http://schemas.microsoft.com/office/drawing/2016/5/11/chartex" xmlns:cx6="http://schemas.microsoft.com/office/drawing/2016/5/12/chartex" xmlns:cx7="http://schemas.microsoft.com/office/drawing/2016/5/13/chartex" xmlns:cx8="http://schemas.microsoft.com/office/drawing/2016/5/14/chartex" xmlns:mc="http://schemas.openxmlformats.org/markup-compatibility/2006" xmlns:aink="http://schemas.microsoft.com/office/drawing/2016/ink" xmlns:am3d="http://schemas.microsoft.com/office/drawing/2017/model3d" xmlns:o="urn:schemas-microsoft-com:office:office" xmlns:oel="http://schemas.microsoft.com/office/2019/extlst" xmlns:r="http://schemas.openxmlformats.org/officeDocument/2006/relationships" xmlns:m="http://schemas.openxmlformats.org/officeDocument/2006/math" xmlns:v="urn:schemas-microsoft-com:vml" xmlns:wp14="http://schemas.microsoft.com/office/word/2010/wordprocessingDrawing" xmlns:wp="http://schemas.openxmlformats.org/drawingml/2006/wordprocessingDrawing" xmlns:w10="urn:schemas-microsoft-com:office:word" xmlns:w="http://schemas.openxmlformats.org/wordprocessingml/2006/main" xmlns:w14="http://schemas.microsoft.com/office/word/2010/wordml" xmlns:w15="http://schemas.microsoft.com/office/word/2012/wordml" xmlns:w16cex="http://schemas.microsoft.com/office/word/2018/wordml/cex" xmlns:w16cid="http://schemas.microsoft.com/office/word/2016/wordml/cid" xmlns:w16="http://schemas.microsoft.com/office/word/2018/wordml" xmlns:w16sdtdh="http://schemas.microsoft.com/office/word/2020/wordml/sdtdatahash" xmlns:w16se="http://schemas.microsoft.com/office/word/2015/wordml/symex" xmlns:wpg="http://schemas.microsoft.com/office/word/2010/wordprocessingGroup" xmlns:wpi="http://schemas.microsoft.com/office/word/2010/wordprocessingInk" xmlns:wne="http://schemas.microsoft.com/office/word/2006/wordml" xmlns:wps="http://schemas.microsoft.com/office/word/2010/wordprocessingShape" mc:Ignorable="w14 w15 w16se w16cid w16 w16cex w16sdtdh wp14">
+<w:hdr xmlns:wpc="http://schemas.microsoft.com/office/word/2010/wordprocessingCanvas" xmlns:cx="http://schemas.microsoft.com/office/drawing/2014/chartex" xmlns:cx1="http://schemas.microsoft.com/office/drawing/2015/9/8/chartex" xmlns:cx2="http://schemas.microsoft.com/office/drawing/2015/10/21/chartex" xmlns:cx3="http://schemas.microsoft.com/office/drawing/2016/5/9/chartex" xmlns:cx4="http://schemas.microsoft.com/office/drawing/2016/5/10/chartex" xmlns:cx5="http://schemas.microsoft.com/office/drawing/2016/5/11/chartex" xmlns:cx6="http://schemas.microsoft.com/office/drawing/2016/5/12/chartex" xmlns:cx7="http://schemas.microsoft.com/office/drawing/2016/5/13/chartex" xmlns:cx8="http://schemas.microsoft.com/office/drawing/2016/5/14/chartex" xmlns:mc="http://schemas.openxmlformats.org/markup-compatibility/2006" xmlns:aink="http://schemas.microsoft.com/office/drawing/2016/ink" xmlns:am3d="http://schemas.microsoft.com/office/drawing/2017/model3d" xmlns:o="urn:schemas-microsoft-com:office:office" xmlns:oel="http://schemas.microsoft.com/office/2019/extlst" xmlns:r="http://schemas.openxmlformats.org/officeDocument/2006/relationships" xmlns:m="http://schemas.openxmlformats.org/officeDocument/2006/math" xmlns:v="urn:schemas-microsoft-com:vml" xmlns:wp14="http://schemas.microsoft.com/office/word/2010/wordprocessingDrawing" xmlns:wp="http://schemas.openxmlformats.org/drawingml/2006/wordprocessingDrawing" xmlns:w10="urn:schemas-microsoft-com:office:word" xmlns:w="http://schemas.openxmlformats.org/wordprocessingml/2006/main" xmlns:w14="http://schemas.microsoft.com/office/word/2010/wordml" xmlns:w15="http://schemas.microsoft.com/office/word/2012/wordml" xmlns:w16cex="http://schemas.microsoft.com/office/word/2018/wordml/cex" xmlns:w16cid="http://schemas.microsoft.com/office/word/2016/wordml/cid" xmlns:w16="http://schemas.microsoft.com/office/word/2018/wordml" xmlns:w16du="http://schemas.microsoft.com/office/word/2023/wordml/word16du" xmlns:w16sdtdh="http://schemas.microsoft.com/office/word/2020/wordml/sdtdatahash" xmlns:w16sdtfl="http://schemas.microsoft.com/office/word/2024/wordml/sdtformatlock" xmlns:w16se="http://schemas.microsoft.com/office/word/2015/wordml/symex" xmlns:wpg="http://schemas.microsoft.com/office/word/2010/wordprocessingGroup" xmlns:wpi="http://schemas.microsoft.com/office/word/2010/wordprocessingInk" xmlns:wne="http://schemas.microsoft.com/office/word/2006/wordml" xmlns:wps="http://schemas.microsoft.com/office/word/2010/wordprocessingShape" mc:Ignorable="w14 w15 w16se w16cid w16 w16cex w16sdtdh w16sdtfl w16du wp14">
   <w:p/>
 </w:hdr>
 </file>
 
 <file path=word/header9.xml><?xml version="1.0" encoding="utf-8"?>
-<w:hdr xmlns:wpc="http://schemas.microsoft.com/office/word/2010/wordprocessingCanvas" xmlns:cx="http://schemas.microsoft.com/office/drawing/2014/chartex" xmlns:cx1="http://schemas.microsoft.com/office/drawing/2015/9/8/chartex" xmlns:cx2="http://schemas.microsoft.com/office/drawing/2015/10/21/chartex" xmlns:cx3="http://schemas.microsoft.com/office/drawing/2016/5/9/chartex" xmlns:cx4="http://schemas.microsoft.com/office/drawing/2016/5/10/chartex" xmlns:cx5="http://schemas.microsoft.com/office/drawing/2016/5/11/chartex" xmlns:cx6="http://schemas.microsoft.com/office/drawing/2016/5/12/chartex" xmlns:cx7="http://schemas.microsoft.com/office/drawing/2016/5/13/chartex" xmlns:cx8="http://schemas.microsoft.com/office/drawing/2016/5/14/chartex" xmlns:mc="http://schemas.openxmlformats.org/markup-compatibility/2006" xmlns:aink="http://schemas.microsoft.com/office/drawing/2016/ink" xmlns:am3d="http://schemas.microsoft.com/office/drawing/2017/model3d" xmlns:o="urn:schemas-microsoft-com:office:office" xmlns:oel="http://schemas.microsoft.com/office/2019/extlst" xmlns:r="http://schemas.openxmlformats.org/officeDocument/2006/relationships" xmlns:m="http://schemas.openxmlformats.org/officeDocument/2006/math" xmlns:v="urn:schemas-microsoft-com:vml" xmlns:wp14="http://schemas.microsoft.com/office/word/2010/wordprocessingDrawing" xmlns:wp="http://schemas.openxmlformats.org/drawingml/2006/wordprocessingDrawing" xmlns:w10="urn:schemas-microsoft-com:office:word" xmlns:w="http://schemas.openxmlformats.org/wordprocessingml/2006/main" xmlns:w14="http://schemas.microsoft.com/office/word/2010/wordml" xmlns:w15="http://schemas.microsoft.com/office/word/2012/wordml" xmlns:w16cex="http://schemas.microsoft.com/office/word/2018/wordml/cex" xmlns:w16cid="http://schemas.microsoft.com/office/word/2016/wordml/cid" xmlns:w16="http://schemas.microsoft.com/office/word/2018/wordml" xmlns:w16sdtdh="http://schemas.microsoft.com/office/word/2020/wordml/sdtdatahash" xmlns:w16se="http://schemas.microsoft.com/office/word/2015/wordml/symex" xmlns:wpg="http://schemas.microsoft.com/office/word/2010/wordprocessingGroup" xmlns:wpi="http://schemas.microsoft.com/office/word/2010/wordprocessingInk" xmlns:wne="http://schemas.microsoft.com/office/word/2006/wordml" xmlns:wps="http://schemas.microsoft.com/office/word/2010/wordprocessingShape" mc:Ignorable="w14 w15 w16se w16cid w16 w16cex w16sdtdh wp14">
+<w:hdr xmlns:wpc="http://schemas.microsoft.com/office/word/2010/wordprocessingCanvas" xmlns:cx="http://schemas.microsoft.com/office/drawing/2014/chartex" xmlns:cx1="http://schemas.microsoft.com/office/drawing/2015/9/8/chartex" xmlns:cx2="http://schemas.microsoft.com/office/drawing/2015/10/21/chartex" xmlns:cx3="http://schemas.microsoft.com/office/drawing/2016/5/9/chartex" xmlns:cx4="http://schemas.microsoft.com/office/drawing/2016/5/10/chartex" xmlns:cx5="http://schemas.microsoft.com/office/drawing/2016/5/11/chartex" xmlns:cx6="http://schemas.microsoft.com/office/drawing/2016/5/12/chartex" xmlns:cx7="http://schemas.microsoft.com/office/drawing/2016/5/13/chartex" xmlns:cx8="http://schemas.microsoft.com/office/drawing/2016/5/14/chartex" xmlns:mc="http://schemas.openxmlformats.org/markup-compatibility/2006" xmlns:aink="http://schemas.microsoft.com/office/drawing/2016/ink" xmlns:am3d="http://schemas.microsoft.com/office/drawing/2017/model3d" xmlns:o="urn:schemas-microsoft-com:office:office" xmlns:oel="http://schemas.microsoft.com/office/2019/extlst" xmlns:r="http://schemas.openxmlformats.org/officeDocument/2006/relationships" xmlns:m="http://schemas.openxmlformats.org/officeDocument/2006/math" xmlns:v="urn:schemas-microsoft-com:vml" xmlns:wp14="http://schemas.microsoft.com/office/word/2010/wordprocessingDrawing" xmlns:wp="http://schemas.openxmlformats.org/drawingml/2006/wordprocessingDrawing" xmlns:w10="urn:schemas-microsoft-com:office:word" xmlns:w="http://schemas.openxmlformats.org/wordprocessingml/2006/main" xmlns:w14="http://schemas.microsoft.com/office/word/2010/wordml" xmlns:w15="http://schemas.microsoft.com/office/word/2012/wordml" xmlns:w16cex="http://schemas.microsoft.com/office/word/2018/wordml/cex" xmlns:w16cid="http://schemas.microsoft.com/office/word/2016/wordml/cid" xmlns:w16="http://schemas.microsoft.com/office/word/2018/wordml" xmlns:w16du="http://schemas.microsoft.com/office/word/2023/wordml/word16du" xmlns:w16sdtdh="http://schemas.microsoft.com/office/word/2020/wordml/sdtdatahash" xmlns:w16sdtfl="http://schemas.microsoft.com/office/word/2024/wordml/sdtformatlock" xmlns:w16se="http://schemas.microsoft.com/office/word/2015/wordml/symex" xmlns:wpg="http://schemas.microsoft.com/office/word/2010/wordprocessingGroup" xmlns:wpi="http://schemas.microsoft.com/office/word/2010/wordprocessingInk" xmlns:wne="http://schemas.microsoft.com/office/word/2006/wordml" xmlns:wps="http://schemas.microsoft.com/office/word/2010/wordprocessingShape" mc:Ignorable="w14 w15 w16se w16cid w16 w16cex w16sdtdh w16sdtfl w16du wp14">
   <w:p/>
 </w:hdr>
 </file>
 
 <file path=word/numbering.xml><?xml version="1.0" encoding="utf-8"?>
-<w:numbering xmlns:wpc="http://schemas.microsoft.com/office/word/2010/wordprocessingCanvas" xmlns:cx="http://schemas.microsoft.com/office/drawing/2014/chartex" xmlns:cx1="http://schemas.microsoft.com/office/drawing/2015/9/8/chartex" xmlns:cx2="http://schemas.microsoft.com/office/drawing/2015/10/21/chartex" xmlns:cx3="http://schemas.microsoft.com/office/drawing/2016/5/9/chartex" xmlns:cx4="http://schemas.microsoft.com/office/drawing/2016/5/10/chartex" xmlns:cx5="http://schemas.microsoft.com/office/drawing/2016/5/11/chartex" xmlns:cx6="http://schemas.microsoft.com/office/drawing/2016/5/12/chartex" xmlns:cx7="http://schemas.microsoft.com/office/drawing/2016/5/13/chartex" xmlns:cx8="http://schemas.microsoft.com/office/drawing/2016/5/14/chartex" xmlns:mc="http://schemas.openxmlformats.org/markup-compatibility/2006" xmlns:aink="http://schemas.microsoft.com/office/drawing/2016/ink" xmlns:am3d="http://schemas.microsoft.com/office/drawing/2017/model3d" xmlns:o="urn:schemas-microsoft-com:office:office" xmlns:oel="http://schemas.microsoft.com/office/2019/extlst" xmlns:r="http://schemas.openxmlformats.org/officeDocument/2006/relationships" xmlns:m="http://schemas.openxmlformats.org/officeDocument/2006/math" xmlns:v="urn:schemas-microsoft-com:vml" xmlns:wp14="http://schemas.microsoft.com/office/word/2010/wordprocessingDrawing" xmlns:wp="http://schemas.openxmlformats.org/drawingml/2006/wordprocessingDrawing" xmlns:w10="urn:schemas-microsoft-com:office:word" xmlns:w="http://schemas.openxmlformats.org/wordprocessingml/2006/main" xmlns:w14="http://schemas.microsoft.com/office/word/2010/wordml" xmlns:w15="http://schemas.microsoft.com/office/word/2012/wordml" xmlns:w16cex="http://schemas.microsoft.com/office/word/2018/wordml/cex" xmlns:w16cid="http://schemas.microsoft.com/office/word/2016/wordml/cid" xmlns:w16="http://schemas.microsoft.com/office/word/2018/wordml" xmlns:w16sdtdh="http://schemas.microsoft.com/office/word/2020/wordml/sdtdatahash" xmlns:w16se="http://schemas.microsoft.com/office/word/2015/wordml/symex" xmlns:wpg="http://schemas.microsoft.com/office/word/2010/wordprocessingGroup" xmlns:wpi="http://schemas.microsoft.com/office/word/2010/wordprocessingInk" xmlns:wne="http://schemas.microsoft.com/office/word/2006/wordml" xmlns:wps="http://schemas.microsoft.com/office/word/2010/wordprocessingShape" mc:Ignorable="w14 w15 w16se w16cid w16 w16cex w16sdtdh wp14">
+<w:numbering xmlns:wpc="http://schemas.microsoft.com/office/word/2010/wordprocessingCanvas" xmlns:cx="http://schemas.microsoft.com/office/drawing/2014/chartex" xmlns:cx1="http://schemas.microsoft.com/office/drawing/2015/9/8/chartex" xmlns:cx2="http://schemas.microsoft.com/office/drawing/2015/10/21/chartex" xmlns:cx3="http://schemas.microsoft.com/office/drawing/2016/5/9/chartex" xmlns:cx4="http://schemas.microsoft.com/office/drawing/2016/5/10/chartex" xmlns:cx5="http://schemas.microsoft.com/office/drawing/2016/5/11/chartex" xmlns:cx6="http://schemas.microsoft.com/office/drawing/2016/5/12/chartex" xmlns:cx7="http://schemas.microsoft.com/office/drawing/2016/5/13/chartex" xmlns:cx8="http://schemas.microsoft.com/office/drawing/2016/5/14/chartex" xmlns:mc="http://schemas.openxmlformats.org/markup-compatibility/2006" xmlns:aink="http://schemas.microsoft.com/office/drawing/2016/ink" xmlns:am3d="http://schemas.microsoft.com/office/drawing/2017/model3d" xmlns:o="urn:schemas-microsoft-com:office:office" xmlns:oel="http://schemas.microsoft.com/office/2019/extlst" xmlns:r="http://schemas.openxmlformats.org/officeDocument/2006/relationships" xmlns:m="http://schemas.openxmlformats.org/officeDocument/2006/math" xmlns:v="urn:schemas-microsoft-com:vml" xmlns:wp14="http://schemas.microsoft.com/office/word/2010/wordprocessingDrawing" xmlns:wp="http://schemas.openxmlformats.org/drawingml/2006/wordprocessingDrawing" xmlns:w10="urn:schemas-microsoft-com:office:word" xmlns:w="http://schemas.openxmlformats.org/wordprocessingml/2006/main" xmlns:w14="http://schemas.microsoft.com/office/word/2010/wordml" xmlns:w15="http://schemas.microsoft.com/office/word/2012/wordml" xmlns:w16cex="http://schemas.microsoft.com/office/word/2018/wordml/cex" xmlns:w16cid="http://schemas.microsoft.com/office/word/2016/wordml/cid" xmlns:w16="http://schemas.microsoft.com/office/word/2018/wordml" xmlns:w16du="http://schemas.microsoft.com/office/word/2023/wordml/word16du" xmlns:w16sdtdh="http://schemas.microsoft.com/office/word/2020/wordml/sdtdatahash" xmlns:w16sdtfl="http://schemas.microsoft.com/office/word/2024/wordml/sdtformatlock" xmlns:w16se="http://schemas.microsoft.com/office/word/2015/wordml/symex" xmlns:wpg="http://schemas.microsoft.com/office/word/2010/wordprocessingGroup" xmlns:wpi="http://schemas.microsoft.com/office/word/2010/wordprocessingInk" xmlns:wne="http://schemas.microsoft.com/office/word/2006/wordml" xmlns:wps="http://schemas.microsoft.com/office/word/2010/wordprocessingShape" mc:Ignorable="w14 w15 w16se w16cid w16 w16cex w16sdtdh w16sdtfl w16du wp14">
   <w:abstractNum w:abstractNumId="0" w15:restartNumberingAfterBreak="0">
     <w:nsid w:val="00000001"/>
     <w:multiLevelType w:val="multilevel"/>
@@ -12330,7 +12756,7 @@
 </file>
 
 <file path=word/styles.xml><?xml version="1.0" encoding="utf-8"?>
-<w:styles xmlns:mc="http://schemas.openxmlformats.org/markup-compatibility/2006" xmlns:r="http://schemas.openxmlformats.org/officeDocument/2006/relationships" xmlns:w="http://schemas.openxmlformats.org/wordprocessingml/2006/main" xmlns:w14="http://schemas.microsoft.com/office/word/2010/wordml" xmlns:w15="http://schemas.microsoft.com/office/word/2012/wordml" xmlns:w16cex="http://schemas.microsoft.com/office/word/2018/wordml/cex" xmlns:w16cid="http://schemas.microsoft.com/office/word/2016/wordml/cid" xmlns:w16="http://schemas.microsoft.com/office/word/2018/wordml" xmlns:w16sdtdh="http://schemas.microsoft.com/office/word/2020/wordml/sdtdatahash" xmlns:w16se="http://schemas.microsoft.com/office/word/2015/wordml/symex" mc:Ignorable="w14 w15 w16se w16cid w16 w16cex w16sdtdh">
+<w:styles xmlns:mc="http://schemas.openxmlformats.org/markup-compatibility/2006" xmlns:r="http://schemas.openxmlformats.org/officeDocument/2006/relationships" xmlns:w="http://schemas.openxmlformats.org/wordprocessingml/2006/main" xmlns:w14="http://schemas.microsoft.com/office/word/2010/wordml" xmlns:w15="http://schemas.microsoft.com/office/word/2012/wordml" xmlns:w16cex="http://schemas.microsoft.com/office/word/2018/wordml/cex" xmlns:w16cid="http://schemas.microsoft.com/office/word/2016/wordml/cid" xmlns:w16="http://schemas.microsoft.com/office/word/2018/wordml" xmlns:w16du="http://schemas.microsoft.com/office/word/2023/wordml/word16du" xmlns:w16sdtdh="http://schemas.microsoft.com/office/word/2020/wordml/sdtdatahash" xmlns:w16sdtfl="http://schemas.microsoft.com/office/word/2024/wordml/sdtformatlock" xmlns:w16se="http://schemas.microsoft.com/office/word/2015/wordml/symex" mc:Ignorable="w14 w15 w16se w16cid w16 w16cex w16sdtdh w16sdtfl w16du">
   <w:docDefaults>
     <w:rPrDefault>
       <w:rPr>
@@ -12731,10 +13157,10 @@
       <w:lang w:eastAsia="zh-CN"/>
     </w:rPr>
   </w:style>
-  <w:style w:type="paragraph" w:styleId="Heading3">
+  <w:style w:type="paragraph" w:styleId="Ttulo3">
     <w:name w:val="heading 3"/>
     <w:basedOn w:val="Normal"/>
-    <w:link w:val="Heading3Char"/>
+    <w:link w:val="Ttulo3Carter"/>
     <w:uiPriority w:val="9"/>
     <w:qFormat/>
     <w:rsid w:val="00CA14FE"/>
@@ -12753,13 +13179,12 @@
       <w:lang w:val="en-US" w:eastAsia="en-US"/>
     </w:rPr>
   </w:style>
-  <w:style w:type="character" w:default="1" w:styleId="DefaultParagraphFont">
+  <w:style w:type="character" w:default="1" w:styleId="Tipodeletrapredefinidodopargrafo">
     <w:name w:val="Default Paragraph Font"/>
     <w:uiPriority w:val="1"/>
-    <w:semiHidden/>
     <w:unhideWhenUsed/>
   </w:style>
-  <w:style w:type="table" w:default="1" w:styleId="TableNormal">
+  <w:style w:type="table" w:default="1" w:styleId="Tabelanormal">
     <w:name w:val="Normal Table"/>
     <w:uiPriority w:val="99"/>
     <w:semiHidden/>
@@ -12774,7 +13199,7 @@
       </w:tblCellMar>
     </w:tblPr>
   </w:style>
-  <w:style w:type="numbering" w:default="1" w:styleId="NoList">
+  <w:style w:type="numbering" w:default="1" w:styleId="Semlista">
     <w:name w:val="No List"/>
     <w:uiPriority w:val="99"/>
     <w:semiHidden/>
@@ -13082,7 +13507,7 @@
   <w:style w:type="character" w:customStyle="1" w:styleId="Tipodeletrapredefinidodopargrafo1">
     <w:name w:val="Tipo de letra predefinido do parágrafo1"/>
   </w:style>
-  <w:style w:type="character" w:styleId="Hyperlink">
+  <w:style w:type="character" w:styleId="Hiperligao">
     <w:name w:val="Hyperlink"/>
     <w:uiPriority w:val="99"/>
     <w:rPr>
@@ -13090,7 +13515,7 @@
       <w:u w:val="single"/>
     </w:rPr>
   </w:style>
-  <w:style w:type="character" w:styleId="PageNumber">
+  <w:style w:type="character" w:styleId="Nmerodepgina">
     <w:name w:val="page number"/>
     <w:basedOn w:val="Tipodeletrapredefinidodopargrafo1"/>
   </w:style>
@@ -13125,7 +13550,7 @@
   <w:style w:type="paragraph" w:customStyle="1" w:styleId="Heading">
     <w:name w:val="Heading"/>
     <w:basedOn w:val="Normal"/>
-    <w:next w:val="BodyText"/>
+    <w:next w:val="Corpodetexto"/>
     <w:pPr>
       <w:keepNext/>
       <w:spacing w:before="240" w:after="120"/>
@@ -13136,21 +13561,21 @@
       <w:szCs w:val="28"/>
     </w:rPr>
   </w:style>
-  <w:style w:type="paragraph" w:styleId="BodyText">
+  <w:style w:type="paragraph" w:styleId="Corpodetexto">
     <w:name w:val="Body Text"/>
     <w:basedOn w:val="Normal"/>
     <w:rPr>
       <w:rFonts w:ascii="Arial" w:hAnsi="Arial" w:cs="Arial"/>
     </w:rPr>
   </w:style>
-  <w:style w:type="paragraph" w:styleId="List">
+  <w:style w:type="paragraph" w:styleId="Lista">
     <w:name w:val="List"/>
-    <w:basedOn w:val="BodyText"/>
+    <w:basedOn w:val="Corpodetexto"/>
     <w:rPr>
       <w:rFonts w:cs="Lohit Hindi"/>
     </w:rPr>
   </w:style>
-  <w:style w:type="paragraph" w:styleId="Caption">
+  <w:style w:type="paragraph" w:styleId="Legenda">
     <w:name w:val="caption"/>
     <w:basedOn w:val="Normal"/>
     <w:next w:val="Normal"/>
@@ -13212,7 +13637,7 @@
       <w:bCs w:val="0"/>
     </w:rPr>
   </w:style>
-  <w:style w:type="paragraph" w:styleId="TOC1">
+  <w:style w:type="paragraph" w:styleId="ndice1">
     <w:name w:val="toc 1"/>
     <w:basedOn w:val="Normal"/>
     <w:next w:val="Normal"/>
@@ -13227,7 +13652,7 @@
       <w:iCs/>
     </w:rPr>
   </w:style>
-  <w:style w:type="paragraph" w:styleId="TOC2">
+  <w:style w:type="paragraph" w:styleId="ndice2">
     <w:name w:val="toc 2"/>
     <w:basedOn w:val="Normal"/>
     <w:next w:val="Normal"/>
@@ -13243,7 +13668,7 @@
       <w:szCs w:val="22"/>
     </w:rPr>
   </w:style>
-  <w:style w:type="paragraph" w:styleId="TOC3">
+  <w:style w:type="paragraph" w:styleId="ndice3">
     <w:name w:val="toc 3"/>
     <w:basedOn w:val="Normal"/>
     <w:next w:val="Normal"/>
@@ -13257,7 +13682,7 @@
       <w:szCs w:val="20"/>
     </w:rPr>
   </w:style>
-  <w:style w:type="paragraph" w:styleId="TOC4">
+  <w:style w:type="paragraph" w:styleId="ndice4">
     <w:name w:val="toc 4"/>
     <w:basedOn w:val="Normal"/>
     <w:next w:val="Normal"/>
@@ -13271,7 +13696,7 @@
       <w:szCs w:val="20"/>
     </w:rPr>
   </w:style>
-  <w:style w:type="paragraph" w:styleId="TOC5">
+  <w:style w:type="paragraph" w:styleId="ndice5">
     <w:name w:val="toc 5"/>
     <w:basedOn w:val="Normal"/>
     <w:next w:val="Normal"/>
@@ -13285,7 +13710,7 @@
       <w:szCs w:val="20"/>
     </w:rPr>
   </w:style>
-  <w:style w:type="paragraph" w:styleId="TOC6">
+  <w:style w:type="paragraph" w:styleId="ndice6">
     <w:name w:val="toc 6"/>
     <w:basedOn w:val="Normal"/>
     <w:next w:val="Normal"/>
@@ -13299,7 +13724,7 @@
       <w:szCs w:val="20"/>
     </w:rPr>
   </w:style>
-  <w:style w:type="paragraph" w:styleId="TOC7">
+  <w:style w:type="paragraph" w:styleId="ndice7">
     <w:name w:val="toc 7"/>
     <w:basedOn w:val="Normal"/>
     <w:next w:val="Normal"/>
@@ -13313,7 +13738,7 @@
       <w:szCs w:val="20"/>
     </w:rPr>
   </w:style>
-  <w:style w:type="paragraph" w:styleId="TOC8">
+  <w:style w:type="paragraph" w:styleId="ndice8">
     <w:name w:val="toc 8"/>
     <w:basedOn w:val="Normal"/>
     <w:next w:val="Normal"/>
@@ -13327,7 +13752,7 @@
       <w:szCs w:val="20"/>
     </w:rPr>
   </w:style>
-  <w:style w:type="paragraph" w:styleId="TOC9">
+  <w:style w:type="paragraph" w:styleId="ndice9">
     <w:name w:val="toc 9"/>
     <w:basedOn w:val="Normal"/>
     <w:next w:val="Normal"/>
@@ -13378,7 +13803,7 @@
       <w:szCs w:val="20"/>
     </w:rPr>
   </w:style>
-  <w:style w:type="paragraph" w:styleId="Header">
+  <w:style w:type="paragraph" w:styleId="Cabealho">
     <w:name w:val="header"/>
     <w:basedOn w:val="Normal"/>
     <w:pPr>
@@ -13394,7 +13819,7 @@
       <w:szCs w:val="18"/>
     </w:rPr>
   </w:style>
-  <w:style w:type="paragraph" w:styleId="Footer">
+  <w:style w:type="paragraph" w:styleId="Rodap">
     <w:name w:val="footer"/>
     <w:basedOn w:val="Normal"/>
     <w:pPr>
@@ -13680,7 +14105,7 @@
       </w:tabs>
     </w:pPr>
   </w:style>
-  <w:style w:type="paragraph" w:styleId="TableofFigures">
+  <w:style w:type="paragraph" w:styleId="ndicedeilustraes">
     <w:name w:val="table of figures"/>
     <w:basedOn w:val="Normal"/>
     <w:next w:val="Normal"/>
@@ -13688,7 +14113,7 @@
     <w:unhideWhenUsed/>
     <w:rsid w:val="00BC08DF"/>
   </w:style>
-  <w:style w:type="paragraph" w:styleId="ListParagraph">
+  <w:style w:type="paragraph" w:styleId="PargrafodaLista">
     <w:name w:val="List Paragraph"/>
     <w:basedOn w:val="Normal"/>
     <w:uiPriority w:val="34"/>
@@ -13699,10 +14124,10 @@
       <w:contextualSpacing/>
     </w:pPr>
   </w:style>
-  <w:style w:type="paragraph" w:styleId="BalloonText">
+  <w:style w:type="paragraph" w:styleId="Textodebalo">
     <w:name w:val="Balloon Text"/>
     <w:basedOn w:val="Normal"/>
-    <w:link w:val="BalloonTextChar"/>
+    <w:link w:val="TextodebaloCarter"/>
     <w:uiPriority w:val="99"/>
     <w:semiHidden/>
     <w:unhideWhenUsed/>
@@ -13716,10 +14141,10 @@
       <w:szCs w:val="18"/>
     </w:rPr>
   </w:style>
-  <w:style w:type="character" w:customStyle="1" w:styleId="BalloonTextChar">
-    <w:name w:val="Balloon Text Char"/>
-    <w:basedOn w:val="DefaultParagraphFont"/>
-    <w:link w:val="BalloonText"/>
+  <w:style w:type="character" w:customStyle="1" w:styleId="TextodebaloCarter">
+    <w:name w:val="Texto de balão Caráter"/>
+    <w:basedOn w:val="Tipodeletrapredefinidodopargrafo"/>
+    <w:link w:val="Textodebalo"/>
     <w:uiPriority w:val="99"/>
     <w:semiHidden/>
     <w:rsid w:val="009B53DC"/>
@@ -13729,9 +14154,9 @@
       <w:lang w:eastAsia="zh-CN"/>
     </w:rPr>
   </w:style>
-  <w:style w:type="character" w:styleId="CommentReference">
+  <w:style w:type="character" w:styleId="Refdecomentrio">
     <w:name w:val="annotation reference"/>
-    <w:basedOn w:val="DefaultParagraphFont"/>
+    <w:basedOn w:val="Tipodeletrapredefinidodopargrafo"/>
     <w:uiPriority w:val="99"/>
     <w:semiHidden/>
     <w:unhideWhenUsed/>
@@ -13741,10 +14166,10 @@
       <w:szCs w:val="16"/>
     </w:rPr>
   </w:style>
-  <w:style w:type="paragraph" w:styleId="CommentText">
+  <w:style w:type="paragraph" w:styleId="Textodecomentrio">
     <w:name w:val="annotation text"/>
     <w:basedOn w:val="Normal"/>
-    <w:link w:val="CommentTextChar"/>
+    <w:link w:val="TextodecomentrioCarter"/>
     <w:uiPriority w:val="99"/>
     <w:semiHidden/>
     <w:unhideWhenUsed/>
@@ -13757,10 +14182,10 @@
       <w:szCs w:val="20"/>
     </w:rPr>
   </w:style>
-  <w:style w:type="character" w:customStyle="1" w:styleId="CommentTextChar">
-    <w:name w:val="Comment Text Char"/>
-    <w:basedOn w:val="DefaultParagraphFont"/>
-    <w:link w:val="CommentText"/>
+  <w:style w:type="character" w:customStyle="1" w:styleId="TextodecomentrioCarter">
+    <w:name w:val="Texto de comentário Caráter"/>
+    <w:basedOn w:val="Tipodeletrapredefinidodopargrafo"/>
+    <w:link w:val="Textodecomentrio"/>
     <w:uiPriority w:val="99"/>
     <w:semiHidden/>
     <w:rsid w:val="009B53DC"/>
@@ -13769,11 +14194,11 @@
       <w:lang w:eastAsia="zh-CN"/>
     </w:rPr>
   </w:style>
-  <w:style w:type="paragraph" w:styleId="CommentSubject">
+  <w:style w:type="paragraph" w:styleId="Assuntodecomentrio">
     <w:name w:val="annotation subject"/>
-    <w:basedOn w:val="CommentText"/>
-    <w:next w:val="CommentText"/>
-    <w:link w:val="CommentSubjectChar"/>
+    <w:basedOn w:val="Textodecomentrio"/>
+    <w:next w:val="Textodecomentrio"/>
+    <w:link w:val="AssuntodecomentrioCarter"/>
     <w:uiPriority w:val="99"/>
     <w:semiHidden/>
     <w:unhideWhenUsed/>
@@ -13783,10 +14208,10 @@
       <w:bCs/>
     </w:rPr>
   </w:style>
-  <w:style w:type="character" w:customStyle="1" w:styleId="CommentSubjectChar">
-    <w:name w:val="Comment Subject Char"/>
-    <w:basedOn w:val="CommentTextChar"/>
-    <w:link w:val="CommentSubject"/>
+  <w:style w:type="character" w:customStyle="1" w:styleId="AssuntodecomentrioCarter">
+    <w:name w:val="Assunto de comentário Caráter"/>
+    <w:basedOn w:val="TextodecomentrioCarter"/>
+    <w:link w:val="Assuntodecomentrio"/>
     <w:uiPriority w:val="99"/>
     <w:semiHidden/>
     <w:rsid w:val="009B53DC"/>
@@ -13797,7 +14222,7 @@
       <w:lang w:eastAsia="zh-CN"/>
     </w:rPr>
   </w:style>
-  <w:style w:type="paragraph" w:styleId="Revision">
+  <w:style w:type="paragraph" w:styleId="Reviso">
     <w:name w:val="Revision"/>
     <w:hidden/>
     <w:uiPriority w:val="99"/>
@@ -13827,9 +14252,9 @@
       <w:lang w:val="en-US" w:eastAsia="en-US"/>
     </w:rPr>
   </w:style>
-  <w:style w:type="character" w:styleId="Strong">
+  <w:style w:type="character" w:styleId="Forte">
     <w:name w:val="Strong"/>
-    <w:basedOn w:val="DefaultParagraphFont"/>
+    <w:basedOn w:val="Tipodeletrapredefinidodopargrafo"/>
     <w:uiPriority w:val="22"/>
     <w:qFormat/>
     <w:rsid w:val="007975C8"/>
@@ -13838,10 +14263,10 @@
       <w:bCs/>
     </w:rPr>
   </w:style>
-  <w:style w:type="character" w:customStyle="1" w:styleId="Heading3Char">
-    <w:name w:val="Heading 3 Char"/>
-    <w:basedOn w:val="DefaultParagraphFont"/>
-    <w:link w:val="Heading3"/>
+  <w:style w:type="character" w:customStyle="1" w:styleId="Ttulo3Carter">
+    <w:name w:val="Título 3 Caráter"/>
+    <w:basedOn w:val="Tipodeletrapredefinidodopargrafo"/>
+    <w:link w:val="Ttulo3"/>
     <w:uiPriority w:val="9"/>
     <w:rsid w:val="00CA14FE"/>
     <w:rPr>

</xml_diff>